<commit_message>
Add joint token-feature geometry figures
</commit_message>
<xml_diff>
--- a/docs/PAPER_SUPPLEMENTARY.docx
+++ b/docs/PAPER_SUPPLEMENTARY.docx
@@ -6,13 +6,14 @@
       <w:pPr>
         <w:pStyle w:val="Title"/>
         <w:spacing w:after="160"/>
+        <w:jc w:val="both"/>
       </w:pPr>
       <w:r>
         <w:rPr>
           <w:rFonts w:ascii="Times New Roman" w:hAnsi="Times New Roman"/>
           <w:b/>
           <w:color w:val="000000"/>
-          <w:sz w:val="36"/>
+          <w:sz w:val="20"/>
         </w:rPr>
         <w:t>Supplementary Material</w:t>
       </w:r>
@@ -21,13 +22,14 @@
       <w:pPr>
         <w:pStyle w:val="Heading1"/>
         <w:keepNext/>
+        <w:jc w:val="both"/>
       </w:pPr>
       <w:r>
         <w:rPr>
           <w:rFonts w:ascii="Times New Roman" w:hAnsi="Times New Roman"/>
           <w:b/>
           <w:color w:val="000000"/>
-          <w:sz w:val="28"/>
+          <w:sz w:val="20"/>
         </w:rPr>
         <w:t>Patch-Content Fungibility: Geometry, Functional Transmission, and Operator-Aware Token Compression</w:t>
       </w:r>
@@ -35,6 +37,7 @@
     <w:p>
       <w:pPr>
         <w:spacing w:after="100" w:line="259" w:lineRule="auto"/>
+        <w:jc w:val="both"/>
       </w:pPr>
       <w:r>
         <w:rPr>
@@ -50,13 +53,14 @@
       <w:pPr>
         <w:pStyle w:val="Heading1"/>
         <w:keepNext/>
+        <w:jc w:val="both"/>
       </w:pPr>
       <w:r>
         <w:rPr>
           <w:rFonts w:ascii="Times New Roman" w:hAnsi="Times New Roman"/>
           <w:b/>
           <w:color w:val="000000"/>
-          <w:sz w:val="28"/>
+          <w:sz w:val="20"/>
         </w:rPr>
         <w:t>S1. Evidence map and study design</w:t>
       </w:r>
@@ -64,6 +68,7 @@
     <w:p>
       <w:pPr>
         <w:spacing w:after="100" w:line="259" w:lineRule="auto"/>
+        <w:jc w:val="both"/>
       </w:pPr>
       <w:r>
         <w:rPr>
@@ -73,6 +78,17 @@
           <w:sz w:val="20"/>
         </w:rPr>
         <w:t>The analyses are grouped by the scientific question they address. Table I in the main text identifies each evidence family’s sample unit; cohorts and endpoints are not pooled across studies.</w:t>
+      </w:r>
+    </w:p>
+    <w:p>
+      <w:pPr>
+        <w:jc w:val="both"/>
+      </w:pPr>
+      <w:r>
+        <w:rPr>
+          <w:sz w:val="20"/>
+        </w:rPr>
+        <w:t>Supplementary evidence map. Summary of evidence families, scientific questions, model coverage, core conditions, and contributions covered by the supplementary analyses.</w:t>
       </w:r>
     </w:p>
     <w:tbl>
@@ -110,13 +126,17 @@
               <w:spacing w:after="0" w:line="240" w:lineRule="auto"/>
               <w:jc w:val="center"/>
             </w:pPr>
-            <w:r/>
+            <w:r>
+              <w:rPr>
+                <w:sz w:val="20"/>
+              </w:rPr>
+            </w:r>
             <w:r>
               <w:rPr>
                 <w:rFonts w:ascii="Times New Roman" w:hAnsi="Times New Roman"/>
                 <w:b/>
                 <w:color w:val="17232D"/>
-                <w:sz w:val="16"/>
+                <w:sz w:val="20"/>
               </w:rPr>
               <w:t>Evidence family</w:t>
             </w:r>
@@ -139,13 +159,17 @@
               <w:spacing w:after="0" w:line="240" w:lineRule="auto"/>
               <w:jc w:val="center"/>
             </w:pPr>
-            <w:r/>
+            <w:r>
+              <w:rPr>
+                <w:sz w:val="20"/>
+              </w:rPr>
+            </w:r>
             <w:r>
               <w:rPr>
                 <w:rFonts w:ascii="Times New Roman" w:hAnsi="Times New Roman"/>
                 <w:b/>
                 <w:color w:val="17232D"/>
-                <w:sz w:val="16"/>
+                <w:sz w:val="20"/>
               </w:rPr>
               <w:t>Scientific question</w:t>
             </w:r>
@@ -168,13 +192,17 @@
               <w:spacing w:after="0" w:line="240" w:lineRule="auto"/>
               <w:jc w:val="center"/>
             </w:pPr>
-            <w:r/>
+            <w:r>
+              <w:rPr>
+                <w:sz w:val="20"/>
+              </w:rPr>
+            </w:r>
             <w:r>
               <w:rPr>
                 <w:rFonts w:ascii="Times New Roman" w:hAnsi="Times New Roman"/>
                 <w:b/>
                 <w:color w:val="17232D"/>
-                <w:sz w:val="16"/>
+                <w:sz w:val="20"/>
               </w:rPr>
               <w:t>Models</w:t>
             </w:r>
@@ -197,13 +225,17 @@
               <w:spacing w:after="0" w:line="240" w:lineRule="auto"/>
               <w:jc w:val="center"/>
             </w:pPr>
-            <w:r/>
+            <w:r>
+              <w:rPr>
+                <w:sz w:val="20"/>
+              </w:rPr>
+            </w:r>
             <w:r>
               <w:rPr>
                 <w:rFonts w:ascii="Times New Roman" w:hAnsi="Times New Roman"/>
                 <w:b/>
                 <w:color w:val="17232D"/>
-                <w:sz w:val="16"/>
+                <w:sz w:val="20"/>
               </w:rPr>
               <w:t>Core conditions</w:t>
             </w:r>
@@ -226,13 +258,17 @@
               <w:spacing w:after="0" w:line="240" w:lineRule="auto"/>
               <w:jc w:val="center"/>
             </w:pPr>
-            <w:r/>
+            <w:r>
+              <w:rPr>
+                <w:sz w:val="20"/>
+              </w:rPr>
+            </w:r>
             <w:r>
               <w:rPr>
                 <w:rFonts w:ascii="Times New Roman" w:hAnsi="Times New Roman"/>
                 <w:b/>
                 <w:color w:val="17232D"/>
-                <w:sz w:val="16"/>
+                <w:sz w:val="20"/>
               </w:rPr>
               <w:t>Contribution</w:t>
             </w:r>
@@ -255,13 +291,17 @@
             <w:pPr>
               <w:spacing w:after="0" w:line="240" w:lineRule="auto"/>
             </w:pPr>
-            <w:r/>
+            <w:r>
+              <w:rPr>
+                <w:sz w:val="20"/>
+              </w:rPr>
+            </w:r>
             <w:r>
               <w:rPr>
                 <w:rFonts w:ascii="Times New Roman" w:hAnsi="Times New Roman"/>
                 <w:b w:val="0"/>
                 <w:color w:val="202A32"/>
-                <w:sz w:val="16"/>
+                <w:sz w:val="20"/>
               </w:rPr>
               <w:t>Depth-dependent replacement</w:t>
             </w:r>
@@ -283,13 +323,17 @@
               <w:spacing w:after="0" w:line="240" w:lineRule="auto"/>
               <w:jc w:val="center"/>
             </w:pPr>
-            <w:r/>
+            <w:r>
+              <w:rPr>
+                <w:sz w:val="20"/>
+              </w:rPr>
+            </w:r>
             <w:r>
               <w:rPr>
                 <w:rFonts w:ascii="Times New Roman" w:hAnsi="Times New Roman"/>
                 <w:b w:val="0"/>
                 <w:color w:val="202A32"/>
-                <w:sz w:val="16"/>
+                <w:sz w:val="20"/>
               </w:rPr>
               <w:t>How does replacement tolerance vary with depth, and how does it differ from zero ablation?</w:t>
             </w:r>
@@ -311,13 +355,17 @@
               <w:spacing w:after="0" w:line="240" w:lineRule="auto"/>
               <w:jc w:val="center"/>
             </w:pPr>
-            <w:r/>
+            <w:r>
+              <w:rPr>
+                <w:sz w:val="20"/>
+              </w:rPr>
+            </w:r>
             <w:r>
               <w:rPr>
                 <w:rFonts w:ascii="Times New Roman" w:hAnsi="Times New Roman"/>
                 <w:b w:val="0"/>
                 <w:color w:val="202A32"/>
-                <w:sz w:val="16"/>
+                <w:sz w:val="20"/>
               </w:rPr>
               <w:t>All four architectures</w:t>
             </w:r>
@@ -339,13 +387,17 @@
               <w:spacing w:after="0" w:line="240" w:lineRule="auto"/>
               <w:jc w:val="center"/>
             </w:pPr>
-            <w:r/>
+            <w:r>
+              <w:rPr>
+                <w:sz w:val="20"/>
+              </w:rPr>
+            </w:r>
             <w:r>
               <w:rPr>
                 <w:rFonts w:ascii="Times New Roman" w:hAnsi="Times New Roman"/>
                 <w:b w:val="0"/>
                 <w:color w:val="202A32"/>
-                <w:sz w:val="16"/>
+                <w:sz w:val="20"/>
               </w:rPr>
               <w:t>Zero, calibration centroid, and Gaussian surrogates at 25% replacement across depths 5–10; depth-6 follow-up for ViT-B and DINOv2</w:t>
             </w:r>
@@ -367,13 +419,17 @@
               <w:spacing w:after="0" w:line="240" w:lineRule="auto"/>
               <w:jc w:val="center"/>
             </w:pPr>
-            <w:r/>
+            <w:r>
+              <w:rPr>
+                <w:sz w:val="20"/>
+              </w:rPr>
+            </w:r>
             <w:r>
               <w:rPr>
                 <w:rFonts w:ascii="Times New Roman" w:hAnsi="Times New Roman"/>
                 <w:b w:val="0"/>
                 <w:color w:val="202A32"/>
-                <w:sz w:val="16"/>
+                <w:sz w:val="20"/>
               </w:rPr>
               <w:t>Establishes architecture-dependent depth profiles and the distinction between content replacement and removal.</w:t>
             </w:r>
@@ -396,13 +452,17 @@
             <w:pPr>
               <w:spacing w:after="0" w:line="240" w:lineRule="auto"/>
             </w:pPr>
-            <w:r/>
+            <w:r>
+              <w:rPr>
+                <w:sz w:val="20"/>
+              </w:rPr>
+            </w:r>
             <w:r>
               <w:rPr>
                 <w:rFonts w:ascii="Times New Roman" w:hAnsi="Times New Roman"/>
                 <w:b w:val="0"/>
                 <w:color w:val="202A32"/>
-                <w:sz w:val="16"/>
+                <w:sz w:val="20"/>
               </w:rPr>
               <w:t>Geometric compatibility</w:t>
             </w:r>
@@ -424,13 +484,17 @@
               <w:spacing w:after="0" w:line="240" w:lineRule="auto"/>
               <w:jc w:val="center"/>
             </w:pPr>
-            <w:r/>
+            <w:r>
+              <w:rPr>
+                <w:sz w:val="20"/>
+              </w:rPr>
+            </w:r>
             <w:r>
               <w:rPr>
                 <w:rFonts w:ascii="Times New Roman" w:hAnsi="Times New Roman"/>
                 <w:b w:val="0"/>
                 <w:color w:val="202A32"/>
-                <w:sz w:val="16"/>
+                <w:sz w:val="20"/>
               </w:rPr>
               <w:t>Which properties of static surrogate vectors constrain replacement?</w:t>
             </w:r>
@@ -452,13 +516,17 @@
               <w:spacing w:after="0" w:line="240" w:lineRule="auto"/>
               <w:jc w:val="center"/>
             </w:pPr>
-            <w:r/>
+            <w:r>
+              <w:rPr>
+                <w:sz w:val="20"/>
+              </w:rPr>
+            </w:r>
             <w:r>
               <w:rPr>
                 <w:rFonts w:ascii="Times New Roman" w:hAnsi="Times New Roman"/>
                 <w:b w:val="0"/>
                 <w:color w:val="202A32"/>
-                <w:sz w:val="16"/>
+                <w:sz w:val="20"/>
               </w:rPr>
               <w:t>All four architectures</w:t>
             </w:r>
@@ -480,13 +548,17 @@
               <w:spacing w:after="0" w:line="240" w:lineRule="auto"/>
               <w:jc w:val="center"/>
             </w:pPr>
-            <w:r/>
+            <w:r>
+              <w:rPr>
+                <w:sz w:val="20"/>
+              </w:rPr>
+            </w:r>
             <w:r>
               <w:rPr>
                 <w:rFonts w:ascii="Times New Roman" w:hAnsi="Times New Roman"/>
                 <w:b w:val="0"/>
                 <w:color w:val="202A32"/>
-                <w:sz w:val="16"/>
+                <w:sz w:val="20"/>
               </w:rPr>
               <w:t>Centroid, coordinate permutation, sign inversion, scale, and alignment controls</w:t>
             </w:r>
@@ -508,13 +580,17 @@
               <w:spacing w:after="0" w:line="240" w:lineRule="auto"/>
               <w:jc w:val="center"/>
             </w:pPr>
-            <w:r/>
+            <w:r>
+              <w:rPr>
+                <w:sz w:val="20"/>
+              </w:rPr>
+            </w:r>
             <w:r>
               <w:rPr>
                 <w:rFonts w:ascii="Times New Roman" w:hAnsi="Times New Roman"/>
                 <w:b w:val="0"/>
                 <w:color w:val="202A32"/>
-                <w:sz w:val="16"/>
+                <w:sz w:val="20"/>
               </w:rPr>
               <w:t>Shows that coordinate assignment and direction matter in tested settings.</w:t>
             </w:r>
@@ -537,13 +613,17 @@
             <w:pPr>
               <w:spacing w:after="0" w:line="240" w:lineRule="auto"/>
             </w:pPr>
-            <w:r/>
+            <w:r>
+              <w:rPr>
+                <w:sz w:val="20"/>
+              </w:rPr>
+            </w:r>
             <w:r>
               <w:rPr>
                 <w:rFonts w:ascii="Times New Roman" w:hAnsi="Times New Roman"/>
                 <w:b w:val="0"/>
                 <w:color w:val="202A32"/>
-                <w:sz w:val="16"/>
+                <w:sz w:val="20"/>
               </w:rPr>
               <w:t>Token-position diversity</w:t>
             </w:r>
@@ -565,13 +645,17 @@
               <w:spacing w:after="0" w:line="240" w:lineRule="auto"/>
               <w:jc w:val="center"/>
             </w:pPr>
-            <w:r/>
+            <w:r>
+              <w:rPr>
+                <w:sz w:val="20"/>
+              </w:rPr>
+            </w:r>
             <w:r>
               <w:rPr>
                 <w:rFonts w:ascii="Times New Roman" w:hAnsi="Times New Roman"/>
                 <w:b w:val="0"/>
                 <w:color w:val="202A32"/>
-                <w:sz w:val="16"/>
+                <w:sz w:val="20"/>
               </w:rPr>
               <w:t>How does variation across patch positions affect complete replacement?</w:t>
             </w:r>
@@ -593,13 +677,17 @@
               <w:spacing w:after="0" w:line="240" w:lineRule="auto"/>
               <w:jc w:val="center"/>
             </w:pPr>
-            <w:r/>
+            <w:r>
+              <w:rPr>
+                <w:sz w:val="20"/>
+              </w:rPr>
+            </w:r>
             <w:r>
               <w:rPr>
                 <w:rFonts w:ascii="Times New Roman" w:hAnsi="Times New Roman"/>
                 <w:b w:val="0"/>
                 <w:color w:val="202A32"/>
-                <w:sz w:val="16"/>
+                <w:sz w:val="20"/>
               </w:rPr>
               <w:t>All four architectures</w:t>
             </w:r>
@@ -621,13 +709,17 @@
               <w:spacing w:after="0" w:line="240" w:lineRule="auto"/>
               <w:jc w:val="center"/>
             </w:pPr>
-            <w:r/>
+            <w:r>
+              <w:rPr>
+                <w:sz w:val="20"/>
+              </w:rPr>
+            </w:r>
             <w:r>
               <w:rPr>
                 <w:rFonts w:ascii="Times New Roman" w:hAnsi="Times New Roman"/>
                 <w:b w:val="0"/>
                 <w:color w:val="202A32"/>
-                <w:sz w:val="16"/>
+                <w:sz w:val="20"/>
               </w:rPr>
               <w:t>Shared, grouped, and independent Gaussian surrogates at Block 8</w:t>
             </w:r>
@@ -649,13 +741,17 @@
               <w:spacing w:after="0" w:line="240" w:lineRule="auto"/>
               <w:jc w:val="center"/>
             </w:pPr>
-            <w:r/>
+            <w:r>
+              <w:rPr>
+                <w:sz w:val="20"/>
+              </w:rPr>
+            </w:r>
             <w:r>
               <w:rPr>
                 <w:rFonts w:ascii="Times New Roman" w:hAnsi="Times New Roman"/>
                 <w:b w:val="0"/>
                 <w:color w:val="202A32"/>
-                <w:sz w:val="16"/>
+                <w:sz w:val="20"/>
               </w:rPr>
               <w:t>Resolves an architecture-dependent diversity response; DINOv2 accuracy and margin are reported separately.</w:t>
             </w:r>
@@ -678,13 +774,17 @@
             <w:pPr>
               <w:spacing w:after="0" w:line="240" w:lineRule="auto"/>
             </w:pPr>
-            <w:r/>
+            <w:r>
+              <w:rPr>
+                <w:sz w:val="20"/>
+              </w:rPr>
+            </w:r>
             <w:r>
               <w:rPr>
                 <w:rFonts w:ascii="Times New Roman" w:hAnsi="Times New Roman"/>
                 <w:b w:val="0"/>
                 <w:color w:val="202A32"/>
-                <w:sz w:val="16"/>
+                <w:sz w:val="20"/>
               </w:rPr>
               <w:t>Calibration-derived feature directions</w:t>
             </w:r>
@@ -706,13 +806,17 @@
               <w:spacing w:after="0" w:line="240" w:lineRule="auto"/>
               <w:jc w:val="center"/>
             </w:pPr>
-            <w:r/>
+            <w:r>
+              <w:rPr>
+                <w:sz w:val="20"/>
+              </w:rPr>
+            </w:r>
             <w:r>
               <w:rPr>
                 <w:rFonts w:ascii="Times New Roman" w:hAnsi="Times New Roman"/>
                 <w:b w:val="0"/>
                 <w:color w:val="202A32"/>
-                <w:sz w:val="16"/>
+                <w:sz w:val="20"/>
               </w:rPr>
               <w:t>Can a calibrated low-dimensional direction outperform an energy-matched random direction?</w:t>
             </w:r>
@@ -734,13 +838,17 @@
               <w:spacing w:after="0" w:line="240" w:lineRule="auto"/>
               <w:jc w:val="center"/>
             </w:pPr>
-            <w:r/>
+            <w:r>
+              <w:rPr>
+                <w:sz w:val="20"/>
+              </w:rPr>
+            </w:r>
             <w:r>
               <w:rPr>
                 <w:rFonts w:ascii="Times New Roman" w:hAnsi="Times New Roman"/>
                 <w:b w:val="0"/>
                 <w:color w:val="202A32"/>
-                <w:sz w:val="16"/>
+                <w:sz w:val="20"/>
               </w:rPr>
               <w:t>All four architectures</w:t>
             </w:r>
@@ -762,13 +870,17 @@
               <w:spacing w:after="0" w:line="240" w:lineRule="auto"/>
               <w:jc w:val="center"/>
             </w:pPr>
-            <w:r/>
+            <w:r>
+              <w:rPr>
+                <w:sz w:val="20"/>
+              </w:rPr>
+            </w:r>
             <w:r>
               <w:rPr>
                 <w:rFonts w:ascii="Times New Roman" w:hAnsi="Times New Roman"/>
                 <w:b w:val="0"/>
                 <w:color w:val="202A32"/>
-                <w:sz w:val="16"/>
+                <w:sz w:val="20"/>
               </w:rPr>
               <w:t>PCA-aligned and random one-dimensional variation, amplitude controls, and rank analyses</w:t>
             </w:r>
@@ -790,13 +902,17 @@
               <w:spacing w:after="0" w:line="240" w:lineRule="auto"/>
               <w:jc w:val="center"/>
             </w:pPr>
-            <w:r/>
+            <w:r>
+              <w:rPr>
+                <w:sz w:val="20"/>
+              </w:rPr>
+            </w:r>
             <w:r>
               <w:rPr>
                 <w:rFonts w:ascii="Times New Roman" w:hAnsi="Times New Roman"/>
                 <w:b w:val="0"/>
                 <w:color w:val="202A32"/>
-                <w:sz w:val="16"/>
+                <w:sz w:val="20"/>
               </w:rPr>
               <w:t>Supports learned-direction compatibility without establishing rank-1 sufficiency.</w:t>
             </w:r>
@@ -819,13 +935,17 @@
             <w:pPr>
               <w:spacing w:after="0" w:line="240" w:lineRule="auto"/>
             </w:pPr>
-            <w:r/>
+            <w:r>
+              <w:rPr>
+                <w:sz w:val="20"/>
+              </w:rPr>
+            </w:r>
             <w:r>
               <w:rPr>
                 <w:rFonts w:ascii="Times New Roman" w:hAnsi="Times New Roman"/>
                 <w:b w:val="0"/>
                 <w:color w:val="202A32"/>
-                <w:sz w:val="16"/>
+                <w:sz w:val="20"/>
               </w:rPr>
               <w:t>Functional and transmission mechanisms</w:t>
             </w:r>
@@ -847,13 +967,17 @@
               <w:spacing w:after="0" w:line="240" w:lineRule="auto"/>
               <w:jc w:val="center"/>
             </w:pPr>
-            <w:r/>
+            <w:r>
+              <w:rPr>
+                <w:sz w:val="20"/>
+              </w:rPr>
+            </w:r>
             <w:r>
               <w:rPr>
                 <w:rFonts w:ascii="Times New Roman" w:hAnsi="Times New Roman"/>
                 <w:b w:val="0"/>
                 <w:color w:val="202A32"/>
-                <w:sz w:val="16"/>
+                <w:sz w:val="20"/>
               </w:rPr>
               <w:t>How do feature sensitivity, token coherence, and downstream computation relate to replacement effects?</w:t>
             </w:r>
@@ -875,13 +999,17 @@
               <w:spacing w:after="0" w:line="240" w:lineRule="auto"/>
               <w:jc w:val="center"/>
             </w:pPr>
-            <w:r/>
+            <w:r>
+              <w:rPr>
+                <w:sz w:val="20"/>
+              </w:rPr>
+            </w:r>
             <w:r>
               <w:rPr>
                 <w:rFonts w:ascii="Times New Roman" w:hAnsi="Times New Roman"/>
                 <w:b w:val="0"/>
                 <w:color w:val="202A32"/>
-                <w:sz w:val="16"/>
+                <w:sz w:val="20"/>
               </w:rPr>
               <w:t>Cohorts listed in Table I</w:t>
             </w:r>
@@ -903,13 +1031,17 @@
               <w:spacing w:after="0" w:line="240" w:lineRule="auto"/>
               <w:jc w:val="center"/>
             </w:pPr>
-            <w:r/>
+            <w:r>
+              <w:rPr>
+                <w:sz w:val="20"/>
+              </w:rPr>
+            </w:r>
             <w:r>
               <w:rPr>
                 <w:rFonts w:ascii="Times New Roman" w:hAnsi="Times New Roman"/>
                 <w:b w:val="0"/>
                 <w:color w:val="202A32"/>
-                <w:sz w:val="16"/>
+                <w:sz w:val="20"/>
               </w:rPr>
               <w:t>Margin-gradient geometry, frozen-attention Value-path analysis, joint token–feature perturbations, and multi-block operator prediction</w:t>
             </w:r>
@@ -931,13 +1063,17 @@
               <w:spacing w:after="0" w:line="240" w:lineRule="auto"/>
               <w:jc w:val="center"/>
             </w:pPr>
-            <w:r/>
+            <w:r>
+              <w:rPr>
+                <w:sz w:val="20"/>
+              </w:rPr>
+            </w:r>
             <w:r>
               <w:rPr>
                 <w:rFonts w:ascii="Times New Roman" w:hAnsi="Times New Roman"/>
                 <w:b w:val="0"/>
                 <w:color w:val="202A32"/>
-                <w:sz w:val="16"/>
+                <w:sz w:val="20"/>
               </w:rPr>
               <w:t>Connects local feature geometry with token-coherent transmission while retaining the distinct study units.</w:t>
             </w:r>
@@ -960,13 +1096,17 @@
             <w:pPr>
               <w:spacing w:after="0" w:line="240" w:lineRule="auto"/>
             </w:pPr>
-            <w:r/>
+            <w:r>
+              <w:rPr>
+                <w:sz w:val="20"/>
+              </w:rPr>
+            </w:r>
             <w:r>
               <w:rPr>
                 <w:rFonts w:ascii="Times New Roman" w:hAnsi="Times New Roman"/>
                 <w:b w:val="0"/>
                 <w:color w:val="202A32"/>
-                <w:sz w:val="16"/>
+                <w:sz w:val="20"/>
               </w:rPr>
               <w:t>Operator-aware compression</w:t>
             </w:r>
@@ -988,13 +1128,17 @@
               <w:spacing w:after="0" w:line="240" w:lineRule="auto"/>
               <w:jc w:val="center"/>
             </w:pPr>
-            <w:r/>
+            <w:r>
+              <w:rPr>
+                <w:sz w:val="20"/>
+              </w:rPr>
+            </w:r>
             <w:r>
               <w:rPr>
                 <w:rFonts w:ascii="Times New Roman" w:hAnsi="Times New Roman"/>
                 <w:b w:val="0"/>
                 <w:color w:val="202A32"/>
-                <w:sz w:val="16"/>
+                <w:sz w:val="20"/>
               </w:rPr>
               <w:t>Can an end-to-end readout objective guide token grouping and carrier optimization?</w:t>
             </w:r>
@@ -1016,13 +1160,17 @@
               <w:spacing w:after="0" w:line="240" w:lineRule="auto"/>
               <w:jc w:val="center"/>
             </w:pPr>
-            <w:r/>
+            <w:r>
+              <w:rPr>
+                <w:sz w:val="20"/>
+              </w:rPr>
+            </w:r>
             <w:r>
               <w:rPr>
                 <w:rFonts w:ascii="Times New Roman" w:hAnsi="Times New Roman"/>
                 <w:b w:val="0"/>
                 <w:color w:val="202A32"/>
-                <w:sz w:val="16"/>
+                <w:sz w:val="20"/>
               </w:rPr>
               <w:t>All four architectures</w:t>
             </w:r>
@@ -1044,13 +1192,17 @@
               <w:spacing w:after="0" w:line="240" w:lineRule="auto"/>
               <w:jc w:val="center"/>
             </w:pPr>
-            <w:r/>
+            <w:r>
+              <w:rPr>
+                <w:sz w:val="20"/>
+              </w:rPr>
+            </w:r>
             <w:r>
               <w:rPr>
                 <w:rFonts w:ascii="Times New Roman" w:hAnsi="Times New Roman"/>
                 <w:b w:val="0"/>
                 <w:color w:val="202A32"/>
-                <w:sz w:val="16"/>
+                <w:sz w:val="20"/>
               </w:rPr>
               <w:t>Group Mean, pruning, ToMe, full-J oracle, and low-rank operator approximations</w:t>
             </w:r>
@@ -1072,13 +1224,17 @@
               <w:spacing w:after="0" w:line="240" w:lineRule="auto"/>
               <w:jc w:val="center"/>
             </w:pPr>
-            <w:r/>
+            <w:r>
+              <w:rPr>
+                <w:sz w:val="20"/>
+              </w:rPr>
+            </w:r>
             <w:r>
               <w:rPr>
                 <w:rFonts w:ascii="Times New Roman" w:hAnsi="Times New Roman"/>
                 <w:b w:val="0"/>
                 <w:color w:val="202A32"/>
-                <w:sz w:val="16"/>
+                <w:sz w:val="20"/>
               </w:rPr>
               <w:t>Evaluates operator-aware compression on the strict held-out benchmark.</w:t>
             </w:r>
@@ -1101,13 +1257,17 @@
             <w:pPr>
               <w:spacing w:after="0" w:line="240" w:lineRule="auto"/>
             </w:pPr>
-            <w:r/>
+            <w:r>
+              <w:rPr>
+                <w:sz w:val="20"/>
+              </w:rPr>
+            </w:r>
             <w:r>
               <w:rPr>
                 <w:rFonts w:ascii="Times New Roman" w:hAnsi="Times New Roman"/>
                 <w:b w:val="0"/>
                 <w:color w:val="202A32"/>
-                <w:sz w:val="16"/>
+                <w:sz w:val="20"/>
               </w:rPr>
               <w:t>Practical carrier evaluation</w:t>
             </w:r>
@@ -1129,13 +1289,17 @@
               <w:spacing w:after="0" w:line="240" w:lineRule="auto"/>
               <w:jc w:val="center"/>
             </w:pPr>
-            <w:r/>
+            <w:r>
+              <w:rPr>
+                <w:sz w:val="20"/>
+              </w:rPr>
+            </w:r>
             <w:r>
               <w:rPr>
                 <w:rFonts w:ascii="Times New Roman" w:hAnsi="Times New Roman"/>
                 <w:b w:val="0"/>
                 <w:color w:val="202A32"/>
-                <w:sz w:val="16"/>
+                <w:sz w:val="20"/>
               </w:rPr>
               <w:t>Do static corrections improve classifier accuracy or measured throughput?</w:t>
             </w:r>
@@ -1157,13 +1321,17 @@
               <w:spacing w:after="0" w:line="240" w:lineRule="auto"/>
               <w:jc w:val="center"/>
             </w:pPr>
-            <w:r/>
+            <w:r>
+              <w:rPr>
+                <w:sz w:val="20"/>
+              </w:rPr>
+            </w:r>
             <w:r>
               <w:rPr>
                 <w:rFonts w:ascii="Times New Roman" w:hAnsi="Times New Roman"/>
                 <w:b w:val="0"/>
                 <w:color w:val="202A32"/>
-                <w:sz w:val="16"/>
+                <w:sz w:val="20"/>
               </w:rPr>
               <w:t>All four architectures</w:t>
             </w:r>
@@ -1185,13 +1353,17 @@
               <w:spacing w:after="0" w:line="240" w:lineRule="auto"/>
               <w:jc w:val="center"/>
             </w:pPr>
-            <w:r/>
+            <w:r>
+              <w:rPr>
+                <w:sz w:val="20"/>
+              </w:rPr>
+            </w:r>
             <w:r>
               <w:rPr>
                 <w:rFonts w:ascii="Times New Roman" w:hAnsi="Times New Roman"/>
                 <w:b w:val="0"/>
                 <w:color w:val="202A32"/>
-                <w:sz w:val="16"/>
+                <w:sz w:val="20"/>
               </w:rPr>
               <w:t>Calibration-frozen Feature-PCA corrections; separate operator-space and classifier evaluations</w:t>
             </w:r>
@@ -1213,13 +1385,17 @@
               <w:spacing w:after="0" w:line="240" w:lineRule="auto"/>
               <w:jc w:val="center"/>
             </w:pPr>
-            <w:r/>
+            <w:r>
+              <w:rPr>
+                <w:sz w:val="20"/>
+              </w:rPr>
+            </w:r>
             <w:r>
               <w:rPr>
                 <w:rFonts w:ascii="Times New Roman" w:hAnsi="Times New Roman"/>
                 <w:b w:val="0"/>
                 <w:color w:val="202A32"/>
-                <w:sz w:val="16"/>
+                <w:sz w:val="20"/>
               </w:rPr>
               <w:t>Defines the boundary between linearized operator-space gains and practical outcomes.</w:t>
             </w:r>
@@ -1242,13 +1418,17 @@
             <w:pPr>
               <w:spacing w:after="0" w:line="240" w:lineRule="auto"/>
             </w:pPr>
-            <w:r/>
+            <w:r>
+              <w:rPr>
+                <w:sz w:val="20"/>
+              </w:rPr>
+            </w:r>
             <w:r>
               <w:rPr>
                 <w:rFonts w:ascii="Times New Roman" w:hAnsi="Times New Roman"/>
                 <w:b w:val="0"/>
                 <w:color w:val="202A32"/>
-                <w:sz w:val="16"/>
+                <w:sz w:val="20"/>
               </w:rPr>
               <w:t>Supplementary robustness and carrier tests</w:t>
             </w:r>
@@ -1270,13 +1450,17 @@
               <w:spacing w:after="0" w:line="240" w:lineRule="auto"/>
               <w:jc w:val="center"/>
             </w:pPr>
-            <w:r/>
+            <w:r>
+              <w:rPr>
+                <w:sz w:val="20"/>
+              </w:rPr>
+            </w:r>
             <w:r>
               <w:rPr>
                 <w:rFonts w:ascii="Times New Roman" w:hAnsi="Times New Roman"/>
                 <w:b w:val="0"/>
                 <w:color w:val="202A32"/>
-                <w:sz w:val="16"/>
+                <w:sz w:val="20"/>
               </w:rPr>
               <w:t>Are replacement findings sensitive to fractions, spatial masks, token multiplicity, or synthetic banks?</w:t>
             </w:r>
@@ -1298,13 +1482,17 @@
               <w:spacing w:after="0" w:line="240" w:lineRule="auto"/>
               <w:jc w:val="center"/>
             </w:pPr>
-            <w:r/>
+            <w:r>
+              <w:rPr>
+                <w:sz w:val="20"/>
+              </w:rPr>
+            </w:r>
             <w:r>
               <w:rPr>
                 <w:rFonts w:ascii="Times New Roman" w:hAnsi="Times New Roman"/>
                 <w:b w:val="0"/>
                 <w:color w:val="202A32"/>
-                <w:sz w:val="16"/>
+                <w:sz w:val="20"/>
               </w:rPr>
               <w:t>All four architectures</w:t>
             </w:r>
@@ -1326,13 +1514,17 @@
               <w:spacing w:after="0" w:line="240" w:lineRule="auto"/>
               <w:jc w:val="center"/>
             </w:pPr>
-            <w:r/>
+            <w:r>
+              <w:rPr>
+                <w:sz w:val="20"/>
+              </w:rPr>
+            </w:r>
             <w:r>
               <w:rPr>
                 <w:rFonts w:ascii="Times New Roman" w:hAnsi="Times New Roman"/>
                 <w:b w:val="0"/>
                 <w:color w:val="202A32"/>
-                <w:sz w:val="16"/>
+                <w:sz w:val="20"/>
               </w:rPr>
               <w:t>Dense fraction and mask sweeps, multiplicity-aware collapse, and geometry banks at matched token budgets</w:t>
             </w:r>
@@ -1354,13 +1546,17 @@
               <w:spacing w:after="0" w:line="240" w:lineRule="auto"/>
               <w:jc w:val="center"/>
             </w:pPr>
-            <w:r/>
+            <w:r>
+              <w:rPr>
+                <w:sz w:val="20"/>
+              </w:rPr>
+            </w:r>
             <w:r>
               <w:rPr>
                 <w:rFonts w:ascii="Times New Roman" w:hAnsi="Times New Roman"/>
                 <w:b w:val="0"/>
                 <w:color w:val="202A32"/>
-                <w:sz w:val="16"/>
+                <w:sz w:val="20"/>
               </w:rPr>
               <w:t>Characterizes robustness and application limits.</w:t>
             </w:r>
@@ -1376,6 +1572,7 @@
     <w:p>
       <w:pPr>
         <w:spacing w:after="100" w:line="259" w:lineRule="auto"/>
+        <w:jc w:val="both"/>
       </w:pPr>
       <w:r>
         <w:rPr>
@@ -1391,13 +1588,14 @@
       <w:pPr>
         <w:pStyle w:val="Heading1"/>
         <w:keepNext/>
+        <w:jc w:val="both"/>
       </w:pPr>
       <w:r>
         <w:rPr>
           <w:rFonts w:ascii="Times New Roman" w:hAnsi="Times New Roman"/>
           <w:b/>
           <w:color w:val="000000"/>
-          <w:sz w:val="28"/>
+          <w:sz w:val="20"/>
         </w:rPr>
         <w:t>S2. Depth transition and held-out generalization</w:t>
       </w:r>
@@ -1405,6 +1603,7 @@
     <w:p>
       <w:pPr>
         <w:spacing w:after="100" w:line="259" w:lineRule="auto"/>
+        <w:jc w:val="both"/>
       </w:pPr>
       <w:r>
         <w:rPr>
@@ -1419,6 +1618,7 @@
     <w:p>
       <w:pPr>
         <w:spacing w:after="100" w:line="259" w:lineRule="auto"/>
+        <w:jc w:val="both"/>
       </w:pPr>
       <w:r>
         <w:rPr>
@@ -1433,6 +1633,7 @@
     <w:p>
       <w:pPr>
         <w:spacing w:after="100" w:line="259" w:lineRule="auto"/>
+        <w:jc w:val="both"/>
       </w:pPr>
       <w:r>
         <w:rPr>
@@ -1447,6 +1648,7 @@
     <w:p>
       <w:pPr>
         <w:spacing w:after="100" w:line="259" w:lineRule="auto"/>
+        <w:jc w:val="both"/>
       </w:pPr>
       <w:r>
         <w:rPr>
@@ -1462,13 +1664,14 @@
       <w:pPr>
         <w:pStyle w:val="Heading1"/>
         <w:keepNext/>
+        <w:jc w:val="both"/>
       </w:pPr>
       <w:r>
         <w:rPr>
           <w:rFonts w:ascii="Times New Roman" w:hAnsi="Times New Roman"/>
           <w:b/>
           <w:color w:val="000000"/>
-          <w:sz w:val="28"/>
+          <w:sz w:val="20"/>
         </w:rPr>
         <w:t>S3. Prototype geometry controls</w:t>
       </w:r>
@@ -1476,6 +1679,7 @@
     <w:p>
       <w:pPr>
         <w:spacing w:after="100" w:line="259" w:lineRule="auto"/>
+        <w:jc w:val="both"/>
       </w:pPr>
       <w:r>
         <w:rPr>
@@ -1490,6 +1694,7 @@
     <w:p>
       <w:pPr>
         <w:spacing w:after="100" w:line="259" w:lineRule="auto"/>
+        <w:jc w:val="both"/>
       </w:pPr>
       <w:r>
         <w:rPr>
@@ -1504,6 +1709,7 @@
     <w:p>
       <w:pPr>
         <w:spacing w:after="100" w:line="259" w:lineRule="auto"/>
+        <w:jc w:val="both"/>
       </w:pPr>
       <w:r>
         <w:rPr>
@@ -1518,6 +1724,7 @@
     <w:p>
       <w:pPr>
         <w:spacing w:after="100" w:line="259" w:lineRule="auto"/>
+        <w:jc w:val="both"/>
       </w:pPr>
       <w:r>
         <w:rPr>
@@ -1551,13 +1758,14 @@
       <w:pPr>
         <w:pStyle w:val="Heading1"/>
         <w:keepNext/>
+        <w:jc w:val="both"/>
       </w:pPr>
       <w:r>
         <w:rPr>
           <w:rFonts w:ascii="Times New Roman" w:hAnsi="Times New Roman"/>
           <w:b/>
           <w:color w:val="000000"/>
-          <w:sz w:val="28"/>
+          <w:sz w:val="20"/>
         </w:rPr>
         <w:t>S4. Replacement fraction and the complete-stream boundary</w:t>
       </w:r>
@@ -1565,6 +1773,7 @@
     <w:p>
       <w:pPr>
         <w:spacing w:after="100" w:line="259" w:lineRule="auto"/>
+        <w:jc w:val="both"/>
       </w:pPr>
       <w:r>
         <w:rPr>
@@ -1579,6 +1788,7 @@
     <w:p>
       <w:pPr>
         <w:spacing w:after="100" w:line="259" w:lineRule="auto"/>
+        <w:jc w:val="both"/>
       </w:pPr>
       <w:r>
         <w:rPr>
@@ -1757,6 +1967,7 @@
     <w:p>
       <w:pPr>
         <w:spacing w:after="100" w:line="259" w:lineRule="auto"/>
+        <w:jc w:val="both"/>
       </w:pPr>
       <w:r>
         <w:rPr>
@@ -1776,6 +1987,9 @@
         <w:jc w:val="center"/>
       </w:pPr>
       <w:r>
+        <w:rPr>
+          <w:sz w:val="20"/>
+        </w:rPr>
         <w:drawing>
           <wp:inline xmlns:a="http://schemas.openxmlformats.org/drawingml/2006/main" xmlns:pic="http://schemas.openxmlformats.org/drawingml/2006/picture">
             <wp:extent cx="6172200" cy="4730483"/>
@@ -1814,6 +2028,7 @@
       <w:pPr>
         <w:keepLines/>
         <w:spacing w:after="100" w:line="259" w:lineRule="auto"/>
+        <w:jc w:val="both"/>
       </w:pPr>
       <w:r>
         <w:rPr>
@@ -1842,6 +2057,9 @@
         <w:jc w:val="center"/>
       </w:pPr>
       <w:r>
+        <w:rPr>
+          <w:sz w:val="20"/>
+        </w:rPr>
         <w:drawing>
           <wp:inline xmlns:a="http://schemas.openxmlformats.org/drawingml/2006/main" xmlns:pic="http://schemas.openxmlformats.org/drawingml/2006/picture">
             <wp:extent cx="6172200" cy="2365847"/>
@@ -1880,6 +2098,7 @@
       <w:pPr>
         <w:keepLines/>
         <w:spacing w:after="100" w:line="259" w:lineRule="auto"/>
+        <w:jc w:val="both"/>
       </w:pPr>
       <w:r>
         <w:rPr>
@@ -1904,13 +2123,14 @@
       <w:pPr>
         <w:pStyle w:val="Heading1"/>
         <w:keepNext/>
+        <w:jc w:val="both"/>
       </w:pPr>
       <w:r>
         <w:rPr>
           <w:rFonts w:ascii="Times New Roman" w:hAnsi="Times New Roman"/>
           <w:b/>
           <w:color w:val="000000"/>
-          <w:sz w:val="28"/>
+          <w:sz w:val="20"/>
         </w:rPr>
         <w:t>S5. Causal isolation of token-to-token diversity</w:t>
       </w:r>
@@ -1918,6 +2138,7 @@
     <w:p>
       <w:pPr>
         <w:spacing w:after="100" w:line="259" w:lineRule="auto"/>
+        <w:jc w:val="both"/>
       </w:pPr>
       <w:r>
         <w:rPr>
@@ -1932,6 +2153,7 @@
     <w:p>
       <w:pPr>
         <w:spacing w:after="100" w:line="259" w:lineRule="auto"/>
+        <w:jc w:val="both"/>
       </w:pPr>
       <w:r>
         <w:rPr>
@@ -1946,6 +2168,7 @@
     <w:p>
       <w:pPr>
         <w:spacing w:after="100" w:line="259" w:lineRule="auto"/>
+        <w:jc w:val="both"/>
       </w:pPr>
       <w:r>
         <w:rPr>
@@ -1986,6 +2209,7 @@
     <w:p>
       <w:pPr>
         <w:spacing w:after="100" w:line="259" w:lineRule="auto"/>
+        <w:jc w:val="both"/>
       </w:pPr>
       <w:r>
         <w:rPr>
@@ -2026,6 +2250,7 @@
     <w:p>
       <w:pPr>
         <w:spacing w:after="100" w:line="259" w:lineRule="auto"/>
+        <w:jc w:val="both"/>
       </w:pPr>
       <w:r>
         <w:rPr>
@@ -2045,6 +2270,9 @@
         <w:jc w:val="center"/>
       </w:pPr>
       <w:r>
+        <w:rPr>
+          <w:sz w:val="20"/>
+        </w:rPr>
         <w:drawing>
           <wp:inline xmlns:a="http://schemas.openxmlformats.org/drawingml/2006/main" xmlns:pic="http://schemas.openxmlformats.org/drawingml/2006/picture">
             <wp:extent cx="6172200" cy="4117502"/>
@@ -2083,6 +2311,7 @@
       <w:pPr>
         <w:keepLines/>
         <w:spacing w:after="100" w:line="259" w:lineRule="auto"/>
+        <w:jc w:val="both"/>
       </w:pPr>
       <w:r>
         <w:rPr>
@@ -2107,13 +2336,14 @@
       <w:pPr>
         <w:pStyle w:val="Heading1"/>
         <w:keepNext/>
+        <w:jc w:val="both"/>
       </w:pPr>
       <w:r>
         <w:rPr>
           <w:rFonts w:ascii="Times New Roman" w:hAnsi="Times New Roman"/>
           <w:b/>
           <w:color w:val="000000"/>
-          <w:sz w:val="28"/>
+          <w:sz w:val="20"/>
         </w:rPr>
         <w:t>S6. Low-dimensional variation and amplitude controls</w:t>
       </w:r>
@@ -2121,6 +2351,7 @@
     <w:p>
       <w:pPr>
         <w:spacing w:after="100" w:line="259" w:lineRule="auto"/>
+        <w:jc w:val="both"/>
       </w:pPr>
       <w:r>
         <w:rPr>
@@ -2135,6 +2366,7 @@
     <w:p>
       <w:pPr>
         <w:spacing w:after="100" w:line="259" w:lineRule="auto"/>
+        <w:jc w:val="both"/>
       </w:pPr>
       <w:r>
         <w:rPr>
@@ -2149,6 +2381,7 @@
     <w:p>
       <w:pPr>
         <w:spacing w:after="100" w:line="259" w:lineRule="auto"/>
+        <w:jc w:val="both"/>
       </w:pPr>
       <w:r>
         <w:rPr>
@@ -2168,6 +2401,9 @@
         <w:jc w:val="center"/>
       </w:pPr>
       <w:r>
+        <w:rPr>
+          <w:sz w:val="20"/>
+        </w:rPr>
         <w:drawing>
           <wp:inline xmlns:a="http://schemas.openxmlformats.org/drawingml/2006/main" xmlns:pic="http://schemas.openxmlformats.org/drawingml/2006/picture">
             <wp:extent cx="6172200" cy="2792068"/>
@@ -2206,6 +2442,7 @@
       <w:pPr>
         <w:keepLines/>
         <w:spacing w:after="100" w:line="259" w:lineRule="auto"/>
+        <w:jc w:val="both"/>
       </w:pPr>
       <w:r>
         <w:rPr>
@@ -2234,6 +2471,9 @@
         <w:jc w:val="center"/>
       </w:pPr>
       <w:r>
+        <w:rPr>
+          <w:sz w:val="20"/>
+        </w:rPr>
         <w:drawing>
           <wp:inline xmlns:a="http://schemas.openxmlformats.org/drawingml/2006/main" xmlns:pic="http://schemas.openxmlformats.org/drawingml/2006/picture">
             <wp:extent cx="6172200" cy="2734060"/>
@@ -2272,6 +2512,7 @@
       <w:pPr>
         <w:keepLines/>
         <w:spacing w:after="100" w:line="259" w:lineRule="auto"/>
+        <w:jc w:val="both"/>
       </w:pPr>
       <w:r>
         <w:rPr>
@@ -2300,6 +2541,9 @@
         <w:jc w:val="center"/>
       </w:pPr>
       <w:r>
+        <w:rPr>
+          <w:sz w:val="20"/>
+        </w:rPr>
         <w:drawing>
           <wp:inline xmlns:a="http://schemas.openxmlformats.org/drawingml/2006/main" xmlns:pic="http://schemas.openxmlformats.org/drawingml/2006/picture">
             <wp:extent cx="6172200" cy="2824189"/>
@@ -2338,6 +2582,7 @@
       <w:pPr>
         <w:keepLines/>
         <w:spacing w:after="100" w:line="259" w:lineRule="auto"/>
+        <w:jc w:val="both"/>
       </w:pPr>
       <w:r>
         <w:rPr>
@@ -2362,13 +2607,14 @@
       <w:pPr>
         <w:pStyle w:val="Heading1"/>
         <w:keepNext/>
+        <w:jc w:val="both"/>
       </w:pPr>
       <w:r>
         <w:rPr>
           <w:rFonts w:ascii="Times New Roman" w:hAnsi="Times New Roman"/>
           <w:b/>
           <w:color w:val="000000"/>
-          <w:sz w:val="28"/>
+          <w:sz w:val="20"/>
         </w:rPr>
         <w:t>S7. Cross-model forward-parity and readout controls</w:t>
       </w:r>
@@ -2376,6 +2622,7 @@
     <w:p>
       <w:pPr>
         <w:spacing w:after="100" w:line="259" w:lineRule="auto"/>
+        <w:jc w:val="both"/>
       </w:pPr>
       <w:r>
         <w:rPr>
@@ -2390,6 +2637,7 @@
     <w:p>
       <w:pPr>
         <w:spacing w:after="100" w:line="259" w:lineRule="auto"/>
+        <w:jc w:val="both"/>
       </w:pPr>
       <w:r>
         <w:rPr>
@@ -2405,13 +2653,14 @@
       <w:pPr>
         <w:pStyle w:val="Heading1"/>
         <w:keepNext/>
+        <w:jc w:val="both"/>
       </w:pPr>
       <w:r>
         <w:rPr>
           <w:rFonts w:ascii="Times New Roman" w:hAnsi="Times New Roman"/>
           <w:b/>
           <w:color w:val="000000"/>
-          <w:sz w:val="28"/>
+          <w:sz w:val="20"/>
         </w:rPr>
         <w:t>S8. Compression boundary: exact collapse does not imply competitive compression</w:t>
       </w:r>
@@ -2419,6 +2668,7 @@
     <w:p>
       <w:pPr>
         <w:spacing w:after="100" w:line="259" w:lineRule="auto"/>
+        <w:jc w:val="both"/>
       </w:pPr>
       <w:r>
         <w:rPr>
@@ -2433,6 +2683,7 @@
     <w:p>
       <w:pPr>
         <w:spacing w:after="100" w:line="259" w:lineRule="auto"/>
+        <w:jc w:val="both"/>
       </w:pPr>
       <w:r>
         <w:rPr>
@@ -2522,6 +2773,7 @@
     <w:p>
       <w:pPr>
         <w:spacing w:after="100" w:line="259" w:lineRule="auto"/>
+        <w:jc w:val="both"/>
       </w:pPr>
       <w:r>
         <w:rPr>
@@ -2536,6 +2788,7 @@
     <w:p>
       <w:pPr>
         <w:spacing w:after="100" w:line="259" w:lineRule="auto"/>
+        <w:jc w:val="both"/>
       </w:pPr>
       <w:r>
         <w:rPr>
@@ -2550,6 +2803,7 @@
     <w:p>
       <w:pPr>
         <w:spacing w:after="100" w:line="259" w:lineRule="auto"/>
+        <w:jc w:val="both"/>
       </w:pPr>
       <w:r>
         <w:rPr>
@@ -2569,6 +2823,9 @@
         <w:jc w:val="center"/>
       </w:pPr>
       <w:r>
+        <w:rPr>
+          <w:sz w:val="20"/>
+        </w:rPr>
         <w:drawing>
           <wp:inline xmlns:a="http://schemas.openxmlformats.org/drawingml/2006/main" xmlns:pic="http://schemas.openxmlformats.org/drawingml/2006/picture">
             <wp:extent cx="6172200" cy="2937183"/>
@@ -2607,6 +2864,7 @@
       <w:pPr>
         <w:keepLines/>
         <w:spacing w:after="100" w:line="259" w:lineRule="auto"/>
+        <w:jc w:val="both"/>
       </w:pPr>
       <w:r>
         <w:rPr>
@@ -2635,6 +2893,9 @@
         <w:jc w:val="center"/>
       </w:pPr>
       <w:r>
+        <w:rPr>
+          <w:sz w:val="20"/>
+        </w:rPr>
         <w:drawing>
           <wp:inline xmlns:a="http://schemas.openxmlformats.org/drawingml/2006/main" xmlns:pic="http://schemas.openxmlformats.org/drawingml/2006/picture">
             <wp:extent cx="6172200" cy="4642847"/>
@@ -2673,6 +2934,7 @@
       <w:pPr>
         <w:keepLines/>
         <w:spacing w:after="100" w:line="259" w:lineRule="auto"/>
+        <w:jc w:val="both"/>
       </w:pPr>
       <w:r>
         <w:rPr>
@@ -2701,6 +2963,9 @@
         <w:jc w:val="center"/>
       </w:pPr>
       <w:r>
+        <w:rPr>
+          <w:sz w:val="20"/>
+        </w:rPr>
         <w:drawing>
           <wp:inline xmlns:a="http://schemas.openxmlformats.org/drawingml/2006/main" xmlns:pic="http://schemas.openxmlformats.org/drawingml/2006/picture">
             <wp:extent cx="6172200" cy="2960086"/>
@@ -2739,6 +3004,7 @@
       <w:pPr>
         <w:keepLines/>
         <w:spacing w:after="100" w:line="259" w:lineRule="auto"/>
+        <w:jc w:val="both"/>
       </w:pPr>
       <w:r>
         <w:rPr>
@@ -2763,13 +3029,14 @@
       <w:pPr>
         <w:pStyle w:val="Heading1"/>
         <w:keepNext/>
+        <w:jc w:val="both"/>
       </w:pPr>
       <w:r>
         <w:rPr>
           <w:rFonts w:ascii="Times New Roman" w:hAnsi="Times New Roman"/>
           <w:b/>
           <w:color w:val="000000"/>
-          <w:sz w:val="28"/>
+          <w:sz w:val="20"/>
         </w:rPr>
         <w:t>S9. Synthetic carrier banks at matched token budgets</w:t>
       </w:r>
@@ -2777,6 +3044,7 @@
     <w:p>
       <w:pPr>
         <w:spacing w:after="100" w:line="259" w:lineRule="auto"/>
+        <w:jc w:val="both"/>
       </w:pPr>
       <w:r>
         <w:rPr>
@@ -2863,6 +3131,7 @@
     <w:p>
       <w:pPr>
         <w:spacing w:after="100" w:line="259" w:lineRule="auto"/>
+        <w:jc w:val="both"/>
       </w:pPr>
       <w:r>
         <w:rPr>
@@ -2911,6 +3180,7 @@
     <w:p>
       <w:pPr>
         <w:spacing w:after="100" w:line="259" w:lineRule="auto"/>
+        <w:jc w:val="both"/>
       </w:pPr>
       <w:r>
         <w:rPr>
@@ -2948,6 +3218,9 @@
         <w:jc w:val="center"/>
       </w:pPr>
       <w:r>
+        <w:rPr>
+          <w:sz w:val="20"/>
+        </w:rPr>
         <w:drawing>
           <wp:inline xmlns:a="http://schemas.openxmlformats.org/drawingml/2006/main" xmlns:pic="http://schemas.openxmlformats.org/drawingml/2006/picture">
             <wp:extent cx="6172200" cy="4611301"/>
@@ -2986,6 +3259,7 @@
       <w:pPr>
         <w:keepLines/>
         <w:spacing w:after="100" w:line="259" w:lineRule="auto"/>
+        <w:jc w:val="both"/>
       </w:pPr>
       <w:r>
         <w:rPr>
@@ -3010,13 +3284,14 @@
       <w:pPr>
         <w:pStyle w:val="Heading1"/>
         <w:keepNext/>
+        <w:jc w:val="both"/>
       </w:pPr>
       <w:r>
         <w:rPr>
           <w:rFonts w:ascii="Times New Roman" w:hAnsi="Times New Roman"/>
           <w:b/>
           <w:color w:val="000000"/>
-          <w:sz w:val="28"/>
+          <w:sz w:val="20"/>
         </w:rPr>
         <w:t>S10. Statistical and reproducibility notes</w:t>
       </w:r>
@@ -3024,6 +3299,7 @@
     <w:p>
       <w:pPr>
         <w:spacing w:after="100" w:line="259" w:lineRule="auto"/>
+        <w:jc w:val="both"/>
       </w:pPr>
       <w:r>
         <w:rPr>
@@ -3038,6 +3314,7 @@
     <w:p>
       <w:pPr>
         <w:spacing w:after="100" w:line="259" w:lineRule="auto"/>
+        <w:jc w:val="both"/>
       </w:pPr>
       <w:r>
         <w:rPr>
@@ -3154,6 +3431,7 @@
     <w:p>
       <w:pPr>
         <w:spacing w:after="100" w:line="259" w:lineRule="auto"/>
+        <w:jc w:val="both"/>
       </w:pPr>
       <w:r>
         <w:rPr>
@@ -3170,6 +3448,7 @@
         <w:keepNext/>
         <w:keepLines/>
         <w:spacing w:after="100" w:line="259" w:lineRule="auto"/>
+        <w:jc w:val="both"/>
       </w:pPr>
       <w:r>
         <w:rPr>
@@ -3223,13 +3502,17 @@
               <w:spacing w:after="0" w:line="240" w:lineRule="auto"/>
               <w:jc w:val="center"/>
             </w:pPr>
-            <w:r/>
+            <w:r>
+              <w:rPr>
+                <w:sz w:val="20"/>
+              </w:rPr>
+            </w:r>
             <w:r>
               <w:rPr>
                 <w:rFonts w:ascii="Times New Roman" w:hAnsi="Times New Roman"/>
                 <w:b/>
                 <w:color w:val="17232D"/>
-                <w:sz w:val="16"/>
+                <w:sz w:val="20"/>
               </w:rPr>
               <w:t>Analysis</w:t>
             </w:r>
@@ -3252,13 +3535,17 @@
               <w:spacing w:after="0" w:line="240" w:lineRule="auto"/>
               <w:jc w:val="center"/>
             </w:pPr>
-            <w:r/>
+            <w:r>
+              <w:rPr>
+                <w:sz w:val="20"/>
+              </w:rPr>
+            </w:r>
             <w:r>
               <w:rPr>
                 <w:rFonts w:ascii="Times New Roman" w:hAnsi="Times New Roman"/>
                 <w:b/>
                 <w:color w:val="17232D"/>
-                <w:sz w:val="16"/>
+                <w:sz w:val="20"/>
               </w:rPr>
               <w:t>Split and mask seeds</w:t>
             </w:r>
@@ -3281,13 +3568,17 @@
               <w:spacing w:after="0" w:line="240" w:lineRule="auto"/>
               <w:jc w:val="center"/>
             </w:pPr>
-            <w:r/>
+            <w:r>
+              <w:rPr>
+                <w:sz w:val="20"/>
+              </w:rPr>
+            </w:r>
             <w:r>
               <w:rPr>
                 <w:rFonts w:ascii="Times New Roman" w:hAnsi="Times New Roman"/>
                 <w:b/>
                 <w:color w:val="17232D"/>
-                <w:sz w:val="16"/>
+                <w:sz w:val="20"/>
               </w:rPr>
               <w:t>Stochastic seeds and aggregation</w:t>
             </w:r>
@@ -3310,13 +3601,17 @@
             <w:pPr>
               <w:spacing w:after="0" w:line="240" w:lineRule="auto"/>
             </w:pPr>
-            <w:r/>
+            <w:r>
+              <w:rPr>
+                <w:sz w:val="20"/>
+              </w:rPr>
+            </w:r>
             <w:r>
               <w:rPr>
                 <w:rFonts w:ascii="Times New Roman" w:hAnsi="Times New Roman"/>
                 <w:b w:val="0"/>
                 <w:color w:val="202A32"/>
-                <w:sz w:val="16"/>
+                <w:sz w:val="20"/>
               </w:rPr>
               <w:t>Figure 2: DeiT-Tiny/Small depth sweep</w:t>
             </w:r>
@@ -3338,13 +3633,17 @@
               <w:spacing w:after="0" w:line="240" w:lineRule="auto"/>
               <w:jc w:val="center"/>
             </w:pPr>
-            <w:r/>
+            <w:r>
+              <w:rPr>
+                <w:sz w:val="20"/>
+              </w:rPr>
+            </w:r>
             <w:r>
               <w:rPr>
                 <w:rFonts w:ascii="Times New Roman" w:hAnsi="Times New Roman"/>
                 <w:b w:val="0"/>
                 <w:color w:val="202A32"/>
-                <w:sz w:val="16"/>
+                <w:sz w:val="20"/>
               </w:rPr>
               <w:t>Calibration 9101; evaluation 9201; spatial mask 9301</w:t>
             </w:r>
@@ -3366,13 +3665,17 @@
               <w:spacing w:after="0" w:line="240" w:lineRule="auto"/>
               <w:jc w:val="center"/>
             </w:pPr>
-            <w:r/>
+            <w:r>
+              <w:rPr>
+                <w:sz w:val="20"/>
+              </w:rPr>
+            </w:r>
             <w:r>
               <w:rPr>
                 <w:rFonts w:ascii="Times New Roman" w:hAnsi="Times New Roman"/>
                 <w:b w:val="0"/>
                 <w:color w:val="202A32"/>
-                <w:sz w:val="16"/>
+                <w:sz w:val="20"/>
               </w:rPr>
               <w:t>Gaussian seeds 9401–9405; mean and sample SD across five seeds.</w:t>
             </w:r>
@@ -3395,13 +3698,17 @@
             <w:pPr>
               <w:spacing w:after="0" w:line="240" w:lineRule="auto"/>
             </w:pPr>
-            <w:r/>
+            <w:r>
+              <w:rPr>
+                <w:sz w:val="20"/>
+              </w:rPr>
+            </w:r>
             <w:r>
               <w:rPr>
                 <w:rFonts w:ascii="Times New Roman" w:hAnsi="Times New Roman"/>
                 <w:b w:val="0"/>
                 <w:color w:val="202A32"/>
-                <w:sz w:val="16"/>
+                <w:sz w:val="20"/>
               </w:rPr>
               <w:t>Figure 2: ViT-B/16 AugReg and DINOv2 depth sweep</w:t>
             </w:r>
@@ -3423,13 +3730,17 @@
               <w:spacing w:after="0" w:line="240" w:lineRule="auto"/>
               <w:jc w:val="center"/>
             </w:pPr>
-            <w:r/>
+            <w:r>
+              <w:rPr>
+                <w:sz w:val="20"/>
+              </w:rPr>
+            </w:r>
             <w:r>
               <w:rPr>
                 <w:rFonts w:ascii="Times New Roman" w:hAnsi="Times New Roman"/>
                 <w:b w:val="0"/>
                 <w:color w:val="202A32"/>
-                <w:sz w:val="16"/>
+                <w:sz w:val="20"/>
               </w:rPr>
               <w:t>Calibration 9101; evaluation 9201; spatial mask 21001</w:t>
             </w:r>
@@ -3451,13 +3762,17 @@
               <w:spacing w:after="0" w:line="240" w:lineRule="auto"/>
               <w:jc w:val="center"/>
             </w:pPr>
-            <w:r/>
+            <w:r>
+              <w:rPr>
+                <w:sz w:val="20"/>
+              </w:rPr>
+            </w:r>
             <w:r>
               <w:rPr>
                 <w:rFonts w:ascii="Times New Roman" w:hAnsi="Times New Roman"/>
                 <w:b w:val="0"/>
                 <w:color w:val="202A32"/>
-                <w:sz w:val="16"/>
+                <w:sz w:val="20"/>
               </w:rPr>
               <w:t>Gaussian seeds 22001–22003; mean and sample SD across three seeds. The post hoc depth-6 follow-up uses the same split and intervention seeds.</w:t>
             </w:r>
@@ -3480,13 +3795,17 @@
             <w:pPr>
               <w:spacing w:after="0" w:line="240" w:lineRule="auto"/>
             </w:pPr>
-            <w:r/>
+            <w:r>
+              <w:rPr>
+                <w:sz w:val="20"/>
+              </w:rPr>
+            </w:r>
             <w:r>
               <w:rPr>
                 <w:rFonts w:ascii="Times New Roman" w:hAnsi="Times New Roman"/>
                 <w:b w:val="0"/>
                 <w:color w:val="202A32"/>
-                <w:sz w:val="16"/>
+                <w:sz w:val="20"/>
               </w:rPr>
               <w:t>Figure 3(a): DeiT geometry controls</w:t>
             </w:r>
@@ -3508,13 +3827,17 @@
               <w:spacing w:after="0" w:line="240" w:lineRule="auto"/>
               <w:jc w:val="center"/>
             </w:pPr>
-            <w:r/>
+            <w:r>
+              <w:rPr>
+                <w:sz w:val="20"/>
+              </w:rPr>
+            </w:r>
             <w:r>
               <w:rPr>
                 <w:rFonts w:ascii="Times New Roman" w:hAnsi="Times New Roman"/>
                 <w:b w:val="0"/>
                 <w:color w:val="202A32"/>
-                <w:sz w:val="16"/>
+                <w:sz w:val="20"/>
               </w:rPr>
               <w:t>Calibration 9101; evaluation 9201; mask 9601</w:t>
             </w:r>
@@ -3536,13 +3859,17 @@
               <w:spacing w:after="0" w:line="240" w:lineRule="auto"/>
               <w:jc w:val="center"/>
             </w:pPr>
-            <w:r/>
+            <w:r>
+              <w:rPr>
+                <w:sz w:val="20"/>
+              </w:rPr>
+            </w:r>
             <w:r>
               <w:rPr>
                 <w:rFonts w:ascii="Times New Roman" w:hAnsi="Times New Roman"/>
                 <w:b w:val="0"/>
                 <w:color w:val="202A32"/>
-                <w:sz w:val="16"/>
+                <w:sz w:val="20"/>
               </w:rPr>
               <w:t>Coordinate-permutation seeds 9801–9803; centroid and sign-inversion controls are single-run estimates.</w:t>
             </w:r>
@@ -3565,13 +3892,17 @@
             <w:pPr>
               <w:spacing w:after="0" w:line="240" w:lineRule="auto"/>
             </w:pPr>
-            <w:r/>
+            <w:r>
+              <w:rPr>
+                <w:sz w:val="20"/>
+              </w:rPr>
+            </w:r>
             <w:r>
               <w:rPr>
                 <w:rFonts w:ascii="Times New Roman" w:hAnsi="Times New Roman"/>
                 <w:b w:val="0"/>
                 <w:color w:val="202A32"/>
-                <w:sz w:val="16"/>
+                <w:sz w:val="20"/>
               </w:rPr>
               <w:t>Figure 3(a): ViT-B/DINOv2 geometry controls</w:t>
             </w:r>
@@ -3593,13 +3924,17 @@
               <w:spacing w:after="0" w:line="240" w:lineRule="auto"/>
               <w:jc w:val="center"/>
             </w:pPr>
-            <w:r/>
+            <w:r>
+              <w:rPr>
+                <w:sz w:val="20"/>
+              </w:rPr>
+            </w:r>
             <w:r>
               <w:rPr>
                 <w:rFonts w:ascii="Times New Roman" w:hAnsi="Times New Roman"/>
                 <w:b w:val="0"/>
                 <w:color w:val="202A32"/>
-                <w:sz w:val="16"/>
+                <w:sz w:val="20"/>
               </w:rPr>
               <w:t>Calibration 9101; evaluation 9201; mask 21001</w:t>
             </w:r>
@@ -3621,13 +3956,17 @@
               <w:spacing w:after="0" w:line="240" w:lineRule="auto"/>
               <w:jc w:val="center"/>
             </w:pPr>
-            <w:r/>
+            <w:r>
+              <w:rPr>
+                <w:sz w:val="20"/>
+              </w:rPr>
+            </w:r>
             <w:r>
               <w:rPr>
                 <w:rFonts w:ascii="Times New Roman" w:hAnsi="Times New Roman"/>
                 <w:b w:val="0"/>
                 <w:color w:val="202A32"/>
-                <w:sz w:val="16"/>
+                <w:sz w:val="20"/>
               </w:rPr>
               <w:t>Coordinate-permutation seeds 23001–23003; centroid and sign-inversion controls are single-run estimates.</w:t>
             </w:r>
@@ -3650,13 +3989,17 @@
             <w:pPr>
               <w:spacing w:after="0" w:line="240" w:lineRule="auto"/>
             </w:pPr>
-            <w:r/>
+            <w:r>
+              <w:rPr>
+                <w:sz w:val="20"/>
+              </w:rPr>
+            </w:r>
             <w:r>
               <w:rPr>
                 <w:rFonts w:ascii="Times New Roman" w:hAnsi="Times New Roman"/>
                 <w:b w:val="0"/>
                 <w:color w:val="202A32"/>
-                <w:sz w:val="16"/>
+                <w:sz w:val="20"/>
               </w:rPr>
               <w:t>Figure 3(b): DeiT grouped diversity</w:t>
             </w:r>
@@ -3678,13 +4021,17 @@
               <w:spacing w:after="0" w:line="240" w:lineRule="auto"/>
               <w:jc w:val="center"/>
             </w:pPr>
-            <w:r/>
+            <w:r>
+              <w:rPr>
+                <w:sz w:val="20"/>
+              </w:rPr>
+            </w:r>
             <w:r>
               <w:rPr>
                 <w:rFonts w:ascii="Times New Roman" w:hAnsi="Times New Roman"/>
                 <w:b w:val="0"/>
                 <w:color w:val="202A32"/>
-                <w:sz w:val="16"/>
+                <w:sz w:val="20"/>
               </w:rPr>
               <w:t>Calibration 9101; evaluation 9201</w:t>
             </w:r>
@@ -3706,13 +4053,17 @@
               <w:spacing w:after="0" w:line="240" w:lineRule="auto"/>
               <w:jc w:val="center"/>
             </w:pPr>
-            <w:r/>
+            <w:r>
+              <w:rPr>
+                <w:sz w:val="20"/>
+              </w:rPr>
+            </w:r>
             <w:r>
               <w:rPr>
                 <w:rFonts w:ascii="Times New Roman" w:hAnsi="Times New Roman"/>
                 <w:b w:val="0"/>
                 <w:color w:val="202A32"/>
-                <w:sz w:val="16"/>
+                <w:sz w:val="20"/>
               </w:rPr>
               <w:t>Grouped-Gaussian seeds 15001–15003; means and sample SDs are across seeds.</w:t>
             </w:r>
@@ -3735,13 +4086,17 @@
             <w:pPr>
               <w:spacing w:after="0" w:line="240" w:lineRule="auto"/>
             </w:pPr>
-            <w:r/>
+            <w:r>
+              <w:rPr>
+                <w:sz w:val="20"/>
+              </w:rPr>
+            </w:r>
             <w:r>
               <w:rPr>
                 <w:rFonts w:ascii="Times New Roman" w:hAnsi="Times New Roman"/>
                 <w:b w:val="0"/>
                 <w:color w:val="202A32"/>
-                <w:sz w:val="16"/>
+                <w:sz w:val="20"/>
               </w:rPr>
               <w:t>Figure 3(b) and Figure S10: ViT-B/DINOv2 grouped diversity</w:t>
             </w:r>
@@ -3763,13 +4118,17 @@
               <w:spacing w:after="0" w:line="240" w:lineRule="auto"/>
               <w:jc w:val="center"/>
             </w:pPr>
-            <w:r/>
+            <w:r>
+              <w:rPr>
+                <w:sz w:val="20"/>
+              </w:rPr>
+            </w:r>
             <w:r>
               <w:rPr>
                 <w:rFonts w:ascii="Times New Roman" w:hAnsi="Times New Roman"/>
                 <w:b w:val="0"/>
                 <w:color w:val="202A32"/>
-                <w:sz w:val="16"/>
+                <w:sz w:val="20"/>
               </w:rPr>
               <w:t>Calibration 9101; evaluation 9201</w:t>
             </w:r>
@@ -3791,13 +4150,17 @@
               <w:spacing w:after="0" w:line="240" w:lineRule="auto"/>
               <w:jc w:val="center"/>
             </w:pPr>
-            <w:r/>
+            <w:r>
+              <w:rPr>
+                <w:sz w:val="20"/>
+              </w:rPr>
+            </w:r>
             <w:r>
               <w:rPr>
                 <w:rFonts w:ascii="Times New Roman" w:hAnsi="Times New Roman"/>
                 <w:b w:val="0"/>
                 <w:color w:val="202A32"/>
-                <w:sz w:val="16"/>
+                <w:sz w:val="20"/>
               </w:rPr>
               <w:t>Grouped-Gaussian seeds 26001–26005; means and sample SDs are across seeds; paired tests use per-image means across seeds.</w:t>
             </w:r>
@@ -3820,13 +4183,17 @@
             <w:pPr>
               <w:spacing w:after="0" w:line="240" w:lineRule="auto"/>
             </w:pPr>
-            <w:r/>
+            <w:r>
+              <w:rPr>
+                <w:sz w:val="20"/>
+              </w:rPr>
+            </w:r>
             <w:r>
               <w:rPr>
                 <w:rFonts w:ascii="Times New Roman" w:hAnsi="Times New Roman"/>
                 <w:b w:val="0"/>
                 <w:color w:val="202A32"/>
-                <w:sz w:val="16"/>
+                <w:sz w:val="20"/>
               </w:rPr>
               <w:t>Figure 3(c), Section 4.2: PCA-aligned versus random directions</w:t>
             </w:r>
@@ -3848,13 +4215,17 @@
               <w:spacing w:after="0" w:line="240" w:lineRule="auto"/>
               <w:jc w:val="center"/>
             </w:pPr>
-            <w:r/>
+            <w:r>
+              <w:rPr>
+                <w:sz w:val="20"/>
+              </w:rPr>
+            </w:r>
             <w:r>
               <w:rPr>
                 <w:rFonts w:ascii="Times New Roman" w:hAnsi="Times New Roman"/>
                 <w:b w:val="0"/>
                 <w:color w:val="202A32"/>
-                <w:sz w:val="16"/>
+                <w:sz w:val="20"/>
               </w:rPr>
               <w:t>Calibration 9101; evaluation 9201</w:t>
             </w:r>
@@ -3876,13 +4247,17 @@
               <w:spacing w:after="0" w:line="240" w:lineRule="auto"/>
               <w:jc w:val="center"/>
             </w:pPr>
-            <w:r/>
+            <w:r>
+              <w:rPr>
+                <w:sz w:val="20"/>
+              </w:rPr>
+            </w:r>
             <w:r>
               <w:rPr>
                 <w:rFonts w:ascii="Times New Roman" w:hAnsi="Times New Roman"/>
                 <w:b w:val="0"/>
                 <w:color w:val="202A32"/>
-                <w:sz w:val="16"/>
+                <w:sz w:val="20"/>
               </w:rPr>
               <w:t>DeiT natural-PC1 identity seeds 17001–17005 and matched-random-direction seeds 18001–18005; ViT-B/DINOv2 use seeds 25001–25003.</w:t>
             </w:r>
@@ -3905,13 +4280,17 @@
             <w:pPr>
               <w:spacing w:after="0" w:line="240" w:lineRule="auto"/>
             </w:pPr>
-            <w:r/>
+            <w:r>
+              <w:rPr>
+                <w:sz w:val="20"/>
+              </w:rPr>
+            </w:r>
             <w:r>
               <w:rPr>
                 <w:rFonts w:ascii="Times New Roman" w:hAnsi="Times New Roman"/>
                 <w:b w:val="0"/>
                 <w:color w:val="202A32"/>
-                <w:sz w:val="16"/>
+                <w:sz w:val="20"/>
               </w:rPr>
               <w:t>Supplementary dense-fraction sweep</w:t>
             </w:r>
@@ -3933,13 +4312,17 @@
               <w:spacing w:after="0" w:line="240" w:lineRule="auto"/>
               <w:jc w:val="center"/>
             </w:pPr>
-            <w:r/>
+            <w:r>
+              <w:rPr>
+                <w:sz w:val="20"/>
+              </w:rPr>
+            </w:r>
             <w:r>
               <w:rPr>
                 <w:rFonts w:ascii="Times New Roman" w:hAnsi="Times New Roman"/>
                 <w:b w:val="0"/>
                 <w:color w:val="202A32"/>
-                <w:sz w:val="16"/>
+                <w:sz w:val="20"/>
               </w:rPr>
               <w:t>Calibration 9101; evaluation 9201; spatial masks 31001–31005</w:t>
             </w:r>
@@ -3961,13 +4344,17 @@
               <w:spacing w:after="0" w:line="240" w:lineRule="auto"/>
               <w:jc w:val="center"/>
             </w:pPr>
-            <w:r/>
+            <w:r>
+              <w:rPr>
+                <w:sz w:val="20"/>
+              </w:rPr>
+            </w:r>
             <w:r>
               <w:rPr>
                 <w:rFonts w:ascii="Times New Roman" w:hAnsi="Times New Roman"/>
                 <w:b w:val="0"/>
                 <w:color w:val="202A32"/>
-                <w:sz w:val="16"/>
+                <w:sz w:val="20"/>
               </w:rPr>
               <w:t>Gaussian seeds 32001–32003; average within each mask first, then summarize across five masks.</w:t>
             </w:r>
@@ -3990,13 +4377,17 @@
             <w:pPr>
               <w:spacing w:after="0" w:line="240" w:lineRule="auto"/>
             </w:pPr>
-            <w:r/>
+            <w:r>
+              <w:rPr>
+                <w:sz w:val="20"/>
+              </w:rPr>
+            </w:r>
             <w:r>
               <w:rPr>
                 <w:rFonts w:ascii="Times New Roman" w:hAnsi="Times New Roman"/>
                 <w:b w:val="0"/>
                 <w:color w:val="202A32"/>
-                <w:sz w:val="16"/>
+                <w:sz w:val="20"/>
               </w:rPr>
               <w:t>Strict confirmatory compression</w:t>
             </w:r>
@@ -4018,13 +4409,17 @@
               <w:spacing w:after="0" w:line="240" w:lineRule="auto"/>
               <w:jc w:val="center"/>
             </w:pPr>
-            <w:r/>
+            <w:r>
+              <w:rPr>
+                <w:sz w:val="20"/>
+              </w:rPr>
+            </w:r>
             <w:r>
               <w:rPr>
                 <w:rFonts w:ascii="Times New Roman" w:hAnsi="Times New Roman"/>
                 <w:b w:val="0"/>
                 <w:color w:val="202A32"/>
-                <w:sz w:val="16"/>
+                <w:sz w:val="20"/>
               </w:rPr>
               <w:t>Calibration 9101; evaluation 9201</w:t>
             </w:r>
@@ -4046,13 +4441,17 @@
               <w:spacing w:after="0" w:line="240" w:lineRule="auto"/>
               <w:jc w:val="center"/>
             </w:pPr>
-            <w:r/>
+            <w:r>
+              <w:rPr>
+                <w:sz w:val="20"/>
+              </w:rPr>
+            </w:r>
             <w:r>
               <w:rPr>
                 <w:rFonts w:ascii="Times New Roman" w:hAnsi="Times New Roman"/>
                 <w:b w:val="0"/>
                 <w:color w:val="202A32"/>
-                <w:sz w:val="16"/>
+                <w:sz w:val="20"/>
               </w:rPr>
               <w:t>Random-pruning and random-grouping seeds 31001–31005; paired method comparisons use the shared held-out image cohort.</w:t>
             </w:r>
@@ -4075,13 +4474,17 @@
             <w:pPr>
               <w:spacing w:after="0" w:line="240" w:lineRule="auto"/>
             </w:pPr>
-            <w:r/>
+            <w:r>
+              <w:rPr>
+                <w:sz w:val="20"/>
+              </w:rPr>
+            </w:r>
             <w:r>
               <w:rPr>
                 <w:rFonts w:ascii="Times New Roman" w:hAnsi="Times New Roman"/>
                 <w:b w:val="0"/>
                 <w:color w:val="202A32"/>
-                <w:sz w:val="16"/>
+                <w:sz w:val="20"/>
               </w:rPr>
               <w:t>Held-out classifier-carrier evaluation</w:t>
             </w:r>
@@ -4103,13 +4506,17 @@
               <w:spacing w:after="0" w:line="240" w:lineRule="auto"/>
               <w:jc w:val="center"/>
             </w:pPr>
-            <w:r/>
+            <w:r>
+              <w:rPr>
+                <w:sz w:val="20"/>
+              </w:rPr>
+            </w:r>
             <w:r>
               <w:rPr>
                 <w:rFonts w:ascii="Times New Roman" w:hAnsi="Times New Roman"/>
                 <w:b w:val="0"/>
                 <w:color w:val="202A32"/>
-                <w:sz w:val="16"/>
+                <w:sz w:val="20"/>
               </w:rPr>
               <w:t>Calibration 7101 (500 images); evaluation 9201 (1,000 images)</w:t>
             </w:r>
@@ -4131,13 +4538,17 @@
               <w:spacing w:after="0" w:line="240" w:lineRule="auto"/>
               <w:jc w:val="center"/>
             </w:pPr>
-            <w:r/>
+            <w:r>
+              <w:rPr>
+                <w:sz w:val="20"/>
+              </w:rPr>
+            </w:r>
             <w:r>
               <w:rPr>
                 <w:rFonts w:ascii="Times New Roman" w:hAnsi="Times New Roman"/>
                 <w:b w:val="0"/>
                 <w:color w:val="202A32"/>
-                <w:sz w:val="16"/>
+                <w:sz w:val="20"/>
               </w:rPr>
               <w:t>Fixed cohort; no seed-level averaging.</w:t>
             </w:r>
@@ -4154,13 +4565,14 @@
       <w:pPr>
         <w:pStyle w:val="Heading1"/>
         <w:keepNext/>
+        <w:jc w:val="both"/>
       </w:pPr>
       <w:r>
         <w:rPr>
           <w:rFonts w:ascii="Times New Roman" w:hAnsi="Times New Roman"/>
           <w:b/>
           <w:color w:val="000000"/>
-          <w:sz w:val="28"/>
+          <w:sz w:val="20"/>
         </w:rPr>
         <w:t>S11. Cross-architecture mechanistic evidence</w:t>
       </w:r>
@@ -4168,6 +4580,7 @@
     <w:p>
       <w:pPr>
         <w:spacing w:after="100" w:line="259" w:lineRule="auto"/>
+        <w:jc w:val="both"/>
       </w:pPr>
       <w:r>
         <w:rPr>
@@ -4207,6 +4620,7 @@
         <w:keepNext/>
         <w:keepLines/>
         <w:spacing w:after="100" w:line="259" w:lineRule="auto"/>
+        <w:jc w:val="both"/>
       </w:pPr>
       <w:r>
         <w:rPr>
@@ -4377,13 +4791,17 @@
               <w:spacing w:after="0" w:line="240" w:lineRule="auto"/>
               <w:jc w:val="center"/>
             </w:pPr>
-            <w:r/>
+            <w:r>
+              <w:rPr>
+                <w:sz w:val="20"/>
+              </w:rPr>
+            </w:r>
             <w:r>
               <w:rPr>
                 <w:rFonts w:ascii="Times New Roman" w:hAnsi="Times New Roman"/>
                 <w:b/>
                 <w:color w:val="17232D"/>
-                <w:sz w:val="15"/>
+                <w:sz w:val="20"/>
               </w:rPr>
               <w:t>Architecture</w:t>
             </w:r>
@@ -4406,13 +4824,17 @@
               <w:spacing w:after="0" w:line="240" w:lineRule="auto"/>
               <w:jc w:val="center"/>
             </w:pPr>
-            <w:r/>
+            <w:r>
+              <w:rPr>
+                <w:sz w:val="20"/>
+              </w:rPr>
+            </w:r>
             <w:r>
               <w:rPr>
                 <w:rFonts w:ascii="Times New Roman" w:hAnsi="Times New Roman"/>
                 <w:b/>
                 <w:color w:val="17232D"/>
-                <w:sz w:val="15"/>
+                <w:sz w:val="20"/>
               </w:rPr>
               <w:t>D, patches</w:t>
             </w:r>
@@ -4435,13 +4857,17 @@
               <w:spacing w:after="0" w:line="240" w:lineRule="auto"/>
               <w:jc w:val="center"/>
             </w:pPr>
-            <w:r/>
+            <w:r>
+              <w:rPr>
+                <w:sz w:val="20"/>
+              </w:rPr>
+            </w:r>
             <w:r>
               <w:rPr>
                 <w:rFonts w:ascii="Times New Roman" w:hAnsi="Times New Roman"/>
                 <w:b/>
                 <w:color w:val="17232D"/>
-                <w:sz w:val="15"/>
+                <w:sz w:val="20"/>
               </w:rPr>
               <w:t>PC1 / PCbottom sensitivity, depth 8</w:t>
             </w:r>
@@ -4464,13 +4890,17 @@
               <w:spacing w:after="0" w:line="240" w:lineRule="auto"/>
               <w:jc w:val="center"/>
             </w:pPr>
-            <w:r/>
+            <w:r>
+              <w:rPr>
+                <w:sz w:val="20"/>
+              </w:rPr>
+            </w:r>
             <w:r>
               <w:rPr>
                 <w:rFonts w:ascii="Times New Roman" w:hAnsi="Times New Roman"/>
                 <w:b/>
                 <w:color w:val="17232D"/>
-                <w:sz w:val="15"/>
+                <w:sz w:val="20"/>
               </w:rPr>
               <w:t>Relative bottom-PC eigengap, depth 8</w:t>
             </w:r>
@@ -4493,13 +4923,17 @@
               <w:spacing w:after="0" w:line="240" w:lineRule="auto"/>
               <w:jc w:val="center"/>
             </w:pPr>
-            <w:r/>
+            <w:r>
+              <w:rPr>
+                <w:sz w:val="20"/>
+              </w:rPr>
+            </w:r>
             <w:r>
               <w:rPr>
                 <w:rFonts w:ascii="Times New Roman" w:hAnsi="Times New Roman"/>
                 <w:b/>
                 <w:color w:val="17232D"/>
-                <w:sz w:val="15"/>
+                <w:sz w:val="20"/>
               </w:rPr>
               <w:t>Near-null fraction, depth 5 → 10</w:t>
             </w:r>
@@ -4522,13 +4956,17 @@
               <w:spacing w:after="0" w:line="240" w:lineRule="auto"/>
               <w:jc w:val="center"/>
             </w:pPr>
-            <w:r/>
+            <w:r>
+              <w:rPr>
+                <w:sz w:val="20"/>
+              </w:rPr>
+            </w:r>
             <w:r>
               <w:rPr>
                 <w:rFonts w:ascii="Times New Roman" w:hAnsi="Times New Roman"/>
                 <w:b/>
                 <w:color w:val="17232D"/>
-                <w:sz w:val="15"/>
+                <w:sz w:val="20"/>
               </w:rPr>
               <w:t>Effective rank / D, depth 5 → 10</w:t>
             </w:r>
@@ -4551,13 +4989,17 @@
               <w:spacing w:after="0" w:line="240" w:lineRule="auto"/>
               <w:jc w:val="center"/>
             </w:pPr>
-            <w:r/>
+            <w:r>
+              <w:rPr>
+                <w:sz w:val="20"/>
+              </w:rPr>
+            </w:r>
             <w:r>
               <w:rPr>
                 <w:rFonts w:ascii="Times New Roman" w:hAnsi="Times New Roman"/>
                 <w:b/>
                 <w:color w:val="17232D"/>
-                <w:sz w:val="15"/>
+                <w:sz w:val="20"/>
               </w:rPr>
               <w:t>Depth-10 near-null count, 10⁻⁴/10⁻²</w:t>
             </w:r>
@@ -4580,13 +5022,17 @@
             <w:pPr>
               <w:spacing w:after="0" w:line="240" w:lineRule="auto"/>
             </w:pPr>
-            <w:r/>
+            <w:r>
+              <w:rPr>
+                <w:sz w:val="20"/>
+              </w:rPr>
+            </w:r>
             <w:r>
               <w:rPr>
                 <w:rFonts w:ascii="Times New Roman" w:hAnsi="Times New Roman"/>
                 <w:b w:val="0"/>
                 <w:color w:val="202A32"/>
-                <w:sz w:val="15"/>
+                <w:sz w:val="20"/>
               </w:rPr>
               <w:t>DeiT-Tiny</w:t>
             </w:r>
@@ -4608,13 +5054,17 @@
               <w:spacing w:after="0" w:line="240" w:lineRule="auto"/>
               <w:jc w:val="center"/>
             </w:pPr>
-            <w:r/>
+            <w:r>
+              <w:rPr>
+                <w:sz w:val="20"/>
+              </w:rPr>
+            </w:r>
             <w:r>
               <w:rPr>
                 <w:rFonts w:ascii="Times New Roman" w:hAnsi="Times New Roman"/>
                 <w:b w:val="0"/>
                 <w:color w:val="202A32"/>
-                <w:sz w:val="15"/>
+                <w:sz w:val="20"/>
               </w:rPr>
               <w:t>192, 196</w:t>
             </w:r>
@@ -4636,13 +5086,17 @@
               <w:spacing w:after="0" w:line="240" w:lineRule="auto"/>
               <w:jc w:val="center"/>
             </w:pPr>
-            <w:r/>
+            <w:r>
+              <w:rPr>
+                <w:sz w:val="20"/>
+              </w:rPr>
+            </w:r>
             <w:r>
               <w:rPr>
                 <w:rFonts w:ascii="Times New Roman" w:hAnsi="Times New Roman"/>
                 <w:b w:val="0"/>
                 <w:color w:val="202A32"/>
-                <w:sz w:val="15"/>
+                <w:sz w:val="20"/>
               </w:rPr>
               <w:t>0.0891</w:t>
             </w:r>
@@ -4664,13 +5118,17 @@
               <w:spacing w:after="0" w:line="240" w:lineRule="auto"/>
               <w:jc w:val="center"/>
             </w:pPr>
-            <w:r/>
+            <w:r>
+              <w:rPr>
+                <w:sz w:val="20"/>
+              </w:rPr>
+            </w:r>
             <w:r>
               <w:rPr>
                 <w:rFonts w:ascii="Times New Roman" w:hAnsi="Times New Roman"/>
                 <w:b w:val="0"/>
                 <w:color w:val="202A32"/>
-                <w:sz w:val="15"/>
+                <w:sz w:val="20"/>
               </w:rPr>
               <w:t>2.58 × 10⁻³</w:t>
             </w:r>
@@ -4692,13 +5150,17 @@
               <w:spacing w:after="0" w:line="240" w:lineRule="auto"/>
               <w:jc w:val="center"/>
             </w:pPr>
-            <w:r/>
+            <w:r>
+              <w:rPr>
+                <w:sz w:val="20"/>
+              </w:rPr>
+            </w:r>
             <w:r>
               <w:rPr>
                 <w:rFonts w:ascii="Times New Roman" w:hAnsi="Times New Roman"/>
                 <w:b w:val="0"/>
                 <w:color w:val="202A32"/>
-                <w:sz w:val="15"/>
+                <w:sz w:val="20"/>
               </w:rPr>
               <w:t>0.52% → 31.77%</w:t>
             </w:r>
@@ -4720,13 +5182,17 @@
               <w:spacing w:after="0" w:line="240" w:lineRule="auto"/>
               <w:jc w:val="center"/>
             </w:pPr>
-            <w:r/>
+            <w:r>
+              <w:rPr>
+                <w:sz w:val="20"/>
+              </w:rPr>
+            </w:r>
             <w:r>
               <w:rPr>
                 <w:rFonts w:ascii="Times New Roman" w:hAnsi="Times New Roman"/>
                 <w:b w:val="0"/>
                 <w:color w:val="202A32"/>
-                <w:sz w:val="15"/>
+                <w:sz w:val="20"/>
               </w:rPr>
               <w:t>0.541 → 0.125</w:t>
             </w:r>
@@ -4748,13 +5214,17 @@
               <w:spacing w:after="0" w:line="240" w:lineRule="auto"/>
               <w:jc w:val="center"/>
             </w:pPr>
-            <w:r/>
+            <w:r>
+              <w:rPr>
+                <w:sz w:val="20"/>
+              </w:rPr>
+            </w:r>
             <w:r>
               <w:rPr>
                 <w:rFonts w:ascii="Times New Roman" w:hAnsi="Times New Roman"/>
                 <w:b w:val="0"/>
                 <w:color w:val="202A32"/>
-                <w:sz w:val="15"/>
+                <w:sz w:val="20"/>
               </w:rPr>
               <w:t>1 / 154</w:t>
             </w:r>
@@ -4777,13 +5247,17 @@
             <w:pPr>
               <w:spacing w:after="0" w:line="240" w:lineRule="auto"/>
             </w:pPr>
-            <w:r/>
+            <w:r>
+              <w:rPr>
+                <w:sz w:val="20"/>
+              </w:rPr>
+            </w:r>
             <w:r>
               <w:rPr>
                 <w:rFonts w:ascii="Times New Roman" w:hAnsi="Times New Roman"/>
                 <w:b w:val="0"/>
                 <w:color w:val="202A32"/>
-                <w:sz w:val="15"/>
+                <w:sz w:val="20"/>
               </w:rPr>
               <w:t>DeiT-Small</w:t>
             </w:r>
@@ -4805,13 +5279,17 @@
               <w:spacing w:after="0" w:line="240" w:lineRule="auto"/>
               <w:jc w:val="center"/>
             </w:pPr>
-            <w:r/>
+            <w:r>
+              <w:rPr>
+                <w:sz w:val="20"/>
+              </w:rPr>
+            </w:r>
             <w:r>
               <w:rPr>
                 <w:rFonts w:ascii="Times New Roman" w:hAnsi="Times New Roman"/>
                 <w:b w:val="0"/>
                 <w:color w:val="202A32"/>
-                <w:sz w:val="15"/>
+                <w:sz w:val="20"/>
               </w:rPr>
               <w:t>384, 196</w:t>
             </w:r>
@@ -4833,13 +5311,17 @@
               <w:spacing w:after="0" w:line="240" w:lineRule="auto"/>
               <w:jc w:val="center"/>
             </w:pPr>
-            <w:r/>
+            <w:r>
+              <w:rPr>
+                <w:sz w:val="20"/>
+              </w:rPr>
+            </w:r>
             <w:r>
               <w:rPr>
                 <w:rFonts w:ascii="Times New Roman" w:hAnsi="Times New Roman"/>
                 <w:b w:val="0"/>
                 <w:color w:val="202A32"/>
-                <w:sz w:val="15"/>
+                <w:sz w:val="20"/>
               </w:rPr>
               <w:t>0.0409</w:t>
             </w:r>
@@ -4861,13 +5343,17 @@
               <w:spacing w:after="0" w:line="240" w:lineRule="auto"/>
               <w:jc w:val="center"/>
             </w:pPr>
-            <w:r/>
+            <w:r>
+              <w:rPr>
+                <w:sz w:val="20"/>
+              </w:rPr>
+            </w:r>
             <w:r>
               <w:rPr>
                 <w:rFonts w:ascii="Times New Roman" w:hAnsi="Times New Roman"/>
                 <w:b w:val="0"/>
                 <w:color w:val="202A32"/>
-                <w:sz w:val="15"/>
+                <w:sz w:val="20"/>
               </w:rPr>
               <w:t>3.52 × 10⁻⁴</w:t>
             </w:r>
@@ -4889,13 +5375,17 @@
               <w:spacing w:after="0" w:line="240" w:lineRule="auto"/>
               <w:jc w:val="center"/>
             </w:pPr>
-            <w:r/>
+            <w:r>
+              <w:rPr>
+                <w:sz w:val="20"/>
+              </w:rPr>
+            </w:r>
             <w:r>
               <w:rPr>
                 <w:rFonts w:ascii="Times New Roman" w:hAnsi="Times New Roman"/>
                 <w:b w:val="0"/>
                 <w:color w:val="202A32"/>
-                <w:sz w:val="15"/>
+                <w:sz w:val="20"/>
               </w:rPr>
               <w:t>0.26% → 57.03%</w:t>
             </w:r>
@@ -4917,13 +5407,17 @@
               <w:spacing w:after="0" w:line="240" w:lineRule="auto"/>
               <w:jc w:val="center"/>
             </w:pPr>
-            <w:r/>
+            <w:r>
+              <w:rPr>
+                <w:sz w:val="20"/>
+              </w:rPr>
+            </w:r>
             <w:r>
               <w:rPr>
                 <w:rFonts w:ascii="Times New Roman" w:hAnsi="Times New Roman"/>
                 <w:b w:val="0"/>
                 <w:color w:val="202A32"/>
-                <w:sz w:val="15"/>
+                <w:sz w:val="20"/>
               </w:rPr>
               <w:t>0.467 → 0.114</w:t>
             </w:r>
@@ -4945,13 +5439,17 @@
               <w:spacing w:after="0" w:line="240" w:lineRule="auto"/>
               <w:jc w:val="center"/>
             </w:pPr>
-            <w:r/>
+            <w:r>
+              <w:rPr>
+                <w:sz w:val="20"/>
+              </w:rPr>
+            </w:r>
             <w:r>
               <w:rPr>
                 <w:rFonts w:ascii="Times New Roman" w:hAnsi="Times New Roman"/>
                 <w:b w:val="0"/>
                 <w:color w:val="202A32"/>
-                <w:sz w:val="15"/>
+                <w:sz w:val="20"/>
               </w:rPr>
               <w:t>47 / 327</w:t>
             </w:r>
@@ -4974,13 +5472,17 @@
             <w:pPr>
               <w:spacing w:after="0" w:line="240" w:lineRule="auto"/>
             </w:pPr>
-            <w:r/>
+            <w:r>
+              <w:rPr>
+                <w:sz w:val="20"/>
+              </w:rPr>
+            </w:r>
             <w:r>
               <w:rPr>
                 <w:rFonts w:ascii="Times New Roman" w:hAnsi="Times New Roman"/>
                 <w:b w:val="0"/>
                 <w:color w:val="202A32"/>
-                <w:sz w:val="15"/>
+                <w:sz w:val="20"/>
               </w:rPr>
               <w:t>ViT-B/16 AugReg</w:t>
             </w:r>
@@ -5002,13 +5504,17 @@
               <w:spacing w:after="0" w:line="240" w:lineRule="auto"/>
               <w:jc w:val="center"/>
             </w:pPr>
-            <w:r/>
+            <w:r>
+              <w:rPr>
+                <w:sz w:val="20"/>
+              </w:rPr>
+            </w:r>
             <w:r>
               <w:rPr>
                 <w:rFonts w:ascii="Times New Roman" w:hAnsi="Times New Roman"/>
                 <w:b w:val="0"/>
                 <w:color w:val="202A32"/>
-                <w:sz w:val="15"/>
+                <w:sz w:val="20"/>
               </w:rPr>
               <w:t>768, 196</w:t>
             </w:r>
@@ -5030,13 +5536,17 @@
               <w:spacing w:after="0" w:line="240" w:lineRule="auto"/>
               <w:jc w:val="center"/>
             </w:pPr>
-            <w:r/>
+            <w:r>
+              <w:rPr>
+                <w:sz w:val="20"/>
+              </w:rPr>
+            </w:r>
             <w:r>
               <w:rPr>
                 <w:rFonts w:ascii="Times New Roman" w:hAnsi="Times New Roman"/>
                 <w:b w:val="0"/>
                 <w:color w:val="202A32"/>
-                <w:sz w:val="15"/>
+                <w:sz w:val="20"/>
               </w:rPr>
               <w:t>65.2</w:t>
             </w:r>
@@ -5058,13 +5568,17 @@
               <w:spacing w:after="0" w:line="240" w:lineRule="auto"/>
               <w:jc w:val="center"/>
             </w:pPr>
-            <w:r/>
+            <w:r>
+              <w:rPr>
+                <w:sz w:val="20"/>
+              </w:rPr>
+            </w:r>
             <w:r>
               <w:rPr>
                 <w:rFonts w:ascii="Times New Roman" w:hAnsi="Times New Roman"/>
                 <w:b w:val="0"/>
                 <w:color w:val="202A32"/>
-                <w:sz w:val="15"/>
+                <w:sz w:val="20"/>
               </w:rPr>
               <w:t>1.53 × 10⁻⁵</w:t>
             </w:r>
@@ -5086,13 +5600,17 @@
               <w:spacing w:after="0" w:line="240" w:lineRule="auto"/>
               <w:jc w:val="center"/>
             </w:pPr>
-            <w:r/>
+            <w:r>
+              <w:rPr>
+                <w:sz w:val="20"/>
+              </w:rPr>
+            </w:r>
             <w:r>
               <w:rPr>
                 <w:rFonts w:ascii="Times New Roman" w:hAnsi="Times New Roman"/>
                 <w:b w:val="0"/>
                 <w:color w:val="202A32"/>
-                <w:sz w:val="15"/>
+                <w:sz w:val="20"/>
               </w:rPr>
               <w:t>0.26% → 49.61%</w:t>
             </w:r>
@@ -5114,13 +5632,17 @@
               <w:spacing w:after="0" w:line="240" w:lineRule="auto"/>
               <w:jc w:val="center"/>
             </w:pPr>
-            <w:r/>
+            <w:r>
+              <w:rPr>
+                <w:sz w:val="20"/>
+              </w:rPr>
+            </w:r>
             <w:r>
               <w:rPr>
                 <w:rFonts w:ascii="Times New Roman" w:hAnsi="Times New Roman"/>
                 <w:b w:val="0"/>
                 <w:color w:val="202A32"/>
-                <w:sz w:val="15"/>
+                <w:sz w:val="20"/>
               </w:rPr>
               <w:t>0.383 → 0.140</w:t>
             </w:r>
@@ -5142,13 +5664,17 @@
               <w:spacing w:after="0" w:line="240" w:lineRule="auto"/>
               <w:jc w:val="center"/>
             </w:pPr>
-            <w:r/>
+            <w:r>
+              <w:rPr>
+                <w:sz w:val="20"/>
+              </w:rPr>
+            </w:r>
             <w:r>
               <w:rPr>
                 <w:rFonts w:ascii="Times New Roman" w:hAnsi="Times New Roman"/>
                 <w:b w:val="0"/>
                 <w:color w:val="202A32"/>
-                <w:sz w:val="15"/>
+                <w:sz w:val="20"/>
               </w:rPr>
               <w:t>41 / 641</w:t>
             </w:r>
@@ -5171,13 +5697,17 @@
             <w:pPr>
               <w:spacing w:after="0" w:line="240" w:lineRule="auto"/>
             </w:pPr>
-            <w:r/>
+            <w:r>
+              <w:rPr>
+                <w:sz w:val="20"/>
+              </w:rPr>
+            </w:r>
             <w:r>
               <w:rPr>
                 <w:rFonts w:ascii="Times New Roman" w:hAnsi="Times New Roman"/>
                 <w:b w:val="0"/>
                 <w:color w:val="202A32"/>
-                <w:sz w:val="15"/>
+                <w:sz w:val="20"/>
               </w:rPr>
               <w:t>DINOv2 ViT-S/14</w:t>
             </w:r>
@@ -5199,13 +5729,17 @@
               <w:spacing w:after="0" w:line="240" w:lineRule="auto"/>
               <w:jc w:val="center"/>
             </w:pPr>
-            <w:r/>
+            <w:r>
+              <w:rPr>
+                <w:sz w:val="20"/>
+              </w:rPr>
+            </w:r>
             <w:r>
               <w:rPr>
                 <w:rFonts w:ascii="Times New Roman" w:hAnsi="Times New Roman"/>
                 <w:b w:val="0"/>
                 <w:color w:val="202A32"/>
-                <w:sz w:val="15"/>
+                <w:sz w:val="20"/>
               </w:rPr>
               <w:t>384, 256</w:t>
             </w:r>
@@ -5227,13 +5761,17 @@
               <w:spacing w:after="0" w:line="240" w:lineRule="auto"/>
               <w:jc w:val="center"/>
             </w:pPr>
-            <w:r/>
+            <w:r>
+              <w:rPr>
+                <w:sz w:val="20"/>
+              </w:rPr>
+            </w:r>
             <w:r>
               <w:rPr>
                 <w:rFonts w:ascii="Times New Roman" w:hAnsi="Times New Roman"/>
                 <w:b w:val="0"/>
                 <w:color w:val="202A32"/>
-                <w:sz w:val="15"/>
+                <w:sz w:val="20"/>
               </w:rPr>
               <w:t>0.199</w:t>
             </w:r>
@@ -5255,13 +5793,17 @@
               <w:spacing w:after="0" w:line="240" w:lineRule="auto"/>
               <w:jc w:val="center"/>
             </w:pPr>
-            <w:r/>
+            <w:r>
+              <w:rPr>
+                <w:sz w:val="20"/>
+              </w:rPr>
+            </w:r>
             <w:r>
               <w:rPr>
                 <w:rFonts w:ascii="Times New Roman" w:hAnsi="Times New Roman"/>
                 <w:b w:val="0"/>
                 <w:color w:val="202A32"/>
-                <w:sz w:val="15"/>
+                <w:sz w:val="20"/>
               </w:rPr>
               <w:t>9.75 × 10⁻⁴</w:t>
             </w:r>
@@ -5283,13 +5825,17 @@
               <w:spacing w:after="0" w:line="240" w:lineRule="auto"/>
               <w:jc w:val="center"/>
             </w:pPr>
-            <w:r/>
+            <w:r>
+              <w:rPr>
+                <w:sz w:val="20"/>
+              </w:rPr>
+            </w:r>
             <w:r>
               <w:rPr>
                 <w:rFonts w:ascii="Times New Roman" w:hAnsi="Times New Roman"/>
                 <w:b w:val="0"/>
                 <w:color w:val="202A32"/>
-                <w:sz w:val="15"/>
+                <w:sz w:val="20"/>
               </w:rPr>
               <w:t>0.26% → 1.56%</w:t>
             </w:r>
@@ -5311,13 +5857,17 @@
               <w:spacing w:after="0" w:line="240" w:lineRule="auto"/>
               <w:jc w:val="center"/>
             </w:pPr>
-            <w:r/>
+            <w:r>
+              <w:rPr>
+                <w:sz w:val="20"/>
+              </w:rPr>
+            </w:r>
             <w:r>
               <w:rPr>
                 <w:rFonts w:ascii="Times New Roman" w:hAnsi="Times New Roman"/>
                 <w:b w:val="0"/>
                 <w:color w:val="202A32"/>
-                <w:sz w:val="15"/>
+                <w:sz w:val="20"/>
               </w:rPr>
               <w:t>0.453 → 0.323</w:t>
             </w:r>
@@ -5339,13 +5889,17 @@
               <w:spacing w:after="0" w:line="240" w:lineRule="auto"/>
               <w:jc w:val="center"/>
             </w:pPr>
-            <w:r/>
+            <w:r>
+              <w:rPr>
+                <w:sz w:val="20"/>
+              </w:rPr>
+            </w:r>
             <w:r>
               <w:rPr>
                 <w:rFonts w:ascii="Times New Roman" w:hAnsi="Times New Roman"/>
                 <w:b w:val="0"/>
                 <w:color w:val="202A32"/>
-                <w:sz w:val="15"/>
+                <w:sz w:val="20"/>
               </w:rPr>
               <w:t>1 / 249</w:t>
             </w:r>
@@ -5361,6 +5915,7 @@
     <w:p>
       <w:pPr>
         <w:spacing w:after="100" w:line="259" w:lineRule="auto"/>
+        <w:jc w:val="both"/>
       </w:pPr>
       <w:r>
         <w:rPr>
@@ -5602,6 +6157,7 @@
     <w:p>
       <w:pPr>
         <w:spacing w:after="100" w:line="259" w:lineRule="auto"/>
+        <w:jc w:val="both"/>
       </w:pPr>
       <w:r>
         <w:rPr>
@@ -5641,6 +6197,9 @@
         <w:jc w:val="center"/>
       </w:pPr>
       <w:r>
+        <w:rPr>
+          <w:sz w:val="20"/>
+        </w:rPr>
         <w:drawing>
           <wp:inline xmlns:a="http://schemas.openxmlformats.org/drawingml/2006/main" xmlns:pic="http://schemas.openxmlformats.org/drawingml/2006/picture">
             <wp:extent cx="6172200" cy="2281858"/>
@@ -5679,6 +6238,7 @@
       <w:pPr>
         <w:keepLines/>
         <w:spacing w:after="100" w:line="259" w:lineRule="auto"/>
+        <w:jc w:val="both"/>
       </w:pPr>
       <w:r>
         <w:rPr>
@@ -5736,6 +6296,7 @@
     <w:p>
       <w:pPr>
         <w:spacing w:after="100" w:line="259" w:lineRule="auto"/>
+        <w:jc w:val="both"/>
       </w:pPr>
       <w:r>
         <w:rPr>
@@ -5778,6 +6339,7 @@
         <w:keepNext/>
         <w:keepLines/>
         <w:spacing w:after="100" w:line="259" w:lineRule="auto"/>
+        <w:jc w:val="both"/>
       </w:pPr>
       <w:r>
         <w:rPr>
@@ -5855,13 +6417,17 @@
               <w:spacing w:after="0" w:line="240" w:lineRule="auto"/>
               <w:jc w:val="center"/>
             </w:pPr>
-            <w:r/>
+            <w:r>
+              <w:rPr>
+                <w:sz w:val="20"/>
+              </w:rPr>
+            </w:r>
             <w:r>
               <w:rPr>
                 <w:rFonts w:ascii="Times New Roman" w:hAnsi="Times New Roman"/>
                 <w:b/>
                 <w:color w:val="17232D"/>
-                <w:sz w:val="16"/>
+                <w:sz w:val="20"/>
               </w:rPr>
               <w:t>Architecture</w:t>
             </w:r>
@@ -5884,13 +6450,17 @@
               <w:spacing w:after="0" w:line="240" w:lineRule="auto"/>
               <w:jc w:val="center"/>
             </w:pPr>
-            <w:r/>
+            <w:r>
+              <w:rPr>
+                <w:sz w:val="20"/>
+              </w:rPr>
+            </w:r>
             <w:r>
               <w:rPr>
                 <w:rFonts w:ascii="Times New Roman" w:hAnsi="Times New Roman"/>
                 <w:b/>
                 <w:color w:val="17232D"/>
-                <w:sz w:val="16"/>
+                <w:sz w:val="20"/>
               </w:rPr>
               <w:t>Operator</w:t>
             </w:r>
@@ -5913,13 +6483,17 @@
               <w:spacing w:after="0" w:line="240" w:lineRule="auto"/>
               <w:jc w:val="center"/>
             </w:pPr>
-            <w:r/>
+            <w:r>
+              <w:rPr>
+                <w:sz w:val="20"/>
+              </w:rPr>
+            </w:r>
             <w:r>
               <w:rPr>
                 <w:rFonts w:ascii="Times New Roman" w:hAnsi="Times New Roman"/>
                 <w:b/>
                 <w:color w:val="17232D"/>
-                <w:sz w:val="16"/>
+                <w:sz w:val="20"/>
               </w:rPr>
               <w:t>Pearson r (95% CI)</w:t>
             </w:r>
@@ -5942,13 +6516,17 @@
               <w:spacing w:after="0" w:line="240" w:lineRule="auto"/>
               <w:jc w:val="center"/>
             </w:pPr>
-            <w:r/>
+            <w:r>
+              <w:rPr>
+                <w:sz w:val="20"/>
+              </w:rPr>
+            </w:r>
             <w:r>
               <w:rPr>
                 <w:rFonts w:ascii="Times New Roman" w:hAnsi="Times New Roman"/>
                 <w:b/>
                 <w:color w:val="17232D"/>
-                <w:sz w:val="16"/>
+                <w:sz w:val="20"/>
               </w:rPr>
               <w:t>Spearman ρ (95% CI)</w:t>
             </w:r>
@@ -5971,13 +6549,17 @@
             <w:pPr>
               <w:spacing w:after="0" w:line="240" w:lineRule="auto"/>
             </w:pPr>
-            <w:r/>
+            <w:r>
+              <w:rPr>
+                <w:sz w:val="20"/>
+              </w:rPr>
+            </w:r>
             <w:r>
               <w:rPr>
                 <w:rFonts w:ascii="Times New Roman" w:hAnsi="Times New Roman"/>
                 <w:b w:val="0"/>
                 <w:color w:val="202A32"/>
-                <w:sz w:val="16"/>
+                <w:sz w:val="20"/>
               </w:rPr>
               <w:t>DeiT-Tiny</w:t>
             </w:r>
@@ -5999,13 +6581,17 @@
               <w:spacing w:after="0" w:line="240" w:lineRule="auto"/>
               <w:jc w:val="center"/>
             </w:pPr>
-            <w:r/>
+            <w:r>
+              <w:rPr>
+                <w:sz w:val="20"/>
+              </w:rPr>
+            </w:r>
             <w:r>
               <w:rPr>
                 <w:rFonts w:ascii="Times New Roman" w:hAnsi="Times New Roman"/>
                 <w:b w:val="0"/>
                 <w:color w:val="202A32"/>
-                <w:sz w:val="16"/>
+                <w:sz w:val="20"/>
               </w:rPr>
               <w:t>Single-block A₈</w:t>
             </w:r>
@@ -6027,13 +6613,17 @@
               <w:spacing w:after="0" w:line="240" w:lineRule="auto"/>
               <w:jc w:val="center"/>
             </w:pPr>
-            <w:r/>
+            <w:r>
+              <w:rPr>
+                <w:sz w:val="20"/>
+              </w:rPr>
+            </w:r>
             <w:r>
               <w:rPr>
                 <w:rFonts w:ascii="Times New Roman" w:hAnsi="Times New Roman"/>
                 <w:b w:val="0"/>
                 <w:color w:val="202A32"/>
-                <w:sz w:val="16"/>
+                <w:sz w:val="20"/>
               </w:rPr>
               <w:t>0.806 [0.773, 0.843]</w:t>
             </w:r>
@@ -6055,13 +6645,17 @@
               <w:spacing w:after="0" w:line="240" w:lineRule="auto"/>
               <w:jc w:val="center"/>
             </w:pPr>
-            <w:r/>
+            <w:r>
+              <w:rPr>
+                <w:sz w:val="20"/>
+              </w:rPr>
+            </w:r>
             <w:r>
               <w:rPr>
                 <w:rFonts w:ascii="Times New Roman" w:hAnsi="Times New Roman"/>
                 <w:b w:val="0"/>
                 <w:color w:val="202A32"/>
-                <w:sz w:val="16"/>
+                <w:sz w:val="20"/>
               </w:rPr>
               <w:t>0.720 [0.681, 0.757]</w:t>
             </w:r>
@@ -6084,13 +6678,17 @@
             <w:pPr>
               <w:spacing w:after="0" w:line="240" w:lineRule="auto"/>
             </w:pPr>
-            <w:r/>
+            <w:r>
+              <w:rPr>
+                <w:sz w:val="20"/>
+              </w:rPr>
+            </w:r>
             <w:r>
               <w:rPr>
                 <w:rFonts w:ascii="Times New Roman" w:hAnsi="Times New Roman"/>
                 <w:b w:val="0"/>
                 <w:color w:val="202A32"/>
-                <w:sz w:val="16"/>
+                <w:sz w:val="20"/>
               </w:rPr>
               <w:t>DeiT-Tiny</w:t>
             </w:r>
@@ -6112,13 +6710,17 @@
               <w:spacing w:after="0" w:line="240" w:lineRule="auto"/>
               <w:jc w:val="center"/>
             </w:pPr>
-            <w:r/>
+            <w:r>
+              <w:rPr>
+                <w:sz w:val="20"/>
+              </w:rPr>
+            </w:r>
             <w:r>
               <w:rPr>
                 <w:rFonts w:ascii="Times New Roman" w:hAnsi="Times New Roman"/>
                 <w:b w:val="0"/>
                 <w:color w:val="202A32"/>
-                <w:sz w:val="16"/>
+                <w:sz w:val="20"/>
               </w:rPr>
               <w:t>End-to-end J₈→L</w:t>
             </w:r>
@@ -6140,13 +6742,17 @@
               <w:spacing w:after="0" w:line="240" w:lineRule="auto"/>
               <w:jc w:val="center"/>
             </w:pPr>
-            <w:r/>
+            <w:r>
+              <w:rPr>
+                <w:sz w:val="20"/>
+              </w:rPr>
+            </w:r>
             <w:r>
               <w:rPr>
                 <w:rFonts w:ascii="Times New Roman" w:hAnsi="Times New Roman"/>
                 <w:b w:val="0"/>
                 <w:color w:val="202A32"/>
-                <w:sz w:val="16"/>
+                <w:sz w:val="20"/>
               </w:rPr>
               <w:t>0.964 [0.955, 0.974]</w:t>
             </w:r>
@@ -6168,13 +6774,17 @@
               <w:spacing w:after="0" w:line="240" w:lineRule="auto"/>
               <w:jc w:val="center"/>
             </w:pPr>
-            <w:r/>
+            <w:r>
+              <w:rPr>
+                <w:sz w:val="20"/>
+              </w:rPr>
+            </w:r>
             <w:r>
               <w:rPr>
                 <w:rFonts w:ascii="Times New Roman" w:hAnsi="Times New Roman"/>
                 <w:b w:val="0"/>
                 <w:color w:val="202A32"/>
-                <w:sz w:val="16"/>
+                <w:sz w:val="20"/>
               </w:rPr>
               <w:t>0.964 [0.951, 0.973]</w:t>
             </w:r>
@@ -6197,13 +6807,17 @@
             <w:pPr>
               <w:spacing w:after="0" w:line="240" w:lineRule="auto"/>
             </w:pPr>
-            <w:r/>
+            <w:r>
+              <w:rPr>
+                <w:sz w:val="20"/>
+              </w:rPr>
+            </w:r>
             <w:r>
               <w:rPr>
                 <w:rFonts w:ascii="Times New Roman" w:hAnsi="Times New Roman"/>
                 <w:b w:val="0"/>
                 <w:color w:val="202A32"/>
-                <w:sz w:val="16"/>
+                <w:sz w:val="20"/>
               </w:rPr>
               <w:t>DeiT-Small</w:t>
             </w:r>
@@ -6225,13 +6839,17 @@
               <w:spacing w:after="0" w:line="240" w:lineRule="auto"/>
               <w:jc w:val="center"/>
             </w:pPr>
-            <w:r/>
+            <w:r>
+              <w:rPr>
+                <w:sz w:val="20"/>
+              </w:rPr>
+            </w:r>
             <w:r>
               <w:rPr>
                 <w:rFonts w:ascii="Times New Roman" w:hAnsi="Times New Roman"/>
                 <w:b w:val="0"/>
                 <w:color w:val="202A32"/>
-                <w:sz w:val="16"/>
+                <w:sz w:val="20"/>
               </w:rPr>
               <w:t>Single-block A₈</w:t>
             </w:r>
@@ -6253,13 +6871,17 @@
               <w:spacing w:after="0" w:line="240" w:lineRule="auto"/>
               <w:jc w:val="center"/>
             </w:pPr>
-            <w:r/>
+            <w:r>
+              <w:rPr>
+                <w:sz w:val="20"/>
+              </w:rPr>
+            </w:r>
             <w:r>
               <w:rPr>
                 <w:rFonts w:ascii="Times New Roman" w:hAnsi="Times New Roman"/>
                 <w:b w:val="0"/>
                 <w:color w:val="202A32"/>
-                <w:sz w:val="16"/>
+                <w:sz w:val="20"/>
               </w:rPr>
               <w:t>0.753 [0.719, 0.790]</w:t>
             </w:r>
@@ -6281,13 +6903,17 @@
               <w:spacing w:after="0" w:line="240" w:lineRule="auto"/>
               <w:jc w:val="center"/>
             </w:pPr>
-            <w:r/>
+            <w:r>
+              <w:rPr>
+                <w:sz w:val="20"/>
+              </w:rPr>
+            </w:r>
             <w:r>
               <w:rPr>
                 <w:rFonts w:ascii="Times New Roman" w:hAnsi="Times New Roman"/>
                 <w:b w:val="0"/>
                 <w:color w:val="202A32"/>
-                <w:sz w:val="16"/>
+                <w:sz w:val="20"/>
               </w:rPr>
               <w:t>0.735 [0.696, 0.772]</w:t>
             </w:r>
@@ -6310,13 +6936,17 @@
             <w:pPr>
               <w:spacing w:after="0" w:line="240" w:lineRule="auto"/>
             </w:pPr>
-            <w:r/>
+            <w:r>
+              <w:rPr>
+                <w:sz w:val="20"/>
+              </w:rPr>
+            </w:r>
             <w:r>
               <w:rPr>
                 <w:rFonts w:ascii="Times New Roman" w:hAnsi="Times New Roman"/>
                 <w:b w:val="0"/>
                 <w:color w:val="202A32"/>
-                <w:sz w:val="16"/>
+                <w:sz w:val="20"/>
               </w:rPr>
               <w:t>DeiT-Small</w:t>
             </w:r>
@@ -6338,13 +6968,17 @@
               <w:spacing w:after="0" w:line="240" w:lineRule="auto"/>
               <w:jc w:val="center"/>
             </w:pPr>
-            <w:r/>
+            <w:r>
+              <w:rPr>
+                <w:sz w:val="20"/>
+              </w:rPr>
+            </w:r>
             <w:r>
               <w:rPr>
                 <w:rFonts w:ascii="Times New Roman" w:hAnsi="Times New Roman"/>
                 <w:b w:val="0"/>
                 <w:color w:val="202A32"/>
-                <w:sz w:val="16"/>
+                <w:sz w:val="20"/>
               </w:rPr>
               <w:t>End-to-end J₈→L</w:t>
             </w:r>
@@ -6366,13 +7000,17 @@
               <w:spacing w:after="0" w:line="240" w:lineRule="auto"/>
               <w:jc w:val="center"/>
             </w:pPr>
-            <w:r/>
+            <w:r>
+              <w:rPr>
+                <w:sz w:val="20"/>
+              </w:rPr>
+            </w:r>
             <w:r>
               <w:rPr>
                 <w:rFonts w:ascii="Times New Roman" w:hAnsi="Times New Roman"/>
                 <w:b w:val="0"/>
                 <w:color w:val="202A32"/>
-                <w:sz w:val="16"/>
+                <w:sz w:val="20"/>
               </w:rPr>
               <w:t>0.975 [0.966, 0.983]</w:t>
             </w:r>
@@ -6394,13 +7032,17 @@
               <w:spacing w:after="0" w:line="240" w:lineRule="auto"/>
               <w:jc w:val="center"/>
             </w:pPr>
-            <w:r/>
+            <w:r>
+              <w:rPr>
+                <w:sz w:val="20"/>
+              </w:rPr>
+            </w:r>
             <w:r>
               <w:rPr>
                 <w:rFonts w:ascii="Times New Roman" w:hAnsi="Times New Roman"/>
                 <w:b w:val="0"/>
                 <w:color w:val="202A32"/>
-                <w:sz w:val="16"/>
+                <w:sz w:val="20"/>
               </w:rPr>
               <w:t>0.945 [0.932, 0.958]</w:t>
             </w:r>
@@ -6423,13 +7065,17 @@
             <w:pPr>
               <w:spacing w:after="0" w:line="240" w:lineRule="auto"/>
             </w:pPr>
-            <w:r/>
+            <w:r>
+              <w:rPr>
+                <w:sz w:val="20"/>
+              </w:rPr>
+            </w:r>
             <w:r>
               <w:rPr>
                 <w:rFonts w:ascii="Times New Roman" w:hAnsi="Times New Roman"/>
                 <w:b w:val="0"/>
                 <w:color w:val="202A32"/>
-                <w:sz w:val="16"/>
+                <w:sz w:val="20"/>
               </w:rPr>
               <w:t>ViT-B/16 AugReg</w:t>
             </w:r>
@@ -6451,13 +7097,17 @@
               <w:spacing w:after="0" w:line="240" w:lineRule="auto"/>
               <w:jc w:val="center"/>
             </w:pPr>
-            <w:r/>
+            <w:r>
+              <w:rPr>
+                <w:sz w:val="20"/>
+              </w:rPr>
+            </w:r>
             <w:r>
               <w:rPr>
                 <w:rFonts w:ascii="Times New Roman" w:hAnsi="Times New Roman"/>
                 <w:b w:val="0"/>
                 <w:color w:val="202A32"/>
-                <w:sz w:val="16"/>
+                <w:sz w:val="20"/>
               </w:rPr>
               <w:t>Single-block A₈</w:t>
             </w:r>
@@ -6479,13 +7129,17 @@
               <w:spacing w:after="0" w:line="240" w:lineRule="auto"/>
               <w:jc w:val="center"/>
             </w:pPr>
-            <w:r/>
+            <w:r>
+              <w:rPr>
+                <w:sz w:val="20"/>
+              </w:rPr>
+            </w:r>
             <w:r>
               <w:rPr>
                 <w:rFonts w:ascii="Times New Roman" w:hAnsi="Times New Roman"/>
                 <w:b w:val="0"/>
                 <w:color w:val="202A32"/>
-                <w:sz w:val="16"/>
+                <w:sz w:val="20"/>
               </w:rPr>
               <w:t>0.757 [0.728, 0.786]</w:t>
             </w:r>
@@ -6507,13 +7161,17 @@
               <w:spacing w:after="0" w:line="240" w:lineRule="auto"/>
               <w:jc w:val="center"/>
             </w:pPr>
-            <w:r/>
+            <w:r>
+              <w:rPr>
+                <w:sz w:val="20"/>
+              </w:rPr>
+            </w:r>
             <w:r>
               <w:rPr>
                 <w:rFonts w:ascii="Times New Roman" w:hAnsi="Times New Roman"/>
                 <w:b w:val="0"/>
                 <w:color w:val="202A32"/>
-                <w:sz w:val="16"/>
+                <w:sz w:val="20"/>
               </w:rPr>
               <w:t>0.725 [0.684, 0.766]</w:t>
             </w:r>
@@ -6536,13 +7194,17 @@
             <w:pPr>
               <w:spacing w:after="0" w:line="240" w:lineRule="auto"/>
             </w:pPr>
-            <w:r/>
+            <w:r>
+              <w:rPr>
+                <w:sz w:val="20"/>
+              </w:rPr>
+            </w:r>
             <w:r>
               <w:rPr>
                 <w:rFonts w:ascii="Times New Roman" w:hAnsi="Times New Roman"/>
                 <w:b w:val="0"/>
                 <w:color w:val="202A32"/>
-                <w:sz w:val="16"/>
+                <w:sz w:val="20"/>
               </w:rPr>
               <w:t>ViT-B/16 AugReg</w:t>
             </w:r>
@@ -6564,13 +7226,17 @@
               <w:spacing w:after="0" w:line="240" w:lineRule="auto"/>
               <w:jc w:val="center"/>
             </w:pPr>
-            <w:r/>
+            <w:r>
+              <w:rPr>
+                <w:sz w:val="20"/>
+              </w:rPr>
+            </w:r>
             <w:r>
               <w:rPr>
                 <w:rFonts w:ascii="Times New Roman" w:hAnsi="Times New Roman"/>
                 <w:b w:val="0"/>
                 <w:color w:val="202A32"/>
-                <w:sz w:val="16"/>
+                <w:sz w:val="20"/>
               </w:rPr>
               <w:t>End-to-end J₈→L</w:t>
             </w:r>
@@ -6592,13 +7258,17 @@
               <w:spacing w:after="0" w:line="240" w:lineRule="auto"/>
               <w:jc w:val="center"/>
             </w:pPr>
-            <w:r/>
+            <w:r>
+              <w:rPr>
+                <w:sz w:val="20"/>
+              </w:rPr>
+            </w:r>
             <w:r>
               <w:rPr>
                 <w:rFonts w:ascii="Times New Roman" w:hAnsi="Times New Roman"/>
                 <w:b w:val="0"/>
                 <w:color w:val="202A32"/>
-                <w:sz w:val="16"/>
+                <w:sz w:val="20"/>
               </w:rPr>
               <w:t>0.954 [0.938, 0.970]</w:t>
             </w:r>
@@ -6620,13 +7290,17 @@
               <w:spacing w:after="0" w:line="240" w:lineRule="auto"/>
               <w:jc w:val="center"/>
             </w:pPr>
-            <w:r/>
+            <w:r>
+              <w:rPr>
+                <w:sz w:val="20"/>
+              </w:rPr>
+            </w:r>
             <w:r>
               <w:rPr>
                 <w:rFonts w:ascii="Times New Roman" w:hAnsi="Times New Roman"/>
                 <w:b w:val="0"/>
                 <w:color w:val="202A32"/>
-                <w:sz w:val="16"/>
+                <w:sz w:val="20"/>
               </w:rPr>
               <w:t>0.934 [0.911, 0.953]</w:t>
             </w:r>
@@ -6649,13 +7323,17 @@
             <w:pPr>
               <w:spacing w:after="0" w:line="240" w:lineRule="auto"/>
             </w:pPr>
-            <w:r/>
+            <w:r>
+              <w:rPr>
+                <w:sz w:val="20"/>
+              </w:rPr>
+            </w:r>
             <w:r>
               <w:rPr>
                 <w:rFonts w:ascii="Times New Roman" w:hAnsi="Times New Roman"/>
                 <w:b w:val="0"/>
                 <w:color w:val="202A32"/>
-                <w:sz w:val="16"/>
+                <w:sz w:val="20"/>
               </w:rPr>
               <w:t>DINOv2 ViT-S/14</w:t>
             </w:r>
@@ -6677,13 +7355,17 @@
               <w:spacing w:after="0" w:line="240" w:lineRule="auto"/>
               <w:jc w:val="center"/>
             </w:pPr>
-            <w:r/>
+            <w:r>
+              <w:rPr>
+                <w:sz w:val="20"/>
+              </w:rPr>
+            </w:r>
             <w:r>
               <w:rPr>
                 <w:rFonts w:ascii="Times New Roman" w:hAnsi="Times New Roman"/>
                 <w:b w:val="0"/>
                 <w:color w:val="202A32"/>
-                <w:sz w:val="16"/>
+                <w:sz w:val="20"/>
               </w:rPr>
               <w:t>Single-block A₈</w:t>
             </w:r>
@@ -6705,13 +7387,17 @@
               <w:spacing w:after="0" w:line="240" w:lineRule="auto"/>
               <w:jc w:val="center"/>
             </w:pPr>
-            <w:r/>
+            <w:r>
+              <w:rPr>
+                <w:sz w:val="20"/>
+              </w:rPr>
+            </w:r>
             <w:r>
               <w:rPr>
                 <w:rFonts w:ascii="Times New Roman" w:hAnsi="Times New Roman"/>
                 <w:b w:val="0"/>
                 <w:color w:val="202A32"/>
-                <w:sz w:val="16"/>
+                <w:sz w:val="20"/>
               </w:rPr>
               <w:t>0.883 [0.861, 0.903]</w:t>
             </w:r>
@@ -6733,13 +7419,17 @@
               <w:spacing w:after="0" w:line="240" w:lineRule="auto"/>
               <w:jc w:val="center"/>
             </w:pPr>
-            <w:r/>
+            <w:r>
+              <w:rPr>
+                <w:sz w:val="20"/>
+              </w:rPr>
+            </w:r>
             <w:r>
               <w:rPr>
                 <w:rFonts w:ascii="Times New Roman" w:hAnsi="Times New Roman"/>
                 <w:b w:val="0"/>
                 <w:color w:val="202A32"/>
-                <w:sz w:val="16"/>
+                <w:sz w:val="20"/>
               </w:rPr>
               <w:t>0.829 [0.781, 0.869]</w:t>
             </w:r>
@@ -6762,13 +7452,17 @@
             <w:pPr>
               <w:spacing w:after="0" w:line="240" w:lineRule="auto"/>
             </w:pPr>
-            <w:r/>
+            <w:r>
+              <w:rPr>
+                <w:sz w:val="20"/>
+              </w:rPr>
+            </w:r>
             <w:r>
               <w:rPr>
                 <w:rFonts w:ascii="Times New Roman" w:hAnsi="Times New Roman"/>
                 <w:b w:val="0"/>
                 <w:color w:val="202A32"/>
-                <w:sz w:val="16"/>
+                <w:sz w:val="20"/>
               </w:rPr>
               <w:t>DINOv2 ViT-S/14</w:t>
             </w:r>
@@ -6790,13 +7484,17 @@
               <w:spacing w:after="0" w:line="240" w:lineRule="auto"/>
               <w:jc w:val="center"/>
             </w:pPr>
-            <w:r/>
+            <w:r>
+              <w:rPr>
+                <w:sz w:val="20"/>
+              </w:rPr>
+            </w:r>
             <w:r>
               <w:rPr>
                 <w:rFonts w:ascii="Times New Roman" w:hAnsi="Times New Roman"/>
                 <w:b w:val="0"/>
                 <w:color w:val="202A32"/>
-                <w:sz w:val="16"/>
+                <w:sz w:val="20"/>
               </w:rPr>
               <w:t>End-to-end J₈→L</w:t>
             </w:r>
@@ -6818,13 +7516,17 @@
               <w:spacing w:after="0" w:line="240" w:lineRule="auto"/>
               <w:jc w:val="center"/>
             </w:pPr>
-            <w:r/>
+            <w:r>
+              <w:rPr>
+                <w:sz w:val="20"/>
+              </w:rPr>
+            </w:r>
             <w:r>
               <w:rPr>
                 <w:rFonts w:ascii="Times New Roman" w:hAnsi="Times New Roman"/>
                 <w:b w:val="0"/>
                 <w:color w:val="202A32"/>
-                <w:sz w:val="16"/>
+                <w:sz w:val="20"/>
               </w:rPr>
               <w:t>0.946 [0.941, 0.952]</w:t>
             </w:r>
@@ -6846,13 +7548,17 @@
               <w:spacing w:after="0" w:line="240" w:lineRule="auto"/>
               <w:jc w:val="center"/>
             </w:pPr>
-            <w:r/>
+            <w:r>
+              <w:rPr>
+                <w:sz w:val="20"/>
+              </w:rPr>
+            </w:r>
             <w:r>
               <w:rPr>
                 <w:rFonts w:ascii="Times New Roman" w:hAnsi="Times New Roman"/>
                 <w:b w:val="0"/>
                 <w:color w:val="202A32"/>
-                <w:sz w:val="16"/>
+                <w:sz w:val="20"/>
               </w:rPr>
               <w:t>0.944 [0.932, 0.956]</w:t>
             </w:r>
@@ -6868,6 +7574,7 @@
     <w:p>
       <w:pPr>
         <w:spacing w:after="100" w:line="259" w:lineRule="auto"/>
+        <w:jc w:val="both"/>
       </w:pPr>
       <w:r>
         <w:rPr>
@@ -6883,13 +7590,14 @@
       <w:pPr>
         <w:pStyle w:val="Heading1"/>
         <w:keepNext/>
+        <w:jc w:val="both"/>
       </w:pPr>
       <w:r>
         <w:rPr>
           <w:rFonts w:ascii="Times New Roman" w:hAnsi="Times New Roman"/>
           <w:b/>
           <w:color w:val="000000"/>
-          <w:sz w:val="28"/>
+          <w:sz w:val="20"/>
         </w:rPr>
         <w:t>S12. Primary Q/K/V projection-path comparison</w:t>
       </w:r>
@@ -6897,6 +7605,7 @@
     <w:p>
       <w:pPr>
         <w:spacing w:after="100" w:line="259" w:lineRule="auto"/>
+        <w:jc w:val="both"/>
       </w:pPr>
       <w:r>
         <w:rPr>
@@ -7123,6 +7832,9 @@
         <w:jc w:val="center"/>
       </w:pPr>
       <w:r>
+        <w:rPr>
+          <w:sz w:val="20"/>
+        </w:rPr>
         <w:drawing>
           <wp:inline xmlns:a="http://schemas.openxmlformats.org/drawingml/2006/main" xmlns:pic="http://schemas.openxmlformats.org/drawingml/2006/picture">
             <wp:extent cx="6172200" cy="2459702"/>
@@ -7161,6 +7873,7 @@
       <w:pPr>
         <w:keepLines/>
         <w:spacing w:after="100" w:line="259" w:lineRule="auto"/>
+        <w:jc w:val="both"/>
       </w:pPr>
       <w:r>
         <w:rPr>
@@ -7342,15 +8055,390 @@
     </w:p>
     <w:p>
       <w:pPr>
+        <w:keepNext/>
+        <w:keepLines/>
+        <w:spacing w:after="80"/>
+      </w:pPr>
+      <w:r>
+        <w:rPr>
+          <w:sz w:val="20"/>
+        </w:rPr>
+        <w:t>The signed true-class logit drop is the clean target-class logit minus the perturbed target-class logit, averaged over the same N=100 outcome images.</w:t>
+      </w:r>
+    </w:p>
+    <w:p>
+      <w:pPr>
+        <w:keepNext/>
+        <w:keepLines/>
+        <w:spacing w:after="80"/>
+      </w:pPr>
+      <w:r>
+        <w:rPr>
+          <w:sz w:val="20"/>
+        </w:rPr>
+        <w:t>Contrast(c) = mean true-class logit drop (coherent, c) − mean true-class logit drop (random-sign, c).</w:t>
+      </w:r>
+    </w:p>
+    <w:p>
+      <w:pPr>
+        <w:keepNext/>
+        <w:keepLines/>
+        <w:spacing w:after="80"/>
+      </w:pPr>
+      <w:r>
+        <w:rPr>
+          <w:sz w:val="20"/>
+        </w:rPr>
+        <w:t>Ratio (%) = 100 × Contrast(frozen-attention V-only with perturbed residual) / Contrast(full perturbation).</w:t>
+      </w:r>
+    </w:p>
+    <w:p>
+      <w:pPr>
+        <w:keepNext/>
+        <w:keepLines/>
+        <w:spacing w:after="80"/>
+      </w:pPr>
+      <w:r>
+        <w:rPr>
+          <w:sz w:val="20"/>
+        </w:rPr>
+        <w:t>The contrasts use feature_dir=jac_top and s=1.0. Both ViT-B/16 AugReg contrasts are negative. Its 102.2% ratio is the quotient of two signed contrasts; it does not indicate more than 100% causal contribution because the interventions are not additive causal components.</w:t>
+      </w:r>
+    </w:p>
+    <w:p>
+      <w:pPr>
+        <w:keepNext/>
+        <w:keepLines/>
+        <w:spacing w:after="80"/>
+      </w:pPr>
+      <w:r>
+        <w:rPr>
+          <w:b/>
+          <w:sz w:val="20"/>
+        </w:rPr>
+        <w:t>Table S4.</w:t>
+      </w:r>
+      <w:r>
+        <w:rPr>
+          <w:sz w:val="20"/>
+        </w:rPr>
+        <w:t xml:space="preserve"> Signed true-class logit-drop contrasts for the primary Value-path audit.</w:t>
+      </w:r>
+    </w:p>
+    <w:tbl>
+      <w:tblPr>
+        <w:tblStyle w:val="TableGrid"/>
+        <w:tblW w:type="auto" w:w="0"/>
+        <w:jc w:val="center"/>
+        <w:tblLayout w:type="fixed"/>
+        <w:tblLook w:firstColumn="1" w:firstRow="1" w:lastColumn="0" w:lastRow="0" w:noHBand="0" w:noVBand="1" w:val="04A0"/>
+      </w:tblPr>
+      <w:tblGrid>
+        <w:gridCol w:w="1999"/>
+        <w:gridCol w:w="1999"/>
+        <w:gridCol w:w="1999"/>
+        <w:gridCol w:w="1999"/>
+        <w:gridCol w:w="1999"/>
+      </w:tblGrid>
+      <w:tr>
+        <w:trPr>
+          <w:tblHeader w:val="true"/>
+          <w:cantSplit/>
+        </w:trPr>
+        <w:tc>
+          <w:tcPr>
+            <w:tcW w:type="dxa" w:w="1368"/>
+            <w:vAlign w:val="center"/>
+          </w:tcPr>
+          <w:p>
+            <w:pPr>
+              <w:spacing w:after="0" w:before="0"/>
+              <w:jc w:val="left"/>
+            </w:pPr>
+            <w:r>
+              <w:rPr>
+                <w:sz w:val="20"/>
+              </w:rPr>
+              <w:t>Model</w:t>
+            </w:r>
+          </w:p>
+        </w:tc>
+        <w:tc>
+          <w:tcPr>
+            <w:tcW w:type="dxa" w:w="1267"/>
+            <w:vAlign w:val="center"/>
+          </w:tcPr>
+          <w:p>
+            <w:pPr>
+              <w:spacing w:after="0" w:before="0"/>
+              <w:jc w:val="left"/>
+            </w:pPr>
+            <w:r>
+              <w:rPr>
+                <w:sz w:val="20"/>
+              </w:rPr>
+              <w:t>Intervention depth</w:t>
+            </w:r>
+          </w:p>
+        </w:tc>
+        <w:tc>
+          <w:tcPr>
+            <w:tcW w:type="dxa" w:w="2232"/>
+            <w:vAlign w:val="center"/>
+          </w:tcPr>
+          <w:p>
+            <w:pPr>
+              <w:spacing w:after="0" w:before="0"/>
+              <w:jc w:val="left"/>
+            </w:pPr>
+            <w:r>
+              <w:rPr>
+                <w:sz w:val="20"/>
+              </w:rPr>
+              <w:t>Full-block coherent-minus-random-sign contrast</w:t>
+            </w:r>
+          </w:p>
+        </w:tc>
+        <w:tc>
+          <w:tcPr>
+            <w:tcW w:type="dxa" w:w="3139"/>
+            <w:vAlign w:val="center"/>
+          </w:tcPr>
+          <w:p>
+            <w:pPr>
+              <w:spacing w:after="0" w:before="0"/>
+              <w:jc w:val="left"/>
+            </w:pPr>
+            <w:r>
+              <w:rPr>
+                <w:sz w:val="20"/>
+              </w:rPr>
+              <w:t>Frozen-attention V-only with perturbed-residual contrast</w:t>
+            </w:r>
+          </w:p>
+        </w:tc>
+        <w:tc>
+          <w:tcPr>
+            <w:tcW w:type="dxa" w:w="864"/>
+            <w:vAlign w:val="center"/>
+          </w:tcPr>
+          <w:p>
+            <w:pPr>
+              <w:spacing w:after="0" w:before="0"/>
+              <w:jc w:val="center"/>
+            </w:pPr>
+            <w:r>
+              <w:rPr>
+                <w:sz w:val="20"/>
+              </w:rPr>
+              <w:t>Ratio</w:t>
+            </w:r>
+          </w:p>
+        </w:tc>
+      </w:tr>
+      <w:tr>
+        <w:trPr>
+          <w:cantSplit/>
+        </w:trPr>
+        <w:tc>
+          <w:tcPr>
+            <w:tcW w:type="dxa" w:w="1368"/>
+            <w:vAlign w:val="center"/>
+          </w:tcPr>
+          <w:p>
+            <w:pPr>
+              <w:spacing w:after="0" w:before="0"/>
+              <w:jc w:val="left"/>
+            </w:pPr>
+            <w:r>
+              <w:rPr>
+                <w:sz w:val="20"/>
+              </w:rPr>
+              <w:t>DeiT-Small</w:t>
+            </w:r>
+          </w:p>
+        </w:tc>
+        <w:tc>
+          <w:tcPr>
+            <w:tcW w:type="dxa" w:w="1267"/>
+            <w:vAlign w:val="center"/>
+          </w:tcPr>
+          <w:p>
+            <w:pPr>
+              <w:spacing w:after="0" w:before="0"/>
+              <w:jc w:val="left"/>
+            </w:pPr>
+            <w:r>
+              <w:rPr>
+                <w:sz w:val="20"/>
+              </w:rPr>
+              <w:t>Block 8</w:t>
+            </w:r>
+          </w:p>
+        </w:tc>
+        <w:tc>
+          <w:tcPr>
+            <w:tcW w:type="dxa" w:w="2232"/>
+            <w:vAlign w:val="center"/>
+          </w:tcPr>
+          <w:p>
+            <w:pPr>
+              <w:spacing w:after="0" w:before="0"/>
+              <w:jc w:val="left"/>
+            </w:pPr>
+            <w:r>
+              <w:rPr>
+                <w:sz w:val="20"/>
+              </w:rPr>
+              <w:t>+0.006282993</w:t>
+            </w:r>
+          </w:p>
+        </w:tc>
+        <w:tc>
+          <w:tcPr>
+            <w:tcW w:type="dxa" w:w="3139"/>
+            <w:vAlign w:val="center"/>
+          </w:tcPr>
+          <w:p>
+            <w:pPr>
+              <w:spacing w:after="0" w:before="0"/>
+              <w:jc w:val="left"/>
+            </w:pPr>
+            <w:r>
+              <w:rPr>
+                <w:sz w:val="20"/>
+              </w:rPr>
+              <w:t>+0.004448350</w:t>
+            </w:r>
+          </w:p>
+        </w:tc>
+        <w:tc>
+          <w:tcPr>
+            <w:tcW w:type="dxa" w:w="864"/>
+            <w:vAlign w:val="center"/>
+          </w:tcPr>
+          <w:p>
+            <w:pPr>
+              <w:spacing w:after="0" w:before="0"/>
+              <w:jc w:val="center"/>
+            </w:pPr>
+            <w:r>
+              <w:rPr>
+                <w:sz w:val="20"/>
+              </w:rPr>
+              <w:t>70.8%</w:t>
+            </w:r>
+          </w:p>
+        </w:tc>
+      </w:tr>
+      <w:tr>
+        <w:trPr>
+          <w:cantSplit/>
+        </w:trPr>
+        <w:tc>
+          <w:tcPr>
+            <w:tcW w:type="dxa" w:w="1368"/>
+            <w:vAlign w:val="center"/>
+          </w:tcPr>
+          <w:p>
+            <w:pPr>
+              <w:spacing w:after="0" w:before="0"/>
+              <w:jc w:val="left"/>
+            </w:pPr>
+            <w:r>
+              <w:rPr>
+                <w:sz w:val="20"/>
+              </w:rPr>
+              <w:t>ViT-B/16 AugReg</w:t>
+            </w:r>
+          </w:p>
+        </w:tc>
+        <w:tc>
+          <w:tcPr>
+            <w:tcW w:type="dxa" w:w="1267"/>
+            <w:vAlign w:val="center"/>
+          </w:tcPr>
+          <w:p>
+            <w:pPr>
+              <w:spacing w:after="0" w:before="0"/>
+              <w:jc w:val="left"/>
+            </w:pPr>
+            <w:r>
+              <w:rPr>
+                <w:sz w:val="20"/>
+              </w:rPr>
+              <w:t>Block 7</w:t>
+            </w:r>
+          </w:p>
+        </w:tc>
+        <w:tc>
+          <w:tcPr>
+            <w:tcW w:type="dxa" w:w="2232"/>
+            <w:vAlign w:val="center"/>
+          </w:tcPr>
+          <w:p>
+            <w:pPr>
+              <w:spacing w:after="0" w:before="0"/>
+              <w:jc w:val="left"/>
+            </w:pPr>
+            <w:r>
+              <w:rPr>
+                <w:sz w:val="20"/>
+              </w:rPr>
+              <w:t>−0.247199488</w:t>
+            </w:r>
+          </w:p>
+        </w:tc>
+        <w:tc>
+          <w:tcPr>
+            <w:tcW w:type="dxa" w:w="3139"/>
+            <w:vAlign w:val="center"/>
+          </w:tcPr>
+          <w:p>
+            <w:pPr>
+              <w:spacing w:after="0" w:before="0"/>
+              <w:jc w:val="left"/>
+            </w:pPr>
+            <w:r>
+              <w:rPr>
+                <w:sz w:val="20"/>
+              </w:rPr>
+              <w:t>−0.252697120</w:t>
+            </w:r>
+          </w:p>
+        </w:tc>
+        <w:tc>
+          <w:tcPr>
+            <w:tcW w:type="dxa" w:w="864"/>
+            <w:vAlign w:val="center"/>
+          </w:tcPr>
+          <w:p>
+            <w:pPr>
+              <w:spacing w:after="0" w:before="0"/>
+              <w:jc w:val="center"/>
+            </w:pPr>
+            <w:r>
+              <w:rPr>
+                <w:sz w:val="20"/>
+              </w:rPr>
+              <w:t>102.2%</w:t>
+            </w:r>
+          </w:p>
+        </w:tc>
+      </w:tr>
+    </w:tbl>
+    <w:p>
+      <w:pPr>
         <w:pStyle w:val="Heading1"/>
         <w:keepNext/>
+        <w:jc w:val="both"/>
       </w:pPr>
       <w:r>
         <w:rPr>
           <w:rFonts w:ascii="Times New Roman" w:hAnsi="Times New Roman"/>
           <w:b/>
           <w:color w:val="000000"/>
-          <w:sz w:val="28"/>
+          <w:sz w:val="20"/>
         </w:rPr>
         <w:t>S13. Measured classifier-carrier boundary</w:t>
       </w:r>
@@ -7359,6 +8447,7 @@
       <w:pPr>
         <w:keepNext/>
         <w:spacing w:after="100" w:line="259" w:lineRule="auto"/>
+        <w:jc w:val="both"/>
       </w:pPr>
       <w:r>
         <w:rPr>
@@ -7378,6 +8467,9 @@
         <w:jc w:val="center"/>
       </w:pPr>
       <w:r>
+        <w:rPr>
+          <w:sz w:val="20"/>
+        </w:rPr>
         <w:drawing>
           <wp:inline xmlns:a="http://schemas.openxmlformats.org/drawingml/2006/main" xmlns:pic="http://schemas.openxmlformats.org/drawingml/2006/picture">
             <wp:extent cx="6172200" cy="3897608"/>
@@ -7416,6 +8508,7 @@
       <w:pPr>
         <w:keepLines/>
         <w:spacing w:after="100" w:line="259" w:lineRule="auto"/>
+        <w:jc w:val="both"/>
       </w:pPr>
       <w:r>
         <w:rPr>
@@ -7438,22 +8531,100 @@
     </w:p>
     <w:p>
       <w:pPr>
-        <w:pStyle w:val="Heading1"/>
-        <w:keepNext/>
+        <w:keepLines/>
+        <w:spacing w:after="100" w:line="259" w:lineRule="auto"/>
+        <w:jc w:val="both"/>
+      </w:pPr>
+      <w:r>
+        <w:rPr>
+          <w:rFonts w:ascii="Times New Roman" w:hAnsi="Times New Roman"/>
+          <w:sz w:val="20"/>
+        </w:rPr>
+        <w:t>The joint-stream depth grid covers DeiT-Small at depths 5, 8, and 10 and ViT-B/16 AugReg at depths 5, 7, and 10. DeiT-Tiny and DINOv2 were assessed only in reduced Block-8 replications and are not included in this six-panel grid. For each model, the same N=100-image cohort estimates the feature directions and scores outcomes; these measurements are not held out.</w:t>
+      </w:r>
+    </w:p>
+    <w:p>
+      <w:pPr>
+        <w:keepLines/>
+        <w:spacing w:after="100" w:line="259" w:lineRule="auto"/>
+        <w:jc w:val="center"/>
+      </w:pPr>
+      <w:r>
+        <w:drawing>
+          <wp:inline xmlns:a="http://schemas.openxmlformats.org/drawingml/2006/main" xmlns:pic="http://schemas.openxmlformats.org/drawingml/2006/picture">
+            <wp:extent cx="6172200" cy="4421690"/>
+            <wp:docPr id="14" name="Picture 14"/>
+            <wp:cNvGraphicFramePr>
+              <a:graphicFrameLocks noChangeAspect="1"/>
+            </wp:cNvGraphicFramePr>
+            <a:graphic>
+              <a:graphicData uri="http://schemas.openxmlformats.org/drawingml/2006/picture">
+                <pic:pic>
+                  <pic:nvPicPr>
+                    <pic:cNvPr id="0" name="figureS14_joint_stream_geometry.png"/>
+                    <pic:cNvPicPr/>
+                  </pic:nvPicPr>
+                  <pic:blipFill>
+                    <a:blip r:embed="rId22"/>
+                    <a:stretch>
+                      <a:fillRect/>
+                    </a:stretch>
+                  </pic:blipFill>
+                  <pic:spPr>
+                    <a:xfrm>
+                      <a:off x="0" y="0"/>
+                      <a:ext cx="6172200" cy="4421690"/>
+                    </a:xfrm>
+                    <a:prstGeom prst="rect"/>
+                  </pic:spPr>
+                </pic:pic>
+              </a:graphicData>
+            </a:graphic>
+          </wp:inline>
+        </w:drawing>
+      </w:r>
+    </w:p>
+    <w:p>
+      <w:pPr>
+        <w:keepLines/>
+        <w:spacing w:after="100" w:line="259" w:lineRule="auto"/>
+        <w:jc w:val="both"/>
       </w:pPr>
       <w:r>
         <w:rPr>
           <w:rFonts w:ascii="Times New Roman" w:hAnsi="Times New Roman"/>
           <w:b/>
-          <w:color w:val="000000"/>
-          <w:sz w:val="28"/>
+          <w:sz w:val="20"/>
         </w:rPr>
-        <w:t>S14. Code and data availability</w:t>
+        <w:t>Supplementary Figure S14.</w:t>
+      </w:r>
+      <w:r>
+        <w:rPr>
+          <w:rFonts w:ascii="Times New Roman" w:hAnsi="Times New Roman"/>
+          <w:sz w:val="20"/>
+        </w:rPr>
+        <w:t xml:space="preserve"> Mean per-image final-logit L₂ change at s=1 across the six model–depth combinations listed above. Each panel shows the same eight token-space patterns by five feature-space directions, with the shared logarithmic color scale used in Figure 6. “Grad. top” and “Grad. near-null” denote the joint-stream audit’s mean patch-margin-gradient directions; PC1, Random, and Centroid follow their Figure 6 definitions. The same N=100-image cohort per model estimates directions and scores outcomes.</w:t>
+      </w:r>
+    </w:p>
+    <w:p>
+      <w:pPr>
+        <w:pStyle w:val="Heading1"/>
+        <w:keepNext/>
+        <w:jc w:val="both"/>
+      </w:pPr>
+      <w:r>
+        <w:rPr>
+          <w:rFonts w:ascii="Times New Roman" w:hAnsi="Times New Roman"/>
+          <w:b/>
+          <w:sz w:val="20"/>
+        </w:rPr>
+        <w:t>Code and data availability</w:t>
       </w:r>
     </w:p>
     <w:p>
       <w:pPr>
         <w:spacing w:after="100" w:line="259" w:lineRule="auto"/>
+        <w:jc w:val="both"/>
       </w:pPr>
       <w:r>
         <w:rPr>

</xml_diff>

<commit_message>
Refine PCF novelty positioning and operator evidence
</commit_message>
<xml_diff>
--- a/docs/PAPER_SUPPLEMENTARY.docx
+++ b/docs/PAPER_SUPPLEMENTARY.docx
@@ -6,14 +6,13 @@
       <w:pPr>
         <w:pStyle w:val="Title"/>
         <w:spacing w:after="160"/>
-        <w:jc w:val="both"/>
       </w:pPr>
       <w:r>
         <w:rPr>
           <w:rFonts w:ascii="Times New Roman" w:hAnsi="Times New Roman"/>
           <w:b/>
           <w:color w:val="000000"/>
-          <w:sz w:val="20"/>
+          <w:sz w:val="36"/>
         </w:rPr>
         <w:t>Supplementary Material</w:t>
       </w:r>
@@ -22,14 +21,13 @@
       <w:pPr>
         <w:pStyle w:val="Heading1"/>
         <w:keepNext/>
-        <w:jc w:val="both"/>
       </w:pPr>
       <w:r>
         <w:rPr>
           <w:rFonts w:ascii="Times New Roman" w:hAnsi="Times New Roman"/>
           <w:b/>
           <w:color w:val="000000"/>
-          <w:sz w:val="20"/>
+          <w:sz w:val="28"/>
         </w:rPr>
         <w:t>Patch-Content Fungibility: Geometry, Functional Transmission, and Operator-Aware Token Compression</w:t>
       </w:r>
@@ -37,7 +35,6 @@
     <w:p>
       <w:pPr>
         <w:spacing w:after="100" w:line="259" w:lineRule="auto"/>
-        <w:jc w:val="both"/>
       </w:pPr>
       <w:r>
         <w:rPr>
@@ -53,14 +50,13 @@
       <w:pPr>
         <w:pStyle w:val="Heading1"/>
         <w:keepNext/>
-        <w:jc w:val="both"/>
       </w:pPr>
       <w:r>
         <w:rPr>
           <w:rFonts w:ascii="Times New Roman" w:hAnsi="Times New Roman"/>
           <w:b/>
           <w:color w:val="000000"/>
-          <w:sz w:val="20"/>
+          <w:sz w:val="28"/>
         </w:rPr>
         <w:t>S1. Evidence map and study design</w:t>
       </w:r>
@@ -68,7 +64,6 @@
     <w:p>
       <w:pPr>
         <w:spacing w:after="100" w:line="259" w:lineRule="auto"/>
-        <w:jc w:val="both"/>
       </w:pPr>
       <w:r>
         <w:rPr>
@@ -82,13 +77,25 @@
     </w:p>
     <w:p>
       <w:pPr>
-        <w:jc w:val="both"/>
+        <w:spacing w:after="100" w:line="259" w:lineRule="auto"/>
       </w:pPr>
       <w:r>
         <w:rPr>
+          <w:rFonts w:ascii="Times New Roman" w:hAnsi="Times New Roman"/>
+          <w:b/>
+          <w:color w:val="202A32"/>
           <w:sz w:val="20"/>
         </w:rPr>
-        <w:t>Supplementary evidence map. Summary of evidence families, scientific questions, model coverage, core conditions, and contributions covered by the supplementary analyses.</w:t>
+        <w:t>Supplementary evidence map.</w:t>
+      </w:r>
+      <w:r>
+        <w:rPr>
+          <w:rFonts w:ascii="Times New Roman" w:hAnsi="Times New Roman"/>
+          <w:i w:val="0"/>
+          <w:color w:val="202A32"/>
+          <w:sz w:val="20"/>
+        </w:rPr>
+        <w:t xml:space="preserve"> Summary of evidence families, scientific questions, model coverage, core conditions, and contributions covered by the supplementary analyses.</w:t>
       </w:r>
     </w:p>
     <w:tbl>
@@ -126,17 +133,13 @@
               <w:spacing w:after="0" w:line="240" w:lineRule="auto"/>
               <w:jc w:val="center"/>
             </w:pPr>
-            <w:r>
-              <w:rPr>
-                <w:sz w:val="20"/>
-              </w:rPr>
-            </w:r>
+            <w:r/>
             <w:r>
               <w:rPr>
                 <w:rFonts w:ascii="Times New Roman" w:hAnsi="Times New Roman"/>
                 <w:b/>
                 <w:color w:val="17232D"/>
-                <w:sz w:val="20"/>
+                <w:sz w:val="16"/>
               </w:rPr>
               <w:t>Evidence family</w:t>
             </w:r>
@@ -159,17 +162,13 @@
               <w:spacing w:after="0" w:line="240" w:lineRule="auto"/>
               <w:jc w:val="center"/>
             </w:pPr>
-            <w:r>
-              <w:rPr>
-                <w:sz w:val="20"/>
-              </w:rPr>
-            </w:r>
+            <w:r/>
             <w:r>
               <w:rPr>
                 <w:rFonts w:ascii="Times New Roman" w:hAnsi="Times New Roman"/>
                 <w:b/>
                 <w:color w:val="17232D"/>
-                <w:sz w:val="20"/>
+                <w:sz w:val="16"/>
               </w:rPr>
               <w:t>Scientific question</w:t>
             </w:r>
@@ -192,17 +191,13 @@
               <w:spacing w:after="0" w:line="240" w:lineRule="auto"/>
               <w:jc w:val="center"/>
             </w:pPr>
-            <w:r>
-              <w:rPr>
-                <w:sz w:val="20"/>
-              </w:rPr>
-            </w:r>
+            <w:r/>
             <w:r>
               <w:rPr>
                 <w:rFonts w:ascii="Times New Roman" w:hAnsi="Times New Roman"/>
                 <w:b/>
                 <w:color w:val="17232D"/>
-                <w:sz w:val="20"/>
+                <w:sz w:val="16"/>
               </w:rPr>
               <w:t>Models</w:t>
             </w:r>
@@ -225,17 +220,13 @@
               <w:spacing w:after="0" w:line="240" w:lineRule="auto"/>
               <w:jc w:val="center"/>
             </w:pPr>
-            <w:r>
-              <w:rPr>
-                <w:sz w:val="20"/>
-              </w:rPr>
-            </w:r>
+            <w:r/>
             <w:r>
               <w:rPr>
                 <w:rFonts w:ascii="Times New Roman" w:hAnsi="Times New Roman"/>
                 <w:b/>
                 <w:color w:val="17232D"/>
-                <w:sz w:val="20"/>
+                <w:sz w:val="16"/>
               </w:rPr>
               <w:t>Core conditions</w:t>
             </w:r>
@@ -258,17 +249,13 @@
               <w:spacing w:after="0" w:line="240" w:lineRule="auto"/>
               <w:jc w:val="center"/>
             </w:pPr>
-            <w:r>
-              <w:rPr>
-                <w:sz w:val="20"/>
-              </w:rPr>
-            </w:r>
+            <w:r/>
             <w:r>
               <w:rPr>
                 <w:rFonts w:ascii="Times New Roman" w:hAnsi="Times New Roman"/>
                 <w:b/>
                 <w:color w:val="17232D"/>
-                <w:sz w:val="20"/>
+                <w:sz w:val="16"/>
               </w:rPr>
               <w:t>Contribution</w:t>
             </w:r>
@@ -291,17 +278,13 @@
             <w:pPr>
               <w:spacing w:after="0" w:line="240" w:lineRule="auto"/>
             </w:pPr>
-            <w:r>
-              <w:rPr>
-                <w:sz w:val="20"/>
-              </w:rPr>
-            </w:r>
+            <w:r/>
             <w:r>
               <w:rPr>
                 <w:rFonts w:ascii="Times New Roman" w:hAnsi="Times New Roman"/>
                 <w:b w:val="0"/>
                 <w:color w:val="202A32"/>
-                <w:sz w:val="20"/>
+                <w:sz w:val="16"/>
               </w:rPr>
               <w:t>Depth-dependent replacement</w:t>
             </w:r>
@@ -323,17 +306,13 @@
               <w:spacing w:after="0" w:line="240" w:lineRule="auto"/>
               <w:jc w:val="center"/>
             </w:pPr>
-            <w:r>
-              <w:rPr>
-                <w:sz w:val="20"/>
-              </w:rPr>
-            </w:r>
+            <w:r/>
             <w:r>
               <w:rPr>
                 <w:rFonts w:ascii="Times New Roman" w:hAnsi="Times New Roman"/>
                 <w:b w:val="0"/>
                 <w:color w:val="202A32"/>
-                <w:sz w:val="20"/>
+                <w:sz w:val="16"/>
               </w:rPr>
               <w:t>How does replacement tolerance vary with depth, and how does it differ from zero ablation?</w:t>
             </w:r>
@@ -355,17 +334,13 @@
               <w:spacing w:after="0" w:line="240" w:lineRule="auto"/>
               <w:jc w:val="center"/>
             </w:pPr>
-            <w:r>
-              <w:rPr>
-                <w:sz w:val="20"/>
-              </w:rPr>
-            </w:r>
+            <w:r/>
             <w:r>
               <w:rPr>
                 <w:rFonts w:ascii="Times New Roman" w:hAnsi="Times New Roman"/>
                 <w:b w:val="0"/>
                 <w:color w:val="202A32"/>
-                <w:sz w:val="20"/>
+                <w:sz w:val="16"/>
               </w:rPr>
               <w:t>All four architectures</w:t>
             </w:r>
@@ -387,17 +362,13 @@
               <w:spacing w:after="0" w:line="240" w:lineRule="auto"/>
               <w:jc w:val="center"/>
             </w:pPr>
-            <w:r>
-              <w:rPr>
-                <w:sz w:val="20"/>
-              </w:rPr>
-            </w:r>
+            <w:r/>
             <w:r>
               <w:rPr>
                 <w:rFonts w:ascii="Times New Roman" w:hAnsi="Times New Roman"/>
                 <w:b w:val="0"/>
                 <w:color w:val="202A32"/>
-                <w:sz w:val="20"/>
+                <w:sz w:val="16"/>
               </w:rPr>
               <w:t>Zero, calibration centroid, and Gaussian surrogates at 25% replacement across depths 5–10; depth-6 follow-up for ViT-B and DINOv2</w:t>
             </w:r>
@@ -419,17 +390,13 @@
               <w:spacing w:after="0" w:line="240" w:lineRule="auto"/>
               <w:jc w:val="center"/>
             </w:pPr>
-            <w:r>
-              <w:rPr>
-                <w:sz w:val="20"/>
-              </w:rPr>
-            </w:r>
+            <w:r/>
             <w:r>
               <w:rPr>
                 <w:rFonts w:ascii="Times New Roman" w:hAnsi="Times New Roman"/>
                 <w:b w:val="0"/>
                 <w:color w:val="202A32"/>
-                <w:sz w:val="20"/>
+                <w:sz w:val="16"/>
               </w:rPr>
               <w:t>Establishes architecture-dependent depth profiles and the distinction between content replacement and removal.</w:t>
             </w:r>
@@ -452,17 +419,13 @@
             <w:pPr>
               <w:spacing w:after="0" w:line="240" w:lineRule="auto"/>
             </w:pPr>
-            <w:r>
-              <w:rPr>
-                <w:sz w:val="20"/>
-              </w:rPr>
-            </w:r>
+            <w:r/>
             <w:r>
               <w:rPr>
                 <w:rFonts w:ascii="Times New Roman" w:hAnsi="Times New Roman"/>
                 <w:b w:val="0"/>
                 <w:color w:val="202A32"/>
-                <w:sz w:val="20"/>
+                <w:sz w:val="16"/>
               </w:rPr>
               <w:t>Geometric compatibility</w:t>
             </w:r>
@@ -484,17 +447,13 @@
               <w:spacing w:after="0" w:line="240" w:lineRule="auto"/>
               <w:jc w:val="center"/>
             </w:pPr>
-            <w:r>
-              <w:rPr>
-                <w:sz w:val="20"/>
-              </w:rPr>
-            </w:r>
+            <w:r/>
             <w:r>
               <w:rPr>
                 <w:rFonts w:ascii="Times New Roman" w:hAnsi="Times New Roman"/>
                 <w:b w:val="0"/>
                 <w:color w:val="202A32"/>
-                <w:sz w:val="20"/>
+                <w:sz w:val="16"/>
               </w:rPr>
               <w:t>Which properties of static surrogate vectors constrain replacement?</w:t>
             </w:r>
@@ -516,17 +475,13 @@
               <w:spacing w:after="0" w:line="240" w:lineRule="auto"/>
               <w:jc w:val="center"/>
             </w:pPr>
-            <w:r>
-              <w:rPr>
-                <w:sz w:val="20"/>
-              </w:rPr>
-            </w:r>
+            <w:r/>
             <w:r>
               <w:rPr>
                 <w:rFonts w:ascii="Times New Roman" w:hAnsi="Times New Roman"/>
                 <w:b w:val="0"/>
                 <w:color w:val="202A32"/>
-                <w:sz w:val="20"/>
+                <w:sz w:val="16"/>
               </w:rPr>
               <w:t>All four architectures</w:t>
             </w:r>
@@ -548,17 +503,13 @@
               <w:spacing w:after="0" w:line="240" w:lineRule="auto"/>
               <w:jc w:val="center"/>
             </w:pPr>
-            <w:r>
-              <w:rPr>
-                <w:sz w:val="20"/>
-              </w:rPr>
-            </w:r>
+            <w:r/>
             <w:r>
               <w:rPr>
                 <w:rFonts w:ascii="Times New Roman" w:hAnsi="Times New Roman"/>
                 <w:b w:val="0"/>
                 <w:color w:val="202A32"/>
-                <w:sz w:val="20"/>
+                <w:sz w:val="16"/>
               </w:rPr>
               <w:t>Centroid, coordinate permutation, sign inversion, scale, and alignment controls</w:t>
             </w:r>
@@ -580,17 +531,13 @@
               <w:spacing w:after="0" w:line="240" w:lineRule="auto"/>
               <w:jc w:val="center"/>
             </w:pPr>
-            <w:r>
-              <w:rPr>
-                <w:sz w:val="20"/>
-              </w:rPr>
-            </w:r>
+            <w:r/>
             <w:r>
               <w:rPr>
                 <w:rFonts w:ascii="Times New Roman" w:hAnsi="Times New Roman"/>
                 <w:b w:val="0"/>
                 <w:color w:val="202A32"/>
-                <w:sz w:val="20"/>
+                <w:sz w:val="16"/>
               </w:rPr>
               <w:t>Shows that coordinate assignment and direction matter in tested settings.</w:t>
             </w:r>
@@ -613,17 +560,13 @@
             <w:pPr>
               <w:spacing w:after="0" w:line="240" w:lineRule="auto"/>
             </w:pPr>
-            <w:r>
-              <w:rPr>
-                <w:sz w:val="20"/>
-              </w:rPr>
-            </w:r>
+            <w:r/>
             <w:r>
               <w:rPr>
                 <w:rFonts w:ascii="Times New Roman" w:hAnsi="Times New Roman"/>
                 <w:b w:val="0"/>
                 <w:color w:val="202A32"/>
-                <w:sz w:val="20"/>
+                <w:sz w:val="16"/>
               </w:rPr>
               <w:t>Token-position diversity</w:t>
             </w:r>
@@ -645,17 +588,13 @@
               <w:spacing w:after="0" w:line="240" w:lineRule="auto"/>
               <w:jc w:val="center"/>
             </w:pPr>
-            <w:r>
-              <w:rPr>
-                <w:sz w:val="20"/>
-              </w:rPr>
-            </w:r>
+            <w:r/>
             <w:r>
               <w:rPr>
                 <w:rFonts w:ascii="Times New Roman" w:hAnsi="Times New Roman"/>
                 <w:b w:val="0"/>
                 <w:color w:val="202A32"/>
-                <w:sz w:val="20"/>
+                <w:sz w:val="16"/>
               </w:rPr>
               <w:t>How does variation across patch positions affect complete replacement?</w:t>
             </w:r>
@@ -677,17 +616,13 @@
               <w:spacing w:after="0" w:line="240" w:lineRule="auto"/>
               <w:jc w:val="center"/>
             </w:pPr>
-            <w:r>
-              <w:rPr>
-                <w:sz w:val="20"/>
-              </w:rPr>
-            </w:r>
+            <w:r/>
             <w:r>
               <w:rPr>
                 <w:rFonts w:ascii="Times New Roman" w:hAnsi="Times New Roman"/>
                 <w:b w:val="0"/>
                 <w:color w:val="202A32"/>
-                <w:sz w:val="20"/>
+                <w:sz w:val="16"/>
               </w:rPr>
               <w:t>All four architectures</w:t>
             </w:r>
@@ -709,17 +644,13 @@
               <w:spacing w:after="0" w:line="240" w:lineRule="auto"/>
               <w:jc w:val="center"/>
             </w:pPr>
-            <w:r>
-              <w:rPr>
-                <w:sz w:val="20"/>
-              </w:rPr>
-            </w:r>
+            <w:r/>
             <w:r>
               <w:rPr>
                 <w:rFonts w:ascii="Times New Roman" w:hAnsi="Times New Roman"/>
                 <w:b w:val="0"/>
                 <w:color w:val="202A32"/>
-                <w:sz w:val="20"/>
+                <w:sz w:val="16"/>
               </w:rPr>
               <w:t>Shared, grouped, and independent Gaussian surrogates at Block 8</w:t>
             </w:r>
@@ -741,17 +672,13 @@
               <w:spacing w:after="0" w:line="240" w:lineRule="auto"/>
               <w:jc w:val="center"/>
             </w:pPr>
-            <w:r>
-              <w:rPr>
-                <w:sz w:val="20"/>
-              </w:rPr>
-            </w:r>
+            <w:r/>
             <w:r>
               <w:rPr>
                 <w:rFonts w:ascii="Times New Roman" w:hAnsi="Times New Roman"/>
                 <w:b w:val="0"/>
                 <w:color w:val="202A32"/>
-                <w:sz w:val="20"/>
+                <w:sz w:val="16"/>
               </w:rPr>
               <w:t>Resolves an architecture-dependent diversity response; DINOv2 accuracy and margin are reported separately.</w:t>
             </w:r>
@@ -774,17 +701,13 @@
             <w:pPr>
               <w:spacing w:after="0" w:line="240" w:lineRule="auto"/>
             </w:pPr>
-            <w:r>
-              <w:rPr>
-                <w:sz w:val="20"/>
-              </w:rPr>
-            </w:r>
+            <w:r/>
             <w:r>
               <w:rPr>
                 <w:rFonts w:ascii="Times New Roman" w:hAnsi="Times New Roman"/>
                 <w:b w:val="0"/>
                 <w:color w:val="202A32"/>
-                <w:sz w:val="20"/>
+                <w:sz w:val="16"/>
               </w:rPr>
               <w:t>Calibration-derived feature directions</w:t>
             </w:r>
@@ -806,17 +729,13 @@
               <w:spacing w:after="0" w:line="240" w:lineRule="auto"/>
               <w:jc w:val="center"/>
             </w:pPr>
-            <w:r>
-              <w:rPr>
-                <w:sz w:val="20"/>
-              </w:rPr>
-            </w:r>
+            <w:r/>
             <w:r>
               <w:rPr>
                 <w:rFonts w:ascii="Times New Roman" w:hAnsi="Times New Roman"/>
                 <w:b w:val="0"/>
                 <w:color w:val="202A32"/>
-                <w:sz w:val="20"/>
+                <w:sz w:val="16"/>
               </w:rPr>
               <w:t>Can a calibrated low-dimensional direction outperform an energy-matched random direction?</w:t>
             </w:r>
@@ -838,17 +757,13 @@
               <w:spacing w:after="0" w:line="240" w:lineRule="auto"/>
               <w:jc w:val="center"/>
             </w:pPr>
-            <w:r>
-              <w:rPr>
-                <w:sz w:val="20"/>
-              </w:rPr>
-            </w:r>
+            <w:r/>
             <w:r>
               <w:rPr>
                 <w:rFonts w:ascii="Times New Roman" w:hAnsi="Times New Roman"/>
                 <w:b w:val="0"/>
                 <w:color w:val="202A32"/>
-                <w:sz w:val="20"/>
+                <w:sz w:val="16"/>
               </w:rPr>
               <w:t>All four architectures</w:t>
             </w:r>
@@ -870,17 +785,13 @@
               <w:spacing w:after="0" w:line="240" w:lineRule="auto"/>
               <w:jc w:val="center"/>
             </w:pPr>
-            <w:r>
-              <w:rPr>
-                <w:sz w:val="20"/>
-              </w:rPr>
-            </w:r>
+            <w:r/>
             <w:r>
               <w:rPr>
                 <w:rFonts w:ascii="Times New Roman" w:hAnsi="Times New Roman"/>
                 <w:b w:val="0"/>
                 <w:color w:val="202A32"/>
-                <w:sz w:val="20"/>
+                <w:sz w:val="16"/>
               </w:rPr>
               <w:t>PCA-aligned and random one-dimensional variation, amplitude controls, and rank analyses</w:t>
             </w:r>
@@ -902,17 +813,13 @@
               <w:spacing w:after="0" w:line="240" w:lineRule="auto"/>
               <w:jc w:val="center"/>
             </w:pPr>
-            <w:r>
-              <w:rPr>
-                <w:sz w:val="20"/>
-              </w:rPr>
-            </w:r>
+            <w:r/>
             <w:r>
               <w:rPr>
                 <w:rFonts w:ascii="Times New Roman" w:hAnsi="Times New Roman"/>
                 <w:b w:val="0"/>
                 <w:color w:val="202A32"/>
-                <w:sz w:val="20"/>
+                <w:sz w:val="16"/>
               </w:rPr>
               <w:t>Supports learned-direction compatibility without establishing rank-1 sufficiency.</w:t>
             </w:r>
@@ -935,17 +842,13 @@
             <w:pPr>
               <w:spacing w:after="0" w:line="240" w:lineRule="auto"/>
             </w:pPr>
-            <w:r>
-              <w:rPr>
-                <w:sz w:val="20"/>
-              </w:rPr>
-            </w:r>
+            <w:r/>
             <w:r>
               <w:rPr>
                 <w:rFonts w:ascii="Times New Roman" w:hAnsi="Times New Roman"/>
                 <w:b w:val="0"/>
                 <w:color w:val="202A32"/>
-                <w:sz w:val="20"/>
+                <w:sz w:val="16"/>
               </w:rPr>
               <w:t>Functional and transmission mechanisms</w:t>
             </w:r>
@@ -967,17 +870,13 @@
               <w:spacing w:after="0" w:line="240" w:lineRule="auto"/>
               <w:jc w:val="center"/>
             </w:pPr>
-            <w:r>
-              <w:rPr>
-                <w:sz w:val="20"/>
-              </w:rPr>
-            </w:r>
+            <w:r/>
             <w:r>
               <w:rPr>
                 <w:rFonts w:ascii="Times New Roman" w:hAnsi="Times New Roman"/>
                 <w:b w:val="0"/>
                 <w:color w:val="202A32"/>
-                <w:sz w:val="20"/>
+                <w:sz w:val="16"/>
               </w:rPr>
               <w:t>How do feature sensitivity, token coherence, and downstream computation relate to replacement effects?</w:t>
             </w:r>
@@ -999,17 +898,13 @@
               <w:spacing w:after="0" w:line="240" w:lineRule="auto"/>
               <w:jc w:val="center"/>
             </w:pPr>
-            <w:r>
-              <w:rPr>
-                <w:sz w:val="20"/>
-              </w:rPr>
-            </w:r>
+            <w:r/>
             <w:r>
               <w:rPr>
                 <w:rFonts w:ascii="Times New Roman" w:hAnsi="Times New Roman"/>
                 <w:b w:val="0"/>
                 <w:color w:val="202A32"/>
-                <w:sz w:val="20"/>
+                <w:sz w:val="16"/>
               </w:rPr>
               <w:t>Cohorts listed in Table I</w:t>
             </w:r>
@@ -1031,17 +926,13 @@
               <w:spacing w:after="0" w:line="240" w:lineRule="auto"/>
               <w:jc w:val="center"/>
             </w:pPr>
-            <w:r>
-              <w:rPr>
-                <w:sz w:val="20"/>
-              </w:rPr>
-            </w:r>
+            <w:r/>
             <w:r>
               <w:rPr>
                 <w:rFonts w:ascii="Times New Roman" w:hAnsi="Times New Roman"/>
                 <w:b w:val="0"/>
                 <w:color w:val="202A32"/>
-                <w:sz w:val="20"/>
+                <w:sz w:val="16"/>
               </w:rPr>
               <w:t>Margin-gradient geometry, frozen-attention Value-path analysis, joint token–feature perturbations, and multi-block operator prediction</w:t>
             </w:r>
@@ -1063,17 +954,13 @@
               <w:spacing w:after="0" w:line="240" w:lineRule="auto"/>
               <w:jc w:val="center"/>
             </w:pPr>
-            <w:r>
-              <w:rPr>
-                <w:sz w:val="20"/>
-              </w:rPr>
-            </w:r>
+            <w:r/>
             <w:r>
               <w:rPr>
                 <w:rFonts w:ascii="Times New Roman" w:hAnsi="Times New Roman"/>
                 <w:b w:val="0"/>
                 <w:color w:val="202A32"/>
-                <w:sz w:val="20"/>
+                <w:sz w:val="16"/>
               </w:rPr>
               <w:t>Connects local feature geometry with token-coherent transmission while retaining the distinct study units.</w:t>
             </w:r>
@@ -1096,17 +983,13 @@
             <w:pPr>
               <w:spacing w:after="0" w:line="240" w:lineRule="auto"/>
             </w:pPr>
-            <w:r>
-              <w:rPr>
-                <w:sz w:val="20"/>
-              </w:rPr>
-            </w:r>
+            <w:r/>
             <w:r>
               <w:rPr>
                 <w:rFonts w:ascii="Times New Roman" w:hAnsi="Times New Roman"/>
                 <w:b w:val="0"/>
                 <w:color w:val="202A32"/>
-                <w:sz w:val="20"/>
+                <w:sz w:val="16"/>
               </w:rPr>
               <w:t>Operator-aware compression</w:t>
             </w:r>
@@ -1128,17 +1011,13 @@
               <w:spacing w:after="0" w:line="240" w:lineRule="auto"/>
               <w:jc w:val="center"/>
             </w:pPr>
-            <w:r>
-              <w:rPr>
-                <w:sz w:val="20"/>
-              </w:rPr>
-            </w:r>
+            <w:r/>
             <w:r>
               <w:rPr>
                 <w:rFonts w:ascii="Times New Roman" w:hAnsi="Times New Roman"/>
                 <w:b w:val="0"/>
                 <w:color w:val="202A32"/>
-                <w:sz w:val="20"/>
+                <w:sz w:val="16"/>
               </w:rPr>
               <w:t>Can an end-to-end readout objective guide token grouping and carrier optimization?</w:t>
             </w:r>
@@ -1160,17 +1039,13 @@
               <w:spacing w:after="0" w:line="240" w:lineRule="auto"/>
               <w:jc w:val="center"/>
             </w:pPr>
-            <w:r>
-              <w:rPr>
-                <w:sz w:val="20"/>
-              </w:rPr>
-            </w:r>
+            <w:r/>
             <w:r>
               <w:rPr>
                 <w:rFonts w:ascii="Times New Roman" w:hAnsi="Times New Roman"/>
                 <w:b w:val="0"/>
                 <w:color w:val="202A32"/>
-                <w:sz w:val="20"/>
+                <w:sz w:val="16"/>
               </w:rPr>
               <w:t>All four architectures</w:t>
             </w:r>
@@ -1192,17 +1067,13 @@
               <w:spacing w:after="0" w:line="240" w:lineRule="auto"/>
               <w:jc w:val="center"/>
             </w:pPr>
-            <w:r>
-              <w:rPr>
-                <w:sz w:val="20"/>
-              </w:rPr>
-            </w:r>
+            <w:r/>
             <w:r>
               <w:rPr>
                 <w:rFonts w:ascii="Times New Roman" w:hAnsi="Times New Roman"/>
                 <w:b w:val="0"/>
                 <w:color w:val="202A32"/>
-                <w:sz w:val="20"/>
+                <w:sz w:val="16"/>
               </w:rPr>
               <w:t>Group Mean, pruning, ToMe, full-J oracle, and low-rank operator approximations</w:t>
             </w:r>
@@ -1224,17 +1095,13 @@
               <w:spacing w:after="0" w:line="240" w:lineRule="auto"/>
               <w:jc w:val="center"/>
             </w:pPr>
-            <w:r>
-              <w:rPr>
-                <w:sz w:val="20"/>
-              </w:rPr>
-            </w:r>
+            <w:r/>
             <w:r>
               <w:rPr>
                 <w:rFonts w:ascii="Times New Roman" w:hAnsi="Times New Roman"/>
                 <w:b w:val="0"/>
                 <w:color w:val="202A32"/>
-                <w:sz w:val="20"/>
+                <w:sz w:val="16"/>
               </w:rPr>
               <w:t>Evaluates operator-aware compression on the strict held-out benchmark.</w:t>
             </w:r>
@@ -1257,17 +1124,13 @@
             <w:pPr>
               <w:spacing w:after="0" w:line="240" w:lineRule="auto"/>
             </w:pPr>
-            <w:r>
-              <w:rPr>
-                <w:sz w:val="20"/>
-              </w:rPr>
-            </w:r>
+            <w:r/>
             <w:r>
               <w:rPr>
                 <w:rFonts w:ascii="Times New Roman" w:hAnsi="Times New Roman"/>
                 <w:b w:val="0"/>
                 <w:color w:val="202A32"/>
-                <w:sz w:val="20"/>
+                <w:sz w:val="16"/>
               </w:rPr>
               <w:t>Practical carrier evaluation</w:t>
             </w:r>
@@ -1289,17 +1152,13 @@
               <w:spacing w:after="0" w:line="240" w:lineRule="auto"/>
               <w:jc w:val="center"/>
             </w:pPr>
-            <w:r>
-              <w:rPr>
-                <w:sz w:val="20"/>
-              </w:rPr>
-            </w:r>
+            <w:r/>
             <w:r>
               <w:rPr>
                 <w:rFonts w:ascii="Times New Roman" w:hAnsi="Times New Roman"/>
                 <w:b w:val="0"/>
                 <w:color w:val="202A32"/>
-                <w:sz w:val="20"/>
+                <w:sz w:val="16"/>
               </w:rPr>
               <w:t>Do static corrections improve classifier accuracy or measured throughput?</w:t>
             </w:r>
@@ -1321,17 +1180,13 @@
               <w:spacing w:after="0" w:line="240" w:lineRule="auto"/>
               <w:jc w:val="center"/>
             </w:pPr>
-            <w:r>
-              <w:rPr>
-                <w:sz w:val="20"/>
-              </w:rPr>
-            </w:r>
+            <w:r/>
             <w:r>
               <w:rPr>
                 <w:rFonts w:ascii="Times New Roman" w:hAnsi="Times New Roman"/>
                 <w:b w:val="0"/>
                 <w:color w:val="202A32"/>
-                <w:sz w:val="20"/>
+                <w:sz w:val="16"/>
               </w:rPr>
               <w:t>All four architectures</w:t>
             </w:r>
@@ -1353,17 +1208,13 @@
               <w:spacing w:after="0" w:line="240" w:lineRule="auto"/>
               <w:jc w:val="center"/>
             </w:pPr>
-            <w:r>
-              <w:rPr>
-                <w:sz w:val="20"/>
-              </w:rPr>
-            </w:r>
+            <w:r/>
             <w:r>
               <w:rPr>
                 <w:rFonts w:ascii="Times New Roman" w:hAnsi="Times New Roman"/>
                 <w:b w:val="0"/>
                 <w:color w:val="202A32"/>
-                <w:sz w:val="20"/>
+                <w:sz w:val="16"/>
               </w:rPr>
               <w:t>Calibration-frozen Feature-PCA corrections; separate operator-space and classifier evaluations</w:t>
             </w:r>
@@ -1385,17 +1236,13 @@
               <w:spacing w:after="0" w:line="240" w:lineRule="auto"/>
               <w:jc w:val="center"/>
             </w:pPr>
-            <w:r>
-              <w:rPr>
-                <w:sz w:val="20"/>
-              </w:rPr>
-            </w:r>
+            <w:r/>
             <w:r>
               <w:rPr>
                 <w:rFonts w:ascii="Times New Roman" w:hAnsi="Times New Roman"/>
                 <w:b w:val="0"/>
                 <w:color w:val="202A32"/>
-                <w:sz w:val="20"/>
+                <w:sz w:val="16"/>
               </w:rPr>
               <w:t>Defines the boundary between linearized operator-space gains and practical outcomes.</w:t>
             </w:r>
@@ -1418,17 +1265,13 @@
             <w:pPr>
               <w:spacing w:after="0" w:line="240" w:lineRule="auto"/>
             </w:pPr>
-            <w:r>
-              <w:rPr>
-                <w:sz w:val="20"/>
-              </w:rPr>
-            </w:r>
+            <w:r/>
             <w:r>
               <w:rPr>
                 <w:rFonts w:ascii="Times New Roman" w:hAnsi="Times New Roman"/>
                 <w:b w:val="0"/>
                 <w:color w:val="202A32"/>
-                <w:sz w:val="20"/>
+                <w:sz w:val="16"/>
               </w:rPr>
               <w:t>Supplementary robustness and carrier tests</w:t>
             </w:r>
@@ -1450,17 +1293,13 @@
               <w:spacing w:after="0" w:line="240" w:lineRule="auto"/>
               <w:jc w:val="center"/>
             </w:pPr>
-            <w:r>
-              <w:rPr>
-                <w:sz w:val="20"/>
-              </w:rPr>
-            </w:r>
+            <w:r/>
             <w:r>
               <w:rPr>
                 <w:rFonts w:ascii="Times New Roman" w:hAnsi="Times New Roman"/>
                 <w:b w:val="0"/>
                 <w:color w:val="202A32"/>
-                <w:sz w:val="20"/>
+                <w:sz w:val="16"/>
               </w:rPr>
               <w:t>Are replacement findings sensitive to fractions, spatial masks, token multiplicity, or synthetic banks?</w:t>
             </w:r>
@@ -1482,17 +1321,13 @@
               <w:spacing w:after="0" w:line="240" w:lineRule="auto"/>
               <w:jc w:val="center"/>
             </w:pPr>
-            <w:r>
-              <w:rPr>
-                <w:sz w:val="20"/>
-              </w:rPr>
-            </w:r>
+            <w:r/>
             <w:r>
               <w:rPr>
                 <w:rFonts w:ascii="Times New Roman" w:hAnsi="Times New Roman"/>
                 <w:b w:val="0"/>
                 <w:color w:val="202A32"/>
-                <w:sz w:val="20"/>
+                <w:sz w:val="16"/>
               </w:rPr>
               <w:t>All four architectures</w:t>
             </w:r>
@@ -1514,17 +1349,13 @@
               <w:spacing w:after="0" w:line="240" w:lineRule="auto"/>
               <w:jc w:val="center"/>
             </w:pPr>
-            <w:r>
-              <w:rPr>
-                <w:sz w:val="20"/>
-              </w:rPr>
-            </w:r>
+            <w:r/>
             <w:r>
               <w:rPr>
                 <w:rFonts w:ascii="Times New Roman" w:hAnsi="Times New Roman"/>
                 <w:b w:val="0"/>
                 <w:color w:val="202A32"/>
-                <w:sz w:val="20"/>
+                <w:sz w:val="16"/>
               </w:rPr>
               <w:t>Dense fraction and mask sweeps, multiplicity-aware collapse, and geometry banks at matched token budgets</w:t>
             </w:r>
@@ -1546,17 +1377,13 @@
               <w:spacing w:after="0" w:line="240" w:lineRule="auto"/>
               <w:jc w:val="center"/>
             </w:pPr>
-            <w:r>
-              <w:rPr>
-                <w:sz w:val="20"/>
-              </w:rPr>
-            </w:r>
+            <w:r/>
             <w:r>
               <w:rPr>
                 <w:rFonts w:ascii="Times New Roman" w:hAnsi="Times New Roman"/>
                 <w:b w:val="0"/>
                 <w:color w:val="202A32"/>
-                <w:sz w:val="20"/>
+                <w:sz w:val="16"/>
               </w:rPr>
               <w:t>Characterizes robustness and application limits.</w:t>
             </w:r>
@@ -1572,7 +1399,6 @@
     <w:p>
       <w:pPr>
         <w:spacing w:after="100" w:line="259" w:lineRule="auto"/>
-        <w:jc w:val="both"/>
       </w:pPr>
       <w:r>
         <w:rPr>
@@ -1588,14 +1414,13 @@
       <w:pPr>
         <w:pStyle w:val="Heading1"/>
         <w:keepNext/>
-        <w:jc w:val="both"/>
       </w:pPr>
       <w:r>
         <w:rPr>
           <w:rFonts w:ascii="Times New Roman" w:hAnsi="Times New Roman"/>
           <w:b/>
           <w:color w:val="000000"/>
-          <w:sz w:val="20"/>
+          <w:sz w:val="28"/>
         </w:rPr>
         <w:t>S2. Depth transition and held-out generalization</w:t>
       </w:r>
@@ -1603,7 +1428,6 @@
     <w:p>
       <w:pPr>
         <w:spacing w:after="100" w:line="259" w:lineRule="auto"/>
-        <w:jc w:val="both"/>
       </w:pPr>
       <w:r>
         <w:rPr>
@@ -1618,7 +1442,6 @@
     <w:p>
       <w:pPr>
         <w:spacing w:after="100" w:line="259" w:lineRule="auto"/>
-        <w:jc w:val="both"/>
       </w:pPr>
       <w:r>
         <w:rPr>
@@ -1633,7 +1456,6 @@
     <w:p>
       <w:pPr>
         <w:spacing w:after="100" w:line="259" w:lineRule="auto"/>
-        <w:jc w:val="both"/>
       </w:pPr>
       <w:r>
         <w:rPr>
@@ -1648,7 +1470,6 @@
     <w:p>
       <w:pPr>
         <w:spacing w:after="100" w:line="259" w:lineRule="auto"/>
-        <w:jc w:val="both"/>
       </w:pPr>
       <w:r>
         <w:rPr>
@@ -1664,14 +1485,13 @@
       <w:pPr>
         <w:pStyle w:val="Heading1"/>
         <w:keepNext/>
-        <w:jc w:val="both"/>
       </w:pPr>
       <w:r>
         <w:rPr>
           <w:rFonts w:ascii="Times New Roman" w:hAnsi="Times New Roman"/>
           <w:b/>
           <w:color w:val="000000"/>
-          <w:sz w:val="20"/>
+          <w:sz w:val="28"/>
         </w:rPr>
         <w:t>S3. Prototype geometry controls</w:t>
       </w:r>
@@ -1679,7 +1499,6 @@
     <w:p>
       <w:pPr>
         <w:spacing w:after="100" w:line="259" w:lineRule="auto"/>
-        <w:jc w:val="both"/>
       </w:pPr>
       <w:r>
         <w:rPr>
@@ -1694,7 +1513,6 @@
     <w:p>
       <w:pPr>
         <w:spacing w:after="100" w:line="259" w:lineRule="auto"/>
-        <w:jc w:val="both"/>
       </w:pPr>
       <w:r>
         <w:rPr>
@@ -1709,7 +1527,6 @@
     <w:p>
       <w:pPr>
         <w:spacing w:after="100" w:line="259" w:lineRule="auto"/>
-        <w:jc w:val="both"/>
       </w:pPr>
       <w:r>
         <w:rPr>
@@ -1724,7 +1541,6 @@
     <w:p>
       <w:pPr>
         <w:spacing w:after="100" w:line="259" w:lineRule="auto"/>
-        <w:jc w:val="both"/>
       </w:pPr>
       <w:r>
         <w:rPr>
@@ -1758,14 +1574,13 @@
       <w:pPr>
         <w:pStyle w:val="Heading1"/>
         <w:keepNext/>
-        <w:jc w:val="both"/>
       </w:pPr>
       <w:r>
         <w:rPr>
           <w:rFonts w:ascii="Times New Roman" w:hAnsi="Times New Roman"/>
           <w:b/>
           <w:color w:val="000000"/>
-          <w:sz w:val="20"/>
+          <w:sz w:val="28"/>
         </w:rPr>
         <w:t>S4. Replacement fraction and the complete-stream boundary</w:t>
       </w:r>
@@ -1773,7 +1588,6 @@
     <w:p>
       <w:pPr>
         <w:spacing w:after="100" w:line="259" w:lineRule="auto"/>
-        <w:jc w:val="both"/>
       </w:pPr>
       <w:r>
         <w:rPr>
@@ -1788,7 +1602,6 @@
     <w:p>
       <w:pPr>
         <w:spacing w:after="100" w:line="259" w:lineRule="auto"/>
-        <w:jc w:val="both"/>
       </w:pPr>
       <w:r>
         <w:rPr>
@@ -1967,7 +1780,6 @@
     <w:p>
       <w:pPr>
         <w:spacing w:after="100" w:line="259" w:lineRule="auto"/>
-        <w:jc w:val="both"/>
       </w:pPr>
       <w:r>
         <w:rPr>
@@ -1987,9 +1799,6 @@
         <w:jc w:val="center"/>
       </w:pPr>
       <w:r>
-        <w:rPr>
-          <w:sz w:val="20"/>
-        </w:rPr>
         <w:drawing>
           <wp:inline xmlns:a="http://schemas.openxmlformats.org/drawingml/2006/main" xmlns:pic="http://schemas.openxmlformats.org/drawingml/2006/picture">
             <wp:extent cx="6172200" cy="4730483"/>
@@ -2028,7 +1837,6 @@
       <w:pPr>
         <w:keepLines/>
         <w:spacing w:after="100" w:line="259" w:lineRule="auto"/>
-        <w:jc w:val="both"/>
       </w:pPr>
       <w:r>
         <w:rPr>
@@ -2057,9 +1865,6 @@
         <w:jc w:val="center"/>
       </w:pPr>
       <w:r>
-        <w:rPr>
-          <w:sz w:val="20"/>
-        </w:rPr>
         <w:drawing>
           <wp:inline xmlns:a="http://schemas.openxmlformats.org/drawingml/2006/main" xmlns:pic="http://schemas.openxmlformats.org/drawingml/2006/picture">
             <wp:extent cx="6172200" cy="2365847"/>
@@ -2098,7 +1903,6 @@
       <w:pPr>
         <w:keepLines/>
         <w:spacing w:after="100" w:line="259" w:lineRule="auto"/>
-        <w:jc w:val="both"/>
       </w:pPr>
       <w:r>
         <w:rPr>
@@ -2123,14 +1927,13 @@
       <w:pPr>
         <w:pStyle w:val="Heading1"/>
         <w:keepNext/>
-        <w:jc w:val="both"/>
       </w:pPr>
       <w:r>
         <w:rPr>
           <w:rFonts w:ascii="Times New Roman" w:hAnsi="Times New Roman"/>
           <w:b/>
           <w:color w:val="000000"/>
-          <w:sz w:val="20"/>
+          <w:sz w:val="28"/>
         </w:rPr>
         <w:t>S5. Causal isolation of token-to-token diversity</w:t>
       </w:r>
@@ -2138,7 +1941,6 @@
     <w:p>
       <w:pPr>
         <w:spacing w:after="100" w:line="259" w:lineRule="auto"/>
-        <w:jc w:val="both"/>
       </w:pPr>
       <w:r>
         <w:rPr>
@@ -2153,7 +1955,6 @@
     <w:p>
       <w:pPr>
         <w:spacing w:after="100" w:line="259" w:lineRule="auto"/>
-        <w:jc w:val="both"/>
       </w:pPr>
       <w:r>
         <w:rPr>
@@ -2168,7 +1969,6 @@
     <w:p>
       <w:pPr>
         <w:spacing w:after="100" w:line="259" w:lineRule="auto"/>
-        <w:jc w:val="both"/>
       </w:pPr>
       <w:r>
         <w:rPr>
@@ -2209,7 +2009,6 @@
     <w:p>
       <w:pPr>
         <w:spacing w:after="100" w:line="259" w:lineRule="auto"/>
-        <w:jc w:val="both"/>
       </w:pPr>
       <w:r>
         <w:rPr>
@@ -2250,7 +2049,6 @@
     <w:p>
       <w:pPr>
         <w:spacing w:after="100" w:line="259" w:lineRule="auto"/>
-        <w:jc w:val="both"/>
       </w:pPr>
       <w:r>
         <w:rPr>
@@ -2270,9 +2068,6 @@
         <w:jc w:val="center"/>
       </w:pPr>
       <w:r>
-        <w:rPr>
-          <w:sz w:val="20"/>
-        </w:rPr>
         <w:drawing>
           <wp:inline xmlns:a="http://schemas.openxmlformats.org/drawingml/2006/main" xmlns:pic="http://schemas.openxmlformats.org/drawingml/2006/picture">
             <wp:extent cx="6172200" cy="4117502"/>
@@ -2311,7 +2106,6 @@
       <w:pPr>
         <w:keepLines/>
         <w:spacing w:after="100" w:line="259" w:lineRule="auto"/>
-        <w:jc w:val="both"/>
       </w:pPr>
       <w:r>
         <w:rPr>
@@ -2336,14 +2130,13 @@
       <w:pPr>
         <w:pStyle w:val="Heading1"/>
         <w:keepNext/>
-        <w:jc w:val="both"/>
       </w:pPr>
       <w:r>
         <w:rPr>
           <w:rFonts w:ascii="Times New Roman" w:hAnsi="Times New Roman"/>
           <w:b/>
           <w:color w:val="000000"/>
-          <w:sz w:val="20"/>
+          <w:sz w:val="28"/>
         </w:rPr>
         <w:t>S6. Low-dimensional variation and amplitude controls</w:t>
       </w:r>
@@ -2351,7 +2144,6 @@
     <w:p>
       <w:pPr>
         <w:spacing w:after="100" w:line="259" w:lineRule="auto"/>
-        <w:jc w:val="both"/>
       </w:pPr>
       <w:r>
         <w:rPr>
@@ -2366,7 +2158,6 @@
     <w:p>
       <w:pPr>
         <w:spacing w:after="100" w:line="259" w:lineRule="auto"/>
-        <w:jc w:val="both"/>
       </w:pPr>
       <w:r>
         <w:rPr>
@@ -2381,7 +2172,6 @@
     <w:p>
       <w:pPr>
         <w:spacing w:after="100" w:line="259" w:lineRule="auto"/>
-        <w:jc w:val="both"/>
       </w:pPr>
       <w:r>
         <w:rPr>
@@ -2401,9 +2191,6 @@
         <w:jc w:val="center"/>
       </w:pPr>
       <w:r>
-        <w:rPr>
-          <w:sz w:val="20"/>
-        </w:rPr>
         <w:drawing>
           <wp:inline xmlns:a="http://schemas.openxmlformats.org/drawingml/2006/main" xmlns:pic="http://schemas.openxmlformats.org/drawingml/2006/picture">
             <wp:extent cx="6172200" cy="2792068"/>
@@ -2442,7 +2229,6 @@
       <w:pPr>
         <w:keepLines/>
         <w:spacing w:after="100" w:line="259" w:lineRule="auto"/>
-        <w:jc w:val="both"/>
       </w:pPr>
       <w:r>
         <w:rPr>
@@ -2471,9 +2257,6 @@
         <w:jc w:val="center"/>
       </w:pPr>
       <w:r>
-        <w:rPr>
-          <w:sz w:val="20"/>
-        </w:rPr>
         <w:drawing>
           <wp:inline xmlns:a="http://schemas.openxmlformats.org/drawingml/2006/main" xmlns:pic="http://schemas.openxmlformats.org/drawingml/2006/picture">
             <wp:extent cx="6172200" cy="2734060"/>
@@ -2512,7 +2295,6 @@
       <w:pPr>
         <w:keepLines/>
         <w:spacing w:after="100" w:line="259" w:lineRule="auto"/>
-        <w:jc w:val="both"/>
       </w:pPr>
       <w:r>
         <w:rPr>
@@ -2541,9 +2323,6 @@
         <w:jc w:val="center"/>
       </w:pPr>
       <w:r>
-        <w:rPr>
-          <w:sz w:val="20"/>
-        </w:rPr>
         <w:drawing>
           <wp:inline xmlns:a="http://schemas.openxmlformats.org/drawingml/2006/main" xmlns:pic="http://schemas.openxmlformats.org/drawingml/2006/picture">
             <wp:extent cx="6172200" cy="2824189"/>
@@ -2582,7 +2361,6 @@
       <w:pPr>
         <w:keepLines/>
         <w:spacing w:after="100" w:line="259" w:lineRule="auto"/>
-        <w:jc w:val="both"/>
       </w:pPr>
       <w:r>
         <w:rPr>
@@ -2607,14 +2385,13 @@
       <w:pPr>
         <w:pStyle w:val="Heading1"/>
         <w:keepNext/>
-        <w:jc w:val="both"/>
       </w:pPr>
       <w:r>
         <w:rPr>
           <w:rFonts w:ascii="Times New Roman" w:hAnsi="Times New Roman"/>
           <w:b/>
           <w:color w:val="000000"/>
-          <w:sz w:val="20"/>
+          <w:sz w:val="28"/>
         </w:rPr>
         <w:t>S7. Cross-model forward-parity and readout controls</w:t>
       </w:r>
@@ -2622,7 +2399,6 @@
     <w:p>
       <w:pPr>
         <w:spacing w:after="100" w:line="259" w:lineRule="auto"/>
-        <w:jc w:val="both"/>
       </w:pPr>
       <w:r>
         <w:rPr>
@@ -2637,7 +2413,6 @@
     <w:p>
       <w:pPr>
         <w:spacing w:after="100" w:line="259" w:lineRule="auto"/>
-        <w:jc w:val="both"/>
       </w:pPr>
       <w:r>
         <w:rPr>
@@ -2653,14 +2428,13 @@
       <w:pPr>
         <w:pStyle w:val="Heading1"/>
         <w:keepNext/>
-        <w:jc w:val="both"/>
       </w:pPr>
       <w:r>
         <w:rPr>
           <w:rFonts w:ascii="Times New Roman" w:hAnsi="Times New Roman"/>
           <w:b/>
           <w:color w:val="000000"/>
-          <w:sz w:val="20"/>
+          <w:sz w:val="28"/>
         </w:rPr>
         <w:t>S8. Compression boundary: exact collapse does not imply competitive compression</w:t>
       </w:r>
@@ -2668,7 +2442,6 @@
     <w:p>
       <w:pPr>
         <w:spacing w:after="100" w:line="259" w:lineRule="auto"/>
-        <w:jc w:val="both"/>
       </w:pPr>
       <w:r>
         <w:rPr>
@@ -2683,7 +2456,6 @@
     <w:p>
       <w:pPr>
         <w:spacing w:after="100" w:line="259" w:lineRule="auto"/>
-        <w:jc w:val="both"/>
       </w:pPr>
       <w:r>
         <w:rPr>
@@ -2773,7 +2545,6 @@
     <w:p>
       <w:pPr>
         <w:spacing w:after="100" w:line="259" w:lineRule="auto"/>
-        <w:jc w:val="both"/>
       </w:pPr>
       <w:r>
         <w:rPr>
@@ -2788,7 +2559,6 @@
     <w:p>
       <w:pPr>
         <w:spacing w:after="100" w:line="259" w:lineRule="auto"/>
-        <w:jc w:val="both"/>
       </w:pPr>
       <w:r>
         <w:rPr>
@@ -2803,7 +2573,6 @@
     <w:p>
       <w:pPr>
         <w:spacing w:after="100" w:line="259" w:lineRule="auto"/>
-        <w:jc w:val="both"/>
       </w:pPr>
       <w:r>
         <w:rPr>
@@ -2823,9 +2592,6 @@
         <w:jc w:val="center"/>
       </w:pPr>
       <w:r>
-        <w:rPr>
-          <w:sz w:val="20"/>
-        </w:rPr>
         <w:drawing>
           <wp:inline xmlns:a="http://schemas.openxmlformats.org/drawingml/2006/main" xmlns:pic="http://schemas.openxmlformats.org/drawingml/2006/picture">
             <wp:extent cx="6172200" cy="2937183"/>
@@ -2864,7 +2630,6 @@
       <w:pPr>
         <w:keepLines/>
         <w:spacing w:after="100" w:line="259" w:lineRule="auto"/>
-        <w:jc w:val="both"/>
       </w:pPr>
       <w:r>
         <w:rPr>
@@ -2893,9 +2658,6 @@
         <w:jc w:val="center"/>
       </w:pPr>
       <w:r>
-        <w:rPr>
-          <w:sz w:val="20"/>
-        </w:rPr>
         <w:drawing>
           <wp:inline xmlns:a="http://schemas.openxmlformats.org/drawingml/2006/main" xmlns:pic="http://schemas.openxmlformats.org/drawingml/2006/picture">
             <wp:extent cx="6172200" cy="4642847"/>
@@ -2934,7 +2696,6 @@
       <w:pPr>
         <w:keepLines/>
         <w:spacing w:after="100" w:line="259" w:lineRule="auto"/>
-        <w:jc w:val="both"/>
       </w:pPr>
       <w:r>
         <w:rPr>
@@ -2963,9 +2724,6 @@
         <w:jc w:val="center"/>
       </w:pPr>
       <w:r>
-        <w:rPr>
-          <w:sz w:val="20"/>
-        </w:rPr>
         <w:drawing>
           <wp:inline xmlns:a="http://schemas.openxmlformats.org/drawingml/2006/main" xmlns:pic="http://schemas.openxmlformats.org/drawingml/2006/picture">
             <wp:extent cx="6172200" cy="2960086"/>
@@ -3004,7 +2762,6 @@
       <w:pPr>
         <w:keepLines/>
         <w:spacing w:after="100" w:line="259" w:lineRule="auto"/>
-        <w:jc w:val="both"/>
       </w:pPr>
       <w:r>
         <w:rPr>
@@ -3029,14 +2786,13 @@
       <w:pPr>
         <w:pStyle w:val="Heading1"/>
         <w:keepNext/>
-        <w:jc w:val="both"/>
       </w:pPr>
       <w:r>
         <w:rPr>
           <w:rFonts w:ascii="Times New Roman" w:hAnsi="Times New Roman"/>
           <w:b/>
           <w:color w:val="000000"/>
-          <w:sz w:val="20"/>
+          <w:sz w:val="28"/>
         </w:rPr>
         <w:t>S9. Synthetic carrier banks at matched token budgets</w:t>
       </w:r>
@@ -3044,7 +2800,6 @@
     <w:p>
       <w:pPr>
         <w:spacing w:after="100" w:line="259" w:lineRule="auto"/>
-        <w:jc w:val="both"/>
       </w:pPr>
       <w:r>
         <w:rPr>
@@ -3131,7 +2886,6 @@
     <w:p>
       <w:pPr>
         <w:spacing w:after="100" w:line="259" w:lineRule="auto"/>
-        <w:jc w:val="both"/>
       </w:pPr>
       <w:r>
         <w:rPr>
@@ -3180,7 +2934,6 @@
     <w:p>
       <w:pPr>
         <w:spacing w:after="100" w:line="259" w:lineRule="auto"/>
-        <w:jc w:val="both"/>
       </w:pPr>
       <w:r>
         <w:rPr>
@@ -3218,9 +2971,6 @@
         <w:jc w:val="center"/>
       </w:pPr>
       <w:r>
-        <w:rPr>
-          <w:sz w:val="20"/>
-        </w:rPr>
         <w:drawing>
           <wp:inline xmlns:a="http://schemas.openxmlformats.org/drawingml/2006/main" xmlns:pic="http://schemas.openxmlformats.org/drawingml/2006/picture">
             <wp:extent cx="6172200" cy="4611301"/>
@@ -3259,7 +3009,6 @@
       <w:pPr>
         <w:keepLines/>
         <w:spacing w:after="100" w:line="259" w:lineRule="auto"/>
-        <w:jc w:val="both"/>
       </w:pPr>
       <w:r>
         <w:rPr>
@@ -3284,14 +3033,13 @@
       <w:pPr>
         <w:pStyle w:val="Heading1"/>
         <w:keepNext/>
-        <w:jc w:val="both"/>
       </w:pPr>
       <w:r>
         <w:rPr>
           <w:rFonts w:ascii="Times New Roman" w:hAnsi="Times New Roman"/>
           <w:b/>
           <w:color w:val="000000"/>
-          <w:sz w:val="20"/>
+          <w:sz w:val="28"/>
         </w:rPr>
         <w:t>S10. Statistical and reproducibility notes</w:t>
       </w:r>
@@ -3299,7 +3047,6 @@
     <w:p>
       <w:pPr>
         <w:spacing w:after="100" w:line="259" w:lineRule="auto"/>
-        <w:jc w:val="both"/>
       </w:pPr>
       <w:r>
         <w:rPr>
@@ -3314,7 +3061,6 @@
     <w:p>
       <w:pPr>
         <w:spacing w:after="100" w:line="259" w:lineRule="auto"/>
-        <w:jc w:val="both"/>
       </w:pPr>
       <w:r>
         <w:rPr>
@@ -3431,7 +3177,6 @@
     <w:p>
       <w:pPr>
         <w:spacing w:after="100" w:line="259" w:lineRule="auto"/>
-        <w:jc w:val="both"/>
       </w:pPr>
       <w:r>
         <w:rPr>
@@ -3448,7 +3193,6 @@
         <w:keepNext/>
         <w:keepLines/>
         <w:spacing w:after="100" w:line="259" w:lineRule="auto"/>
-        <w:jc w:val="both"/>
       </w:pPr>
       <w:r>
         <w:rPr>
@@ -3502,17 +3246,13 @@
               <w:spacing w:after="0" w:line="240" w:lineRule="auto"/>
               <w:jc w:val="center"/>
             </w:pPr>
-            <w:r>
-              <w:rPr>
-                <w:sz w:val="20"/>
-              </w:rPr>
-            </w:r>
+            <w:r/>
             <w:r>
               <w:rPr>
                 <w:rFonts w:ascii="Times New Roman" w:hAnsi="Times New Roman"/>
                 <w:b/>
                 <w:color w:val="17232D"/>
-                <w:sz w:val="20"/>
+                <w:sz w:val="16"/>
               </w:rPr>
               <w:t>Analysis</w:t>
             </w:r>
@@ -3535,17 +3275,13 @@
               <w:spacing w:after="0" w:line="240" w:lineRule="auto"/>
               <w:jc w:val="center"/>
             </w:pPr>
-            <w:r>
-              <w:rPr>
-                <w:sz w:val="20"/>
-              </w:rPr>
-            </w:r>
+            <w:r/>
             <w:r>
               <w:rPr>
                 <w:rFonts w:ascii="Times New Roman" w:hAnsi="Times New Roman"/>
                 <w:b/>
                 <w:color w:val="17232D"/>
-                <w:sz w:val="20"/>
+                <w:sz w:val="16"/>
               </w:rPr>
               <w:t>Split and mask seeds</w:t>
             </w:r>
@@ -3568,17 +3304,13 @@
               <w:spacing w:after="0" w:line="240" w:lineRule="auto"/>
               <w:jc w:val="center"/>
             </w:pPr>
-            <w:r>
-              <w:rPr>
-                <w:sz w:val="20"/>
-              </w:rPr>
-            </w:r>
+            <w:r/>
             <w:r>
               <w:rPr>
                 <w:rFonts w:ascii="Times New Roman" w:hAnsi="Times New Roman"/>
                 <w:b/>
                 <w:color w:val="17232D"/>
-                <w:sz w:val="20"/>
+                <w:sz w:val="16"/>
               </w:rPr>
               <w:t>Stochastic seeds and aggregation</w:t>
             </w:r>
@@ -3601,17 +3333,13 @@
             <w:pPr>
               <w:spacing w:after="0" w:line="240" w:lineRule="auto"/>
             </w:pPr>
-            <w:r>
-              <w:rPr>
-                <w:sz w:val="20"/>
-              </w:rPr>
-            </w:r>
+            <w:r/>
             <w:r>
               <w:rPr>
                 <w:rFonts w:ascii="Times New Roman" w:hAnsi="Times New Roman"/>
                 <w:b w:val="0"/>
                 <w:color w:val="202A32"/>
-                <w:sz w:val="20"/>
+                <w:sz w:val="16"/>
               </w:rPr>
               <w:t>Figure 2: DeiT-Tiny/Small depth sweep</w:t>
             </w:r>
@@ -3633,17 +3361,13 @@
               <w:spacing w:after="0" w:line="240" w:lineRule="auto"/>
               <w:jc w:val="center"/>
             </w:pPr>
-            <w:r>
-              <w:rPr>
-                <w:sz w:val="20"/>
-              </w:rPr>
-            </w:r>
+            <w:r/>
             <w:r>
               <w:rPr>
                 <w:rFonts w:ascii="Times New Roman" w:hAnsi="Times New Roman"/>
                 <w:b w:val="0"/>
                 <w:color w:val="202A32"/>
-                <w:sz w:val="20"/>
+                <w:sz w:val="16"/>
               </w:rPr>
               <w:t>Calibration 9101; evaluation 9201; spatial mask 9301</w:t>
             </w:r>
@@ -3665,17 +3389,13 @@
               <w:spacing w:after="0" w:line="240" w:lineRule="auto"/>
               <w:jc w:val="center"/>
             </w:pPr>
-            <w:r>
-              <w:rPr>
-                <w:sz w:val="20"/>
-              </w:rPr>
-            </w:r>
+            <w:r/>
             <w:r>
               <w:rPr>
                 <w:rFonts w:ascii="Times New Roman" w:hAnsi="Times New Roman"/>
                 <w:b w:val="0"/>
                 <w:color w:val="202A32"/>
-                <w:sz w:val="20"/>
+                <w:sz w:val="16"/>
               </w:rPr>
               <w:t>Gaussian seeds 9401–9405; mean and sample SD across five seeds.</w:t>
             </w:r>
@@ -3698,17 +3418,13 @@
             <w:pPr>
               <w:spacing w:after="0" w:line="240" w:lineRule="auto"/>
             </w:pPr>
-            <w:r>
-              <w:rPr>
-                <w:sz w:val="20"/>
-              </w:rPr>
-            </w:r>
+            <w:r/>
             <w:r>
               <w:rPr>
                 <w:rFonts w:ascii="Times New Roman" w:hAnsi="Times New Roman"/>
                 <w:b w:val="0"/>
                 <w:color w:val="202A32"/>
-                <w:sz w:val="20"/>
+                <w:sz w:val="16"/>
               </w:rPr>
               <w:t>Figure 2: ViT-B/16 AugReg and DINOv2 depth sweep</w:t>
             </w:r>
@@ -3730,17 +3446,13 @@
               <w:spacing w:after="0" w:line="240" w:lineRule="auto"/>
               <w:jc w:val="center"/>
             </w:pPr>
-            <w:r>
-              <w:rPr>
-                <w:sz w:val="20"/>
-              </w:rPr>
-            </w:r>
+            <w:r/>
             <w:r>
               <w:rPr>
                 <w:rFonts w:ascii="Times New Roman" w:hAnsi="Times New Roman"/>
                 <w:b w:val="0"/>
                 <w:color w:val="202A32"/>
-                <w:sz w:val="20"/>
+                <w:sz w:val="16"/>
               </w:rPr>
               <w:t>Calibration 9101; evaluation 9201; spatial mask 21001</w:t>
             </w:r>
@@ -3762,17 +3474,13 @@
               <w:spacing w:after="0" w:line="240" w:lineRule="auto"/>
               <w:jc w:val="center"/>
             </w:pPr>
-            <w:r>
-              <w:rPr>
-                <w:sz w:val="20"/>
-              </w:rPr>
-            </w:r>
+            <w:r/>
             <w:r>
               <w:rPr>
                 <w:rFonts w:ascii="Times New Roman" w:hAnsi="Times New Roman"/>
                 <w:b w:val="0"/>
                 <w:color w:val="202A32"/>
-                <w:sz w:val="20"/>
+                <w:sz w:val="16"/>
               </w:rPr>
               <w:t>Gaussian seeds 22001–22003; mean and sample SD across three seeds. The post hoc depth-6 follow-up uses the same split and intervention seeds.</w:t>
             </w:r>
@@ -3795,17 +3503,13 @@
             <w:pPr>
               <w:spacing w:after="0" w:line="240" w:lineRule="auto"/>
             </w:pPr>
-            <w:r>
-              <w:rPr>
-                <w:sz w:val="20"/>
-              </w:rPr>
-            </w:r>
+            <w:r/>
             <w:r>
               <w:rPr>
                 <w:rFonts w:ascii="Times New Roman" w:hAnsi="Times New Roman"/>
                 <w:b w:val="0"/>
                 <w:color w:val="202A32"/>
-                <w:sz w:val="20"/>
+                <w:sz w:val="16"/>
               </w:rPr>
               <w:t>Figure 3(a): DeiT geometry controls</w:t>
             </w:r>
@@ -3827,17 +3531,13 @@
               <w:spacing w:after="0" w:line="240" w:lineRule="auto"/>
               <w:jc w:val="center"/>
             </w:pPr>
-            <w:r>
-              <w:rPr>
-                <w:sz w:val="20"/>
-              </w:rPr>
-            </w:r>
+            <w:r/>
             <w:r>
               <w:rPr>
                 <w:rFonts w:ascii="Times New Roman" w:hAnsi="Times New Roman"/>
                 <w:b w:val="0"/>
                 <w:color w:val="202A32"/>
-                <w:sz w:val="20"/>
+                <w:sz w:val="16"/>
               </w:rPr>
               <w:t>Calibration 9101; evaluation 9201; mask 9601</w:t>
             </w:r>
@@ -3859,17 +3559,13 @@
               <w:spacing w:after="0" w:line="240" w:lineRule="auto"/>
               <w:jc w:val="center"/>
             </w:pPr>
-            <w:r>
-              <w:rPr>
-                <w:sz w:val="20"/>
-              </w:rPr>
-            </w:r>
+            <w:r/>
             <w:r>
               <w:rPr>
                 <w:rFonts w:ascii="Times New Roman" w:hAnsi="Times New Roman"/>
                 <w:b w:val="0"/>
                 <w:color w:val="202A32"/>
-                <w:sz w:val="20"/>
+                <w:sz w:val="16"/>
               </w:rPr>
               <w:t>Coordinate-permutation seeds 9801–9803; centroid and sign-inversion controls are single-run estimates.</w:t>
             </w:r>
@@ -3892,17 +3588,13 @@
             <w:pPr>
               <w:spacing w:after="0" w:line="240" w:lineRule="auto"/>
             </w:pPr>
-            <w:r>
-              <w:rPr>
-                <w:sz w:val="20"/>
-              </w:rPr>
-            </w:r>
+            <w:r/>
             <w:r>
               <w:rPr>
                 <w:rFonts w:ascii="Times New Roman" w:hAnsi="Times New Roman"/>
                 <w:b w:val="0"/>
                 <w:color w:val="202A32"/>
-                <w:sz w:val="20"/>
+                <w:sz w:val="16"/>
               </w:rPr>
               <w:t>Figure 3(a): ViT-B/DINOv2 geometry controls</w:t>
             </w:r>
@@ -3924,17 +3616,13 @@
               <w:spacing w:after="0" w:line="240" w:lineRule="auto"/>
               <w:jc w:val="center"/>
             </w:pPr>
-            <w:r>
-              <w:rPr>
-                <w:sz w:val="20"/>
-              </w:rPr>
-            </w:r>
+            <w:r/>
             <w:r>
               <w:rPr>
                 <w:rFonts w:ascii="Times New Roman" w:hAnsi="Times New Roman"/>
                 <w:b w:val="0"/>
                 <w:color w:val="202A32"/>
-                <w:sz w:val="20"/>
+                <w:sz w:val="16"/>
               </w:rPr>
               <w:t>Calibration 9101; evaluation 9201; mask 21001</w:t>
             </w:r>
@@ -3956,17 +3644,13 @@
               <w:spacing w:after="0" w:line="240" w:lineRule="auto"/>
               <w:jc w:val="center"/>
             </w:pPr>
-            <w:r>
-              <w:rPr>
-                <w:sz w:val="20"/>
-              </w:rPr>
-            </w:r>
+            <w:r/>
             <w:r>
               <w:rPr>
                 <w:rFonts w:ascii="Times New Roman" w:hAnsi="Times New Roman"/>
                 <w:b w:val="0"/>
                 <w:color w:val="202A32"/>
-                <w:sz w:val="20"/>
+                <w:sz w:val="16"/>
               </w:rPr>
               <w:t>Coordinate-permutation seeds 23001–23003; centroid and sign-inversion controls are single-run estimates.</w:t>
             </w:r>
@@ -3989,17 +3673,13 @@
             <w:pPr>
               <w:spacing w:after="0" w:line="240" w:lineRule="auto"/>
             </w:pPr>
-            <w:r>
-              <w:rPr>
-                <w:sz w:val="20"/>
-              </w:rPr>
-            </w:r>
+            <w:r/>
             <w:r>
               <w:rPr>
                 <w:rFonts w:ascii="Times New Roman" w:hAnsi="Times New Roman"/>
                 <w:b w:val="0"/>
                 <w:color w:val="202A32"/>
-                <w:sz w:val="20"/>
+                <w:sz w:val="16"/>
               </w:rPr>
               <w:t>Figure 3(b): DeiT grouped diversity</w:t>
             </w:r>
@@ -4021,17 +3701,13 @@
               <w:spacing w:after="0" w:line="240" w:lineRule="auto"/>
               <w:jc w:val="center"/>
             </w:pPr>
-            <w:r>
-              <w:rPr>
-                <w:sz w:val="20"/>
-              </w:rPr>
-            </w:r>
+            <w:r/>
             <w:r>
               <w:rPr>
                 <w:rFonts w:ascii="Times New Roman" w:hAnsi="Times New Roman"/>
                 <w:b w:val="0"/>
                 <w:color w:val="202A32"/>
-                <w:sz w:val="20"/>
+                <w:sz w:val="16"/>
               </w:rPr>
               <w:t>Calibration 9101; evaluation 9201</w:t>
             </w:r>
@@ -4053,17 +3729,13 @@
               <w:spacing w:after="0" w:line="240" w:lineRule="auto"/>
               <w:jc w:val="center"/>
             </w:pPr>
-            <w:r>
-              <w:rPr>
-                <w:sz w:val="20"/>
-              </w:rPr>
-            </w:r>
+            <w:r/>
             <w:r>
               <w:rPr>
                 <w:rFonts w:ascii="Times New Roman" w:hAnsi="Times New Roman"/>
                 <w:b w:val="0"/>
                 <w:color w:val="202A32"/>
-                <w:sz w:val="20"/>
+                <w:sz w:val="16"/>
               </w:rPr>
               <w:t>Grouped-Gaussian seeds 15001–15003; means and sample SDs are across seeds.</w:t>
             </w:r>
@@ -4086,17 +3758,13 @@
             <w:pPr>
               <w:spacing w:after="0" w:line="240" w:lineRule="auto"/>
             </w:pPr>
-            <w:r>
-              <w:rPr>
-                <w:sz w:val="20"/>
-              </w:rPr>
-            </w:r>
+            <w:r/>
             <w:r>
               <w:rPr>
                 <w:rFonts w:ascii="Times New Roman" w:hAnsi="Times New Roman"/>
                 <w:b w:val="0"/>
                 <w:color w:val="202A32"/>
-                <w:sz w:val="20"/>
+                <w:sz w:val="16"/>
               </w:rPr>
               <w:t>Figure 3(b) and Figure S10: ViT-B/DINOv2 grouped diversity</w:t>
             </w:r>
@@ -4118,17 +3786,13 @@
               <w:spacing w:after="0" w:line="240" w:lineRule="auto"/>
               <w:jc w:val="center"/>
             </w:pPr>
-            <w:r>
-              <w:rPr>
-                <w:sz w:val="20"/>
-              </w:rPr>
-            </w:r>
+            <w:r/>
             <w:r>
               <w:rPr>
                 <w:rFonts w:ascii="Times New Roman" w:hAnsi="Times New Roman"/>
                 <w:b w:val="0"/>
                 <w:color w:val="202A32"/>
-                <w:sz w:val="20"/>
+                <w:sz w:val="16"/>
               </w:rPr>
               <w:t>Calibration 9101; evaluation 9201</w:t>
             </w:r>
@@ -4150,17 +3814,13 @@
               <w:spacing w:after="0" w:line="240" w:lineRule="auto"/>
               <w:jc w:val="center"/>
             </w:pPr>
-            <w:r>
-              <w:rPr>
-                <w:sz w:val="20"/>
-              </w:rPr>
-            </w:r>
+            <w:r/>
             <w:r>
               <w:rPr>
                 <w:rFonts w:ascii="Times New Roman" w:hAnsi="Times New Roman"/>
                 <w:b w:val="0"/>
                 <w:color w:val="202A32"/>
-                <w:sz w:val="20"/>
+                <w:sz w:val="16"/>
               </w:rPr>
               <w:t>Grouped-Gaussian seeds 26001–26005; means and sample SDs are across seeds; paired tests use per-image means across seeds.</w:t>
             </w:r>
@@ -4183,17 +3843,13 @@
             <w:pPr>
               <w:spacing w:after="0" w:line="240" w:lineRule="auto"/>
             </w:pPr>
-            <w:r>
-              <w:rPr>
-                <w:sz w:val="20"/>
-              </w:rPr>
-            </w:r>
+            <w:r/>
             <w:r>
               <w:rPr>
                 <w:rFonts w:ascii="Times New Roman" w:hAnsi="Times New Roman"/>
                 <w:b w:val="0"/>
                 <w:color w:val="202A32"/>
-                <w:sz w:val="20"/>
+                <w:sz w:val="16"/>
               </w:rPr>
               <w:t>Figure 3(c), Section 4.2: PCA-aligned versus random directions</w:t>
             </w:r>
@@ -4215,17 +3871,13 @@
               <w:spacing w:after="0" w:line="240" w:lineRule="auto"/>
               <w:jc w:val="center"/>
             </w:pPr>
-            <w:r>
-              <w:rPr>
-                <w:sz w:val="20"/>
-              </w:rPr>
-            </w:r>
+            <w:r/>
             <w:r>
               <w:rPr>
                 <w:rFonts w:ascii="Times New Roman" w:hAnsi="Times New Roman"/>
                 <w:b w:val="0"/>
                 <w:color w:val="202A32"/>
-                <w:sz w:val="20"/>
+                <w:sz w:val="16"/>
               </w:rPr>
               <w:t>Calibration 9101; evaluation 9201</w:t>
             </w:r>
@@ -4247,17 +3899,13 @@
               <w:spacing w:after="0" w:line="240" w:lineRule="auto"/>
               <w:jc w:val="center"/>
             </w:pPr>
-            <w:r>
-              <w:rPr>
-                <w:sz w:val="20"/>
-              </w:rPr>
-            </w:r>
+            <w:r/>
             <w:r>
               <w:rPr>
                 <w:rFonts w:ascii="Times New Roman" w:hAnsi="Times New Roman"/>
                 <w:b w:val="0"/>
                 <w:color w:val="202A32"/>
-                <w:sz w:val="20"/>
+                <w:sz w:val="16"/>
               </w:rPr>
               <w:t>DeiT natural-PC1 identity seeds 17001–17005 and matched-random-direction seeds 18001–18005; ViT-B/DINOv2 use seeds 25001–25003.</w:t>
             </w:r>
@@ -4280,17 +3928,13 @@
             <w:pPr>
               <w:spacing w:after="0" w:line="240" w:lineRule="auto"/>
             </w:pPr>
-            <w:r>
-              <w:rPr>
-                <w:sz w:val="20"/>
-              </w:rPr>
-            </w:r>
+            <w:r/>
             <w:r>
               <w:rPr>
                 <w:rFonts w:ascii="Times New Roman" w:hAnsi="Times New Roman"/>
                 <w:b w:val="0"/>
                 <w:color w:val="202A32"/>
-                <w:sz w:val="20"/>
+                <w:sz w:val="16"/>
               </w:rPr>
               <w:t>Supplementary dense-fraction sweep</w:t>
             </w:r>
@@ -4312,17 +3956,13 @@
               <w:spacing w:after="0" w:line="240" w:lineRule="auto"/>
               <w:jc w:val="center"/>
             </w:pPr>
-            <w:r>
-              <w:rPr>
-                <w:sz w:val="20"/>
-              </w:rPr>
-            </w:r>
+            <w:r/>
             <w:r>
               <w:rPr>
                 <w:rFonts w:ascii="Times New Roman" w:hAnsi="Times New Roman"/>
                 <w:b w:val="0"/>
                 <w:color w:val="202A32"/>
-                <w:sz w:val="20"/>
+                <w:sz w:val="16"/>
               </w:rPr>
               <w:t>Calibration 9101; evaluation 9201; spatial masks 31001–31005</w:t>
             </w:r>
@@ -4344,17 +3984,13 @@
               <w:spacing w:after="0" w:line="240" w:lineRule="auto"/>
               <w:jc w:val="center"/>
             </w:pPr>
-            <w:r>
-              <w:rPr>
-                <w:sz w:val="20"/>
-              </w:rPr>
-            </w:r>
+            <w:r/>
             <w:r>
               <w:rPr>
                 <w:rFonts w:ascii="Times New Roman" w:hAnsi="Times New Roman"/>
                 <w:b w:val="0"/>
                 <w:color w:val="202A32"/>
-                <w:sz w:val="20"/>
+                <w:sz w:val="16"/>
               </w:rPr>
               <w:t>Gaussian seeds 32001–32003; average within each mask first, then summarize across five masks.</w:t>
             </w:r>
@@ -4377,17 +4013,13 @@
             <w:pPr>
               <w:spacing w:after="0" w:line="240" w:lineRule="auto"/>
             </w:pPr>
-            <w:r>
-              <w:rPr>
-                <w:sz w:val="20"/>
-              </w:rPr>
-            </w:r>
+            <w:r/>
             <w:r>
               <w:rPr>
                 <w:rFonts w:ascii="Times New Roman" w:hAnsi="Times New Roman"/>
                 <w:b w:val="0"/>
                 <w:color w:val="202A32"/>
-                <w:sz w:val="20"/>
+                <w:sz w:val="16"/>
               </w:rPr>
               <w:t>Strict confirmatory compression</w:t>
             </w:r>
@@ -4409,17 +4041,13 @@
               <w:spacing w:after="0" w:line="240" w:lineRule="auto"/>
               <w:jc w:val="center"/>
             </w:pPr>
-            <w:r>
-              <w:rPr>
-                <w:sz w:val="20"/>
-              </w:rPr>
-            </w:r>
+            <w:r/>
             <w:r>
               <w:rPr>
                 <w:rFonts w:ascii="Times New Roman" w:hAnsi="Times New Roman"/>
                 <w:b w:val="0"/>
                 <w:color w:val="202A32"/>
-                <w:sz w:val="20"/>
+                <w:sz w:val="16"/>
               </w:rPr>
               <w:t>Calibration 9101; evaluation 9201</w:t>
             </w:r>
@@ -4441,17 +4069,13 @@
               <w:spacing w:after="0" w:line="240" w:lineRule="auto"/>
               <w:jc w:val="center"/>
             </w:pPr>
-            <w:r>
-              <w:rPr>
-                <w:sz w:val="20"/>
-              </w:rPr>
-            </w:r>
+            <w:r/>
             <w:r>
               <w:rPr>
                 <w:rFonts w:ascii="Times New Roman" w:hAnsi="Times New Roman"/>
                 <w:b w:val="0"/>
                 <w:color w:val="202A32"/>
-                <w:sz w:val="20"/>
+                <w:sz w:val="16"/>
               </w:rPr>
               <w:t>Random-pruning and random-grouping seeds 31001–31005; paired method comparisons use the shared held-out image cohort.</w:t>
             </w:r>
@@ -4474,17 +4098,13 @@
             <w:pPr>
               <w:spacing w:after="0" w:line="240" w:lineRule="auto"/>
             </w:pPr>
-            <w:r>
-              <w:rPr>
-                <w:sz w:val="20"/>
-              </w:rPr>
-            </w:r>
+            <w:r/>
             <w:r>
               <w:rPr>
                 <w:rFonts w:ascii="Times New Roman" w:hAnsi="Times New Roman"/>
                 <w:b w:val="0"/>
                 <w:color w:val="202A32"/>
-                <w:sz w:val="20"/>
+                <w:sz w:val="16"/>
               </w:rPr>
               <w:t>Held-out classifier-carrier evaluation</w:t>
             </w:r>
@@ -4506,17 +4126,13 @@
               <w:spacing w:after="0" w:line="240" w:lineRule="auto"/>
               <w:jc w:val="center"/>
             </w:pPr>
-            <w:r>
-              <w:rPr>
-                <w:sz w:val="20"/>
-              </w:rPr>
-            </w:r>
+            <w:r/>
             <w:r>
               <w:rPr>
                 <w:rFonts w:ascii="Times New Roman" w:hAnsi="Times New Roman"/>
                 <w:b w:val="0"/>
                 <w:color w:val="202A32"/>
-                <w:sz w:val="20"/>
+                <w:sz w:val="16"/>
               </w:rPr>
               <w:t>Calibration 7101 (500 images); evaluation 9201 (1,000 images)</w:t>
             </w:r>
@@ -4538,17 +4154,13 @@
               <w:spacing w:after="0" w:line="240" w:lineRule="auto"/>
               <w:jc w:val="center"/>
             </w:pPr>
-            <w:r>
-              <w:rPr>
-                <w:sz w:val="20"/>
-              </w:rPr>
-            </w:r>
+            <w:r/>
             <w:r>
               <w:rPr>
                 <w:rFonts w:ascii="Times New Roman" w:hAnsi="Times New Roman"/>
                 <w:b w:val="0"/>
                 <w:color w:val="202A32"/>
-                <w:sz w:val="20"/>
+                <w:sz w:val="16"/>
               </w:rPr>
               <w:t>Fixed cohort; no seed-level averaging.</w:t>
             </w:r>
@@ -4565,14 +4177,13 @@
       <w:pPr>
         <w:pStyle w:val="Heading1"/>
         <w:keepNext/>
-        <w:jc w:val="both"/>
       </w:pPr>
       <w:r>
         <w:rPr>
           <w:rFonts w:ascii="Times New Roman" w:hAnsi="Times New Roman"/>
           <w:b/>
           <w:color w:val="000000"/>
-          <w:sz w:val="20"/>
+          <w:sz w:val="28"/>
         </w:rPr>
         <w:t>S11. Cross-architecture mechanistic evidence</w:t>
       </w:r>
@@ -4580,7 +4191,6 @@
     <w:p>
       <w:pPr>
         <w:spacing w:after="100" w:line="259" w:lineRule="auto"/>
-        <w:jc w:val="both"/>
       </w:pPr>
       <w:r>
         <w:rPr>
@@ -4620,7 +4230,6 @@
         <w:keepNext/>
         <w:keepLines/>
         <w:spacing w:after="100" w:line="259" w:lineRule="auto"/>
-        <w:jc w:val="both"/>
       </w:pPr>
       <w:r>
         <w:rPr>
@@ -4791,17 +4400,13 @@
               <w:spacing w:after="0" w:line="240" w:lineRule="auto"/>
               <w:jc w:val="center"/>
             </w:pPr>
-            <w:r>
-              <w:rPr>
-                <w:sz w:val="20"/>
-              </w:rPr>
-            </w:r>
+            <w:r/>
             <w:r>
               <w:rPr>
                 <w:rFonts w:ascii="Times New Roman" w:hAnsi="Times New Roman"/>
                 <w:b/>
                 <w:color w:val="17232D"/>
-                <w:sz w:val="20"/>
+                <w:sz w:val="15"/>
               </w:rPr>
               <w:t>Architecture</w:t>
             </w:r>
@@ -4824,17 +4429,13 @@
               <w:spacing w:after="0" w:line="240" w:lineRule="auto"/>
               <w:jc w:val="center"/>
             </w:pPr>
-            <w:r>
-              <w:rPr>
-                <w:sz w:val="20"/>
-              </w:rPr>
-            </w:r>
+            <w:r/>
             <w:r>
               <w:rPr>
                 <w:rFonts w:ascii="Times New Roman" w:hAnsi="Times New Roman"/>
                 <w:b/>
                 <w:color w:val="17232D"/>
-                <w:sz w:val="20"/>
+                <w:sz w:val="15"/>
               </w:rPr>
               <w:t>D, patches</w:t>
             </w:r>
@@ -4857,17 +4458,13 @@
               <w:spacing w:after="0" w:line="240" w:lineRule="auto"/>
               <w:jc w:val="center"/>
             </w:pPr>
-            <w:r>
-              <w:rPr>
-                <w:sz w:val="20"/>
-              </w:rPr>
-            </w:r>
+            <w:r/>
             <w:r>
               <w:rPr>
                 <w:rFonts w:ascii="Times New Roman" w:hAnsi="Times New Roman"/>
                 <w:b/>
                 <w:color w:val="17232D"/>
-                <w:sz w:val="20"/>
+                <w:sz w:val="15"/>
               </w:rPr>
               <w:t>PC1 / PCbottom sensitivity, depth 8</w:t>
             </w:r>
@@ -4890,17 +4487,13 @@
               <w:spacing w:after="0" w:line="240" w:lineRule="auto"/>
               <w:jc w:val="center"/>
             </w:pPr>
-            <w:r>
-              <w:rPr>
-                <w:sz w:val="20"/>
-              </w:rPr>
-            </w:r>
+            <w:r/>
             <w:r>
               <w:rPr>
                 <w:rFonts w:ascii="Times New Roman" w:hAnsi="Times New Roman"/>
                 <w:b/>
                 <w:color w:val="17232D"/>
-                <w:sz w:val="20"/>
+                <w:sz w:val="15"/>
               </w:rPr>
               <w:t>Relative bottom-PC eigengap, depth 8</w:t>
             </w:r>
@@ -4923,17 +4516,13 @@
               <w:spacing w:after="0" w:line="240" w:lineRule="auto"/>
               <w:jc w:val="center"/>
             </w:pPr>
-            <w:r>
-              <w:rPr>
-                <w:sz w:val="20"/>
-              </w:rPr>
-            </w:r>
+            <w:r/>
             <w:r>
               <w:rPr>
                 <w:rFonts w:ascii="Times New Roman" w:hAnsi="Times New Roman"/>
                 <w:b/>
                 <w:color w:val="17232D"/>
-                <w:sz w:val="20"/>
+                <w:sz w:val="15"/>
               </w:rPr>
               <w:t>Near-null fraction, depth 5 → 10</w:t>
             </w:r>
@@ -4956,17 +4545,13 @@
               <w:spacing w:after="0" w:line="240" w:lineRule="auto"/>
               <w:jc w:val="center"/>
             </w:pPr>
-            <w:r>
-              <w:rPr>
-                <w:sz w:val="20"/>
-              </w:rPr>
-            </w:r>
+            <w:r/>
             <w:r>
               <w:rPr>
                 <w:rFonts w:ascii="Times New Roman" w:hAnsi="Times New Roman"/>
                 <w:b/>
                 <w:color w:val="17232D"/>
-                <w:sz w:val="20"/>
+                <w:sz w:val="15"/>
               </w:rPr>
               <w:t>Effective rank / D, depth 5 → 10</w:t>
             </w:r>
@@ -4989,17 +4574,13 @@
               <w:spacing w:after="0" w:line="240" w:lineRule="auto"/>
               <w:jc w:val="center"/>
             </w:pPr>
-            <w:r>
-              <w:rPr>
-                <w:sz w:val="20"/>
-              </w:rPr>
-            </w:r>
+            <w:r/>
             <w:r>
               <w:rPr>
                 <w:rFonts w:ascii="Times New Roman" w:hAnsi="Times New Roman"/>
                 <w:b/>
                 <w:color w:val="17232D"/>
-                <w:sz w:val="20"/>
+                <w:sz w:val="15"/>
               </w:rPr>
               <w:t>Depth-10 near-null count, 10⁻⁴/10⁻²</w:t>
             </w:r>
@@ -5022,17 +4603,13 @@
             <w:pPr>
               <w:spacing w:after="0" w:line="240" w:lineRule="auto"/>
             </w:pPr>
-            <w:r>
-              <w:rPr>
-                <w:sz w:val="20"/>
-              </w:rPr>
-            </w:r>
+            <w:r/>
             <w:r>
               <w:rPr>
                 <w:rFonts w:ascii="Times New Roman" w:hAnsi="Times New Roman"/>
                 <w:b w:val="0"/>
                 <w:color w:val="202A32"/>
-                <w:sz w:val="20"/>
+                <w:sz w:val="15"/>
               </w:rPr>
               <w:t>DeiT-Tiny</w:t>
             </w:r>
@@ -5054,17 +4631,13 @@
               <w:spacing w:after="0" w:line="240" w:lineRule="auto"/>
               <w:jc w:val="center"/>
             </w:pPr>
-            <w:r>
-              <w:rPr>
-                <w:sz w:val="20"/>
-              </w:rPr>
-            </w:r>
+            <w:r/>
             <w:r>
               <w:rPr>
                 <w:rFonts w:ascii="Times New Roman" w:hAnsi="Times New Roman"/>
                 <w:b w:val="0"/>
                 <w:color w:val="202A32"/>
-                <w:sz w:val="20"/>
+                <w:sz w:val="15"/>
               </w:rPr>
               <w:t>192, 196</w:t>
             </w:r>
@@ -5086,17 +4659,13 @@
               <w:spacing w:after="0" w:line="240" w:lineRule="auto"/>
               <w:jc w:val="center"/>
             </w:pPr>
-            <w:r>
-              <w:rPr>
-                <w:sz w:val="20"/>
-              </w:rPr>
-            </w:r>
+            <w:r/>
             <w:r>
               <w:rPr>
                 <w:rFonts w:ascii="Times New Roman" w:hAnsi="Times New Roman"/>
                 <w:b w:val="0"/>
                 <w:color w:val="202A32"/>
-                <w:sz w:val="20"/>
+                <w:sz w:val="15"/>
               </w:rPr>
               <w:t>0.0891</w:t>
             </w:r>
@@ -5118,17 +4687,13 @@
               <w:spacing w:after="0" w:line="240" w:lineRule="auto"/>
               <w:jc w:val="center"/>
             </w:pPr>
-            <w:r>
-              <w:rPr>
-                <w:sz w:val="20"/>
-              </w:rPr>
-            </w:r>
+            <w:r/>
             <w:r>
               <w:rPr>
                 <w:rFonts w:ascii="Times New Roman" w:hAnsi="Times New Roman"/>
                 <w:b w:val="0"/>
                 <w:color w:val="202A32"/>
-                <w:sz w:val="20"/>
+                <w:sz w:val="15"/>
               </w:rPr>
               <w:t>2.58 × 10⁻³</w:t>
             </w:r>
@@ -5150,17 +4715,13 @@
               <w:spacing w:after="0" w:line="240" w:lineRule="auto"/>
               <w:jc w:val="center"/>
             </w:pPr>
-            <w:r>
-              <w:rPr>
-                <w:sz w:val="20"/>
-              </w:rPr>
-            </w:r>
+            <w:r/>
             <w:r>
               <w:rPr>
                 <w:rFonts w:ascii="Times New Roman" w:hAnsi="Times New Roman"/>
                 <w:b w:val="0"/>
                 <w:color w:val="202A32"/>
-                <w:sz w:val="20"/>
+                <w:sz w:val="15"/>
               </w:rPr>
               <w:t>0.52% → 31.77%</w:t>
             </w:r>
@@ -5182,17 +4743,13 @@
               <w:spacing w:after="0" w:line="240" w:lineRule="auto"/>
               <w:jc w:val="center"/>
             </w:pPr>
-            <w:r>
-              <w:rPr>
-                <w:sz w:val="20"/>
-              </w:rPr>
-            </w:r>
+            <w:r/>
             <w:r>
               <w:rPr>
                 <w:rFonts w:ascii="Times New Roman" w:hAnsi="Times New Roman"/>
                 <w:b w:val="0"/>
                 <w:color w:val="202A32"/>
-                <w:sz w:val="20"/>
+                <w:sz w:val="15"/>
               </w:rPr>
               <w:t>0.541 → 0.125</w:t>
             </w:r>
@@ -5214,17 +4771,13 @@
               <w:spacing w:after="0" w:line="240" w:lineRule="auto"/>
               <w:jc w:val="center"/>
             </w:pPr>
-            <w:r>
-              <w:rPr>
-                <w:sz w:val="20"/>
-              </w:rPr>
-            </w:r>
+            <w:r/>
             <w:r>
               <w:rPr>
                 <w:rFonts w:ascii="Times New Roman" w:hAnsi="Times New Roman"/>
                 <w:b w:val="0"/>
                 <w:color w:val="202A32"/>
-                <w:sz w:val="20"/>
+                <w:sz w:val="15"/>
               </w:rPr>
               <w:t>1 / 154</w:t>
             </w:r>
@@ -5247,17 +4800,13 @@
             <w:pPr>
               <w:spacing w:after="0" w:line="240" w:lineRule="auto"/>
             </w:pPr>
-            <w:r>
-              <w:rPr>
-                <w:sz w:val="20"/>
-              </w:rPr>
-            </w:r>
+            <w:r/>
             <w:r>
               <w:rPr>
                 <w:rFonts w:ascii="Times New Roman" w:hAnsi="Times New Roman"/>
                 <w:b w:val="0"/>
                 <w:color w:val="202A32"/>
-                <w:sz w:val="20"/>
+                <w:sz w:val="15"/>
               </w:rPr>
               <w:t>DeiT-Small</w:t>
             </w:r>
@@ -5279,17 +4828,13 @@
               <w:spacing w:after="0" w:line="240" w:lineRule="auto"/>
               <w:jc w:val="center"/>
             </w:pPr>
-            <w:r>
-              <w:rPr>
-                <w:sz w:val="20"/>
-              </w:rPr>
-            </w:r>
+            <w:r/>
             <w:r>
               <w:rPr>
                 <w:rFonts w:ascii="Times New Roman" w:hAnsi="Times New Roman"/>
                 <w:b w:val="0"/>
                 <w:color w:val="202A32"/>
-                <w:sz w:val="20"/>
+                <w:sz w:val="15"/>
               </w:rPr>
               <w:t>384, 196</w:t>
             </w:r>
@@ -5311,17 +4856,13 @@
               <w:spacing w:after="0" w:line="240" w:lineRule="auto"/>
               <w:jc w:val="center"/>
             </w:pPr>
-            <w:r>
-              <w:rPr>
-                <w:sz w:val="20"/>
-              </w:rPr>
-            </w:r>
+            <w:r/>
             <w:r>
               <w:rPr>
                 <w:rFonts w:ascii="Times New Roman" w:hAnsi="Times New Roman"/>
                 <w:b w:val="0"/>
                 <w:color w:val="202A32"/>
-                <w:sz w:val="20"/>
+                <w:sz w:val="15"/>
               </w:rPr>
               <w:t>0.0409</w:t>
             </w:r>
@@ -5343,17 +4884,13 @@
               <w:spacing w:after="0" w:line="240" w:lineRule="auto"/>
               <w:jc w:val="center"/>
             </w:pPr>
-            <w:r>
-              <w:rPr>
-                <w:sz w:val="20"/>
-              </w:rPr>
-            </w:r>
+            <w:r/>
             <w:r>
               <w:rPr>
                 <w:rFonts w:ascii="Times New Roman" w:hAnsi="Times New Roman"/>
                 <w:b w:val="0"/>
                 <w:color w:val="202A32"/>
-                <w:sz w:val="20"/>
+                <w:sz w:val="15"/>
               </w:rPr>
               <w:t>3.52 × 10⁻⁴</w:t>
             </w:r>
@@ -5375,17 +4912,13 @@
               <w:spacing w:after="0" w:line="240" w:lineRule="auto"/>
               <w:jc w:val="center"/>
             </w:pPr>
-            <w:r>
-              <w:rPr>
-                <w:sz w:val="20"/>
-              </w:rPr>
-            </w:r>
+            <w:r/>
             <w:r>
               <w:rPr>
                 <w:rFonts w:ascii="Times New Roman" w:hAnsi="Times New Roman"/>
                 <w:b w:val="0"/>
                 <w:color w:val="202A32"/>
-                <w:sz w:val="20"/>
+                <w:sz w:val="15"/>
               </w:rPr>
               <w:t>0.26% → 57.03%</w:t>
             </w:r>
@@ -5407,17 +4940,13 @@
               <w:spacing w:after="0" w:line="240" w:lineRule="auto"/>
               <w:jc w:val="center"/>
             </w:pPr>
-            <w:r>
-              <w:rPr>
-                <w:sz w:val="20"/>
-              </w:rPr>
-            </w:r>
+            <w:r/>
             <w:r>
               <w:rPr>
                 <w:rFonts w:ascii="Times New Roman" w:hAnsi="Times New Roman"/>
                 <w:b w:val="0"/>
                 <w:color w:val="202A32"/>
-                <w:sz w:val="20"/>
+                <w:sz w:val="15"/>
               </w:rPr>
               <w:t>0.467 → 0.114</w:t>
             </w:r>
@@ -5439,17 +4968,13 @@
               <w:spacing w:after="0" w:line="240" w:lineRule="auto"/>
               <w:jc w:val="center"/>
             </w:pPr>
-            <w:r>
-              <w:rPr>
-                <w:sz w:val="20"/>
-              </w:rPr>
-            </w:r>
+            <w:r/>
             <w:r>
               <w:rPr>
                 <w:rFonts w:ascii="Times New Roman" w:hAnsi="Times New Roman"/>
                 <w:b w:val="0"/>
                 <w:color w:val="202A32"/>
-                <w:sz w:val="20"/>
+                <w:sz w:val="15"/>
               </w:rPr>
               <w:t>47 / 327</w:t>
             </w:r>
@@ -5472,17 +4997,13 @@
             <w:pPr>
               <w:spacing w:after="0" w:line="240" w:lineRule="auto"/>
             </w:pPr>
-            <w:r>
-              <w:rPr>
-                <w:sz w:val="20"/>
-              </w:rPr>
-            </w:r>
+            <w:r/>
             <w:r>
               <w:rPr>
                 <w:rFonts w:ascii="Times New Roman" w:hAnsi="Times New Roman"/>
                 <w:b w:val="0"/>
                 <w:color w:val="202A32"/>
-                <w:sz w:val="20"/>
+                <w:sz w:val="15"/>
               </w:rPr>
               <w:t>ViT-B/16 AugReg</w:t>
             </w:r>
@@ -5504,17 +5025,13 @@
               <w:spacing w:after="0" w:line="240" w:lineRule="auto"/>
               <w:jc w:val="center"/>
             </w:pPr>
-            <w:r>
-              <w:rPr>
-                <w:sz w:val="20"/>
-              </w:rPr>
-            </w:r>
+            <w:r/>
             <w:r>
               <w:rPr>
                 <w:rFonts w:ascii="Times New Roman" w:hAnsi="Times New Roman"/>
                 <w:b w:val="0"/>
                 <w:color w:val="202A32"/>
-                <w:sz w:val="20"/>
+                <w:sz w:val="15"/>
               </w:rPr>
               <w:t>768, 196</w:t>
             </w:r>
@@ -5536,17 +5053,13 @@
               <w:spacing w:after="0" w:line="240" w:lineRule="auto"/>
               <w:jc w:val="center"/>
             </w:pPr>
-            <w:r>
-              <w:rPr>
-                <w:sz w:val="20"/>
-              </w:rPr>
-            </w:r>
+            <w:r/>
             <w:r>
               <w:rPr>
                 <w:rFonts w:ascii="Times New Roman" w:hAnsi="Times New Roman"/>
                 <w:b w:val="0"/>
                 <w:color w:val="202A32"/>
-                <w:sz w:val="20"/>
+                <w:sz w:val="15"/>
               </w:rPr>
               <w:t>65.2</w:t>
             </w:r>
@@ -5568,17 +5081,13 @@
               <w:spacing w:after="0" w:line="240" w:lineRule="auto"/>
               <w:jc w:val="center"/>
             </w:pPr>
-            <w:r>
-              <w:rPr>
-                <w:sz w:val="20"/>
-              </w:rPr>
-            </w:r>
+            <w:r/>
             <w:r>
               <w:rPr>
                 <w:rFonts w:ascii="Times New Roman" w:hAnsi="Times New Roman"/>
                 <w:b w:val="0"/>
                 <w:color w:val="202A32"/>
-                <w:sz w:val="20"/>
+                <w:sz w:val="15"/>
               </w:rPr>
               <w:t>1.53 × 10⁻⁵</w:t>
             </w:r>
@@ -5600,17 +5109,13 @@
               <w:spacing w:after="0" w:line="240" w:lineRule="auto"/>
               <w:jc w:val="center"/>
             </w:pPr>
-            <w:r>
-              <w:rPr>
-                <w:sz w:val="20"/>
-              </w:rPr>
-            </w:r>
+            <w:r/>
             <w:r>
               <w:rPr>
                 <w:rFonts w:ascii="Times New Roman" w:hAnsi="Times New Roman"/>
                 <w:b w:val="0"/>
                 <w:color w:val="202A32"/>
-                <w:sz w:val="20"/>
+                <w:sz w:val="15"/>
               </w:rPr>
               <w:t>0.26% → 49.61%</w:t>
             </w:r>
@@ -5632,17 +5137,13 @@
               <w:spacing w:after="0" w:line="240" w:lineRule="auto"/>
               <w:jc w:val="center"/>
             </w:pPr>
-            <w:r>
-              <w:rPr>
-                <w:sz w:val="20"/>
-              </w:rPr>
-            </w:r>
+            <w:r/>
             <w:r>
               <w:rPr>
                 <w:rFonts w:ascii="Times New Roman" w:hAnsi="Times New Roman"/>
                 <w:b w:val="0"/>
                 <w:color w:val="202A32"/>
-                <w:sz w:val="20"/>
+                <w:sz w:val="15"/>
               </w:rPr>
               <w:t>0.383 → 0.140</w:t>
             </w:r>
@@ -5664,17 +5165,13 @@
               <w:spacing w:after="0" w:line="240" w:lineRule="auto"/>
               <w:jc w:val="center"/>
             </w:pPr>
-            <w:r>
-              <w:rPr>
-                <w:sz w:val="20"/>
-              </w:rPr>
-            </w:r>
+            <w:r/>
             <w:r>
               <w:rPr>
                 <w:rFonts w:ascii="Times New Roman" w:hAnsi="Times New Roman"/>
                 <w:b w:val="0"/>
                 <w:color w:val="202A32"/>
-                <w:sz w:val="20"/>
+                <w:sz w:val="15"/>
               </w:rPr>
               <w:t>41 / 641</w:t>
             </w:r>
@@ -5697,17 +5194,13 @@
             <w:pPr>
               <w:spacing w:after="0" w:line="240" w:lineRule="auto"/>
             </w:pPr>
-            <w:r>
-              <w:rPr>
-                <w:sz w:val="20"/>
-              </w:rPr>
-            </w:r>
+            <w:r/>
             <w:r>
               <w:rPr>
                 <w:rFonts w:ascii="Times New Roman" w:hAnsi="Times New Roman"/>
                 <w:b w:val="0"/>
                 <w:color w:val="202A32"/>
-                <w:sz w:val="20"/>
+                <w:sz w:val="15"/>
               </w:rPr>
               <w:t>DINOv2 ViT-S/14</w:t>
             </w:r>
@@ -5729,17 +5222,13 @@
               <w:spacing w:after="0" w:line="240" w:lineRule="auto"/>
               <w:jc w:val="center"/>
             </w:pPr>
-            <w:r>
-              <w:rPr>
-                <w:sz w:val="20"/>
-              </w:rPr>
-            </w:r>
+            <w:r/>
             <w:r>
               <w:rPr>
                 <w:rFonts w:ascii="Times New Roman" w:hAnsi="Times New Roman"/>
                 <w:b w:val="0"/>
                 <w:color w:val="202A32"/>
-                <w:sz w:val="20"/>
+                <w:sz w:val="15"/>
               </w:rPr>
               <w:t>384, 256</w:t>
             </w:r>
@@ -5761,17 +5250,13 @@
               <w:spacing w:after="0" w:line="240" w:lineRule="auto"/>
               <w:jc w:val="center"/>
             </w:pPr>
-            <w:r>
-              <w:rPr>
-                <w:sz w:val="20"/>
-              </w:rPr>
-            </w:r>
+            <w:r/>
             <w:r>
               <w:rPr>
                 <w:rFonts w:ascii="Times New Roman" w:hAnsi="Times New Roman"/>
                 <w:b w:val="0"/>
                 <w:color w:val="202A32"/>
-                <w:sz w:val="20"/>
+                <w:sz w:val="15"/>
               </w:rPr>
               <w:t>0.199</w:t>
             </w:r>
@@ -5793,17 +5278,13 @@
               <w:spacing w:after="0" w:line="240" w:lineRule="auto"/>
               <w:jc w:val="center"/>
             </w:pPr>
-            <w:r>
-              <w:rPr>
-                <w:sz w:val="20"/>
-              </w:rPr>
-            </w:r>
+            <w:r/>
             <w:r>
               <w:rPr>
                 <w:rFonts w:ascii="Times New Roman" w:hAnsi="Times New Roman"/>
                 <w:b w:val="0"/>
                 <w:color w:val="202A32"/>
-                <w:sz w:val="20"/>
+                <w:sz w:val="15"/>
               </w:rPr>
               <w:t>9.75 × 10⁻⁴</w:t>
             </w:r>
@@ -5825,17 +5306,13 @@
               <w:spacing w:after="0" w:line="240" w:lineRule="auto"/>
               <w:jc w:val="center"/>
             </w:pPr>
-            <w:r>
-              <w:rPr>
-                <w:sz w:val="20"/>
-              </w:rPr>
-            </w:r>
+            <w:r/>
             <w:r>
               <w:rPr>
                 <w:rFonts w:ascii="Times New Roman" w:hAnsi="Times New Roman"/>
                 <w:b w:val="0"/>
                 <w:color w:val="202A32"/>
-                <w:sz w:val="20"/>
+                <w:sz w:val="15"/>
               </w:rPr>
               <w:t>0.26% → 1.56%</w:t>
             </w:r>
@@ -5857,17 +5334,13 @@
               <w:spacing w:after="0" w:line="240" w:lineRule="auto"/>
               <w:jc w:val="center"/>
             </w:pPr>
-            <w:r>
-              <w:rPr>
-                <w:sz w:val="20"/>
-              </w:rPr>
-            </w:r>
+            <w:r/>
             <w:r>
               <w:rPr>
                 <w:rFonts w:ascii="Times New Roman" w:hAnsi="Times New Roman"/>
                 <w:b w:val="0"/>
                 <w:color w:val="202A32"/>
-                <w:sz w:val="20"/>
+                <w:sz w:val="15"/>
               </w:rPr>
               <w:t>0.453 → 0.323</w:t>
             </w:r>
@@ -5889,17 +5362,13 @@
               <w:spacing w:after="0" w:line="240" w:lineRule="auto"/>
               <w:jc w:val="center"/>
             </w:pPr>
-            <w:r>
-              <w:rPr>
-                <w:sz w:val="20"/>
-              </w:rPr>
-            </w:r>
+            <w:r/>
             <w:r>
               <w:rPr>
                 <w:rFonts w:ascii="Times New Roman" w:hAnsi="Times New Roman"/>
                 <w:b w:val="0"/>
                 <w:color w:val="202A32"/>
-                <w:sz w:val="20"/>
+                <w:sz w:val="15"/>
               </w:rPr>
               <w:t>1 / 249</w:t>
             </w:r>
@@ -5915,7 +5384,6 @@
     <w:p>
       <w:pPr>
         <w:spacing w:after="100" w:line="259" w:lineRule="auto"/>
-        <w:jc w:val="both"/>
       </w:pPr>
       <w:r>
         <w:rPr>
@@ -6157,7 +5625,6 @@
     <w:p>
       <w:pPr>
         <w:spacing w:after="100" w:line="259" w:lineRule="auto"/>
-        <w:jc w:val="both"/>
       </w:pPr>
       <w:r>
         <w:rPr>
@@ -6197,9 +5664,6 @@
         <w:jc w:val="center"/>
       </w:pPr>
       <w:r>
-        <w:rPr>
-          <w:sz w:val="20"/>
-        </w:rPr>
         <w:drawing>
           <wp:inline xmlns:a="http://schemas.openxmlformats.org/drawingml/2006/main" xmlns:pic="http://schemas.openxmlformats.org/drawingml/2006/picture">
             <wp:extent cx="6172200" cy="2281858"/>
@@ -6238,7 +5702,6 @@
       <w:pPr>
         <w:keepLines/>
         <w:spacing w:after="100" w:line="259" w:lineRule="auto"/>
-        <w:jc w:val="both"/>
       </w:pPr>
       <w:r>
         <w:rPr>
@@ -6296,7 +5759,6 @@
     <w:p>
       <w:pPr>
         <w:spacing w:after="100" w:line="259" w:lineRule="auto"/>
-        <w:jc w:val="both"/>
       </w:pPr>
       <w:r>
         <w:rPr>
@@ -6339,7 +5801,6 @@
         <w:keepNext/>
         <w:keepLines/>
         <w:spacing w:after="100" w:line="259" w:lineRule="auto"/>
-        <w:jc w:val="both"/>
       </w:pPr>
       <w:r>
         <w:rPr>
@@ -6417,17 +5878,13 @@
               <w:spacing w:after="0" w:line="240" w:lineRule="auto"/>
               <w:jc w:val="center"/>
             </w:pPr>
-            <w:r>
-              <w:rPr>
-                <w:sz w:val="20"/>
-              </w:rPr>
-            </w:r>
+            <w:r/>
             <w:r>
               <w:rPr>
                 <w:rFonts w:ascii="Times New Roman" w:hAnsi="Times New Roman"/>
                 <w:b/>
                 <w:color w:val="17232D"/>
-                <w:sz w:val="20"/>
+                <w:sz w:val="16"/>
               </w:rPr>
               <w:t>Architecture</w:t>
             </w:r>
@@ -6450,17 +5907,13 @@
               <w:spacing w:after="0" w:line="240" w:lineRule="auto"/>
               <w:jc w:val="center"/>
             </w:pPr>
-            <w:r>
-              <w:rPr>
-                <w:sz w:val="20"/>
-              </w:rPr>
-            </w:r>
+            <w:r/>
             <w:r>
               <w:rPr>
                 <w:rFonts w:ascii="Times New Roman" w:hAnsi="Times New Roman"/>
                 <w:b/>
                 <w:color w:val="17232D"/>
-                <w:sz w:val="20"/>
+                <w:sz w:val="16"/>
               </w:rPr>
               <w:t>Operator</w:t>
             </w:r>
@@ -6483,17 +5936,13 @@
               <w:spacing w:after="0" w:line="240" w:lineRule="auto"/>
               <w:jc w:val="center"/>
             </w:pPr>
-            <w:r>
-              <w:rPr>
-                <w:sz w:val="20"/>
-              </w:rPr>
-            </w:r>
+            <w:r/>
             <w:r>
               <w:rPr>
                 <w:rFonts w:ascii="Times New Roman" w:hAnsi="Times New Roman"/>
                 <w:b/>
                 <w:color w:val="17232D"/>
-                <w:sz w:val="20"/>
+                <w:sz w:val="16"/>
               </w:rPr>
               <w:t>Pearson r (95% CI)</w:t>
             </w:r>
@@ -6516,17 +5965,13 @@
               <w:spacing w:after="0" w:line="240" w:lineRule="auto"/>
               <w:jc w:val="center"/>
             </w:pPr>
-            <w:r>
-              <w:rPr>
-                <w:sz w:val="20"/>
-              </w:rPr>
-            </w:r>
+            <w:r/>
             <w:r>
               <w:rPr>
                 <w:rFonts w:ascii="Times New Roman" w:hAnsi="Times New Roman"/>
                 <w:b/>
                 <w:color w:val="17232D"/>
-                <w:sz w:val="20"/>
+                <w:sz w:val="16"/>
               </w:rPr>
               <w:t>Spearman ρ (95% CI)</w:t>
             </w:r>
@@ -6549,17 +5994,13 @@
             <w:pPr>
               <w:spacing w:after="0" w:line="240" w:lineRule="auto"/>
             </w:pPr>
-            <w:r>
-              <w:rPr>
-                <w:sz w:val="20"/>
-              </w:rPr>
-            </w:r>
+            <w:r/>
             <w:r>
               <w:rPr>
                 <w:rFonts w:ascii="Times New Roman" w:hAnsi="Times New Roman"/>
                 <w:b w:val="0"/>
                 <w:color w:val="202A32"/>
-                <w:sz w:val="20"/>
+                <w:sz w:val="16"/>
               </w:rPr>
               <w:t>DeiT-Tiny</w:t>
             </w:r>
@@ -6581,17 +6022,13 @@
               <w:spacing w:after="0" w:line="240" w:lineRule="auto"/>
               <w:jc w:val="center"/>
             </w:pPr>
-            <w:r>
-              <w:rPr>
-                <w:sz w:val="20"/>
-              </w:rPr>
-            </w:r>
+            <w:r/>
             <w:r>
               <w:rPr>
                 <w:rFonts w:ascii="Times New Roman" w:hAnsi="Times New Roman"/>
                 <w:b w:val="0"/>
                 <w:color w:val="202A32"/>
-                <w:sz w:val="20"/>
+                <w:sz w:val="16"/>
               </w:rPr>
               <w:t>Single-block A₈</w:t>
             </w:r>
@@ -6613,17 +6050,13 @@
               <w:spacing w:after="0" w:line="240" w:lineRule="auto"/>
               <w:jc w:val="center"/>
             </w:pPr>
-            <w:r>
-              <w:rPr>
-                <w:sz w:val="20"/>
-              </w:rPr>
-            </w:r>
+            <w:r/>
             <w:r>
               <w:rPr>
                 <w:rFonts w:ascii="Times New Roman" w:hAnsi="Times New Roman"/>
                 <w:b w:val="0"/>
                 <w:color w:val="202A32"/>
-                <w:sz w:val="20"/>
+                <w:sz w:val="16"/>
               </w:rPr>
               <w:t>0.806 [0.773, 0.843]</w:t>
             </w:r>
@@ -6645,17 +6078,13 @@
               <w:spacing w:after="0" w:line="240" w:lineRule="auto"/>
               <w:jc w:val="center"/>
             </w:pPr>
-            <w:r>
-              <w:rPr>
-                <w:sz w:val="20"/>
-              </w:rPr>
-            </w:r>
+            <w:r/>
             <w:r>
               <w:rPr>
                 <w:rFonts w:ascii="Times New Roman" w:hAnsi="Times New Roman"/>
                 <w:b w:val="0"/>
                 <w:color w:val="202A32"/>
-                <w:sz w:val="20"/>
+                <w:sz w:val="16"/>
               </w:rPr>
               <w:t>0.720 [0.681, 0.757]</w:t>
             </w:r>
@@ -6678,17 +6107,13 @@
             <w:pPr>
               <w:spacing w:after="0" w:line="240" w:lineRule="auto"/>
             </w:pPr>
-            <w:r>
-              <w:rPr>
-                <w:sz w:val="20"/>
-              </w:rPr>
-            </w:r>
+            <w:r/>
             <w:r>
               <w:rPr>
                 <w:rFonts w:ascii="Times New Roman" w:hAnsi="Times New Roman"/>
                 <w:b w:val="0"/>
                 <w:color w:val="202A32"/>
-                <w:sz w:val="20"/>
+                <w:sz w:val="16"/>
               </w:rPr>
               <w:t>DeiT-Tiny</w:t>
             </w:r>
@@ -6710,17 +6135,13 @@
               <w:spacing w:after="0" w:line="240" w:lineRule="auto"/>
               <w:jc w:val="center"/>
             </w:pPr>
-            <w:r>
-              <w:rPr>
-                <w:sz w:val="20"/>
-              </w:rPr>
-            </w:r>
+            <w:r/>
             <w:r>
               <w:rPr>
                 <w:rFonts w:ascii="Times New Roman" w:hAnsi="Times New Roman"/>
                 <w:b w:val="0"/>
                 <w:color w:val="202A32"/>
-                <w:sz w:val="20"/>
+                <w:sz w:val="16"/>
               </w:rPr>
               <w:t>End-to-end J₈→L</w:t>
             </w:r>
@@ -6742,17 +6163,13 @@
               <w:spacing w:after="0" w:line="240" w:lineRule="auto"/>
               <w:jc w:val="center"/>
             </w:pPr>
-            <w:r>
-              <w:rPr>
-                <w:sz w:val="20"/>
-              </w:rPr>
-            </w:r>
+            <w:r/>
             <w:r>
               <w:rPr>
                 <w:rFonts w:ascii="Times New Roman" w:hAnsi="Times New Roman"/>
                 <w:b w:val="0"/>
                 <w:color w:val="202A32"/>
-                <w:sz w:val="20"/>
+                <w:sz w:val="16"/>
               </w:rPr>
               <w:t>0.964 [0.955, 0.974]</w:t>
             </w:r>
@@ -6774,17 +6191,13 @@
               <w:spacing w:after="0" w:line="240" w:lineRule="auto"/>
               <w:jc w:val="center"/>
             </w:pPr>
-            <w:r>
-              <w:rPr>
-                <w:sz w:val="20"/>
-              </w:rPr>
-            </w:r>
+            <w:r/>
             <w:r>
               <w:rPr>
                 <w:rFonts w:ascii="Times New Roman" w:hAnsi="Times New Roman"/>
                 <w:b w:val="0"/>
                 <w:color w:val="202A32"/>
-                <w:sz w:val="20"/>
+                <w:sz w:val="16"/>
               </w:rPr>
               <w:t>0.964 [0.951, 0.973]</w:t>
             </w:r>
@@ -6807,17 +6220,13 @@
             <w:pPr>
               <w:spacing w:after="0" w:line="240" w:lineRule="auto"/>
             </w:pPr>
-            <w:r>
-              <w:rPr>
-                <w:sz w:val="20"/>
-              </w:rPr>
-            </w:r>
+            <w:r/>
             <w:r>
               <w:rPr>
                 <w:rFonts w:ascii="Times New Roman" w:hAnsi="Times New Roman"/>
                 <w:b w:val="0"/>
                 <w:color w:val="202A32"/>
-                <w:sz w:val="20"/>
+                <w:sz w:val="16"/>
               </w:rPr>
               <w:t>DeiT-Small</w:t>
             </w:r>
@@ -6839,17 +6248,13 @@
               <w:spacing w:after="0" w:line="240" w:lineRule="auto"/>
               <w:jc w:val="center"/>
             </w:pPr>
-            <w:r>
-              <w:rPr>
-                <w:sz w:val="20"/>
-              </w:rPr>
-            </w:r>
+            <w:r/>
             <w:r>
               <w:rPr>
                 <w:rFonts w:ascii="Times New Roman" w:hAnsi="Times New Roman"/>
                 <w:b w:val="0"/>
                 <w:color w:val="202A32"/>
-                <w:sz w:val="20"/>
+                <w:sz w:val="16"/>
               </w:rPr>
               <w:t>Single-block A₈</w:t>
             </w:r>
@@ -6871,17 +6276,13 @@
               <w:spacing w:after="0" w:line="240" w:lineRule="auto"/>
               <w:jc w:val="center"/>
             </w:pPr>
-            <w:r>
-              <w:rPr>
-                <w:sz w:val="20"/>
-              </w:rPr>
-            </w:r>
+            <w:r/>
             <w:r>
               <w:rPr>
                 <w:rFonts w:ascii="Times New Roman" w:hAnsi="Times New Roman"/>
                 <w:b w:val="0"/>
                 <w:color w:val="202A32"/>
-                <w:sz w:val="20"/>
+                <w:sz w:val="16"/>
               </w:rPr>
               <w:t>0.753 [0.719, 0.790]</w:t>
             </w:r>
@@ -6903,17 +6304,13 @@
               <w:spacing w:after="0" w:line="240" w:lineRule="auto"/>
               <w:jc w:val="center"/>
             </w:pPr>
-            <w:r>
-              <w:rPr>
-                <w:sz w:val="20"/>
-              </w:rPr>
-            </w:r>
+            <w:r/>
             <w:r>
               <w:rPr>
                 <w:rFonts w:ascii="Times New Roman" w:hAnsi="Times New Roman"/>
                 <w:b w:val="0"/>
                 <w:color w:val="202A32"/>
-                <w:sz w:val="20"/>
+                <w:sz w:val="16"/>
               </w:rPr>
               <w:t>0.735 [0.696, 0.772]</w:t>
             </w:r>
@@ -6936,17 +6333,13 @@
             <w:pPr>
               <w:spacing w:after="0" w:line="240" w:lineRule="auto"/>
             </w:pPr>
-            <w:r>
-              <w:rPr>
-                <w:sz w:val="20"/>
-              </w:rPr>
-            </w:r>
+            <w:r/>
             <w:r>
               <w:rPr>
                 <w:rFonts w:ascii="Times New Roman" w:hAnsi="Times New Roman"/>
                 <w:b w:val="0"/>
                 <w:color w:val="202A32"/>
-                <w:sz w:val="20"/>
+                <w:sz w:val="16"/>
               </w:rPr>
               <w:t>DeiT-Small</w:t>
             </w:r>
@@ -6968,17 +6361,13 @@
               <w:spacing w:after="0" w:line="240" w:lineRule="auto"/>
               <w:jc w:val="center"/>
             </w:pPr>
-            <w:r>
-              <w:rPr>
-                <w:sz w:val="20"/>
-              </w:rPr>
-            </w:r>
+            <w:r/>
             <w:r>
               <w:rPr>
                 <w:rFonts w:ascii="Times New Roman" w:hAnsi="Times New Roman"/>
                 <w:b w:val="0"/>
                 <w:color w:val="202A32"/>
-                <w:sz w:val="20"/>
+                <w:sz w:val="16"/>
               </w:rPr>
               <w:t>End-to-end J₈→L</w:t>
             </w:r>
@@ -7000,17 +6389,13 @@
               <w:spacing w:after="0" w:line="240" w:lineRule="auto"/>
               <w:jc w:val="center"/>
             </w:pPr>
-            <w:r>
-              <w:rPr>
-                <w:sz w:val="20"/>
-              </w:rPr>
-            </w:r>
+            <w:r/>
             <w:r>
               <w:rPr>
                 <w:rFonts w:ascii="Times New Roman" w:hAnsi="Times New Roman"/>
                 <w:b w:val="0"/>
                 <w:color w:val="202A32"/>
-                <w:sz w:val="20"/>
+                <w:sz w:val="16"/>
               </w:rPr>
               <w:t>0.975 [0.966, 0.983]</w:t>
             </w:r>
@@ -7032,17 +6417,13 @@
               <w:spacing w:after="0" w:line="240" w:lineRule="auto"/>
               <w:jc w:val="center"/>
             </w:pPr>
-            <w:r>
-              <w:rPr>
-                <w:sz w:val="20"/>
-              </w:rPr>
-            </w:r>
+            <w:r/>
             <w:r>
               <w:rPr>
                 <w:rFonts w:ascii="Times New Roman" w:hAnsi="Times New Roman"/>
                 <w:b w:val="0"/>
                 <w:color w:val="202A32"/>
-                <w:sz w:val="20"/>
+                <w:sz w:val="16"/>
               </w:rPr>
               <w:t>0.945 [0.932, 0.958]</w:t>
             </w:r>
@@ -7065,17 +6446,13 @@
             <w:pPr>
               <w:spacing w:after="0" w:line="240" w:lineRule="auto"/>
             </w:pPr>
-            <w:r>
-              <w:rPr>
-                <w:sz w:val="20"/>
-              </w:rPr>
-            </w:r>
+            <w:r/>
             <w:r>
               <w:rPr>
                 <w:rFonts w:ascii="Times New Roman" w:hAnsi="Times New Roman"/>
                 <w:b w:val="0"/>
                 <w:color w:val="202A32"/>
-                <w:sz w:val="20"/>
+                <w:sz w:val="16"/>
               </w:rPr>
               <w:t>ViT-B/16 AugReg</w:t>
             </w:r>
@@ -7097,17 +6474,13 @@
               <w:spacing w:after="0" w:line="240" w:lineRule="auto"/>
               <w:jc w:val="center"/>
             </w:pPr>
-            <w:r>
-              <w:rPr>
-                <w:sz w:val="20"/>
-              </w:rPr>
-            </w:r>
+            <w:r/>
             <w:r>
               <w:rPr>
                 <w:rFonts w:ascii="Times New Roman" w:hAnsi="Times New Roman"/>
                 <w:b w:val="0"/>
                 <w:color w:val="202A32"/>
-                <w:sz w:val="20"/>
+                <w:sz w:val="16"/>
               </w:rPr>
               <w:t>Single-block A₈</w:t>
             </w:r>
@@ -7129,17 +6502,13 @@
               <w:spacing w:after="0" w:line="240" w:lineRule="auto"/>
               <w:jc w:val="center"/>
             </w:pPr>
-            <w:r>
-              <w:rPr>
-                <w:sz w:val="20"/>
-              </w:rPr>
-            </w:r>
+            <w:r/>
             <w:r>
               <w:rPr>
                 <w:rFonts w:ascii="Times New Roman" w:hAnsi="Times New Roman"/>
                 <w:b w:val="0"/>
                 <w:color w:val="202A32"/>
-                <w:sz w:val="20"/>
+                <w:sz w:val="16"/>
               </w:rPr>
               <w:t>0.757 [0.728, 0.786]</w:t>
             </w:r>
@@ -7161,17 +6530,13 @@
               <w:spacing w:after="0" w:line="240" w:lineRule="auto"/>
               <w:jc w:val="center"/>
             </w:pPr>
-            <w:r>
-              <w:rPr>
-                <w:sz w:val="20"/>
-              </w:rPr>
-            </w:r>
+            <w:r/>
             <w:r>
               <w:rPr>
                 <w:rFonts w:ascii="Times New Roman" w:hAnsi="Times New Roman"/>
                 <w:b w:val="0"/>
                 <w:color w:val="202A32"/>
-                <w:sz w:val="20"/>
+                <w:sz w:val="16"/>
               </w:rPr>
               <w:t>0.725 [0.684, 0.766]</w:t>
             </w:r>
@@ -7194,17 +6559,13 @@
             <w:pPr>
               <w:spacing w:after="0" w:line="240" w:lineRule="auto"/>
             </w:pPr>
-            <w:r>
-              <w:rPr>
-                <w:sz w:val="20"/>
-              </w:rPr>
-            </w:r>
+            <w:r/>
             <w:r>
               <w:rPr>
                 <w:rFonts w:ascii="Times New Roman" w:hAnsi="Times New Roman"/>
                 <w:b w:val="0"/>
                 <w:color w:val="202A32"/>
-                <w:sz w:val="20"/>
+                <w:sz w:val="16"/>
               </w:rPr>
               <w:t>ViT-B/16 AugReg</w:t>
             </w:r>
@@ -7226,17 +6587,13 @@
               <w:spacing w:after="0" w:line="240" w:lineRule="auto"/>
               <w:jc w:val="center"/>
             </w:pPr>
-            <w:r>
-              <w:rPr>
-                <w:sz w:val="20"/>
-              </w:rPr>
-            </w:r>
+            <w:r/>
             <w:r>
               <w:rPr>
                 <w:rFonts w:ascii="Times New Roman" w:hAnsi="Times New Roman"/>
                 <w:b w:val="0"/>
                 <w:color w:val="202A32"/>
-                <w:sz w:val="20"/>
+                <w:sz w:val="16"/>
               </w:rPr>
               <w:t>End-to-end J₈→L</w:t>
             </w:r>
@@ -7258,17 +6615,13 @@
               <w:spacing w:after="0" w:line="240" w:lineRule="auto"/>
               <w:jc w:val="center"/>
             </w:pPr>
-            <w:r>
-              <w:rPr>
-                <w:sz w:val="20"/>
-              </w:rPr>
-            </w:r>
+            <w:r/>
             <w:r>
               <w:rPr>
                 <w:rFonts w:ascii="Times New Roman" w:hAnsi="Times New Roman"/>
                 <w:b w:val="0"/>
                 <w:color w:val="202A32"/>
-                <w:sz w:val="20"/>
+                <w:sz w:val="16"/>
               </w:rPr>
               <w:t>0.954 [0.938, 0.970]</w:t>
             </w:r>
@@ -7290,17 +6643,13 @@
               <w:spacing w:after="0" w:line="240" w:lineRule="auto"/>
               <w:jc w:val="center"/>
             </w:pPr>
-            <w:r>
-              <w:rPr>
-                <w:sz w:val="20"/>
-              </w:rPr>
-            </w:r>
+            <w:r/>
             <w:r>
               <w:rPr>
                 <w:rFonts w:ascii="Times New Roman" w:hAnsi="Times New Roman"/>
                 <w:b w:val="0"/>
                 <w:color w:val="202A32"/>
-                <w:sz w:val="20"/>
+                <w:sz w:val="16"/>
               </w:rPr>
               <w:t>0.934 [0.911, 0.953]</w:t>
             </w:r>
@@ -7323,17 +6672,13 @@
             <w:pPr>
               <w:spacing w:after="0" w:line="240" w:lineRule="auto"/>
             </w:pPr>
-            <w:r>
-              <w:rPr>
-                <w:sz w:val="20"/>
-              </w:rPr>
-            </w:r>
+            <w:r/>
             <w:r>
               <w:rPr>
                 <w:rFonts w:ascii="Times New Roman" w:hAnsi="Times New Roman"/>
                 <w:b w:val="0"/>
                 <w:color w:val="202A32"/>
-                <w:sz w:val="20"/>
+                <w:sz w:val="16"/>
               </w:rPr>
               <w:t>DINOv2 ViT-S/14</w:t>
             </w:r>
@@ -7355,17 +6700,13 @@
               <w:spacing w:after="0" w:line="240" w:lineRule="auto"/>
               <w:jc w:val="center"/>
             </w:pPr>
-            <w:r>
-              <w:rPr>
-                <w:sz w:val="20"/>
-              </w:rPr>
-            </w:r>
+            <w:r/>
             <w:r>
               <w:rPr>
                 <w:rFonts w:ascii="Times New Roman" w:hAnsi="Times New Roman"/>
                 <w:b w:val="0"/>
                 <w:color w:val="202A32"/>
-                <w:sz w:val="20"/>
+                <w:sz w:val="16"/>
               </w:rPr>
               <w:t>Single-block A₈</w:t>
             </w:r>
@@ -7387,17 +6728,13 @@
               <w:spacing w:after="0" w:line="240" w:lineRule="auto"/>
               <w:jc w:val="center"/>
             </w:pPr>
-            <w:r>
-              <w:rPr>
-                <w:sz w:val="20"/>
-              </w:rPr>
-            </w:r>
+            <w:r/>
             <w:r>
               <w:rPr>
                 <w:rFonts w:ascii="Times New Roman" w:hAnsi="Times New Roman"/>
                 <w:b w:val="0"/>
                 <w:color w:val="202A32"/>
-                <w:sz w:val="20"/>
+                <w:sz w:val="16"/>
               </w:rPr>
               <w:t>0.883 [0.861, 0.903]</w:t>
             </w:r>
@@ -7419,17 +6756,13 @@
               <w:spacing w:after="0" w:line="240" w:lineRule="auto"/>
               <w:jc w:val="center"/>
             </w:pPr>
-            <w:r>
-              <w:rPr>
-                <w:sz w:val="20"/>
-              </w:rPr>
-            </w:r>
+            <w:r/>
             <w:r>
               <w:rPr>
                 <w:rFonts w:ascii="Times New Roman" w:hAnsi="Times New Roman"/>
                 <w:b w:val="0"/>
                 <w:color w:val="202A32"/>
-                <w:sz w:val="20"/>
+                <w:sz w:val="16"/>
               </w:rPr>
               <w:t>0.829 [0.781, 0.869]</w:t>
             </w:r>
@@ -7452,17 +6785,13 @@
             <w:pPr>
               <w:spacing w:after="0" w:line="240" w:lineRule="auto"/>
             </w:pPr>
-            <w:r>
-              <w:rPr>
-                <w:sz w:val="20"/>
-              </w:rPr>
-            </w:r>
+            <w:r/>
             <w:r>
               <w:rPr>
                 <w:rFonts w:ascii="Times New Roman" w:hAnsi="Times New Roman"/>
                 <w:b w:val="0"/>
                 <w:color w:val="202A32"/>
-                <w:sz w:val="20"/>
+                <w:sz w:val="16"/>
               </w:rPr>
               <w:t>DINOv2 ViT-S/14</w:t>
             </w:r>
@@ -7484,17 +6813,13 @@
               <w:spacing w:after="0" w:line="240" w:lineRule="auto"/>
               <w:jc w:val="center"/>
             </w:pPr>
-            <w:r>
-              <w:rPr>
-                <w:sz w:val="20"/>
-              </w:rPr>
-            </w:r>
+            <w:r/>
             <w:r>
               <w:rPr>
                 <w:rFonts w:ascii="Times New Roman" w:hAnsi="Times New Roman"/>
                 <w:b w:val="0"/>
                 <w:color w:val="202A32"/>
-                <w:sz w:val="20"/>
+                <w:sz w:val="16"/>
               </w:rPr>
               <w:t>End-to-end J₈→L</w:t>
             </w:r>
@@ -7516,17 +6841,13 @@
               <w:spacing w:after="0" w:line="240" w:lineRule="auto"/>
               <w:jc w:val="center"/>
             </w:pPr>
-            <w:r>
-              <w:rPr>
-                <w:sz w:val="20"/>
-              </w:rPr>
-            </w:r>
+            <w:r/>
             <w:r>
               <w:rPr>
                 <w:rFonts w:ascii="Times New Roman" w:hAnsi="Times New Roman"/>
                 <w:b w:val="0"/>
                 <w:color w:val="202A32"/>
-                <w:sz w:val="20"/>
+                <w:sz w:val="16"/>
               </w:rPr>
               <w:t>0.946 [0.941, 0.952]</w:t>
             </w:r>
@@ -7548,17 +6869,13 @@
               <w:spacing w:after="0" w:line="240" w:lineRule="auto"/>
               <w:jc w:val="center"/>
             </w:pPr>
-            <w:r>
-              <w:rPr>
-                <w:sz w:val="20"/>
-              </w:rPr>
-            </w:r>
+            <w:r/>
             <w:r>
               <w:rPr>
                 <w:rFonts w:ascii="Times New Roman" w:hAnsi="Times New Roman"/>
                 <w:b w:val="0"/>
                 <w:color w:val="202A32"/>
-                <w:sz w:val="20"/>
+                <w:sz w:val="16"/>
               </w:rPr>
               <w:t>0.944 [0.932, 0.956]</w:t>
             </w:r>
@@ -7574,7 +6891,6 @@
     <w:p>
       <w:pPr>
         <w:spacing w:after="100" w:line="259" w:lineRule="auto"/>
-        <w:jc w:val="both"/>
       </w:pPr>
       <w:r>
         <w:rPr>
@@ -7588,16 +6904,164 @@
     </w:p>
     <w:p>
       <w:pPr>
+        <w:spacing w:after="100" w:line="259" w:lineRule="auto"/>
+      </w:pPr>
+      <w:r>
+        <w:rPr>
+          <w:rFonts w:ascii="Times New Roman" w:hAnsi="Times New Roman"/>
+          <w:i w:val="0"/>
+          <w:color w:val="202A32"/>
+          <w:sz w:val="20"/>
+        </w:rPr>
+        <w:t>The joint token–feature grid uses the same perturbation definition and logit outcome as main Figure 6. The primary depth grid contains DeiT-Small at Blocks 5, 8, and 10 and ViT-B/16 AugReg at Blocks 5, 7, and 10. Each model uses the same 100 calibration images to construct the covariance and margin-gradient directions and to evaluate the perturbation outcomes. DeiT-Tiny and DINOv2 have reduced Block-8 replications only; these are not included in the full-factorial depth grid.</w:t>
+      </w:r>
+    </w:p>
+    <w:p>
+      <w:pPr>
+        <w:keepNext/>
+        <w:keepLines/>
+        <w:spacing w:after="20"/>
+        <w:jc w:val="center"/>
+      </w:pPr>
+      <w:r>
+        <w:drawing>
+          <wp:inline xmlns:a="http://schemas.openxmlformats.org/drawingml/2006/main" xmlns:pic="http://schemas.openxmlformats.org/drawingml/2006/picture">
+            <wp:extent cx="6172200" cy="4421690"/>
+            <wp:docPr id="12" name="Picture 12"/>
+            <wp:cNvGraphicFramePr>
+              <a:graphicFrameLocks noChangeAspect="1"/>
+            </wp:cNvGraphicFramePr>
+            <a:graphic>
+              <a:graphicData uri="http://schemas.openxmlformats.org/drawingml/2006/picture">
+                <pic:pic>
+                  <pic:nvPicPr>
+                    <pic:cNvPr id="0" name="figureS14_joint_stream_geometry.png"/>
+                    <pic:cNvPicPr/>
+                  </pic:nvPicPr>
+                  <pic:blipFill>
+                    <a:blip r:embed="rId20"/>
+                    <a:stretch>
+                      <a:fillRect/>
+                    </a:stretch>
+                  </pic:blipFill>
+                  <pic:spPr>
+                    <a:xfrm>
+                      <a:off x="0" y="0"/>
+                      <a:ext cx="6172200" cy="4421690"/>
+                    </a:xfrm>
+                    <a:prstGeom prst="rect"/>
+                  </pic:spPr>
+                </pic:pic>
+              </a:graphicData>
+            </a:graphic>
+          </wp:inline>
+        </w:drawing>
+      </w:r>
+    </w:p>
+    <w:p>
+      <w:pPr>
+        <w:keepLines/>
+        <w:spacing w:after="100" w:line="259" w:lineRule="auto"/>
+      </w:pPr>
+      <w:r>
+        <w:rPr>
+          <w:rFonts w:ascii="Times New Roman" w:hAnsi="Times New Roman"/>
+          <w:b/>
+          <w:color w:val="202A32"/>
+          <w:sz w:val="20"/>
+        </w:rPr>
+        <w:t>Supplementary Figure S14. Joint token–feature geometry across depth.</w:t>
+      </w:r>
+      <w:r>
+        <w:rPr>
+          <w:rFonts w:ascii="Times New Roman" w:hAnsi="Times New Roman"/>
+          <w:i w:val="0"/>
+          <w:color w:val="202A32"/>
+          <w:sz w:val="20"/>
+        </w:rPr>
+        <w:t xml:space="preserve"> Mean per-image Euclidean final-logit </w:t>
+      </w:r>
+      <m:oMath>
+        <m:sSub>
+          <m:e>
+            <m:r>
+              <m:t xml:space="preserve">L</m:t>
+            </m:r>
+          </m:e>
+          <m:sub>
+            <m:r>
+              <m:t xml:space="preserve">2</m:t>
+            </m:r>
+          </m:sub>
+        </m:sSub>
+      </m:oMath>
+      <w:r>
+        <w:rPr>
+          <w:rFonts w:ascii="Times New Roman" w:hAnsi="Times New Roman"/>
+          <w:i w:val="0"/>
+          <w:color w:val="202A32"/>
+          <w:sz w:val="20"/>
+        </w:rPr>
+        <w:t xml:space="preserve"> change at </w:t>
+      </w:r>
+      <m:oMath>
+        <m:r>
+          <m:t xml:space="preserve">s</m:t>
+        </m:r>
+        <m:r>
+          <m:t xml:space="preserve">=</m:t>
+        </m:r>
+        <m:r>
+          <m:t xml:space="preserve">1</m:t>
+        </m:r>
+        <m:r>
+          <m:t xml:space="preserve">.</m:t>
+        </m:r>
+        <m:r>
+          <m:t xml:space="preserve">0</m:t>
+        </m:r>
+      </m:oMath>
+      <w:r>
+        <w:rPr>
+          <w:rFonts w:ascii="Times New Roman" w:hAnsi="Times New Roman"/>
+          <w:i w:val="0"/>
+          <w:color w:val="202A32"/>
+          <w:sz w:val="20"/>
+        </w:rPr>
+        <w:t xml:space="preserve"> for the eight token patterns and five feature directions in each panel: (a–c) DeiT-Small Blocks 5, 8, and 10; (d–f) ViT-B/16 AugReg Blocks 5, 7, and 10. All panels use one logarithmic color scale shared with main Figure 6. Each panel summarizes the same </w:t>
+      </w:r>
+      <m:oMath>
+        <m:r>
+          <m:t xml:space="preserve">N</m:t>
+        </m:r>
+        <m:r>
+          <m:t xml:space="preserve">=</m:t>
+        </m:r>
+        <m:r>
+          <m:t xml:space="preserve">100</m:t>
+        </m:r>
+      </m:oMath>
+      <w:r>
+        <w:rPr>
+          <w:rFonts w:ascii="Times New Roman" w:hAnsi="Times New Roman"/>
+          <w:i w:val="0"/>
+          <w:color w:val="202A32"/>
+          <w:sz w:val="20"/>
+        </w:rPr>
+        <w:t xml:space="preserve"> calibration images used to construct its directions; these outcomes are within-cohort descriptive summaries. Reduced Block-8 replications in DeiT-Tiny and DINOv2 are reported separately and are not included in this six-panel full-factorial grid.</w:t>
+      </w:r>
+    </w:p>
+    <w:p>
+      <w:pPr>
         <w:pStyle w:val="Heading1"/>
         <w:keepNext/>
-        <w:jc w:val="both"/>
       </w:pPr>
       <w:r>
         <w:rPr>
           <w:rFonts w:ascii="Times New Roman" w:hAnsi="Times New Roman"/>
           <w:b/>
           <w:color w:val="000000"/>
-          <w:sz w:val="20"/>
+          <w:sz w:val="28"/>
         </w:rPr>
         <w:t>S12. Primary Q/K/V projection-path comparison</w:t>
       </w:r>
@@ -7605,7 +7069,6 @@
     <w:p>
       <w:pPr>
         <w:spacing w:after="100" w:line="259" w:lineRule="auto"/>
-        <w:jc w:val="both"/>
       </w:pPr>
       <w:r>
         <w:rPr>
@@ -7832,13 +7295,10 @@
         <w:jc w:val="center"/>
       </w:pPr>
       <w:r>
-        <w:rPr>
-          <w:sz w:val="20"/>
-        </w:rPr>
         <w:drawing>
           <wp:inline xmlns:a="http://schemas.openxmlformats.org/drawingml/2006/main" xmlns:pic="http://schemas.openxmlformats.org/drawingml/2006/picture">
             <wp:extent cx="6172200" cy="2459702"/>
-            <wp:docPr id="12" name="Picture 12"/>
+            <wp:docPr id="13" name="Picture 13"/>
             <wp:cNvGraphicFramePr>
               <a:graphicFrameLocks noChangeAspect="1"/>
             </wp:cNvGraphicFramePr>
@@ -7850,7 +7310,7 @@
                     <pic:cNvPicPr/>
                   </pic:nvPicPr>
                   <pic:blipFill>
-                    <a:blip r:embed="rId20"/>
+                    <a:blip r:embed="rId21"/>
                     <a:stretch>
                       <a:fillRect/>
                     </a:stretch>
@@ -7873,7 +7333,6 @@
       <w:pPr>
         <w:keepLines/>
         <w:spacing w:after="100" w:line="259" w:lineRule="auto"/>
-        <w:jc w:val="both"/>
       </w:pPr>
       <w:r>
         <w:rPr>
@@ -8055,82 +7514,130 @@
     </w:p>
     <w:p>
       <w:pPr>
-        <w:keepNext/>
-        <w:keepLines/>
-        <w:spacing w:after="80"/>
+        <w:spacing w:after="100" w:line="259" w:lineRule="auto"/>
       </w:pPr>
       <w:r>
         <w:rPr>
+          <w:rFonts w:ascii="Times New Roman" w:hAnsi="Times New Roman"/>
+          <w:i w:val="0"/>
+          <w:color w:val="202A32"/>
           <w:sz w:val="20"/>
         </w:rPr>
-        <w:t>The signed true-class logit drop is the clean target-class logit minus the perturbed target-class logit, averaged over the same N=100 outcome images.</w:t>
+        <w:t>The signed true-class logit drop is the clean target-class logit minus the perturbed target-class logit, averaged across the same (N=100) outcome images. For condition (c), we define</w:t>
       </w:r>
     </w:p>
     <w:p>
       <w:pPr>
-        <w:keepNext/>
-        <w:keepLines/>
-        <w:spacing w:after="80"/>
+        <w:spacing w:after="100" w:line="259" w:lineRule="auto"/>
       </w:pPr>
       <w:r>
         <w:rPr>
+          <w:rFonts w:ascii="Times New Roman" w:hAnsi="Times New Roman"/>
+          <w:b/>
+          <w:color w:val="202A32"/>
           <w:sz w:val="20"/>
         </w:rPr>
-        <w:t>Contrast(c) = mean true-class logit drop (coherent, c) − mean true-class logit drop (random-sign, c).</w:t>
+        <w:t>Contrast(c)</w:t>
+      </w:r>
+      <w:r>
+        <w:rPr>
+          <w:rFonts w:ascii="Times New Roman" w:hAnsi="Times New Roman"/>
+          <w:i w:val="0"/>
+          <w:color w:val="202A32"/>
+          <w:sz w:val="20"/>
+        </w:rPr>
+        <w:t xml:space="preserve"> = mean true-class logit drop (coherent, c) − mean true-class logit drop (random-sign, c).</w:t>
       </w:r>
     </w:p>
     <w:p>
       <w:pPr>
-        <w:keepNext/>
-        <w:keepLines/>
-        <w:spacing w:after="80"/>
+        <w:spacing w:after="100" w:line="259" w:lineRule="auto"/>
       </w:pPr>
       <w:r>
         <w:rPr>
+          <w:rFonts w:ascii="Times New Roman" w:hAnsi="Times New Roman"/>
+          <w:i w:val="0"/>
+          <w:color w:val="202A32"/>
           <w:sz w:val="20"/>
         </w:rPr>
-        <w:t>Ratio (%) = 100 × Contrast(frozen-attention V-only with perturbed residual) / Contrast(full perturbation).</w:t>
+        <w:t>and report</w:t>
       </w:r>
     </w:p>
     <w:p>
       <w:pPr>
-        <w:keepNext/>
-        <w:keepLines/>
-        <w:spacing w:after="80"/>
+        <w:spacing w:after="100" w:line="259" w:lineRule="auto"/>
       </w:pPr>
       <w:r>
         <w:rPr>
+          <w:rFonts w:ascii="Times New Roman" w:hAnsi="Times New Roman"/>
+          <w:b/>
+          <w:color w:val="202A32"/>
           <w:sz w:val="20"/>
         </w:rPr>
-        <w:t>The contrasts use feature_dir=jac_top and s=1.0. Both ViT-B/16 AugReg contrasts are negative. Its 102.2% ratio is the quotient of two signed contrasts; it does not indicate more than 100% causal contribution because the interventions are not additive causal components.</w:t>
+        <w:t>Ratio (%)</w:t>
+      </w:r>
+      <w:r>
+        <w:rPr>
+          <w:rFonts w:ascii="Times New Roman" w:hAnsi="Times New Roman"/>
+          <w:i w:val="0"/>
+          <w:color w:val="202A32"/>
+          <w:sz w:val="20"/>
+        </w:rPr>
+        <w:t xml:space="preserve"> = 100 × Contrast(frozen-attention V-only with perturbed residual) / Contrast(full perturbation).</w:t>
       </w:r>
     </w:p>
     <w:p>
       <w:pPr>
-        <w:keepNext/>
-        <w:keepLines/>
-        <w:spacing w:after="80"/>
+        <w:spacing w:after="100" w:line="259" w:lineRule="auto"/>
       </w:pPr>
       <w:r>
         <w:rPr>
-          <w:b/>
+          <w:rFonts w:ascii="Times New Roman" w:hAnsi="Times New Roman"/>
+          <w:i w:val="0"/>
+          <w:color w:val="202A32"/>
           <w:sz w:val="20"/>
         </w:rPr>
-        <w:t>Table S4.</w:t>
+        <w:t xml:space="preserve">The contrasts use </w:t>
       </w:r>
       <w:r>
         <w:rPr>
+          <w:rFonts w:ascii="Consolas" w:hAnsi="Consolas"/>
+          <w:color w:val="34495E"/>
+          <w:sz w:val="18"/>
+        </w:rPr>
+        <w:t>feature_dir=jac_top</w:t>
+      </w:r>
+      <w:r>
+        <w:rPr>
+          <w:rFonts w:ascii="Times New Roman" w:hAnsi="Times New Roman"/>
+          <w:i w:val="0"/>
+          <w:color w:val="202A32"/>
           <w:sz w:val="20"/>
         </w:rPr>
-        <w:t xml:space="preserve"> Signed true-class logit-drop contrasts for the primary Value-path audit.</w:t>
+        <w:t xml:space="preserve"> and (s=1.0). Both ViT-B/16 AugReg contrasts are negative. Its 102.2% ratio is the quotient of these two signed contrasts; it does not indicate more than 100% causal contribution because the interventions are not additive causal components.</w:t>
+      </w:r>
+    </w:p>
+    <w:p>
+      <w:pPr>
+        <w:keepLines/>
+        <w:spacing w:after="80"/>
+        <w:jc w:val="center"/>
+      </w:pPr>
+      <w:r>
+        <w:rPr>
+          <w:rFonts w:ascii="Times New Roman" w:hAnsi="Times New Roman"/>
+          <w:i/>
+          <w:color w:val="4C5963"/>
+          <w:sz w:val="17"/>
+        </w:rPr>
+        <w:t>Table S4. Signed true-class logit-drop contrasts for the primary Value-path audit.</w:t>
       </w:r>
     </w:p>
     <w:tbl>
       <w:tblPr>
         <w:tblStyle w:val="TableGrid"/>
         <w:tblW w:type="auto" w:w="0"/>
-        <w:jc w:val="center"/>
-        <w:tblLayout w:type="fixed"/>
+        <w:tblLayout w:type="autofit"/>
         <w:tblLook w:firstColumn="1" w:firstRow="1" w:lastColumn="0" w:lastRow="0" w:noHBand="0" w:noVBand="1" w:val="04A0"/>
       </w:tblPr>
       <w:tblGrid>
@@ -8143,21 +7650,31 @@
       <w:tr>
         <w:trPr>
           <w:tblHeader w:val="true"/>
-          <w:cantSplit/>
         </w:trPr>
         <w:tc>
           <w:tcPr>
-            <w:tcW w:type="dxa" w:w="1368"/>
+            <w:tcW w:type="dxa" w:w="1999"/>
             <w:vAlign w:val="center"/>
+            <w:tcMar>
+              <w:top w:w="55" w:type="dxa"/>
+              <w:start w:w="65" w:type="dxa"/>
+              <w:bottom w:w="55" w:type="dxa"/>
+              <w:end w:w="65" w:type="dxa"/>
+            </w:tcMar>
+            <w:shd w:fill="DCEBF2"/>
           </w:tcPr>
           <w:p>
             <w:pPr>
-              <w:spacing w:after="0" w:before="0"/>
-              <w:jc w:val="left"/>
+              <w:spacing w:after="0" w:line="240" w:lineRule="auto"/>
+              <w:jc w:val="center"/>
             </w:pPr>
+            <w:r/>
             <w:r>
               <w:rPr>
-                <w:sz w:val="20"/>
+                <w:rFonts w:ascii="Times New Roman" w:hAnsi="Times New Roman"/>
+                <w:b/>
+                <w:color w:val="17232D"/>
+                <w:sz w:val="16"/>
               </w:rPr>
               <w:t>Model</w:t>
             </w:r>
@@ -8165,17 +7682,28 @@
         </w:tc>
         <w:tc>
           <w:tcPr>
-            <w:tcW w:type="dxa" w:w="1267"/>
+            <w:tcW w:type="dxa" w:w="1999"/>
             <w:vAlign w:val="center"/>
+            <w:tcMar>
+              <w:top w:w="55" w:type="dxa"/>
+              <w:start w:w="65" w:type="dxa"/>
+              <w:bottom w:w="55" w:type="dxa"/>
+              <w:end w:w="65" w:type="dxa"/>
+            </w:tcMar>
+            <w:shd w:fill="DCEBF2"/>
           </w:tcPr>
           <w:p>
             <w:pPr>
-              <w:spacing w:after="0" w:before="0"/>
-              <w:jc w:val="left"/>
+              <w:spacing w:after="0" w:line="240" w:lineRule="auto"/>
+              <w:jc w:val="center"/>
             </w:pPr>
+            <w:r/>
             <w:r>
               <w:rPr>
-                <w:sz w:val="20"/>
+                <w:rFonts w:ascii="Times New Roman" w:hAnsi="Times New Roman"/>
+                <w:b/>
+                <w:color w:val="17232D"/>
+                <w:sz w:val="16"/>
               </w:rPr>
               <w:t>Intervention depth</w:t>
             </w:r>
@@ -8183,17 +7711,28 @@
         </w:tc>
         <w:tc>
           <w:tcPr>
-            <w:tcW w:type="dxa" w:w="2232"/>
+            <w:tcW w:type="dxa" w:w="1999"/>
             <w:vAlign w:val="center"/>
+            <w:tcMar>
+              <w:top w:w="55" w:type="dxa"/>
+              <w:start w:w="65" w:type="dxa"/>
+              <w:bottom w:w="55" w:type="dxa"/>
+              <w:end w:w="65" w:type="dxa"/>
+            </w:tcMar>
+            <w:shd w:fill="DCEBF2"/>
           </w:tcPr>
           <w:p>
             <w:pPr>
-              <w:spacing w:after="0" w:before="0"/>
-              <w:jc w:val="left"/>
+              <w:spacing w:after="0" w:line="240" w:lineRule="auto"/>
+              <w:jc w:val="center"/>
             </w:pPr>
+            <w:r/>
             <w:r>
               <w:rPr>
-                <w:sz w:val="20"/>
+                <w:rFonts w:ascii="Times New Roman" w:hAnsi="Times New Roman"/>
+                <w:b/>
+                <w:color w:val="17232D"/>
+                <w:sz w:val="16"/>
               </w:rPr>
               <w:t>Full-block coherent-minus-random-sign contrast</w:t>
             </w:r>
@@ -8201,17 +7740,28 @@
         </w:tc>
         <w:tc>
           <w:tcPr>
-            <w:tcW w:type="dxa" w:w="3139"/>
+            <w:tcW w:type="dxa" w:w="1999"/>
             <w:vAlign w:val="center"/>
+            <w:tcMar>
+              <w:top w:w="55" w:type="dxa"/>
+              <w:start w:w="65" w:type="dxa"/>
+              <w:bottom w:w="55" w:type="dxa"/>
+              <w:end w:w="65" w:type="dxa"/>
+            </w:tcMar>
+            <w:shd w:fill="DCEBF2"/>
           </w:tcPr>
           <w:p>
             <w:pPr>
-              <w:spacing w:after="0" w:before="0"/>
-              <w:jc w:val="left"/>
+              <w:spacing w:after="0" w:line="240" w:lineRule="auto"/>
+              <w:jc w:val="center"/>
             </w:pPr>
+            <w:r/>
             <w:r>
               <w:rPr>
-                <w:sz w:val="20"/>
+                <w:rFonts w:ascii="Times New Roman" w:hAnsi="Times New Roman"/>
+                <w:b/>
+                <w:color w:val="17232D"/>
+                <w:sz w:val="16"/>
               </w:rPr>
               <w:t>Frozen-attention V-only with perturbed-residual contrast</w:t>
             </w:r>
@@ -8219,17 +7769,28 @@
         </w:tc>
         <w:tc>
           <w:tcPr>
-            <w:tcW w:type="dxa" w:w="864"/>
+            <w:tcW w:type="dxa" w:w="1999"/>
             <w:vAlign w:val="center"/>
+            <w:tcMar>
+              <w:top w:w="55" w:type="dxa"/>
+              <w:start w:w="65" w:type="dxa"/>
+              <w:bottom w:w="55" w:type="dxa"/>
+              <w:end w:w="65" w:type="dxa"/>
+            </w:tcMar>
+            <w:shd w:fill="DCEBF2"/>
           </w:tcPr>
           <w:p>
             <w:pPr>
-              <w:spacing w:after="0" w:before="0"/>
+              <w:spacing w:after="0" w:line="240" w:lineRule="auto"/>
               <w:jc w:val="center"/>
             </w:pPr>
+            <w:r/>
             <w:r>
               <w:rPr>
-                <w:sz w:val="20"/>
+                <w:rFonts w:ascii="Times New Roman" w:hAnsi="Times New Roman"/>
+                <w:b/>
+                <w:color w:val="17232D"/>
+                <w:sz w:val="16"/>
               </w:rPr>
               <w:t>Ratio</w:t>
             </w:r>
@@ -8237,22 +7798,28 @@
         </w:tc>
       </w:tr>
       <w:tr>
-        <w:trPr>
-          <w:cantSplit/>
-        </w:trPr>
         <w:tc>
           <w:tcPr>
-            <w:tcW w:type="dxa" w:w="1368"/>
+            <w:tcW w:type="dxa" w:w="1999"/>
             <w:vAlign w:val="center"/>
+            <w:tcMar>
+              <w:top w:w="55" w:type="dxa"/>
+              <w:start w:w="65" w:type="dxa"/>
+              <w:bottom w:w="55" w:type="dxa"/>
+              <w:end w:w="65" w:type="dxa"/>
+            </w:tcMar>
           </w:tcPr>
           <w:p>
             <w:pPr>
-              <w:spacing w:after="0" w:before="0"/>
-              <w:jc w:val="left"/>
+              <w:spacing w:after="0" w:line="240" w:lineRule="auto"/>
             </w:pPr>
+            <w:r/>
             <w:r>
               <w:rPr>
-                <w:sz w:val="20"/>
+                <w:rFonts w:ascii="Times New Roman" w:hAnsi="Times New Roman"/>
+                <w:b w:val="0"/>
+                <w:color w:val="202A32"/>
+                <w:sz w:val="16"/>
               </w:rPr>
               <w:t>DeiT-Small</w:t>
             </w:r>
@@ -8260,17 +7827,27 @@
         </w:tc>
         <w:tc>
           <w:tcPr>
-            <w:tcW w:type="dxa" w:w="1267"/>
+            <w:tcW w:type="dxa" w:w="1999"/>
             <w:vAlign w:val="center"/>
+            <w:tcMar>
+              <w:top w:w="55" w:type="dxa"/>
+              <w:start w:w="65" w:type="dxa"/>
+              <w:bottom w:w="55" w:type="dxa"/>
+              <w:end w:w="65" w:type="dxa"/>
+            </w:tcMar>
           </w:tcPr>
           <w:p>
             <w:pPr>
-              <w:spacing w:after="0" w:before="0"/>
-              <w:jc w:val="left"/>
+              <w:spacing w:after="0" w:line="240" w:lineRule="auto"/>
+              <w:jc w:val="center"/>
             </w:pPr>
+            <w:r/>
             <w:r>
               <w:rPr>
-                <w:sz w:val="20"/>
+                <w:rFonts w:ascii="Times New Roman" w:hAnsi="Times New Roman"/>
+                <w:b w:val="0"/>
+                <w:color w:val="202A32"/>
+                <w:sz w:val="16"/>
               </w:rPr>
               <w:t>Block 8</w:t>
             </w:r>
@@ -8278,17 +7855,27 @@
         </w:tc>
         <w:tc>
           <w:tcPr>
-            <w:tcW w:type="dxa" w:w="2232"/>
+            <w:tcW w:type="dxa" w:w="1999"/>
             <w:vAlign w:val="center"/>
+            <w:tcMar>
+              <w:top w:w="55" w:type="dxa"/>
+              <w:start w:w="65" w:type="dxa"/>
+              <w:bottom w:w="55" w:type="dxa"/>
+              <w:end w:w="65" w:type="dxa"/>
+            </w:tcMar>
           </w:tcPr>
           <w:p>
             <w:pPr>
-              <w:spacing w:after="0" w:before="0"/>
-              <w:jc w:val="left"/>
+              <w:spacing w:after="0" w:line="240" w:lineRule="auto"/>
+              <w:jc w:val="center"/>
             </w:pPr>
+            <w:r/>
             <w:r>
               <w:rPr>
-                <w:sz w:val="20"/>
+                <w:rFonts w:ascii="Times New Roman" w:hAnsi="Times New Roman"/>
+                <w:b w:val="0"/>
+                <w:color w:val="202A32"/>
+                <w:sz w:val="16"/>
               </w:rPr>
               <w:t>+0.006282993</w:t>
             </w:r>
@@ -8296,17 +7883,27 @@
         </w:tc>
         <w:tc>
           <w:tcPr>
-            <w:tcW w:type="dxa" w:w="3139"/>
+            <w:tcW w:type="dxa" w:w="1999"/>
             <w:vAlign w:val="center"/>
+            <w:tcMar>
+              <w:top w:w="55" w:type="dxa"/>
+              <w:start w:w="65" w:type="dxa"/>
+              <w:bottom w:w="55" w:type="dxa"/>
+              <w:end w:w="65" w:type="dxa"/>
+            </w:tcMar>
           </w:tcPr>
           <w:p>
             <w:pPr>
-              <w:spacing w:after="0" w:before="0"/>
-              <w:jc w:val="left"/>
+              <w:spacing w:after="0" w:line="240" w:lineRule="auto"/>
+              <w:jc w:val="center"/>
             </w:pPr>
+            <w:r/>
             <w:r>
               <w:rPr>
-                <w:sz w:val="20"/>
+                <w:rFonts w:ascii="Times New Roman" w:hAnsi="Times New Roman"/>
+                <w:b w:val="0"/>
+                <w:color w:val="202A32"/>
+                <w:sz w:val="16"/>
               </w:rPr>
               <w:t>+0.004448350</w:t>
             </w:r>
@@ -8314,17 +7911,27 @@
         </w:tc>
         <w:tc>
           <w:tcPr>
-            <w:tcW w:type="dxa" w:w="864"/>
+            <w:tcW w:type="dxa" w:w="1999"/>
             <w:vAlign w:val="center"/>
+            <w:tcMar>
+              <w:top w:w="55" w:type="dxa"/>
+              <w:start w:w="65" w:type="dxa"/>
+              <w:bottom w:w="55" w:type="dxa"/>
+              <w:end w:w="65" w:type="dxa"/>
+            </w:tcMar>
           </w:tcPr>
           <w:p>
             <w:pPr>
-              <w:spacing w:after="0" w:before="0"/>
+              <w:spacing w:after="0" w:line="240" w:lineRule="auto"/>
               <w:jc w:val="center"/>
             </w:pPr>
+            <w:r/>
             <w:r>
               <w:rPr>
-                <w:sz w:val="20"/>
+                <w:rFonts w:ascii="Times New Roman" w:hAnsi="Times New Roman"/>
+                <w:b w:val="0"/>
+                <w:color w:val="202A32"/>
+                <w:sz w:val="16"/>
               </w:rPr>
               <w:t>70.8%</w:t>
             </w:r>
@@ -8332,22 +7939,28 @@
         </w:tc>
       </w:tr>
       <w:tr>
-        <w:trPr>
-          <w:cantSplit/>
-        </w:trPr>
         <w:tc>
           <w:tcPr>
-            <w:tcW w:type="dxa" w:w="1368"/>
+            <w:tcW w:type="dxa" w:w="1999"/>
             <w:vAlign w:val="center"/>
+            <w:tcMar>
+              <w:top w:w="55" w:type="dxa"/>
+              <w:start w:w="65" w:type="dxa"/>
+              <w:bottom w:w="55" w:type="dxa"/>
+              <w:end w:w="65" w:type="dxa"/>
+            </w:tcMar>
           </w:tcPr>
           <w:p>
             <w:pPr>
-              <w:spacing w:after="0" w:before="0"/>
-              <w:jc w:val="left"/>
+              <w:spacing w:after="0" w:line="240" w:lineRule="auto"/>
             </w:pPr>
+            <w:r/>
             <w:r>
               <w:rPr>
-                <w:sz w:val="20"/>
+                <w:rFonts w:ascii="Times New Roman" w:hAnsi="Times New Roman"/>
+                <w:b w:val="0"/>
+                <w:color w:val="202A32"/>
+                <w:sz w:val="16"/>
               </w:rPr>
               <w:t>ViT-B/16 AugReg</w:t>
             </w:r>
@@ -8355,17 +7968,27 @@
         </w:tc>
         <w:tc>
           <w:tcPr>
-            <w:tcW w:type="dxa" w:w="1267"/>
+            <w:tcW w:type="dxa" w:w="1999"/>
             <w:vAlign w:val="center"/>
+            <w:tcMar>
+              <w:top w:w="55" w:type="dxa"/>
+              <w:start w:w="65" w:type="dxa"/>
+              <w:bottom w:w="55" w:type="dxa"/>
+              <w:end w:w="65" w:type="dxa"/>
+            </w:tcMar>
           </w:tcPr>
           <w:p>
             <w:pPr>
-              <w:spacing w:after="0" w:before="0"/>
-              <w:jc w:val="left"/>
+              <w:spacing w:after="0" w:line="240" w:lineRule="auto"/>
+              <w:jc w:val="center"/>
             </w:pPr>
+            <w:r/>
             <w:r>
               <w:rPr>
-                <w:sz w:val="20"/>
+                <w:rFonts w:ascii="Times New Roman" w:hAnsi="Times New Roman"/>
+                <w:b w:val="0"/>
+                <w:color w:val="202A32"/>
+                <w:sz w:val="16"/>
               </w:rPr>
               <w:t>Block 7</w:t>
             </w:r>
@@ -8373,17 +7996,27 @@
         </w:tc>
         <w:tc>
           <w:tcPr>
-            <w:tcW w:type="dxa" w:w="2232"/>
+            <w:tcW w:type="dxa" w:w="1999"/>
             <w:vAlign w:val="center"/>
+            <w:tcMar>
+              <w:top w:w="55" w:type="dxa"/>
+              <w:start w:w="65" w:type="dxa"/>
+              <w:bottom w:w="55" w:type="dxa"/>
+              <w:end w:w="65" w:type="dxa"/>
+            </w:tcMar>
           </w:tcPr>
           <w:p>
             <w:pPr>
-              <w:spacing w:after="0" w:before="0"/>
-              <w:jc w:val="left"/>
+              <w:spacing w:after="0" w:line="240" w:lineRule="auto"/>
+              <w:jc w:val="center"/>
             </w:pPr>
+            <w:r/>
             <w:r>
               <w:rPr>
-                <w:sz w:val="20"/>
+                <w:rFonts w:ascii="Times New Roman" w:hAnsi="Times New Roman"/>
+                <w:b w:val="0"/>
+                <w:color w:val="202A32"/>
+                <w:sz w:val="16"/>
               </w:rPr>
               <w:t>−0.247199488</w:t>
             </w:r>
@@ -8391,17 +8024,27 @@
         </w:tc>
         <w:tc>
           <w:tcPr>
-            <w:tcW w:type="dxa" w:w="3139"/>
+            <w:tcW w:type="dxa" w:w="1999"/>
             <w:vAlign w:val="center"/>
+            <w:tcMar>
+              <w:top w:w="55" w:type="dxa"/>
+              <w:start w:w="65" w:type="dxa"/>
+              <w:bottom w:w="55" w:type="dxa"/>
+              <w:end w:w="65" w:type="dxa"/>
+            </w:tcMar>
           </w:tcPr>
           <w:p>
             <w:pPr>
-              <w:spacing w:after="0" w:before="0"/>
-              <w:jc w:val="left"/>
+              <w:spacing w:after="0" w:line="240" w:lineRule="auto"/>
+              <w:jc w:val="center"/>
             </w:pPr>
+            <w:r/>
             <w:r>
               <w:rPr>
-                <w:sz w:val="20"/>
+                <w:rFonts w:ascii="Times New Roman" w:hAnsi="Times New Roman"/>
+                <w:b w:val="0"/>
+                <w:color w:val="202A32"/>
+                <w:sz w:val="16"/>
               </w:rPr>
               <w:t>−0.252697120</w:t>
             </w:r>
@@ -8409,17 +8052,27 @@
         </w:tc>
         <w:tc>
           <w:tcPr>
-            <w:tcW w:type="dxa" w:w="864"/>
+            <w:tcW w:type="dxa" w:w="1999"/>
             <w:vAlign w:val="center"/>
+            <w:tcMar>
+              <w:top w:w="55" w:type="dxa"/>
+              <w:start w:w="65" w:type="dxa"/>
+              <w:bottom w:w="55" w:type="dxa"/>
+              <w:end w:w="65" w:type="dxa"/>
+            </w:tcMar>
           </w:tcPr>
           <w:p>
             <w:pPr>
-              <w:spacing w:after="0" w:before="0"/>
+              <w:spacing w:after="0" w:line="240" w:lineRule="auto"/>
               <w:jc w:val="center"/>
             </w:pPr>
+            <w:r/>
             <w:r>
               <w:rPr>
-                <w:sz w:val="20"/>
+                <w:rFonts w:ascii="Times New Roman" w:hAnsi="Times New Roman"/>
+                <w:b w:val="0"/>
+                <w:color w:val="202A32"/>
+                <w:sz w:val="16"/>
               </w:rPr>
               <w:t>102.2%</w:t>
             </w:r>
@@ -8429,16 +8082,20 @@
     </w:tbl>
     <w:p>
       <w:pPr>
+        <w:spacing w:after="20"/>
+      </w:pPr>
+    </w:p>
+    <w:p>
+      <w:pPr>
         <w:pStyle w:val="Heading1"/>
         <w:keepNext/>
-        <w:jc w:val="both"/>
       </w:pPr>
       <w:r>
         <w:rPr>
           <w:rFonts w:ascii="Times New Roman" w:hAnsi="Times New Roman"/>
           <w:b/>
           <w:color w:val="000000"/>
-          <w:sz w:val="20"/>
+          <w:sz w:val="28"/>
         </w:rPr>
         <w:t>S13. Measured classifier-carrier boundary</w:t>
       </w:r>
@@ -8447,7 +8104,6 @@
       <w:pPr>
         <w:keepNext/>
         <w:spacing w:after="100" w:line="259" w:lineRule="auto"/>
-        <w:jc w:val="both"/>
       </w:pPr>
       <w:r>
         <w:rPr>
@@ -8467,13 +8123,10 @@
         <w:jc w:val="center"/>
       </w:pPr>
       <w:r>
-        <w:rPr>
-          <w:sz w:val="20"/>
-        </w:rPr>
         <w:drawing>
           <wp:inline xmlns:a="http://schemas.openxmlformats.org/drawingml/2006/main" xmlns:pic="http://schemas.openxmlformats.org/drawingml/2006/picture">
             <wp:extent cx="6172200" cy="3897608"/>
-            <wp:docPr id="13" name="Picture 13"/>
+            <wp:docPr id="14" name="Picture 14"/>
             <wp:cNvGraphicFramePr>
               <a:graphicFrameLocks noChangeAspect="1"/>
             </wp:cNvGraphicFramePr>
@@ -8485,7 +8138,7 @@
                     <pic:cNvPicPr/>
                   </pic:nvPicPr>
                   <pic:blipFill>
-                    <a:blip r:embed="rId21"/>
+                    <a:blip r:embed="rId22"/>
                     <a:stretch>
                       <a:fillRect/>
                     </a:stretch>
@@ -8508,7 +8161,6 @@
       <w:pPr>
         <w:keepLines/>
         <w:spacing w:after="100" w:line="259" w:lineRule="auto"/>
-        <w:jc w:val="both"/>
       </w:pPr>
       <w:r>
         <w:rPr>
@@ -8531,100 +8183,22 @@
     </w:p>
     <w:p>
       <w:pPr>
-        <w:keepLines/>
-        <w:spacing w:after="100" w:line="259" w:lineRule="auto"/>
-        <w:jc w:val="both"/>
-      </w:pPr>
-      <w:r>
-        <w:rPr>
-          <w:rFonts w:ascii="Times New Roman" w:hAnsi="Times New Roman"/>
-          <w:sz w:val="20"/>
-        </w:rPr>
-        <w:t>The joint-stream depth grid covers DeiT-Small at depths 5, 8, and 10 and ViT-B/16 AugReg at depths 5, 7, and 10. DeiT-Tiny and DINOv2 were assessed only in reduced Block-8 replications and are not included in this six-panel grid. For each model, the same N=100-image cohort estimates the feature directions and scores outcomes; these measurements are not held out.</w:t>
-      </w:r>
-    </w:p>
-    <w:p>
-      <w:pPr>
-        <w:keepLines/>
-        <w:spacing w:after="100" w:line="259" w:lineRule="auto"/>
-        <w:jc w:val="center"/>
-      </w:pPr>
-      <w:r>
-        <w:drawing>
-          <wp:inline xmlns:a="http://schemas.openxmlformats.org/drawingml/2006/main" xmlns:pic="http://schemas.openxmlformats.org/drawingml/2006/picture">
-            <wp:extent cx="6172200" cy="4421690"/>
-            <wp:docPr id="14" name="Picture 14"/>
-            <wp:cNvGraphicFramePr>
-              <a:graphicFrameLocks noChangeAspect="1"/>
-            </wp:cNvGraphicFramePr>
-            <a:graphic>
-              <a:graphicData uri="http://schemas.openxmlformats.org/drawingml/2006/picture">
-                <pic:pic>
-                  <pic:nvPicPr>
-                    <pic:cNvPr id="0" name="figureS14_joint_stream_geometry.png"/>
-                    <pic:cNvPicPr/>
-                  </pic:nvPicPr>
-                  <pic:blipFill>
-                    <a:blip r:embed="rId22"/>
-                    <a:stretch>
-                      <a:fillRect/>
-                    </a:stretch>
-                  </pic:blipFill>
-                  <pic:spPr>
-                    <a:xfrm>
-                      <a:off x="0" y="0"/>
-                      <a:ext cx="6172200" cy="4421690"/>
-                    </a:xfrm>
-                    <a:prstGeom prst="rect"/>
-                  </pic:spPr>
-                </pic:pic>
-              </a:graphicData>
-            </a:graphic>
-          </wp:inline>
-        </w:drawing>
-      </w:r>
-    </w:p>
-    <w:p>
-      <w:pPr>
-        <w:keepLines/>
-        <w:spacing w:after="100" w:line="259" w:lineRule="auto"/>
-        <w:jc w:val="both"/>
+        <w:pStyle w:val="Heading1"/>
+        <w:keepNext/>
       </w:pPr>
       <w:r>
         <w:rPr>
           <w:rFonts w:ascii="Times New Roman" w:hAnsi="Times New Roman"/>
           <w:b/>
-          <w:sz w:val="20"/>
+          <w:color w:val="000000"/>
+          <w:sz w:val="28"/>
         </w:rPr>
-        <w:t>Supplementary Figure S14.</w:t>
-      </w:r>
-      <w:r>
-        <w:rPr>
-          <w:rFonts w:ascii="Times New Roman" w:hAnsi="Times New Roman"/>
-          <w:sz w:val="20"/>
-        </w:rPr>
-        <w:t xml:space="preserve"> Mean per-image final-logit L₂ change at s=1 across the six model–depth combinations listed above. Each panel shows the same eight token-space patterns by five feature-space directions, with the shared logarithmic color scale used in Figure 6. “Grad. top” and “Grad. near-null” denote the joint-stream audit’s mean patch-margin-gradient directions; PC1, Random, and Centroid follow their Figure 6 definitions. The same N=100-image cohort per model estimates directions and scores outcomes.</w:t>
-      </w:r>
-    </w:p>
-    <w:p>
-      <w:pPr>
-        <w:pStyle w:val="Heading1"/>
-        <w:keepNext/>
-        <w:jc w:val="both"/>
-      </w:pPr>
-      <w:r>
-        <w:rPr>
-          <w:rFonts w:ascii="Times New Roman" w:hAnsi="Times New Roman"/>
-          <w:b/>
-          <w:sz w:val="20"/>
-        </w:rPr>
-        <w:t>Code and data availability</w:t>
+        <w:t>S14. Code and data availability</w:t>
       </w:r>
     </w:p>
     <w:p>
       <w:pPr>
         <w:spacing w:after="100" w:line="259" w:lineRule="auto"/>
-        <w:jc w:val="both"/>
       </w:pPr>
       <w:r>
         <w:rPr>

</xml_diff>

<commit_message>
Integrate corrected regularization sensitivity into paper
</commit_message>
<xml_diff>
--- a/docs/PAPER_SUPPLEMENTARY.docx
+++ b/docs/PAPER_SUPPLEMENTARY.docx
@@ -8210,6 +8210,2493 @@
         <w:t>The repository provides the experiment protocols, frozen split manifests, per-image results, seed-level summaries, validation manifests, and figure-generation sources. Publication-facing results are traceable through the main-text claims and number maps; experiment-specific seed IDs and statistical procedures are listed in Supplementary Section S10.</w:t>
       </w:r>
     </w:p>
+    <w:p>
+      <w:pPr>
+        <w:pStyle w:val="Heading1"/>
+        <w:keepNext/>
+      </w:pPr>
+      <w:r>
+        <w:rPr>
+          <w:rFonts w:ascii="Times New Roman" w:hAnsi="Times New Roman"/>
+          <w:b/>
+          <w:color w:val="000000"/>
+          <w:sz w:val="28"/>
+        </w:rPr>
+        <w:t>S15. Regularization Sensitivity of Operator-Aware Carriers</w:t>
+      </w:r>
+    </w:p>
+    <w:p>
+      <w:pPr>
+        <w:spacing w:after="100" w:line="259" w:lineRule="auto"/>
+      </w:pPr>
+      <w:r>
+        <w:rPr>
+          <w:rFonts w:ascii="Times New Roman" w:hAnsi="Times New Roman"/>
+          <w:i w:val="0"/>
+          <w:color w:val="202A32"/>
+          <w:sz w:val="20"/>
+        </w:rPr>
+        <w:t xml:space="preserve">This post-hoc sensitivity analysis evaluates the trace-normalized regularization in Equation (8) without changing the confirmatory solver or its archived results. For a dimensionless candidate factor </w:t>
+      </w:r>
+      <m:oMath>
+        <m:r>
+          <m:t xml:space="preserve">f</m:t>
+        </m:r>
+      </m:oMath>
+      <w:r>
+        <w:rPr>
+          <w:rFonts w:ascii="Times New Roman" w:hAnsi="Times New Roman"/>
+          <w:i w:val="0"/>
+          <w:color w:val="202A32"/>
+          <w:sz w:val="20"/>
+        </w:rPr>
+        <w:t>, the effective regularization is</w:t>
+      </w:r>
+    </w:p>
+    <w:tbl>
+      <w:tblPr>
+        <w:tblW w:type="auto" w:w="0"/>
+        <w:jc w:val="center"/>
+        <w:tblLayout w:type="fixed"/>
+        <w:tblLook w:firstColumn="1" w:firstRow="1" w:lastColumn="0" w:lastRow="0" w:noHBand="0" w:noVBand="1" w:val="04A0"/>
+        <w:tblW w:w="9994" w:type="dxa"/>
+        <w:tblBorders>
+          <w:top w:val="nil"/>
+          <w:left w:val="nil"/>
+          <w:bottom w:val="nil"/>
+          <w:right w:val="nil"/>
+          <w:insideH w:val="nil"/>
+          <w:insideV w:val="nil"/>
+        </w:tblBorders>
+      </w:tblPr>
+      <w:tblGrid>
+        <w:gridCol w:w="518"/>
+        <w:gridCol w:w="8957"/>
+        <w:gridCol w:w="518"/>
+      </w:tblGrid>
+      <w:tr>
+        <w:trPr>
+          <w:cantSplit/>
+        </w:trPr>
+        <w:tc>
+          <w:tcPr>
+            <w:tcW w:type="dxa" w:w="518"/>
+            <w:vAlign w:val="center"/>
+            <w:tcMar>
+              <w:top w:w="0" w:type="dxa"/>
+              <w:left w:w="0" w:type="dxa"/>
+              <w:bottom w:w="0" w:type="dxa"/>
+              <w:right w:w="0" w:type="dxa"/>
+            </w:tcMar>
+          </w:tcPr>
+          <w:p>
+            <w:pPr>
+              <w:keepLines/>
+              <w:spacing w:before="40" w:after="80" w:line="240" w:lineRule="auto"/>
+            </w:pPr>
+          </w:p>
+        </w:tc>
+        <w:tc>
+          <w:tcPr>
+            <w:tcW w:type="dxa" w:w="8957"/>
+            <w:vAlign w:val="center"/>
+            <w:tcMar>
+              <w:top w:w="0" w:type="dxa"/>
+              <w:left w:w="0" w:type="dxa"/>
+              <w:bottom w:w="0" w:type="dxa"/>
+              <w:right w:w="0" w:type="dxa"/>
+            </w:tcMar>
+          </w:tcPr>
+          <w:p>
+            <w:pPr>
+              <w:keepLines/>
+              <w:spacing w:before="0" w:after="0" w:line="240" w:lineRule="auto"/>
+              <w:jc w:val="center"/>
+            </w:pPr>
+            <m:oMath>
+              <m:sSub>
+                <m:e>
+                  <m:r>
+                    <m:t xml:space="preserve">λ</m:t>
+                  </m:r>
+                </m:e>
+                <m:sub>
+                  <m:r>
+                    <m:t xml:space="preserve">{</m:t>
+                  </m:r>
+                  <m:r>
+                    <m:t xml:space="preserve">abs</m:t>
+                  </m:r>
+                  <m:r>
+                    <m:t xml:space="preserve">}</m:t>
+                  </m:r>
+                </m:sub>
+              </m:sSub>
+              <m:r>
+                <m:t xml:space="preserve">=</m:t>
+              </m:r>
+              <m:r>
+                <m:t xml:space="preserve">f</m:t>
+              </m:r>
+              <m:r>
+                <m:t xml:space="preserve">\</m:t>
+              </m:r>
+              <m:r>
+                <m:t xml:space="preserve">,</m:t>
+              </m:r>
+              <m:r>
+                <m:t xml:space="preserve"> </m:t>
+              </m:r>
+              <m:r>
+                <m:t xml:space="preserve">{</m:t>
+              </m:r>
+              <m:r>
+                <m:t xml:space="preserve">tr</m:t>
+              </m:r>
+              <m:r>
+                <m:t xml:space="preserve">}</m:t>
+              </m:r>
+              <m:r>
+                <m:t xml:space="preserve">(</m:t>
+              </m:r>
+              <m:sSub>
+                <m:e>
+                  <m:r>
+                    <m:t xml:space="preserve">H</m:t>
+                  </m:r>
+                </m:e>
+                <m:sub>
+                  <m:r>
+                    <m:t xml:space="preserve">J</m:t>
+                  </m:r>
+                </m:sub>
+              </m:sSub>
+              <m:r>
+                <m:t xml:space="preserve">)</m:t>
+              </m:r>
+              <m:r>
+                <m:t xml:space="preserve">/</m:t>
+              </m:r>
+              <m:sSub>
+                <m:e>
+                  <m:r>
+                    <m:t xml:space="preserve">d</m:t>
+                  </m:r>
+                </m:e>
+                <m:sub>
+                  <m:r>
+                    <m:t xml:space="preserve">s</m:t>
+                  </m:r>
+                </m:sub>
+              </m:sSub>
+              <m:r>
+                <m:t xml:space="preserve">,</m:t>
+              </m:r>
+              <m:r>
+                <m:t xml:space="preserve"> </m:t>
+              </m:r>
+            </m:oMath>
+          </w:p>
+        </w:tc>
+        <w:tc>
+          <w:tcPr>
+            <w:tcW w:type="dxa" w:w="518"/>
+            <w:vAlign w:val="center"/>
+            <w:tcMar>
+              <w:top w:w="0" w:type="dxa"/>
+              <w:left w:w="0" w:type="dxa"/>
+              <w:bottom w:w="0" w:type="dxa"/>
+              <w:right w:w="0" w:type="dxa"/>
+            </w:tcMar>
+          </w:tcPr>
+          <w:p>
+            <w:pPr>
+              <w:keepLines/>
+              <w:spacing w:before="40" w:after="80" w:line="240" w:lineRule="auto"/>
+              <w:jc w:val="right"/>
+            </w:pPr>
+            <w:r>
+              <w:rPr>
+                <w:rFonts w:ascii="Times New Roman" w:hAnsi="Times New Roman"/>
+                <w:sz w:val="18"/>
+              </w:rPr>
+              <w:t>(1)</w:t>
+            </w:r>
+          </w:p>
+        </w:tc>
+      </w:tr>
+    </w:tbl>
+    <w:p>
+      <w:pPr>
+        <w:spacing w:after="100" w:line="259" w:lineRule="auto"/>
+      </w:pPr>
+      <w:r>
+        <w:rPr>
+          <w:rFonts w:ascii="Times New Roman" w:hAnsi="Times New Roman"/>
+          <w:i w:val="0"/>
+          <w:color w:val="202A32"/>
+          <w:sz w:val="20"/>
+        </w:rPr>
+        <w:t xml:space="preserve">with </w:t>
+      </w:r>
+      <m:oMath>
+        <m:r>
+          <m:t xml:space="preserve">f</m:t>
+        </m:r>
+        <m:r>
+          <m:t xml:space="preserve">∈</m:t>
+        </m:r>
+        <m:r>
+          <m:t xml:space="preserve">{</m:t>
+        </m:r>
+        <m:r>
+          <m:t xml:space="preserve">0</m:t>
+        </m:r>
+        <m:r>
+          <m:t xml:space="preserve">.</m:t>
+        </m:r>
+        <m:r>
+          <m:t xml:space="preserve">01</m:t>
+        </m:r>
+        <m:r>
+          <m:t xml:space="preserve">,</m:t>
+        </m:r>
+        <m:r>
+          <m:t xml:space="preserve">0</m:t>
+        </m:r>
+        <m:r>
+          <m:t xml:space="preserve">.</m:t>
+        </m:r>
+        <m:r>
+          <m:t xml:space="preserve">1</m:t>
+        </m:r>
+        <m:r>
+          <m:t xml:space="preserve">,</m:t>
+        </m:r>
+        <m:r>
+          <m:t xml:space="preserve">1</m:t>
+        </m:r>
+        <m:r>
+          <m:t xml:space="preserve">,</m:t>
+        </m:r>
+        <m:r>
+          <m:t xml:space="preserve">3</m:t>
+        </m:r>
+        <m:r>
+          <m:t xml:space="preserve">,</m:t>
+        </m:r>
+        <m:r>
+          <m:t xml:space="preserve">10</m:t>
+        </m:r>
+        <m:r>
+          <m:t xml:space="preserve">,</m:t>
+        </m:r>
+        <m:r>
+          <m:t xml:space="preserve">30</m:t>
+        </m:r>
+        <m:r>
+          <m:t xml:space="preserve">,</m:t>
+        </m:r>
+        <m:r>
+          <m:t xml:space="preserve">100</m:t>
+        </m:r>
+        <m:r>
+          <m:t xml:space="preserve">}</m:t>
+        </m:r>
+      </m:oMath>
+      <w:r>
+        <w:rPr>
+          <w:rFonts w:ascii="Times New Roman" w:hAnsi="Times New Roman"/>
+          <w:i w:val="0"/>
+          <w:color w:val="202A32"/>
+          <w:sz w:val="20"/>
+        </w:rPr>
+        <w:t>. The calibration cohort was constructed from the canonical 1,000-image, 1,000-class calibration split with seed 9101. We sampled 200 distinct class labels uniformly without replacement using independent fixed seed 61327 and used the corresponding image IDs for every model, budget, and factor. All IDs are in the canonical calibration split and disjoint from the seed-9201 confirmatory evaluation IDs; evaluation images and outcomes were not used. The cohort hash and selected labels and global image indices are recorded in the v2 manifest and selected cohort CSV.</w:t>
+      </w:r>
+    </w:p>
+    <w:p>
+      <w:pPr>
+        <w:spacing w:after="100" w:line="259" w:lineRule="auto"/>
+      </w:pPr>
+      <w:r>
+        <w:rPr>
+          <w:rFonts w:ascii="Times New Roman" w:hAnsi="Times New Roman"/>
+          <w:i w:val="0"/>
+          <w:color w:val="202A32"/>
+          <w:sz w:val="20"/>
+        </w:rPr>
+        <w:t xml:space="preserve">We evaluated frozen DeiT-Tiny, DeiT-Small, and ViT-B/16 AugReg at retained-token budgets </w:t>
+      </w:r>
+      <m:oMath>
+        <m:r>
+          <m:t xml:space="preserve">B</m:t>
+        </m:r>
+        <m:r>
+          <m:t xml:space="preserve">∈</m:t>
+        </m:r>
+        <m:r>
+          <m:t xml:space="preserve">{</m:t>
+        </m:r>
+        <m:r>
+          <m:t xml:space="preserve">32</m:t>
+        </m:r>
+        <m:r>
+          <m:t xml:space="preserve">,</m:t>
+        </m:r>
+        <m:r>
+          <m:t xml:space="preserve">98</m:t>
+        </m:r>
+        <m:r>
+          <m:t xml:space="preserve">}</m:t>
+        </m:r>
+      </m:oMath>
+      <w:r>
+        <w:rPr>
+          <w:rFonts w:ascii="Times New Roman" w:hAnsi="Times New Roman"/>
+          <w:i w:val="0"/>
+          <w:color w:val="202A32"/>
+          <w:sz w:val="20"/>
+        </w:rPr>
+        <w:t xml:space="preserve">, and DINOv2 ViT-S/14 at </w:t>
+      </w:r>
+      <m:oMath>
+        <m:r>
+          <m:t xml:space="preserve">B</m:t>
+        </m:r>
+        <m:r>
+          <m:t xml:space="preserve">∈</m:t>
+        </m:r>
+        <m:r>
+          <m:t xml:space="preserve">{</m:t>
+        </m:r>
+        <m:r>
+          <m:t xml:space="preserve">42</m:t>
+        </m:r>
+        <m:r>
+          <m:t xml:space="preserve">,</m:t>
+        </m:r>
+        <m:r>
+          <m:t xml:space="preserve">128</m:t>
+        </m:r>
+        <m:r>
+          <m:t xml:space="preserve">}</m:t>
+        </m:r>
+      </m:oMath>
+      <w:r>
+        <w:rPr>
+          <w:rFonts w:ascii="Times New Roman" w:hAnsi="Times New Roman"/>
+          <w:i w:val="0"/>
+          <w:color w:val="202A32"/>
+          <w:sz w:val="20"/>
+        </w:rPr>
+        <w:t xml:space="preserve">. Feature-similarity grouping and the existing exact per-image Jacobian solver were used. Each image's Jacobian and grouping were reused across all factors and both budgets, and the multiplicity-aware downstream forward was unchanged. Each model–budget cell therefore contains the same </w:t>
+      </w:r>
+      <m:oMath>
+        <m:r>
+          <m:t xml:space="preserve">N</m:t>
+        </m:r>
+        <m:r>
+          <m:t xml:space="preserve">=</m:t>
+        </m:r>
+        <m:r>
+          <m:t xml:space="preserve">200</m:t>
+        </m:r>
+      </m:oMath>
+      <w:r>
+        <w:rPr>
+          <w:rFonts w:ascii="Times New Roman" w:hAnsi="Times New Roman"/>
+          <w:i w:val="0"/>
+          <w:color w:val="202A32"/>
+          <w:sz w:val="20"/>
+        </w:rPr>
+        <w:t xml:space="preserve"> calibration images for every factor and for the common Group Mean baseline. The per-image CSV records nonlinear Top-1 correctness, clean-to-compressed final-logit </w:t>
+      </w:r>
+      <m:oMath>
+        <m:sSub>
+          <m:e>
+            <m:r>
+              <m:t xml:space="preserve">L</m:t>
+            </m:r>
+          </m:e>
+          <m:sub>
+            <m:r>
+              <m:t xml:space="preserve">2</m:t>
+            </m:r>
+          </m:sub>
+        </m:sSub>
+      </m:oMath>
+      <w:r>
+        <w:rPr>
+          <w:rFonts w:ascii="Times New Roman" w:hAnsi="Times New Roman"/>
+          <w:i w:val="0"/>
+          <w:color w:val="202A32"/>
+          <w:sz w:val="20"/>
+        </w:rPr>
+        <w:t xml:space="preserve"> damage, true-class margin change, linearized residual </w:t>
+      </w:r>
+      <m:oMath>
+        <m:r>
+          <m:t xml:space="preserve">||</m:t>
+        </m:r>
+        <m:r>
+          <m:t xml:space="preserve">JE</m:t>
+        </m:r>
+        <m:r>
+          <m:t xml:space="preserve">||</m:t>
+        </m:r>
+      </m:oMath>
+      <w:r>
+        <w:rPr>
+          <w:rFonts w:ascii="Times New Roman" w:hAnsi="Times New Roman"/>
+          <w:i w:val="0"/>
+          <w:color w:val="202A32"/>
+          <w:sz w:val="20"/>
+        </w:rPr>
+        <w:t xml:space="preserve">, carrier displacement </w:t>
+      </w:r>
+      <m:oMath>
+        <m:sSub>
+          <m:e>
+            <m:r>
+              <m:t xml:space="preserve">||</m:t>
+            </m:r>
+            <m:sSub>
+              <m:e>
+                <m:r>
+                  <m:t xml:space="preserve">C</m:t>
+                </m:r>
+              </m:e>
+              <m:sub>
+                <m:r>
+                  <m:t xml:space="preserve">opt</m:t>
+                </m:r>
+              </m:sub>
+            </m:sSub>
+            <m:r>
+              <m:t xml:space="preserve">-</m:t>
+            </m:r>
+            <m:sSub>
+              <m:e>
+                <m:r>
+                  <m:t xml:space="preserve">C</m:t>
+                </m:r>
+              </m:e>
+              <m:sub>
+                <m:r>
+                  <m:t xml:space="preserve">mean</m:t>
+                </m:r>
+              </m:sub>
+            </m:sSub>
+            <m:r>
+              <m:t xml:space="preserve">||</m:t>
+            </m:r>
+          </m:e>
+          <m:sub>
+            <m:r>
+              <m:t xml:space="preserve">F</m:t>
+            </m:r>
+          </m:sub>
+        </m:sSub>
+      </m:oMath>
+      <w:r>
+        <w:rPr>
+          <w:rFonts w:ascii="Times New Roman" w:hAnsi="Times New Roman"/>
+          <w:i w:val="0"/>
+          <w:color w:val="202A32"/>
+          <w:sz w:val="20"/>
+        </w:rPr>
+        <w:t xml:space="preserve">, </w:t>
+      </w:r>
+      <m:oMath>
+        <m:r>
+          <m:t xml:space="preserve">{</m:t>
+        </m:r>
+        <m:r>
+          <m:t xml:space="preserve">tr</m:t>
+        </m:r>
+        <m:r>
+          <m:t xml:space="preserve">}</m:t>
+        </m:r>
+        <m:r>
+          <m:t xml:space="preserve">(</m:t>
+        </m:r>
+        <m:sSub>
+          <m:e>
+            <m:r>
+              <m:t xml:space="preserve">H</m:t>
+            </m:r>
+          </m:e>
+          <m:sub>
+            <m:r>
+              <m:t xml:space="preserve">J</m:t>
+            </m:r>
+          </m:sub>
+        </m:sSub>
+        <m:r>
+          <m:t xml:space="preserve">)</m:t>
+        </m:r>
+        <m:r>
+          <m:t xml:space="preserve">/</m:t>
+        </m:r>
+        <m:sSub>
+          <m:e>
+            <m:r>
+              <m:t xml:space="preserve">d</m:t>
+            </m:r>
+          </m:e>
+          <m:sub>
+            <m:r>
+              <m:t xml:space="preserve">s</m:t>
+            </m:r>
+          </m:sub>
+        </m:sSub>
+      </m:oMath>
+      <w:r>
+        <w:rPr>
+          <w:rFonts w:ascii="Times New Roman" w:hAnsi="Times New Roman"/>
+          <w:i w:val="0"/>
+          <w:color w:val="202A32"/>
+          <w:sz w:val="20"/>
+        </w:rPr>
+        <w:t>, and effective absolute regularization.</w:t>
+      </w:r>
+    </w:p>
+    <w:p>
+      <w:pPr>
+        <w:keepLines/>
+        <w:spacing w:after="80"/>
+        <w:jc w:val="center"/>
+      </w:pPr>
+      <w:r>
+        <w:rPr>
+          <w:rFonts w:ascii="Times New Roman" w:hAnsi="Times New Roman"/>
+          <w:i/>
+          <w:color w:val="4C5963"/>
+          <w:sz w:val="17"/>
+        </w:rPr>
+        <w:t>Table S5. Calibration-cohort Top-1 sensitivity across regularization factors.</w:t>
+      </w:r>
+    </w:p>
+    <w:tbl>
+      <w:tblPr>
+        <w:tblStyle w:val="TableGrid"/>
+        <w:tblW w:type="auto" w:w="0"/>
+        <w:tblLayout w:type="autofit"/>
+        <w:tblLook w:firstColumn="1" w:firstRow="1" w:lastColumn="0" w:lastRow="0" w:noHBand="0" w:noVBand="1" w:val="04A0"/>
+      </w:tblPr>
+      <w:tblGrid>
+        <w:gridCol w:w="1666"/>
+        <w:gridCol w:w="1666"/>
+        <w:gridCol w:w="1666"/>
+        <w:gridCol w:w="1666"/>
+        <w:gridCol w:w="1666"/>
+        <w:gridCol w:w="1666"/>
+      </w:tblGrid>
+      <w:tr>
+        <w:trPr>
+          <w:tblHeader w:val="true"/>
+        </w:trPr>
+        <w:tc>
+          <w:tcPr>
+            <w:tcW w:type="dxa" w:w="1666"/>
+            <w:vAlign w:val="center"/>
+            <w:tcMar>
+              <w:top w:w="55" w:type="dxa"/>
+              <w:start w:w="65" w:type="dxa"/>
+              <w:bottom w:w="55" w:type="dxa"/>
+              <w:end w:w="65" w:type="dxa"/>
+            </w:tcMar>
+            <w:shd w:fill="DCEBF2"/>
+          </w:tcPr>
+          <w:p>
+            <w:pPr>
+              <w:spacing w:after="0" w:line="240" w:lineRule="auto"/>
+              <w:jc w:val="center"/>
+            </w:pPr>
+            <w:r/>
+            <w:r>
+              <w:rPr>
+                <w:rFonts w:ascii="Times New Roman" w:hAnsi="Times New Roman"/>
+                <w:b/>
+                <w:color w:val="17232D"/>
+                <w:sz w:val="15"/>
+              </w:rPr>
+              <w:t>Architecture</w:t>
+            </w:r>
+          </w:p>
+        </w:tc>
+        <w:tc>
+          <w:tcPr>
+            <w:tcW w:type="dxa" w:w="1666"/>
+            <w:vAlign w:val="center"/>
+            <w:tcMar>
+              <w:top w:w="55" w:type="dxa"/>
+              <w:start w:w="65" w:type="dxa"/>
+              <w:bottom w:w="55" w:type="dxa"/>
+              <w:end w:w="65" w:type="dxa"/>
+            </w:tcMar>
+            <w:shd w:fill="DCEBF2"/>
+          </w:tcPr>
+          <w:p>
+            <w:pPr>
+              <w:spacing w:after="0" w:line="240" w:lineRule="auto"/>
+              <w:jc w:val="center"/>
+            </w:pPr>
+            <w:r/>
+            <w:r>
+              <w:rPr>
+                <w:rFonts w:ascii="Times New Roman" w:hAnsi="Times New Roman"/>
+                <w:b/>
+                <w:color w:val="17232D"/>
+                <w:sz w:val="15"/>
+              </w:rPr>
+              <w:t>Budget (B)</w:t>
+            </w:r>
+          </w:p>
+        </w:tc>
+        <w:tc>
+          <w:tcPr>
+            <w:tcW w:type="dxa" w:w="1666"/>
+            <w:vAlign w:val="center"/>
+            <w:tcMar>
+              <w:top w:w="55" w:type="dxa"/>
+              <w:start w:w="65" w:type="dxa"/>
+              <w:bottom w:w="55" w:type="dxa"/>
+              <w:end w:w="65" w:type="dxa"/>
+            </w:tcMar>
+            <w:shd w:fill="DCEBF2"/>
+          </w:tcPr>
+          <w:p>
+            <w:pPr>
+              <w:spacing w:after="0" w:line="240" w:lineRule="auto"/>
+              <w:jc w:val="center"/>
+            </w:pPr>
+            <w:r/>
+            <w:r>
+              <w:rPr>
+                <w:rFonts w:ascii="Times New Roman" w:hAnsi="Times New Roman"/>
+                <w:b/>
+                <w:color w:val="17232D"/>
+                <w:sz w:val="15"/>
+              </w:rPr>
+              <w:t>Factor 10 Top-1 (%)</w:t>
+            </w:r>
+          </w:p>
+        </w:tc>
+        <w:tc>
+          <w:tcPr>
+            <w:tcW w:type="dxa" w:w="1666"/>
+            <w:vAlign w:val="center"/>
+            <w:tcMar>
+              <w:top w:w="55" w:type="dxa"/>
+              <w:start w:w="65" w:type="dxa"/>
+              <w:bottom w:w="55" w:type="dxa"/>
+              <w:end w:w="65" w:type="dxa"/>
+            </w:tcMar>
+            <w:shd w:fill="DCEBF2"/>
+          </w:tcPr>
+          <w:p>
+            <w:pPr>
+              <w:spacing w:after="0" w:line="240" w:lineRule="auto"/>
+              <w:jc w:val="center"/>
+            </w:pPr>
+            <w:r/>
+            <w:r>
+              <w:rPr>
+                <w:rFonts w:ascii="Times New Roman" w:hAnsi="Times New Roman"/>
+                <w:b/>
+                <w:color w:val="17232D"/>
+                <w:sz w:val="15"/>
+              </w:rPr>
+              <w:t>Cell maximum (%)</w:t>
+            </w:r>
+          </w:p>
+        </w:tc>
+        <w:tc>
+          <w:tcPr>
+            <w:tcW w:type="dxa" w:w="1666"/>
+            <w:vAlign w:val="center"/>
+            <w:tcMar>
+              <w:top w:w="55" w:type="dxa"/>
+              <w:start w:w="65" w:type="dxa"/>
+              <w:bottom w:w="55" w:type="dxa"/>
+              <w:end w:w="65" w:type="dxa"/>
+            </w:tcMar>
+            <w:shd w:fill="DCEBF2"/>
+          </w:tcPr>
+          <w:p>
+            <w:pPr>
+              <w:spacing w:after="0" w:line="240" w:lineRule="auto"/>
+              <w:jc w:val="center"/>
+            </w:pPr>
+            <w:r/>
+            <w:r>
+              <w:rPr>
+                <w:rFonts w:ascii="Times New Roman" w:hAnsi="Times New Roman"/>
+                <w:b/>
+                <w:color w:val="17232D"/>
+                <w:sz w:val="15"/>
+              </w:rPr>
+              <w:t>Factor(s) at maximum</w:t>
+            </w:r>
+          </w:p>
+        </w:tc>
+        <w:tc>
+          <w:tcPr>
+            <w:tcW w:type="dxa" w:w="1666"/>
+            <w:vAlign w:val="center"/>
+            <w:tcMar>
+              <w:top w:w="55" w:type="dxa"/>
+              <w:start w:w="65" w:type="dxa"/>
+              <w:bottom w:w="55" w:type="dxa"/>
+              <w:end w:w="65" w:type="dxa"/>
+            </w:tcMar>
+            <w:shd w:fill="DCEBF2"/>
+          </w:tcPr>
+          <w:p>
+            <w:pPr>
+              <w:spacing w:after="0" w:line="240" w:lineRule="auto"/>
+              <w:jc w:val="center"/>
+            </w:pPr>
+            <w:r/>
+            <w:r>
+              <w:rPr>
+                <w:rFonts w:ascii="Times New Roman" w:hAnsi="Times New Roman"/>
+                <w:b/>
+                <w:color w:val="17232D"/>
+                <w:sz w:val="15"/>
+              </w:rPr>
+              <w:t>Group Mean Top-1 (%)</w:t>
+            </w:r>
+          </w:p>
+        </w:tc>
+      </w:tr>
+      <w:tr>
+        <w:tc>
+          <w:tcPr>
+            <w:tcW w:type="dxa" w:w="1666"/>
+            <w:vAlign w:val="center"/>
+            <w:tcMar>
+              <w:top w:w="55" w:type="dxa"/>
+              <w:start w:w="65" w:type="dxa"/>
+              <w:bottom w:w="55" w:type="dxa"/>
+              <w:end w:w="65" w:type="dxa"/>
+            </w:tcMar>
+          </w:tcPr>
+          <w:p>
+            <w:pPr>
+              <w:spacing w:after="0" w:line="240" w:lineRule="auto"/>
+            </w:pPr>
+            <w:r/>
+            <w:r>
+              <w:rPr>
+                <w:rFonts w:ascii="Times New Roman" w:hAnsi="Times New Roman"/>
+                <w:b w:val="0"/>
+                <w:color w:val="202A32"/>
+                <w:sz w:val="15"/>
+              </w:rPr>
+              <w:t>DeiT-Tiny</w:t>
+            </w:r>
+          </w:p>
+        </w:tc>
+        <w:tc>
+          <w:tcPr>
+            <w:tcW w:type="dxa" w:w="1666"/>
+            <w:vAlign w:val="center"/>
+            <w:tcMar>
+              <w:top w:w="55" w:type="dxa"/>
+              <w:start w:w="65" w:type="dxa"/>
+              <w:bottom w:w="55" w:type="dxa"/>
+              <w:end w:w="65" w:type="dxa"/>
+            </w:tcMar>
+          </w:tcPr>
+          <w:p>
+            <w:pPr>
+              <w:spacing w:after="0" w:line="240" w:lineRule="auto"/>
+              <w:jc w:val="center"/>
+            </w:pPr>
+            <w:r/>
+            <w:r>
+              <w:rPr>
+                <w:rFonts w:ascii="Times New Roman" w:hAnsi="Times New Roman"/>
+                <w:b w:val="0"/>
+                <w:color w:val="202A32"/>
+                <w:sz w:val="15"/>
+              </w:rPr>
+              <w:t>32</w:t>
+            </w:r>
+          </w:p>
+        </w:tc>
+        <w:tc>
+          <w:tcPr>
+            <w:tcW w:type="dxa" w:w="1666"/>
+            <w:vAlign w:val="center"/>
+            <w:tcMar>
+              <w:top w:w="55" w:type="dxa"/>
+              <w:start w:w="65" w:type="dxa"/>
+              <w:bottom w:w="55" w:type="dxa"/>
+              <w:end w:w="65" w:type="dxa"/>
+            </w:tcMar>
+          </w:tcPr>
+          <w:p>
+            <w:pPr>
+              <w:spacing w:after="0" w:line="240" w:lineRule="auto"/>
+              <w:jc w:val="center"/>
+            </w:pPr>
+            <w:r/>
+            <w:r>
+              <w:rPr>
+                <w:rFonts w:ascii="Times New Roman" w:hAnsi="Times New Roman"/>
+                <w:b w:val="0"/>
+                <w:color w:val="202A32"/>
+                <w:sz w:val="15"/>
+              </w:rPr>
+              <w:t>71.0</w:t>
+            </w:r>
+          </w:p>
+        </w:tc>
+        <w:tc>
+          <w:tcPr>
+            <w:tcW w:type="dxa" w:w="1666"/>
+            <w:vAlign w:val="center"/>
+            <w:tcMar>
+              <w:top w:w="55" w:type="dxa"/>
+              <w:start w:w="65" w:type="dxa"/>
+              <w:bottom w:w="55" w:type="dxa"/>
+              <w:end w:w="65" w:type="dxa"/>
+            </w:tcMar>
+          </w:tcPr>
+          <w:p>
+            <w:pPr>
+              <w:spacing w:after="0" w:line="240" w:lineRule="auto"/>
+              <w:jc w:val="center"/>
+            </w:pPr>
+            <w:r/>
+            <w:r>
+              <w:rPr>
+                <w:rFonts w:ascii="Times New Roman" w:hAnsi="Times New Roman"/>
+                <w:b w:val="0"/>
+                <w:color w:val="202A32"/>
+                <w:sz w:val="15"/>
+              </w:rPr>
+              <w:t>71.5</w:t>
+            </w:r>
+          </w:p>
+        </w:tc>
+        <w:tc>
+          <w:tcPr>
+            <w:tcW w:type="dxa" w:w="1666"/>
+            <w:vAlign w:val="center"/>
+            <w:tcMar>
+              <w:top w:w="55" w:type="dxa"/>
+              <w:start w:w="65" w:type="dxa"/>
+              <w:bottom w:w="55" w:type="dxa"/>
+              <w:end w:w="65" w:type="dxa"/>
+            </w:tcMar>
+          </w:tcPr>
+          <w:p>
+            <w:pPr>
+              <w:spacing w:after="0" w:line="240" w:lineRule="auto"/>
+              <w:jc w:val="center"/>
+            </w:pPr>
+            <w:r/>
+            <w:r>
+              <w:rPr>
+                <w:rFonts w:ascii="Times New Roman" w:hAnsi="Times New Roman"/>
+                <w:b w:val="0"/>
+                <w:color w:val="202A32"/>
+                <w:sz w:val="15"/>
+              </w:rPr>
+              <w:t>1, 30</w:t>
+            </w:r>
+          </w:p>
+        </w:tc>
+        <w:tc>
+          <w:tcPr>
+            <w:tcW w:type="dxa" w:w="1666"/>
+            <w:vAlign w:val="center"/>
+            <w:tcMar>
+              <w:top w:w="55" w:type="dxa"/>
+              <w:start w:w="65" w:type="dxa"/>
+              <w:bottom w:w="55" w:type="dxa"/>
+              <w:end w:w="65" w:type="dxa"/>
+            </w:tcMar>
+          </w:tcPr>
+          <w:p>
+            <w:pPr>
+              <w:spacing w:after="0" w:line="240" w:lineRule="auto"/>
+              <w:jc w:val="center"/>
+            </w:pPr>
+            <w:r/>
+            <w:r>
+              <w:rPr>
+                <w:rFonts w:ascii="Times New Roman" w:hAnsi="Times New Roman"/>
+                <w:b w:val="0"/>
+                <w:color w:val="202A32"/>
+                <w:sz w:val="15"/>
+              </w:rPr>
+              <w:t>70.5</w:t>
+            </w:r>
+          </w:p>
+        </w:tc>
+      </w:tr>
+      <w:tr>
+        <w:tc>
+          <w:tcPr>
+            <w:tcW w:type="dxa" w:w="1666"/>
+            <w:vAlign w:val="center"/>
+            <w:tcMar>
+              <w:top w:w="55" w:type="dxa"/>
+              <w:start w:w="65" w:type="dxa"/>
+              <w:bottom w:w="55" w:type="dxa"/>
+              <w:end w:w="65" w:type="dxa"/>
+            </w:tcMar>
+          </w:tcPr>
+          <w:p>
+            <w:pPr>
+              <w:spacing w:after="0" w:line="240" w:lineRule="auto"/>
+            </w:pPr>
+            <w:r/>
+            <w:r>
+              <w:rPr>
+                <w:rFonts w:ascii="Times New Roman" w:hAnsi="Times New Roman"/>
+                <w:b w:val="0"/>
+                <w:color w:val="202A32"/>
+                <w:sz w:val="15"/>
+              </w:rPr>
+              <w:t>DeiT-Tiny</w:t>
+            </w:r>
+          </w:p>
+        </w:tc>
+        <w:tc>
+          <w:tcPr>
+            <w:tcW w:type="dxa" w:w="1666"/>
+            <w:vAlign w:val="center"/>
+            <w:tcMar>
+              <w:top w:w="55" w:type="dxa"/>
+              <w:start w:w="65" w:type="dxa"/>
+              <w:bottom w:w="55" w:type="dxa"/>
+              <w:end w:w="65" w:type="dxa"/>
+            </w:tcMar>
+          </w:tcPr>
+          <w:p>
+            <w:pPr>
+              <w:spacing w:after="0" w:line="240" w:lineRule="auto"/>
+              <w:jc w:val="center"/>
+            </w:pPr>
+            <w:r/>
+            <w:r>
+              <w:rPr>
+                <w:rFonts w:ascii="Times New Roman" w:hAnsi="Times New Roman"/>
+                <w:b w:val="0"/>
+                <w:color w:val="202A32"/>
+                <w:sz w:val="15"/>
+              </w:rPr>
+              <w:t>98</w:t>
+            </w:r>
+          </w:p>
+        </w:tc>
+        <w:tc>
+          <w:tcPr>
+            <w:tcW w:type="dxa" w:w="1666"/>
+            <w:vAlign w:val="center"/>
+            <w:tcMar>
+              <w:top w:w="55" w:type="dxa"/>
+              <w:start w:w="65" w:type="dxa"/>
+              <w:bottom w:w="55" w:type="dxa"/>
+              <w:end w:w="65" w:type="dxa"/>
+            </w:tcMar>
+          </w:tcPr>
+          <w:p>
+            <w:pPr>
+              <w:spacing w:after="0" w:line="240" w:lineRule="auto"/>
+              <w:jc w:val="center"/>
+            </w:pPr>
+            <w:r/>
+            <w:r>
+              <w:rPr>
+                <w:rFonts w:ascii="Times New Roman" w:hAnsi="Times New Roman"/>
+                <w:b w:val="0"/>
+                <w:color w:val="202A32"/>
+                <w:sz w:val="15"/>
+              </w:rPr>
+              <w:t>72.0</w:t>
+            </w:r>
+          </w:p>
+        </w:tc>
+        <w:tc>
+          <w:tcPr>
+            <w:tcW w:type="dxa" w:w="1666"/>
+            <w:vAlign w:val="center"/>
+            <w:tcMar>
+              <w:top w:w="55" w:type="dxa"/>
+              <w:start w:w="65" w:type="dxa"/>
+              <w:bottom w:w="55" w:type="dxa"/>
+              <w:end w:w="65" w:type="dxa"/>
+            </w:tcMar>
+          </w:tcPr>
+          <w:p>
+            <w:pPr>
+              <w:spacing w:after="0" w:line="240" w:lineRule="auto"/>
+              <w:jc w:val="center"/>
+            </w:pPr>
+            <w:r/>
+            <w:r>
+              <w:rPr>
+                <w:rFonts w:ascii="Times New Roman" w:hAnsi="Times New Roman"/>
+                <w:b w:val="0"/>
+                <w:color w:val="202A32"/>
+                <w:sz w:val="15"/>
+              </w:rPr>
+              <w:t>72.5</w:t>
+            </w:r>
+          </w:p>
+        </w:tc>
+        <w:tc>
+          <w:tcPr>
+            <w:tcW w:type="dxa" w:w="1666"/>
+            <w:vAlign w:val="center"/>
+            <w:tcMar>
+              <w:top w:w="55" w:type="dxa"/>
+              <w:start w:w="65" w:type="dxa"/>
+              <w:bottom w:w="55" w:type="dxa"/>
+              <w:end w:w="65" w:type="dxa"/>
+            </w:tcMar>
+          </w:tcPr>
+          <w:p>
+            <w:pPr>
+              <w:spacing w:after="0" w:line="240" w:lineRule="auto"/>
+              <w:jc w:val="center"/>
+            </w:pPr>
+            <w:r/>
+            <w:r>
+              <w:rPr>
+                <w:rFonts w:ascii="Times New Roman" w:hAnsi="Times New Roman"/>
+                <w:b w:val="0"/>
+                <w:color w:val="202A32"/>
+                <w:sz w:val="15"/>
+              </w:rPr>
+              <w:t>1, 3</w:t>
+            </w:r>
+          </w:p>
+        </w:tc>
+        <w:tc>
+          <w:tcPr>
+            <w:tcW w:type="dxa" w:w="1666"/>
+            <w:vAlign w:val="center"/>
+            <w:tcMar>
+              <w:top w:w="55" w:type="dxa"/>
+              <w:start w:w="65" w:type="dxa"/>
+              <w:bottom w:w="55" w:type="dxa"/>
+              <w:end w:w="65" w:type="dxa"/>
+            </w:tcMar>
+          </w:tcPr>
+          <w:p>
+            <w:pPr>
+              <w:spacing w:after="0" w:line="240" w:lineRule="auto"/>
+              <w:jc w:val="center"/>
+            </w:pPr>
+            <w:r/>
+            <w:r>
+              <w:rPr>
+                <w:rFonts w:ascii="Times New Roman" w:hAnsi="Times New Roman"/>
+                <w:b w:val="0"/>
+                <w:color w:val="202A32"/>
+                <w:sz w:val="15"/>
+              </w:rPr>
+              <w:t>72.0</w:t>
+            </w:r>
+          </w:p>
+        </w:tc>
+      </w:tr>
+      <w:tr>
+        <w:tc>
+          <w:tcPr>
+            <w:tcW w:type="dxa" w:w="1666"/>
+            <w:vAlign w:val="center"/>
+            <w:tcMar>
+              <w:top w:w="55" w:type="dxa"/>
+              <w:start w:w="65" w:type="dxa"/>
+              <w:bottom w:w="55" w:type="dxa"/>
+              <w:end w:w="65" w:type="dxa"/>
+            </w:tcMar>
+          </w:tcPr>
+          <w:p>
+            <w:pPr>
+              <w:spacing w:after="0" w:line="240" w:lineRule="auto"/>
+            </w:pPr>
+            <w:r/>
+            <w:r>
+              <w:rPr>
+                <w:rFonts w:ascii="Times New Roman" w:hAnsi="Times New Roman"/>
+                <w:b w:val="0"/>
+                <w:color w:val="202A32"/>
+                <w:sz w:val="15"/>
+              </w:rPr>
+              <w:t>DeiT-Small</w:t>
+            </w:r>
+          </w:p>
+        </w:tc>
+        <w:tc>
+          <w:tcPr>
+            <w:tcW w:type="dxa" w:w="1666"/>
+            <w:vAlign w:val="center"/>
+            <w:tcMar>
+              <w:top w:w="55" w:type="dxa"/>
+              <w:start w:w="65" w:type="dxa"/>
+              <w:bottom w:w="55" w:type="dxa"/>
+              <w:end w:w="65" w:type="dxa"/>
+            </w:tcMar>
+          </w:tcPr>
+          <w:p>
+            <w:pPr>
+              <w:spacing w:after="0" w:line="240" w:lineRule="auto"/>
+              <w:jc w:val="center"/>
+            </w:pPr>
+            <w:r/>
+            <w:r>
+              <w:rPr>
+                <w:rFonts w:ascii="Times New Roman" w:hAnsi="Times New Roman"/>
+                <w:b w:val="0"/>
+                <w:color w:val="202A32"/>
+                <w:sz w:val="15"/>
+              </w:rPr>
+              <w:t>32</w:t>
+            </w:r>
+          </w:p>
+        </w:tc>
+        <w:tc>
+          <w:tcPr>
+            <w:tcW w:type="dxa" w:w="1666"/>
+            <w:vAlign w:val="center"/>
+            <w:tcMar>
+              <w:top w:w="55" w:type="dxa"/>
+              <w:start w:w="65" w:type="dxa"/>
+              <w:bottom w:w="55" w:type="dxa"/>
+              <w:end w:w="65" w:type="dxa"/>
+            </w:tcMar>
+          </w:tcPr>
+          <w:p>
+            <w:pPr>
+              <w:spacing w:after="0" w:line="240" w:lineRule="auto"/>
+              <w:jc w:val="center"/>
+            </w:pPr>
+            <w:r/>
+            <w:r>
+              <w:rPr>
+                <w:rFonts w:ascii="Times New Roman" w:hAnsi="Times New Roman"/>
+                <w:b w:val="0"/>
+                <w:color w:val="202A32"/>
+                <w:sz w:val="15"/>
+              </w:rPr>
+              <w:t>80.5</w:t>
+            </w:r>
+          </w:p>
+        </w:tc>
+        <w:tc>
+          <w:tcPr>
+            <w:tcW w:type="dxa" w:w="1666"/>
+            <w:vAlign w:val="center"/>
+            <w:tcMar>
+              <w:top w:w="55" w:type="dxa"/>
+              <w:start w:w="65" w:type="dxa"/>
+              <w:bottom w:w="55" w:type="dxa"/>
+              <w:end w:w="65" w:type="dxa"/>
+            </w:tcMar>
+          </w:tcPr>
+          <w:p>
+            <w:pPr>
+              <w:spacing w:after="0" w:line="240" w:lineRule="auto"/>
+              <w:jc w:val="center"/>
+            </w:pPr>
+            <w:r/>
+            <w:r>
+              <w:rPr>
+                <w:rFonts w:ascii="Times New Roman" w:hAnsi="Times New Roman"/>
+                <w:b w:val="0"/>
+                <w:color w:val="202A32"/>
+                <w:sz w:val="15"/>
+              </w:rPr>
+              <w:t>81.0</w:t>
+            </w:r>
+          </w:p>
+        </w:tc>
+        <w:tc>
+          <w:tcPr>
+            <w:tcW w:type="dxa" w:w="1666"/>
+            <w:vAlign w:val="center"/>
+            <w:tcMar>
+              <w:top w:w="55" w:type="dxa"/>
+              <w:start w:w="65" w:type="dxa"/>
+              <w:bottom w:w="55" w:type="dxa"/>
+              <w:end w:w="65" w:type="dxa"/>
+            </w:tcMar>
+          </w:tcPr>
+          <w:p>
+            <w:pPr>
+              <w:spacing w:after="0" w:line="240" w:lineRule="auto"/>
+              <w:jc w:val="center"/>
+            </w:pPr>
+            <w:r/>
+            <w:r>
+              <w:rPr>
+                <w:rFonts w:ascii="Times New Roman" w:hAnsi="Times New Roman"/>
+                <w:b w:val="0"/>
+                <w:color w:val="202A32"/>
+                <w:sz w:val="15"/>
+              </w:rPr>
+              <w:t>3</w:t>
+            </w:r>
+          </w:p>
+        </w:tc>
+        <w:tc>
+          <w:tcPr>
+            <w:tcW w:type="dxa" w:w="1666"/>
+            <w:vAlign w:val="center"/>
+            <w:tcMar>
+              <w:top w:w="55" w:type="dxa"/>
+              <w:start w:w="65" w:type="dxa"/>
+              <w:bottom w:w="55" w:type="dxa"/>
+              <w:end w:w="65" w:type="dxa"/>
+            </w:tcMar>
+          </w:tcPr>
+          <w:p>
+            <w:pPr>
+              <w:spacing w:after="0" w:line="240" w:lineRule="auto"/>
+              <w:jc w:val="center"/>
+            </w:pPr>
+            <w:r/>
+            <w:r>
+              <w:rPr>
+                <w:rFonts w:ascii="Times New Roman" w:hAnsi="Times New Roman"/>
+                <w:b w:val="0"/>
+                <w:color w:val="202A32"/>
+                <w:sz w:val="15"/>
+              </w:rPr>
+              <w:t>77.5</w:t>
+            </w:r>
+          </w:p>
+        </w:tc>
+      </w:tr>
+      <w:tr>
+        <w:tc>
+          <w:tcPr>
+            <w:tcW w:type="dxa" w:w="1666"/>
+            <w:vAlign w:val="center"/>
+            <w:tcMar>
+              <w:top w:w="55" w:type="dxa"/>
+              <w:start w:w="65" w:type="dxa"/>
+              <w:bottom w:w="55" w:type="dxa"/>
+              <w:end w:w="65" w:type="dxa"/>
+            </w:tcMar>
+          </w:tcPr>
+          <w:p>
+            <w:pPr>
+              <w:spacing w:after="0" w:line="240" w:lineRule="auto"/>
+            </w:pPr>
+            <w:r/>
+            <w:r>
+              <w:rPr>
+                <w:rFonts w:ascii="Times New Roman" w:hAnsi="Times New Roman"/>
+                <w:b w:val="0"/>
+                <w:color w:val="202A32"/>
+                <w:sz w:val="15"/>
+              </w:rPr>
+              <w:t>DeiT-Small</w:t>
+            </w:r>
+          </w:p>
+        </w:tc>
+        <w:tc>
+          <w:tcPr>
+            <w:tcW w:type="dxa" w:w="1666"/>
+            <w:vAlign w:val="center"/>
+            <w:tcMar>
+              <w:top w:w="55" w:type="dxa"/>
+              <w:start w:w="65" w:type="dxa"/>
+              <w:bottom w:w="55" w:type="dxa"/>
+              <w:end w:w="65" w:type="dxa"/>
+            </w:tcMar>
+          </w:tcPr>
+          <w:p>
+            <w:pPr>
+              <w:spacing w:after="0" w:line="240" w:lineRule="auto"/>
+              <w:jc w:val="center"/>
+            </w:pPr>
+            <w:r/>
+            <w:r>
+              <w:rPr>
+                <w:rFonts w:ascii="Times New Roman" w:hAnsi="Times New Roman"/>
+                <w:b w:val="0"/>
+                <w:color w:val="202A32"/>
+                <w:sz w:val="15"/>
+              </w:rPr>
+              <w:t>98</w:t>
+            </w:r>
+          </w:p>
+        </w:tc>
+        <w:tc>
+          <w:tcPr>
+            <w:tcW w:type="dxa" w:w="1666"/>
+            <w:vAlign w:val="center"/>
+            <w:tcMar>
+              <w:top w:w="55" w:type="dxa"/>
+              <w:start w:w="65" w:type="dxa"/>
+              <w:bottom w:w="55" w:type="dxa"/>
+              <w:end w:w="65" w:type="dxa"/>
+            </w:tcMar>
+          </w:tcPr>
+          <w:p>
+            <w:pPr>
+              <w:spacing w:after="0" w:line="240" w:lineRule="auto"/>
+              <w:jc w:val="center"/>
+            </w:pPr>
+            <w:r/>
+            <w:r>
+              <w:rPr>
+                <w:rFonts w:ascii="Times New Roman" w:hAnsi="Times New Roman"/>
+                <w:b w:val="0"/>
+                <w:color w:val="202A32"/>
+                <w:sz w:val="15"/>
+              </w:rPr>
+              <w:t>81.0</w:t>
+            </w:r>
+          </w:p>
+        </w:tc>
+        <w:tc>
+          <w:tcPr>
+            <w:tcW w:type="dxa" w:w="1666"/>
+            <w:vAlign w:val="center"/>
+            <w:tcMar>
+              <w:top w:w="55" w:type="dxa"/>
+              <w:start w:w="65" w:type="dxa"/>
+              <w:bottom w:w="55" w:type="dxa"/>
+              <w:end w:w="65" w:type="dxa"/>
+            </w:tcMar>
+          </w:tcPr>
+          <w:p>
+            <w:pPr>
+              <w:spacing w:after="0" w:line="240" w:lineRule="auto"/>
+              <w:jc w:val="center"/>
+            </w:pPr>
+            <w:r/>
+            <w:r>
+              <w:rPr>
+                <w:rFonts w:ascii="Times New Roman" w:hAnsi="Times New Roman"/>
+                <w:b w:val="0"/>
+                <w:color w:val="202A32"/>
+                <w:sz w:val="15"/>
+              </w:rPr>
+              <w:t>81.0</w:t>
+            </w:r>
+          </w:p>
+        </w:tc>
+        <w:tc>
+          <w:tcPr>
+            <w:tcW w:type="dxa" w:w="1666"/>
+            <w:vAlign w:val="center"/>
+            <w:tcMar>
+              <w:top w:w="55" w:type="dxa"/>
+              <w:start w:w="65" w:type="dxa"/>
+              <w:bottom w:w="55" w:type="dxa"/>
+              <w:end w:w="65" w:type="dxa"/>
+            </w:tcMar>
+          </w:tcPr>
+          <w:p>
+            <w:pPr>
+              <w:spacing w:after="0" w:line="240" w:lineRule="auto"/>
+              <w:jc w:val="center"/>
+            </w:pPr>
+            <w:r/>
+            <w:r>
+              <w:rPr>
+                <w:rFonts w:ascii="Times New Roman" w:hAnsi="Times New Roman"/>
+                <w:b w:val="0"/>
+                <w:color w:val="202A32"/>
+                <w:sz w:val="15"/>
+              </w:rPr>
+              <w:t>all seven factors</w:t>
+            </w:r>
+          </w:p>
+        </w:tc>
+        <w:tc>
+          <w:tcPr>
+            <w:tcW w:type="dxa" w:w="1666"/>
+            <w:vAlign w:val="center"/>
+            <w:tcMar>
+              <w:top w:w="55" w:type="dxa"/>
+              <w:start w:w="65" w:type="dxa"/>
+              <w:bottom w:w="55" w:type="dxa"/>
+              <w:end w:w="65" w:type="dxa"/>
+            </w:tcMar>
+          </w:tcPr>
+          <w:p>
+            <w:pPr>
+              <w:spacing w:after="0" w:line="240" w:lineRule="auto"/>
+              <w:jc w:val="center"/>
+            </w:pPr>
+            <w:r/>
+            <w:r>
+              <w:rPr>
+                <w:rFonts w:ascii="Times New Roman" w:hAnsi="Times New Roman"/>
+                <w:b w:val="0"/>
+                <w:color w:val="202A32"/>
+                <w:sz w:val="15"/>
+              </w:rPr>
+              <w:t>80.5</w:t>
+            </w:r>
+          </w:p>
+        </w:tc>
+      </w:tr>
+      <w:tr>
+        <w:tc>
+          <w:tcPr>
+            <w:tcW w:type="dxa" w:w="1666"/>
+            <w:vAlign w:val="center"/>
+            <w:tcMar>
+              <w:top w:w="55" w:type="dxa"/>
+              <w:start w:w="65" w:type="dxa"/>
+              <w:bottom w:w="55" w:type="dxa"/>
+              <w:end w:w="65" w:type="dxa"/>
+            </w:tcMar>
+          </w:tcPr>
+          <w:p>
+            <w:pPr>
+              <w:spacing w:after="0" w:line="240" w:lineRule="auto"/>
+            </w:pPr>
+            <w:r/>
+            <w:r>
+              <w:rPr>
+                <w:rFonts w:ascii="Times New Roman" w:hAnsi="Times New Roman"/>
+                <w:b w:val="0"/>
+                <w:color w:val="202A32"/>
+                <w:sz w:val="15"/>
+              </w:rPr>
+              <w:t>ViT-B/16 AugReg</w:t>
+            </w:r>
+          </w:p>
+        </w:tc>
+        <w:tc>
+          <w:tcPr>
+            <w:tcW w:type="dxa" w:w="1666"/>
+            <w:vAlign w:val="center"/>
+            <w:tcMar>
+              <w:top w:w="55" w:type="dxa"/>
+              <w:start w:w="65" w:type="dxa"/>
+              <w:bottom w:w="55" w:type="dxa"/>
+              <w:end w:w="65" w:type="dxa"/>
+            </w:tcMar>
+          </w:tcPr>
+          <w:p>
+            <w:pPr>
+              <w:spacing w:after="0" w:line="240" w:lineRule="auto"/>
+              <w:jc w:val="center"/>
+            </w:pPr>
+            <w:r/>
+            <w:r>
+              <w:rPr>
+                <w:rFonts w:ascii="Times New Roman" w:hAnsi="Times New Roman"/>
+                <w:b w:val="0"/>
+                <w:color w:val="202A32"/>
+                <w:sz w:val="15"/>
+              </w:rPr>
+              <w:t>32</w:t>
+            </w:r>
+          </w:p>
+        </w:tc>
+        <w:tc>
+          <w:tcPr>
+            <w:tcW w:type="dxa" w:w="1666"/>
+            <w:vAlign w:val="center"/>
+            <w:tcMar>
+              <w:top w:w="55" w:type="dxa"/>
+              <w:start w:w="65" w:type="dxa"/>
+              <w:bottom w:w="55" w:type="dxa"/>
+              <w:end w:w="65" w:type="dxa"/>
+            </w:tcMar>
+          </w:tcPr>
+          <w:p>
+            <w:pPr>
+              <w:spacing w:after="0" w:line="240" w:lineRule="auto"/>
+              <w:jc w:val="center"/>
+            </w:pPr>
+            <w:r/>
+            <w:r>
+              <w:rPr>
+                <w:rFonts w:ascii="Times New Roman" w:hAnsi="Times New Roman"/>
+                <w:b w:val="0"/>
+                <w:color w:val="202A32"/>
+                <w:sz w:val="15"/>
+              </w:rPr>
+              <w:t>79.5</w:t>
+            </w:r>
+          </w:p>
+        </w:tc>
+        <w:tc>
+          <w:tcPr>
+            <w:tcW w:type="dxa" w:w="1666"/>
+            <w:vAlign w:val="center"/>
+            <w:tcMar>
+              <w:top w:w="55" w:type="dxa"/>
+              <w:start w:w="65" w:type="dxa"/>
+              <w:bottom w:w="55" w:type="dxa"/>
+              <w:end w:w="65" w:type="dxa"/>
+            </w:tcMar>
+          </w:tcPr>
+          <w:p>
+            <w:pPr>
+              <w:spacing w:after="0" w:line="240" w:lineRule="auto"/>
+              <w:jc w:val="center"/>
+            </w:pPr>
+            <w:r/>
+            <w:r>
+              <w:rPr>
+                <w:rFonts w:ascii="Times New Roman" w:hAnsi="Times New Roman"/>
+                <w:b w:val="0"/>
+                <w:color w:val="202A32"/>
+                <w:sz w:val="15"/>
+              </w:rPr>
+              <w:t>79.5</w:t>
+            </w:r>
+          </w:p>
+        </w:tc>
+        <w:tc>
+          <w:tcPr>
+            <w:tcW w:type="dxa" w:w="1666"/>
+            <w:vAlign w:val="center"/>
+            <w:tcMar>
+              <w:top w:w="55" w:type="dxa"/>
+              <w:start w:w="65" w:type="dxa"/>
+              <w:bottom w:w="55" w:type="dxa"/>
+              <w:end w:w="65" w:type="dxa"/>
+            </w:tcMar>
+          </w:tcPr>
+          <w:p>
+            <w:pPr>
+              <w:spacing w:after="0" w:line="240" w:lineRule="auto"/>
+              <w:jc w:val="center"/>
+            </w:pPr>
+            <w:r/>
+            <w:r>
+              <w:rPr>
+                <w:rFonts w:ascii="Times New Roman" w:hAnsi="Times New Roman"/>
+                <w:b w:val="0"/>
+                <w:color w:val="202A32"/>
+                <w:sz w:val="15"/>
+              </w:rPr>
+              <w:t>10</w:t>
+            </w:r>
+          </w:p>
+        </w:tc>
+        <w:tc>
+          <w:tcPr>
+            <w:tcW w:type="dxa" w:w="1666"/>
+            <w:vAlign w:val="center"/>
+            <w:tcMar>
+              <w:top w:w="55" w:type="dxa"/>
+              <w:start w:w="65" w:type="dxa"/>
+              <w:bottom w:w="55" w:type="dxa"/>
+              <w:end w:w="65" w:type="dxa"/>
+            </w:tcMar>
+          </w:tcPr>
+          <w:p>
+            <w:pPr>
+              <w:spacing w:after="0" w:line="240" w:lineRule="auto"/>
+              <w:jc w:val="center"/>
+            </w:pPr>
+            <w:r/>
+            <w:r>
+              <w:rPr>
+                <w:rFonts w:ascii="Times New Roman" w:hAnsi="Times New Roman"/>
+                <w:b w:val="0"/>
+                <w:color w:val="202A32"/>
+                <w:sz w:val="15"/>
+              </w:rPr>
+              <w:t>78.0</w:t>
+            </w:r>
+          </w:p>
+        </w:tc>
+      </w:tr>
+      <w:tr>
+        <w:tc>
+          <w:tcPr>
+            <w:tcW w:type="dxa" w:w="1666"/>
+            <w:vAlign w:val="center"/>
+            <w:tcMar>
+              <w:top w:w="55" w:type="dxa"/>
+              <w:start w:w="65" w:type="dxa"/>
+              <w:bottom w:w="55" w:type="dxa"/>
+              <w:end w:w="65" w:type="dxa"/>
+            </w:tcMar>
+          </w:tcPr>
+          <w:p>
+            <w:pPr>
+              <w:spacing w:after="0" w:line="240" w:lineRule="auto"/>
+            </w:pPr>
+            <w:r/>
+            <w:r>
+              <w:rPr>
+                <w:rFonts w:ascii="Times New Roman" w:hAnsi="Times New Roman"/>
+                <w:b w:val="0"/>
+                <w:color w:val="202A32"/>
+                <w:sz w:val="15"/>
+              </w:rPr>
+              <w:t>ViT-B/16 AugReg</w:t>
+            </w:r>
+          </w:p>
+        </w:tc>
+        <w:tc>
+          <w:tcPr>
+            <w:tcW w:type="dxa" w:w="1666"/>
+            <w:vAlign w:val="center"/>
+            <w:tcMar>
+              <w:top w:w="55" w:type="dxa"/>
+              <w:start w:w="65" w:type="dxa"/>
+              <w:bottom w:w="55" w:type="dxa"/>
+              <w:end w:w="65" w:type="dxa"/>
+            </w:tcMar>
+          </w:tcPr>
+          <w:p>
+            <w:pPr>
+              <w:spacing w:after="0" w:line="240" w:lineRule="auto"/>
+              <w:jc w:val="center"/>
+            </w:pPr>
+            <w:r/>
+            <w:r>
+              <w:rPr>
+                <w:rFonts w:ascii="Times New Roman" w:hAnsi="Times New Roman"/>
+                <w:b w:val="0"/>
+                <w:color w:val="202A32"/>
+                <w:sz w:val="15"/>
+              </w:rPr>
+              <w:t>98</w:t>
+            </w:r>
+          </w:p>
+        </w:tc>
+        <w:tc>
+          <w:tcPr>
+            <w:tcW w:type="dxa" w:w="1666"/>
+            <w:vAlign w:val="center"/>
+            <w:tcMar>
+              <w:top w:w="55" w:type="dxa"/>
+              <w:start w:w="65" w:type="dxa"/>
+              <w:bottom w:w="55" w:type="dxa"/>
+              <w:end w:w="65" w:type="dxa"/>
+            </w:tcMar>
+          </w:tcPr>
+          <w:p>
+            <w:pPr>
+              <w:spacing w:after="0" w:line="240" w:lineRule="auto"/>
+              <w:jc w:val="center"/>
+            </w:pPr>
+            <w:r/>
+            <w:r>
+              <w:rPr>
+                <w:rFonts w:ascii="Times New Roman" w:hAnsi="Times New Roman"/>
+                <w:b w:val="0"/>
+                <w:color w:val="202A32"/>
+                <w:sz w:val="15"/>
+              </w:rPr>
+              <w:t>79.0</w:t>
+            </w:r>
+          </w:p>
+        </w:tc>
+        <w:tc>
+          <w:tcPr>
+            <w:tcW w:type="dxa" w:w="1666"/>
+            <w:vAlign w:val="center"/>
+            <w:tcMar>
+              <w:top w:w="55" w:type="dxa"/>
+              <w:start w:w="65" w:type="dxa"/>
+              <w:bottom w:w="55" w:type="dxa"/>
+              <w:end w:w="65" w:type="dxa"/>
+            </w:tcMar>
+          </w:tcPr>
+          <w:p>
+            <w:pPr>
+              <w:spacing w:after="0" w:line="240" w:lineRule="auto"/>
+              <w:jc w:val="center"/>
+            </w:pPr>
+            <w:r/>
+            <w:r>
+              <w:rPr>
+                <w:rFonts w:ascii="Times New Roman" w:hAnsi="Times New Roman"/>
+                <w:b w:val="0"/>
+                <w:color w:val="202A32"/>
+                <w:sz w:val="15"/>
+              </w:rPr>
+              <w:t>79.0</w:t>
+            </w:r>
+          </w:p>
+        </w:tc>
+        <w:tc>
+          <w:tcPr>
+            <w:tcW w:type="dxa" w:w="1666"/>
+            <w:vAlign w:val="center"/>
+            <w:tcMar>
+              <w:top w:w="55" w:type="dxa"/>
+              <w:start w:w="65" w:type="dxa"/>
+              <w:bottom w:w="55" w:type="dxa"/>
+              <w:end w:w="65" w:type="dxa"/>
+            </w:tcMar>
+          </w:tcPr>
+          <w:p>
+            <w:pPr>
+              <w:spacing w:after="0" w:line="240" w:lineRule="auto"/>
+              <w:jc w:val="center"/>
+            </w:pPr>
+            <w:r/>
+            <w:r>
+              <w:rPr>
+                <w:rFonts w:ascii="Times New Roman" w:hAnsi="Times New Roman"/>
+                <w:b w:val="0"/>
+                <w:color w:val="202A32"/>
+                <w:sz w:val="15"/>
+              </w:rPr>
+              <w:t>10, 30</w:t>
+            </w:r>
+          </w:p>
+        </w:tc>
+        <w:tc>
+          <w:tcPr>
+            <w:tcW w:type="dxa" w:w="1666"/>
+            <w:vAlign w:val="center"/>
+            <w:tcMar>
+              <w:top w:w="55" w:type="dxa"/>
+              <w:start w:w="65" w:type="dxa"/>
+              <w:bottom w:w="55" w:type="dxa"/>
+              <w:end w:w="65" w:type="dxa"/>
+            </w:tcMar>
+          </w:tcPr>
+          <w:p>
+            <w:pPr>
+              <w:spacing w:after="0" w:line="240" w:lineRule="auto"/>
+              <w:jc w:val="center"/>
+            </w:pPr>
+            <w:r/>
+            <w:r>
+              <w:rPr>
+                <w:rFonts w:ascii="Times New Roman" w:hAnsi="Times New Roman"/>
+                <w:b w:val="0"/>
+                <w:color w:val="202A32"/>
+                <w:sz w:val="15"/>
+              </w:rPr>
+              <w:t>78.5</w:t>
+            </w:r>
+          </w:p>
+        </w:tc>
+      </w:tr>
+      <w:tr>
+        <w:tc>
+          <w:tcPr>
+            <w:tcW w:type="dxa" w:w="1666"/>
+            <w:vAlign w:val="center"/>
+            <w:tcMar>
+              <w:top w:w="55" w:type="dxa"/>
+              <w:start w:w="65" w:type="dxa"/>
+              <w:bottom w:w="55" w:type="dxa"/>
+              <w:end w:w="65" w:type="dxa"/>
+            </w:tcMar>
+          </w:tcPr>
+          <w:p>
+            <w:pPr>
+              <w:spacing w:after="0" w:line="240" w:lineRule="auto"/>
+            </w:pPr>
+            <w:r/>
+            <w:r>
+              <w:rPr>
+                <w:rFonts w:ascii="Times New Roman" w:hAnsi="Times New Roman"/>
+                <w:b w:val="0"/>
+                <w:color w:val="202A32"/>
+                <w:sz w:val="15"/>
+              </w:rPr>
+              <w:t>DINOv2 ViT-S/14</w:t>
+            </w:r>
+          </w:p>
+        </w:tc>
+        <w:tc>
+          <w:tcPr>
+            <w:tcW w:type="dxa" w:w="1666"/>
+            <w:vAlign w:val="center"/>
+            <w:tcMar>
+              <w:top w:w="55" w:type="dxa"/>
+              <w:start w:w="65" w:type="dxa"/>
+              <w:bottom w:w="55" w:type="dxa"/>
+              <w:end w:w="65" w:type="dxa"/>
+            </w:tcMar>
+          </w:tcPr>
+          <w:p>
+            <w:pPr>
+              <w:spacing w:after="0" w:line="240" w:lineRule="auto"/>
+              <w:jc w:val="center"/>
+            </w:pPr>
+            <w:r/>
+            <w:r>
+              <w:rPr>
+                <w:rFonts w:ascii="Times New Roman" w:hAnsi="Times New Roman"/>
+                <w:b w:val="0"/>
+                <w:color w:val="202A32"/>
+                <w:sz w:val="15"/>
+              </w:rPr>
+              <w:t>42</w:t>
+            </w:r>
+          </w:p>
+        </w:tc>
+        <w:tc>
+          <w:tcPr>
+            <w:tcW w:type="dxa" w:w="1666"/>
+            <w:vAlign w:val="center"/>
+            <w:tcMar>
+              <w:top w:w="55" w:type="dxa"/>
+              <w:start w:w="65" w:type="dxa"/>
+              <w:bottom w:w="55" w:type="dxa"/>
+              <w:end w:w="65" w:type="dxa"/>
+            </w:tcMar>
+          </w:tcPr>
+          <w:p>
+            <w:pPr>
+              <w:spacing w:after="0" w:line="240" w:lineRule="auto"/>
+              <w:jc w:val="center"/>
+            </w:pPr>
+            <w:r/>
+            <w:r>
+              <w:rPr>
+                <w:rFonts w:ascii="Times New Roman" w:hAnsi="Times New Roman"/>
+                <w:b w:val="0"/>
+                <w:color w:val="202A32"/>
+                <w:sz w:val="15"/>
+              </w:rPr>
+              <w:t>76.5</w:t>
+            </w:r>
+          </w:p>
+        </w:tc>
+        <w:tc>
+          <w:tcPr>
+            <w:tcW w:type="dxa" w:w="1666"/>
+            <w:vAlign w:val="center"/>
+            <w:tcMar>
+              <w:top w:w="55" w:type="dxa"/>
+              <w:start w:w="65" w:type="dxa"/>
+              <w:bottom w:w="55" w:type="dxa"/>
+              <w:end w:w="65" w:type="dxa"/>
+            </w:tcMar>
+          </w:tcPr>
+          <w:p>
+            <w:pPr>
+              <w:spacing w:after="0" w:line="240" w:lineRule="auto"/>
+              <w:jc w:val="center"/>
+            </w:pPr>
+            <w:r/>
+            <w:r>
+              <w:rPr>
+                <w:rFonts w:ascii="Times New Roman" w:hAnsi="Times New Roman"/>
+                <w:b w:val="0"/>
+                <w:color w:val="202A32"/>
+                <w:sz w:val="15"/>
+              </w:rPr>
+              <w:t>76.5</w:t>
+            </w:r>
+          </w:p>
+        </w:tc>
+        <w:tc>
+          <w:tcPr>
+            <w:tcW w:type="dxa" w:w="1666"/>
+            <w:vAlign w:val="center"/>
+            <w:tcMar>
+              <w:top w:w="55" w:type="dxa"/>
+              <w:start w:w="65" w:type="dxa"/>
+              <w:bottom w:w="55" w:type="dxa"/>
+              <w:end w:w="65" w:type="dxa"/>
+            </w:tcMar>
+          </w:tcPr>
+          <w:p>
+            <w:pPr>
+              <w:spacing w:after="0" w:line="240" w:lineRule="auto"/>
+              <w:jc w:val="center"/>
+            </w:pPr>
+            <w:r/>
+            <w:r>
+              <w:rPr>
+                <w:rFonts w:ascii="Times New Roman" w:hAnsi="Times New Roman"/>
+                <w:b w:val="0"/>
+                <w:color w:val="202A32"/>
+                <w:sz w:val="15"/>
+              </w:rPr>
+              <w:t>10</w:t>
+            </w:r>
+          </w:p>
+        </w:tc>
+        <w:tc>
+          <w:tcPr>
+            <w:tcW w:type="dxa" w:w="1666"/>
+            <w:vAlign w:val="center"/>
+            <w:tcMar>
+              <w:top w:w="55" w:type="dxa"/>
+              <w:start w:w="65" w:type="dxa"/>
+              <w:bottom w:w="55" w:type="dxa"/>
+              <w:end w:w="65" w:type="dxa"/>
+            </w:tcMar>
+          </w:tcPr>
+          <w:p>
+            <w:pPr>
+              <w:spacing w:after="0" w:line="240" w:lineRule="auto"/>
+              <w:jc w:val="center"/>
+            </w:pPr>
+            <w:r/>
+            <w:r>
+              <w:rPr>
+                <w:rFonts w:ascii="Times New Roman" w:hAnsi="Times New Roman"/>
+                <w:b w:val="0"/>
+                <w:color w:val="202A32"/>
+                <w:sz w:val="15"/>
+              </w:rPr>
+              <w:t>72.0</w:t>
+            </w:r>
+          </w:p>
+        </w:tc>
+      </w:tr>
+      <w:tr>
+        <w:tc>
+          <w:tcPr>
+            <w:tcW w:type="dxa" w:w="1666"/>
+            <w:vAlign w:val="center"/>
+            <w:tcMar>
+              <w:top w:w="55" w:type="dxa"/>
+              <w:start w:w="65" w:type="dxa"/>
+              <w:bottom w:w="55" w:type="dxa"/>
+              <w:end w:w="65" w:type="dxa"/>
+            </w:tcMar>
+          </w:tcPr>
+          <w:p>
+            <w:pPr>
+              <w:spacing w:after="0" w:line="240" w:lineRule="auto"/>
+            </w:pPr>
+            <w:r/>
+            <w:r>
+              <w:rPr>
+                <w:rFonts w:ascii="Times New Roman" w:hAnsi="Times New Roman"/>
+                <w:b w:val="0"/>
+                <w:color w:val="202A32"/>
+                <w:sz w:val="15"/>
+              </w:rPr>
+              <w:t>DINOv2 ViT-S/14</w:t>
+            </w:r>
+          </w:p>
+        </w:tc>
+        <w:tc>
+          <w:tcPr>
+            <w:tcW w:type="dxa" w:w="1666"/>
+            <w:vAlign w:val="center"/>
+            <w:tcMar>
+              <w:top w:w="55" w:type="dxa"/>
+              <w:start w:w="65" w:type="dxa"/>
+              <w:bottom w:w="55" w:type="dxa"/>
+              <w:end w:w="65" w:type="dxa"/>
+            </w:tcMar>
+          </w:tcPr>
+          <w:p>
+            <w:pPr>
+              <w:spacing w:after="0" w:line="240" w:lineRule="auto"/>
+              <w:jc w:val="center"/>
+            </w:pPr>
+            <w:r/>
+            <w:r>
+              <w:rPr>
+                <w:rFonts w:ascii="Times New Roman" w:hAnsi="Times New Roman"/>
+                <w:b w:val="0"/>
+                <w:color w:val="202A32"/>
+                <w:sz w:val="15"/>
+              </w:rPr>
+              <w:t>128</w:t>
+            </w:r>
+          </w:p>
+        </w:tc>
+        <w:tc>
+          <w:tcPr>
+            <w:tcW w:type="dxa" w:w="1666"/>
+            <w:vAlign w:val="center"/>
+            <w:tcMar>
+              <w:top w:w="55" w:type="dxa"/>
+              <w:start w:w="65" w:type="dxa"/>
+              <w:bottom w:w="55" w:type="dxa"/>
+              <w:end w:w="65" w:type="dxa"/>
+            </w:tcMar>
+          </w:tcPr>
+          <w:p>
+            <w:pPr>
+              <w:spacing w:after="0" w:line="240" w:lineRule="auto"/>
+              <w:jc w:val="center"/>
+            </w:pPr>
+            <w:r/>
+            <w:r>
+              <w:rPr>
+                <w:rFonts w:ascii="Times New Roman" w:hAnsi="Times New Roman"/>
+                <w:b w:val="0"/>
+                <w:color w:val="202A32"/>
+                <w:sz w:val="15"/>
+              </w:rPr>
+              <w:t>78.5</w:t>
+            </w:r>
+          </w:p>
+        </w:tc>
+        <w:tc>
+          <w:tcPr>
+            <w:tcW w:type="dxa" w:w="1666"/>
+            <w:vAlign w:val="center"/>
+            <w:tcMar>
+              <w:top w:w="55" w:type="dxa"/>
+              <w:start w:w="65" w:type="dxa"/>
+              <w:bottom w:w="55" w:type="dxa"/>
+              <w:end w:w="65" w:type="dxa"/>
+            </w:tcMar>
+          </w:tcPr>
+          <w:p>
+            <w:pPr>
+              <w:spacing w:after="0" w:line="240" w:lineRule="auto"/>
+              <w:jc w:val="center"/>
+            </w:pPr>
+            <w:r/>
+            <w:r>
+              <w:rPr>
+                <w:rFonts w:ascii="Times New Roman" w:hAnsi="Times New Roman"/>
+                <w:b w:val="0"/>
+                <w:color w:val="202A32"/>
+                <w:sz w:val="15"/>
+              </w:rPr>
+              <w:t>78.5</w:t>
+            </w:r>
+          </w:p>
+        </w:tc>
+        <w:tc>
+          <w:tcPr>
+            <w:tcW w:type="dxa" w:w="1666"/>
+            <w:vAlign w:val="center"/>
+            <w:tcMar>
+              <w:top w:w="55" w:type="dxa"/>
+              <w:start w:w="65" w:type="dxa"/>
+              <w:bottom w:w="55" w:type="dxa"/>
+              <w:end w:w="65" w:type="dxa"/>
+            </w:tcMar>
+          </w:tcPr>
+          <w:p>
+            <w:pPr>
+              <w:spacing w:after="0" w:line="240" w:lineRule="auto"/>
+              <w:jc w:val="center"/>
+            </w:pPr>
+            <w:r/>
+            <w:r>
+              <w:rPr>
+                <w:rFonts w:ascii="Times New Roman" w:hAnsi="Times New Roman"/>
+                <w:b w:val="0"/>
+                <w:color w:val="202A32"/>
+                <w:sz w:val="15"/>
+              </w:rPr>
+              <w:t>10, 30, 100</w:t>
+            </w:r>
+          </w:p>
+        </w:tc>
+        <w:tc>
+          <w:tcPr>
+            <w:tcW w:type="dxa" w:w="1666"/>
+            <w:vAlign w:val="center"/>
+            <w:tcMar>
+              <w:top w:w="55" w:type="dxa"/>
+              <w:start w:w="65" w:type="dxa"/>
+              <w:bottom w:w="55" w:type="dxa"/>
+              <w:end w:w="65" w:type="dxa"/>
+            </w:tcMar>
+          </w:tcPr>
+          <w:p>
+            <w:pPr>
+              <w:spacing w:after="0" w:line="240" w:lineRule="auto"/>
+              <w:jc w:val="center"/>
+            </w:pPr>
+            <w:r/>
+            <w:r>
+              <w:rPr>
+                <w:rFonts w:ascii="Times New Roman" w:hAnsi="Times New Roman"/>
+                <w:b w:val="0"/>
+                <w:color w:val="202A32"/>
+                <w:sz w:val="15"/>
+              </w:rPr>
+              <w:t>79.0</w:t>
+            </w:r>
+          </w:p>
+        </w:tc>
+      </w:tr>
+    </w:tbl>
+    <w:p>
+      <w:pPr>
+        <w:spacing w:after="20"/>
+      </w:pPr>
+    </w:p>
+    <w:p>
+      <w:pPr>
+        <w:spacing w:after="100" w:line="259" w:lineRule="auto"/>
+      </w:pPr>
+      <w:r>
+        <w:rPr>
+          <w:rFonts w:ascii="Times New Roman" w:hAnsi="Times New Roman"/>
+          <w:i w:val="0"/>
+          <w:color w:val="202A32"/>
+          <w:sz w:val="20"/>
+        </w:rPr>
+        <w:t xml:space="preserve">Factor 10 was at the cell maximum or tied in five of eight configurations and within 0.5 percentage points of the cell maximum in the other three. It attained the maximum uniquely in two cells, tied in three, and the maximum factor was not universal. Mean nonlinear logit </w:t>
+      </w:r>
+      <m:oMath>
+        <m:sSub>
+          <m:e>
+            <m:r>
+              <m:t xml:space="preserve">L</m:t>
+            </m:r>
+          </m:e>
+          <m:sub>
+            <m:r>
+              <m:t xml:space="preserve">2</m:t>
+            </m:r>
+          </m:sub>
+        </m:sSub>
+      </m:oMath>
+      <w:r>
+        <w:rPr>
+          <w:rFonts w:ascii="Times New Roman" w:hAnsi="Times New Roman"/>
+          <w:i w:val="0"/>
+          <w:color w:val="202A32"/>
+          <w:sz w:val="20"/>
+        </w:rPr>
+        <w:t xml:space="preserve"> damage at factor 10 was lower than Group Mean in all eight cells. At factor 10, the cell-mean </w:t>
+      </w:r>
+      <m:oMath>
+        <m:r>
+          <m:t xml:space="preserve">{</m:t>
+        </m:r>
+        <m:r>
+          <m:t xml:space="preserve">tr</m:t>
+        </m:r>
+        <m:r>
+          <m:t xml:space="preserve">}</m:t>
+        </m:r>
+        <m:r>
+          <m:t xml:space="preserve">(</m:t>
+        </m:r>
+        <m:sSub>
+          <m:e>
+            <m:r>
+              <m:t xml:space="preserve">H</m:t>
+            </m:r>
+          </m:e>
+          <m:sub>
+            <m:r>
+              <m:t xml:space="preserve">J</m:t>
+            </m:r>
+          </m:sub>
+        </m:sSub>
+        <m:r>
+          <m:t xml:space="preserve">)</m:t>
+        </m:r>
+        <m:r>
+          <m:t xml:space="preserve">/</m:t>
+        </m:r>
+        <m:sSub>
+          <m:e>
+            <m:r>
+              <m:t xml:space="preserve">d</m:t>
+            </m:r>
+          </m:e>
+          <m:sub>
+            <m:r>
+              <m:t xml:space="preserve">s</m:t>
+            </m:r>
+          </m:sub>
+        </m:sSub>
+      </m:oMath>
+      <w:r>
+        <w:rPr>
+          <w:rFonts w:ascii="Times New Roman" w:hAnsi="Times New Roman"/>
+          <w:i w:val="0"/>
+          <w:color w:val="202A32"/>
+          <w:sz w:val="20"/>
+        </w:rPr>
+        <w:t xml:space="preserve"> ranged from 0.00914 to 34.6746 and the effective absolute lambda ranged from 0.0914 to 346.746; absolute values are model- and budget-dependent because of the trace scaling.</w:t>
+      </w:r>
+    </w:p>
+    <w:p>
+      <w:pPr>
+        <w:spacing w:after="100" w:line="259" w:lineRule="auto"/>
+      </w:pPr>
+      <w:r>
+        <w:rPr>
+          <w:rFonts w:ascii="Times New Roman" w:hAnsi="Times New Roman"/>
+          <w:i w:val="0"/>
+          <w:color w:val="202A32"/>
+          <w:sz w:val="20"/>
+        </w:rPr>
+        <w:t xml:space="preserve">Across all eight cells, decreasing </w:t>
+      </w:r>
+      <m:oMath>
+        <m:r>
+          <m:t xml:space="preserve">f</m:t>
+        </m:r>
+      </m:oMath>
+      <w:r>
+        <w:rPr>
+          <w:rFonts w:ascii="Times New Roman" w:hAnsi="Times New Roman"/>
+          <w:i w:val="0"/>
+          <w:color w:val="202A32"/>
+          <w:sz w:val="20"/>
+        </w:rPr>
+        <w:t xml:space="preserve"> reduced mean </w:t>
+      </w:r>
+      <m:oMath>
+        <m:r>
+          <m:t xml:space="preserve">||</m:t>
+        </m:r>
+        <m:r>
+          <m:t xml:space="preserve">JE</m:t>
+        </m:r>
+        <m:r>
+          <m:t xml:space="preserve">||</m:t>
+        </m:r>
+      </m:oMath>
+      <w:r>
+        <w:rPr>
+          <w:rFonts w:ascii="Times New Roman" w:hAnsi="Times New Roman"/>
+          <w:i w:val="0"/>
+          <w:color w:val="202A32"/>
+          <w:sz w:val="20"/>
+        </w:rPr>
+        <w:t xml:space="preserve"> and increased mean carrier displacement; increasing </w:t>
+      </w:r>
+      <m:oMath>
+        <m:r>
+          <m:t xml:space="preserve">f</m:t>
+        </m:r>
+      </m:oMath>
+      <w:r>
+        <w:rPr>
+          <w:rFonts w:ascii="Times New Roman" w:hAnsi="Times New Roman"/>
+          <w:i w:val="0"/>
+          <w:color w:val="202A32"/>
+          <w:sz w:val="20"/>
+        </w:rPr>
+        <w:t xml:space="preserve"> moved the solution toward Group Mean. The lowest linearized residual therefore did not consistently correspond to the highest nonlinear Top-1. Figure S15 shows all seven factors for Top-1, logit damage, operator residual, and carrier displacement; the exact means and standard deviations for every endpoint and factor are retained in the aggregated CSV, with per-image values in the raw CSV.</w:t>
+      </w:r>
+    </w:p>
+    <w:p>
+      <w:pPr>
+        <w:spacing w:after="100" w:line="259" w:lineRule="auto"/>
+      </w:pPr>
+      <w:r>
+        <w:rPr>
+          <w:rFonts w:ascii="Times New Roman" w:hAnsi="Times New Roman"/>
+          <w:i w:val="0"/>
+          <w:color w:val="202A32"/>
+          <w:sz w:val="20"/>
+        </w:rPr>
+        <w:t xml:space="preserve">Paired comparisons use images as the unit and compare factor 10 with 3 and 30 within each model–budget cell. Across cells, mean paired Top-1 differences were −0.5 to +2.5 percentage points for 10 versus 3 and −0.5 to +1.5 points for 10 versus 30; paired-difference SDs ranged from 0 to 27.3 and 0 to 15.8 percentage points, respectively, and every 95% interval included zero. No exact McNemar test had an unadjusted </w:t>
+      </w:r>
+      <m:oMath>
+        <m:r>
+          <m:t xml:space="preserve">p</m:t>
+        </m:r>
+        <m:r>
+          <m:t xml:space="preserve">&lt;</m:t>
+        </m:r>
+        <m:r>
+          <m:t xml:space="preserve">0</m:t>
+        </m:r>
+        <m:r>
+          <m:t xml:space="preserve">.</m:t>
+        </m:r>
+        <m:r>
+          <m:t xml:space="preserve">05</m:t>
+        </m:r>
+      </m:oMath>
+      <w:r>
+        <w:rPr>
+          <w:rFonts w:ascii="Times New Roman" w:hAnsi="Times New Roman"/>
+          <w:i w:val="0"/>
+          <w:color w:val="202A32"/>
+          <w:sz w:val="20"/>
+        </w:rPr>
+        <w:t xml:space="preserve"> among the 16 contrasts. These results do not establish equivalence. Images are reused across factors and budgets, so the cellwise comparisons are dependent and are not treated as independent replications.</w:t>
+      </w:r>
+    </w:p>
+    <w:p>
+      <w:pPr>
+        <w:spacing w:after="100" w:line="259" w:lineRule="auto"/>
+      </w:pPr>
+      <w:r>
+        <w:rPr>
+          <w:rFonts w:ascii="Times New Roman" w:hAnsi="Times New Roman"/>
+          <w:i w:val="0"/>
+          <w:color w:val="202A32"/>
+          <w:sz w:val="20"/>
+        </w:rPr>
+        <w:t>The original exploratory cohort selected the first 200 sorted class labels. The cohorts share only 32 image IDs, so this is a descriptive cohort comparison, not a paired comparison. Factor-10 Top-1 was 1.0–7.5 points higher and Group Mean Top-1 was 5.0–9.0 points higher on the original subset; the factor attaining the Top-1 maximum also changed across most cells. The monotone residual–displacement tradeoff replicated, but absolute accuracy and factor ranking showed class-composition sensitivity. The corrected study supports factor 10 as a reasonable empirical middle setting for these measurements, not as a global optimum or proof of preregistered historical selection. This analysis is post-hoc and does not revise the held-out confirmatory benchmark.</w:t>
+      </w:r>
+    </w:p>
+    <w:p>
+      <w:pPr>
+        <w:keepNext/>
+        <w:keepLines/>
+        <w:spacing w:after="20"/>
+        <w:jc w:val="center"/>
+      </w:pPr>
+      <w:r>
+        <w:drawing>
+          <wp:inline xmlns:a="http://schemas.openxmlformats.org/drawingml/2006/main" xmlns:pic="http://schemas.openxmlformats.org/drawingml/2006/picture">
+            <wp:extent cx="6172200" cy="4714875"/>
+            <wp:docPr id="15" name="Picture 15"/>
+            <wp:cNvGraphicFramePr>
+              <a:graphicFrameLocks noChangeAspect="1"/>
+            </wp:cNvGraphicFramePr>
+            <a:graphic>
+              <a:graphicData uri="http://schemas.openxmlformats.org/drawingml/2006/picture">
+                <pic:pic>
+                  <pic:nvPicPr>
+                    <pic:cNvPr id="0" name="figureS15_regularization_sensitivity.png"/>
+                    <pic:cNvPicPr/>
+                  </pic:nvPicPr>
+                  <pic:blipFill>
+                    <a:blip r:embed="rId23"/>
+                    <a:stretch>
+                      <a:fillRect/>
+                    </a:stretch>
+                  </pic:blipFill>
+                  <pic:spPr>
+                    <a:xfrm>
+                      <a:off x="0" y="0"/>
+                      <a:ext cx="6172200" cy="4714875"/>
+                    </a:xfrm>
+                    <a:prstGeom prst="rect"/>
+                  </pic:spPr>
+                </pic:pic>
+              </a:graphicData>
+            </a:graphic>
+          </wp:inline>
+        </w:drawing>
+      </w:r>
+    </w:p>
+    <w:p>
+      <w:pPr>
+        <w:keepLines/>
+        <w:spacing w:after="100" w:line="259" w:lineRule="auto"/>
+      </w:pPr>
+      <w:r>
+        <w:rPr>
+          <w:rFonts w:ascii="Times New Roman" w:hAnsi="Times New Roman"/>
+          <w:b/>
+          <w:color w:val="202A32"/>
+          <w:sz w:val="20"/>
+        </w:rPr>
+        <w:t>Supplementary Figure S15.</w:t>
+      </w:r>
+      <w:r>
+        <w:rPr>
+          <w:rFonts w:ascii="Times New Roman" w:hAnsi="Times New Roman"/>
+          <w:i w:val="0"/>
+          <w:color w:val="202A32"/>
+          <w:sz w:val="20"/>
+        </w:rPr>
+        <w:t xml:space="preserve"> Calibration-cohort means across the seven dimensionless regularization factors. Panels show (a) nonlinear Top-1 accuracy, (b) clean-to-compressed final-logit </w:t>
+      </w:r>
+      <m:oMath>
+        <m:sSub>
+          <m:e>
+            <m:r>
+              <m:t xml:space="preserve">L</m:t>
+            </m:r>
+          </m:e>
+          <m:sub>
+            <m:r>
+              <m:t xml:space="preserve">2</m:t>
+            </m:r>
+          </m:sub>
+        </m:sSub>
+      </m:oMath>
+      <w:r>
+        <w:rPr>
+          <w:rFonts w:ascii="Times New Roman" w:hAnsi="Times New Roman"/>
+          <w:i w:val="0"/>
+          <w:color w:val="202A32"/>
+          <w:sz w:val="20"/>
+        </w:rPr>
+        <w:t xml:space="preserve"> damage, (c) linearized operator residual </w:t>
+      </w:r>
+      <m:oMath>
+        <m:r>
+          <m:t xml:space="preserve">||</m:t>
+        </m:r>
+        <m:r>
+          <m:t xml:space="preserve">JE</m:t>
+        </m:r>
+        <m:r>
+          <m:t xml:space="preserve">||</m:t>
+        </m:r>
+      </m:oMath>
+      <w:r>
+        <w:rPr>
+          <w:rFonts w:ascii="Times New Roman" w:hAnsi="Times New Roman"/>
+          <w:i w:val="0"/>
+          <w:color w:val="202A32"/>
+          <w:sz w:val="20"/>
+        </w:rPr>
+        <w:t xml:space="preserve">, and (d) carrier displacement </w:t>
+      </w:r>
+      <m:oMath>
+        <m:sSub>
+          <m:e>
+            <m:r>
+              <m:t xml:space="preserve">||</m:t>
+            </m:r>
+            <m:sSub>
+              <m:e>
+                <m:r>
+                  <m:t xml:space="preserve">C</m:t>
+                </m:r>
+              </m:e>
+              <m:sub>
+                <m:r>
+                  <m:t xml:space="preserve">opt</m:t>
+                </m:r>
+              </m:sub>
+            </m:sSub>
+            <m:r>
+              <m:t xml:space="preserve">-</m:t>
+            </m:r>
+            <m:sSub>
+              <m:e>
+                <m:r>
+                  <m:t xml:space="preserve">C</m:t>
+                </m:r>
+              </m:e>
+              <m:sub>
+                <m:r>
+                  <m:t xml:space="preserve">mean</m:t>
+                </m:r>
+              </m:sub>
+            </m:sSub>
+            <m:r>
+              <m:t xml:space="preserve">||</m:t>
+            </m:r>
+          </m:e>
+          <m:sub>
+            <m:r>
+              <m:t xml:space="preserve">F</m:t>
+            </m:r>
+          </m:sub>
+        </m:sSub>
+      </m:oMath>
+      <w:r>
+        <w:rPr>
+          <w:rFonts w:ascii="Times New Roman" w:hAnsi="Times New Roman"/>
+          <w:i w:val="0"/>
+          <w:color w:val="202A32"/>
+          <w:sz w:val="20"/>
+        </w:rPr>
+        <w:t>. Colors identify architecture and solid/dashed lines identify the two model-specific token budgets. Each point uses the same 200 calibration images within its model–budget cell; the figure is descriptive and does not treat factors or budgets as independent samples. Data are from the corrected v2 class-randomized cohort; Group Mean is tabulated in Table S5 but is not a regularization-factor curve.</w:t>
+      </w:r>
+    </w:p>
     <w:sectPr>
       <w:pgSz w:w="12240" w:h="15840"/>
       <w:pgMar w:top="979" w:right="1123" w:bottom="979" w:left="1123" w:header="720" w:footer="720" w:gutter="0"/>

</xml_diff>